<commit_message>
refactor: eliminate personal names from proposal master docs
- Replace specific investor nickname with professional term 'Calon Mitra Investor Strategis'
- Replace specific landowner name with neutral term 'Lahan Terbuka Strategis Koridor Cikedal - Menes'
- Recompile master DOCX and PDF (strictly locked 7 pages F4)
- Synchronize markdown blueprint and generator script
</commit_message>
<xml_diff>
--- a/PROPOSAL_INVESTASI_JANGKAR_KOPI.docx
+++ b/PROPOSAL_INVESTASI_JANGKAR_KOPI.docx
@@ -194,7 +194,7 @@
                 <w:color w:val="243B53"/>
                 <w:sz w:val="18"/>
               </w:rPr>
-              <w:t>Rp 6.000.000,- (Sewa Lahan Terbuka 1 Tahun di Muka ~5x5 Meter Milik Bang Hasan).</w:t>
+              <w:t>Rp 6.000.000,- (Sewa Lahan Terbuka 1 Tahun di Muka ~5x5 Meter Koridor Cikedal-Menes).</w:t>
             </w:r>
           </w:p>
           <w:p>
@@ -362,7 +362,7 @@
           <w:color w:val="102A43"/>
           <w:sz w:val="17"/>
         </w:rPr>
-        <w:t>Disusun untuk Calon Mitra Investor Strategis: Bang Nasbro (Bang Nas) &amp; Rekan</w:t>
+        <w:t>Disusun untuk Calon Mitra Investor Strategis &amp; Rekan Kemitraan</w:t>
       </w:r>
     </w:p>
     <w:p>
@@ -413,7 +413,7 @@
           <w:color w:val="243B53"/>
           <w:sz w:val="19"/>
         </w:rPr>
-        <w:t>Berdasarkan evaluasi objektif bersama dewan penasihat dan calon mitra investor utama (Bang Nasbro / Bang Nas), langkah paling bijak dalam memulai usaha F&amp;B pedesaan adalah menerapkan prinsip Lean Startup: memangkas belanja modal yang belum mendesak, menghilangkan risiko kelebihan kapasitas (over-capitalization), dan menguji penerimaan pasar secara langsung dengan modal ringan yang cepat menghasilkan arus kas (cashflow engine).</w:t>
+        <w:t>Berdasarkan evaluasi objektif bersama dewan penasihat dan calon mitra investor strategis, langkah paling bijak dalam memulai usaha F&amp;B pedesaan adalah menerapkan prinsip Lean Startup: memangkas belanja modal yang belum mendesak, menghilangkan risiko kelebihan kapasitas (over-capitalization), dan menguji penerimaan pasar secara langsung dengan modal ringan yang cepat menghasilkan arus kas (cashflow engine).</w:t>
       </w:r>
     </w:p>
     <w:p>
@@ -653,7 +653,7 @@
           <w:color w:val="102A43"/>
           <w:sz w:val="26"/>
         </w:rPr>
-        <w:t>2. KONSEP BISNIS, PRODUK &amp; TATA RUANG LAHAN BANG HASAN</w:t>
+        <w:t>2. KONSEP BISNIS, PRODUK &amp; TATA RUANG LAHAN TERBUKA</w:t>
       </w:r>
     </w:p>
     <w:p>
@@ -731,7 +731,7 @@
           <w:color w:val="243B53"/>
           <w:sz w:val="19"/>
         </w:rPr>
-        <w:t>Rencana pemanfaatan lahan milik Bang Hasan seluas estimasi 5 × 5 meter (25 m²) diatur secara efisien, rapi, dan cepat dibersihkan:</w:t>
+        <w:t>Rencana pemanfaatan lahan terbuka strategis seluas estimasi 5 × 5 meter (25 m²) diatur secara efisien, rapi, dan cepat dibersihkan:</w:t>
       </w:r>
     </w:p>
     <w:tbl>
@@ -773,7 +773,7 @@
                 <w:color w:val="102A43"/>
                 <w:sz w:val="20"/>
               </w:rPr>
-              <w:t>SKEMA TATA RUANG DAN ALUR KERJA LAHAN BANG HASAN (5 × 5 METER)</w:t>
+              <w:t>SKEMA TATA RUANG DAN ALUR KERJA LAHAN TERBUKA STRATEGIS (5 × 5 METER)</w:t>
             </w:r>
           </w:p>
           <w:p>
@@ -1291,7 +1291,7 @@
           <w:color w:val="243B53"/>
           <w:sz w:val="19"/>
         </w:rPr>
-        <w:t>Total kebutuhan belanja modal (CAPEX) dan modal kerja awal Jangkar Kopi dialokasikan tepat sebesar Rp 20.000.000 (Dua Puluh Juta Rupiah). Anggaran ini sudah memperhitungkan alokasi sewa lahan milik Bang Hasan selama 1 tahun di muka sebesar Rp 6.000.000, serta cadangan kas operasional (buffer runway) untuk menjamin keamanan likuiditas usaha.</w:t>
+        <w:t>Total kebutuhan belanja modal (CAPEX) dan modal kerja awal Jangkar Kopi dialokasikan tepat sebesar Rp 20.000.000 (Dua Puluh Juta Rupiah). Anggaran ini sudah memperhitungkan alokasi sewa lahan terbuka selama 1 tahun di muka sebesar Rp 6.000.000, serta cadangan kas operasional (buffer runway) untuk menjamin keamanan likuiditas usaha.</w:t>
       </w:r>
     </w:p>
     <w:p>
@@ -1494,7 +1494,7 @@
                 <w:color w:val="243B53"/>
                 <w:sz w:val="16"/>
               </w:rPr>
-              <w:t>Alokasi sewa lahan ~5x5 meter milik Bang Hasan koridor Cikedal-Menes</w:t>
+              <w:t>Alokasi sewa pekarangan/lahan terbuka ~5x5 meter koridor Cikedal-Menes</w:t>
             </w:r>
           </w:p>
         </w:tc>

</xml_diff>

<commit_message>
feat: scale Jangkar Kopi capital to Rp 10M lean MVP with 4.1-month BEP
</commit_message>
<xml_diff>
--- a/PROPOSAL_INVESTASI_JANGKAR_KOPI.docx
+++ b/PROPOSAL_INVESTASI_JANGKAR_KOPI.docx
@@ -148,7 +148,7 @@
                 <w:color w:val="243B53"/>
                 <w:sz w:val="18"/>
               </w:rPr>
-              <w:t>Rp 20.000.000 (Dua Puluh Juta Rupiah) — Hemat, Efisien &amp; Tervalidasi.</w:t>
+              <w:t>Rp 10.000.000 (Sepuluh Juta Rupiah) — Hemat, Efisien &amp; Tervalidasi.</w:t>
             </w:r>
           </w:p>
           <w:p>
@@ -171,7 +171,7 @@
                 <w:color w:val="243B53"/>
                 <w:sz w:val="18"/>
               </w:rPr>
-              <w:t>1 Investor Penuh (Rp 20 Jt)  |  2 Slot (@ Rp 10 Jt)  |  4 Slot Sindikasi (@ Rp 5 Jt).</w:t>
+              <w:t>1 Investor Penuh (Rp 10 Jt)  |  2 Slot (@ Rp 5 Jt)  |  4 Slot Sindikasi (@ Rp 2,5 Jt).</w:t>
             </w:r>
           </w:p>
           <w:p>
@@ -240,7 +240,7 @@
                 <w:color w:val="243B53"/>
                 <w:sz w:val="18"/>
               </w:rPr>
-              <w:t>6,9 Bulan (~7 Bulan) pada Skenario Moderat; 3,6 Bulan pada Skenario Agresif.</w:t>
+              <w:t>4,1 Bulan (~4 Bulan) pada Skenario Moderat; 2,5 Bulan pada Skenario Agresif.</w:t>
             </w:r>
           </w:p>
           <w:p>
@@ -1275,7 +1275,7 @@
           <w:color w:val="102A43"/>
           <w:sz w:val="26"/>
         </w:rPr>
-        <w:t>4. RENCANA ANGGARAN BIAYA &amp; ALOKASI MODAL LEAN MVP</w:t>
+        <w:t>4. RENCANA ANGGARAN BIAYA &amp; ALOKASI MODAL LEAN MVP (RP 10 JT)</w:t>
       </w:r>
     </w:p>
     <w:p>
@@ -1291,7 +1291,7 @@
           <w:color w:val="243B53"/>
           <w:sz w:val="19"/>
         </w:rPr>
-        <w:t>Total kebutuhan belanja modal (CAPEX) dan modal kerja awal Jangkar Kopi dialokasikan tepat sebesar Rp 20.000.000 (Dua Puluh Juta Rupiah). Anggaran ini sudah memperhitungkan alokasi sewa lahan terbuka selama 1 tahun di muka sebesar Rp 6.000.000, serta cadangan kas operasional (buffer runway) untuk menjamin keamanan likuiditas usaha.</w:t>
+        <w:t>Total kebutuhan belanja modal (CAPEX) dan modal kerja awal Jangkar Kopi dialokasikan tepat sebesar Rp 10.000.000 (Sepuluh Juta Rupiah). Anggaran ini mengalokasikan sewa lahan terbuka selama 1 tahun di muka sebesar Rp 6.000.000, serta memanfaatkan sisa dana Rp 4.000.000 secara cermat dan efisien untuk pengadaan gerobak fungsional, panggangan arang, peralatan dapur wedangan, paket lesehan, wadah saji, stok awal, dan cadangan kas darurat.</w:t>
       </w:r>
     </w:p>
     <w:p>
@@ -1306,7 +1306,7 @@
           <w:color w:val="B45309"/>
           <w:sz w:val="21"/>
         </w:rPr>
-        <w:t>4.1 Tabel Rincian Belanja Modal Awal (Tepat Rp 20.000.000)</w:t>
+        <w:t>4.1 Tabel Rincian Belanja Modal Awal (Tepat Rp 10.000.000)</w:t>
       </w:r>
     </w:p>
     <w:tbl>
@@ -1593,7 +1593,7 @@
                 <w:color w:val="243B53"/>
                 <w:sz w:val="16"/>
               </w:rPr>
-              <w:t>Penyiapan Lahan &amp; Kanopi Terpal</w:t>
+              <w:t>Gerobak Angkringan Kayu Fungsional</w:t>
             </w:r>
           </w:p>
         </w:tc>
@@ -1624,7 +1624,267 @@
                 <w:color w:val="243B53"/>
                 <w:sz w:val="16"/>
               </w:rPr>
-              <w:t>Pondasi koral split bebas becek, terpal penahan angin &amp; kanopi pelindung</w:t>
+              <w:t>Gerobak kayu custom 150x75 cm + etalase kaca display sate higienis</w:t>
+            </w:r>
+          </w:p>
+        </w:tc>
+        <w:tc>
+          <w:tcPr>
+            <w:tcW w:type="dxa" w:w="1247"/>
+            <w:shd w:val="clear" w:color="auto" w:fill="FFFFFF"/>
+            <w:tcMar>
+              <w:top w:w="32" w:type="dxa"/>
+              <w:bottom w:w="32" w:type="dxa"/>
+              <w:left w:w="60" w:type="dxa"/>
+              <w:right w:w="60" w:type="dxa"/>
+            </w:tcMar>
+            <w:tcBorders>
+              <w:top w:val="none"/>
+              <w:left w:val="none"/>
+              <w:bottom w:val="single" w:sz="4" w:space="0" w:color="D9E2EC"/>
+              <w:right w:val="none"/>
+            </w:tcBorders>
+          </w:tcPr>
+          <w:p>
+            <w:pPr>
+              <w:jc w:val="center"/>
+            </w:pPr>
+            <w:r>
+              <w:rPr>
+                <w:rFonts w:ascii="Arial" w:hAnsi="Arial"/>
+                <w:color w:val="243B53"/>
+                <w:sz w:val="16"/>
+              </w:rPr>
+              <w:t>1 unit</w:t>
+            </w:r>
+          </w:p>
+        </w:tc>
+        <w:tc>
+          <w:tcPr>
+            <w:tcW w:type="dxa" w:w="2041"/>
+            <w:shd w:val="clear" w:color="auto" w:fill="FFFFFF"/>
+            <w:tcMar>
+              <w:top w:w="32" w:type="dxa"/>
+              <w:bottom w:w="32" w:type="dxa"/>
+              <w:left w:w="60" w:type="dxa"/>
+              <w:right w:w="60" w:type="dxa"/>
+            </w:tcMar>
+            <w:tcBorders>
+              <w:top w:val="none"/>
+              <w:left w:val="none"/>
+              <w:bottom w:val="single" w:sz="4" w:space="0" w:color="D9E2EC"/>
+              <w:right w:val="none"/>
+            </w:tcBorders>
+          </w:tcPr>
+          <w:p>
+            <w:pPr>
+              <w:jc w:val="right"/>
+            </w:pPr>
+            <w:r>
+              <w:rPr>
+                <w:rFonts w:ascii="Arial" w:hAnsi="Arial"/>
+                <w:color w:val="243B53"/>
+                <w:sz w:val="16"/>
+              </w:rPr>
+              <w:t>Rp 1.500.000</w:t>
+            </w:r>
+          </w:p>
+        </w:tc>
+      </w:tr>
+      <w:tr>
+        <w:trPr>
+          <w:cantSplit/>
+        </w:trPr>
+        <w:tc>
+          <w:tcPr>
+            <w:tcW w:type="dxa" w:w="2721"/>
+            <w:shd w:val="clear" w:color="auto" w:fill="F0F4F8"/>
+            <w:tcMar>
+              <w:top w:w="32" w:type="dxa"/>
+              <w:bottom w:w="32" w:type="dxa"/>
+              <w:left w:w="60" w:type="dxa"/>
+              <w:right w:w="60" w:type="dxa"/>
+            </w:tcMar>
+            <w:tcBorders>
+              <w:top w:val="none"/>
+              <w:left w:val="none"/>
+              <w:bottom w:val="single" w:sz="4" w:space="0" w:color="D9E2EC"/>
+              <w:right w:val="none"/>
+            </w:tcBorders>
+          </w:tcPr>
+          <w:p>
+            <w:pPr>
+              <w:jc w:val="left"/>
+            </w:pPr>
+            <w:r>
+              <w:rPr>
+                <w:rFonts w:ascii="Arial" w:hAnsi="Arial"/>
+                <w:b/>
+                <w:color w:val="243B53"/>
+                <w:sz w:val="16"/>
+              </w:rPr>
+              <w:t>Panggangan Arang Stainless &amp; Blower</w:t>
+            </w:r>
+          </w:p>
+        </w:tc>
+        <w:tc>
+          <w:tcPr>
+            <w:tcW w:type="dxa" w:w="3685"/>
+            <w:shd w:val="clear" w:color="auto" w:fill="F0F4F8"/>
+            <w:tcMar>
+              <w:top w:w="32" w:type="dxa"/>
+              <w:bottom w:w="32" w:type="dxa"/>
+              <w:left w:w="60" w:type="dxa"/>
+              <w:right w:w="60" w:type="dxa"/>
+            </w:tcMar>
+            <w:tcBorders>
+              <w:top w:val="none"/>
+              <w:left w:val="none"/>
+              <w:bottom w:val="single" w:sz="4" w:space="0" w:color="D9E2EC"/>
+              <w:right w:val="none"/>
+            </w:tcBorders>
+          </w:tcPr>
+          <w:p>
+            <w:pPr>
+              <w:jc w:val="left"/>
+            </w:pPr>
+            <w:r>
+              <w:rPr>
+                <w:rFonts w:ascii="Arial" w:hAnsi="Arial"/>
+                <w:color w:val="243B53"/>
+                <w:sz w:val="16"/>
+              </w:rPr>
+              <w:t>Panggangan sate arang batok panjang 65 cm, kisi stainless, blower DC mini, jepitan</w:t>
+            </w:r>
+          </w:p>
+        </w:tc>
+        <w:tc>
+          <w:tcPr>
+            <w:tcW w:type="dxa" w:w="1247"/>
+            <w:shd w:val="clear" w:color="auto" w:fill="F0F4F8"/>
+            <w:tcMar>
+              <w:top w:w="32" w:type="dxa"/>
+              <w:bottom w:w="32" w:type="dxa"/>
+              <w:left w:w="60" w:type="dxa"/>
+              <w:right w:w="60" w:type="dxa"/>
+            </w:tcMar>
+            <w:tcBorders>
+              <w:top w:val="none"/>
+              <w:left w:val="none"/>
+              <w:bottom w:val="single" w:sz="4" w:space="0" w:color="D9E2EC"/>
+              <w:right w:val="none"/>
+            </w:tcBorders>
+          </w:tcPr>
+          <w:p>
+            <w:pPr>
+              <w:jc w:val="center"/>
+            </w:pPr>
+            <w:r>
+              <w:rPr>
+                <w:rFonts w:ascii="Arial" w:hAnsi="Arial"/>
+                <w:color w:val="243B53"/>
+                <w:sz w:val="16"/>
+              </w:rPr>
+              <w:t>1 set</w:t>
+            </w:r>
+          </w:p>
+        </w:tc>
+        <w:tc>
+          <w:tcPr>
+            <w:tcW w:type="dxa" w:w="2041"/>
+            <w:shd w:val="clear" w:color="auto" w:fill="F0F4F8"/>
+            <w:tcMar>
+              <w:top w:w="32" w:type="dxa"/>
+              <w:bottom w:w="32" w:type="dxa"/>
+              <w:left w:w="60" w:type="dxa"/>
+              <w:right w:w="60" w:type="dxa"/>
+            </w:tcMar>
+            <w:tcBorders>
+              <w:top w:val="none"/>
+              <w:left w:val="none"/>
+              <w:bottom w:val="single" w:sz="4" w:space="0" w:color="D9E2EC"/>
+              <w:right w:val="none"/>
+            </w:tcBorders>
+          </w:tcPr>
+          <w:p>
+            <w:pPr>
+              <w:jc w:val="right"/>
+            </w:pPr>
+            <w:r>
+              <w:rPr>
+                <w:rFonts w:ascii="Arial" w:hAnsi="Arial"/>
+                <w:color w:val="243B53"/>
+                <w:sz w:val="16"/>
+              </w:rPr>
+              <w:t>Rp 350.000</w:t>
+            </w:r>
+          </w:p>
+        </w:tc>
+      </w:tr>
+      <w:tr>
+        <w:trPr>
+          <w:cantSplit/>
+        </w:trPr>
+        <w:tc>
+          <w:tcPr>
+            <w:tcW w:type="dxa" w:w="2721"/>
+            <w:shd w:val="clear" w:color="auto" w:fill="FFFFFF"/>
+            <w:tcMar>
+              <w:top w:w="32" w:type="dxa"/>
+              <w:bottom w:w="32" w:type="dxa"/>
+              <w:left w:w="60" w:type="dxa"/>
+              <w:right w:w="60" w:type="dxa"/>
+            </w:tcMar>
+            <w:tcBorders>
+              <w:top w:val="none"/>
+              <w:left w:val="none"/>
+              <w:bottom w:val="single" w:sz="4" w:space="0" w:color="D9E2EC"/>
+              <w:right w:val="none"/>
+            </w:tcBorders>
+          </w:tcPr>
+          <w:p>
+            <w:pPr>
+              <w:jc w:val="left"/>
+            </w:pPr>
+            <w:r>
+              <w:rPr>
+                <w:rFonts w:ascii="Arial" w:hAnsi="Arial"/>
+                <w:b/>
+                <w:color w:val="243B53"/>
+                <w:sz w:val="16"/>
+              </w:rPr>
+              <w:t>Peralatan Masak Dapur &amp; Wedangan</w:t>
+            </w:r>
+          </w:p>
+        </w:tc>
+        <w:tc>
+          <w:tcPr>
+            <w:tcW w:type="dxa" w:w="3685"/>
+            <w:shd w:val="clear" w:color="auto" w:fill="FFFFFF"/>
+            <w:tcMar>
+              <w:top w:w="32" w:type="dxa"/>
+              <w:bottom w:w="32" w:type="dxa"/>
+              <w:left w:w="60" w:type="dxa"/>
+              <w:right w:w="60" w:type="dxa"/>
+            </w:tcMar>
+            <w:tcBorders>
+              <w:top w:val="none"/>
+              <w:left w:val="none"/>
+              <w:bottom w:val="single" w:sz="4" w:space="0" w:color="D9E2EC"/>
+              <w:right w:val="none"/>
+            </w:tcBorders>
+          </w:tcPr>
+          <w:p>
+            <w:pPr>
+              <w:jc w:val="left"/>
+            </w:pPr>
+            <w:r>
+              <w:rPr>
+                <w:rFonts w:ascii="Arial" w:hAnsi="Arial"/>
+                <w:color w:val="243B53"/>
+                <w:sz w:val="16"/>
+              </w:rPr>
+              <w:t>Kompor gas 1 tungku, wajan baja mendoan, ceret wedang stainless, tabung LPG 3kg</w:t>
             </w:r>
           </w:p>
         </w:tc>
@@ -1686,7 +1946,7 @@
                 <w:color w:val="243B53"/>
                 <w:sz w:val="16"/>
               </w:rPr>
-              <w:t>Rp 2.000.000</w:t>
+              <w:t>Rp 450.000</w:t>
             </w:r>
           </w:p>
         </w:tc>
@@ -1723,7 +1983,7 @@
                 <w:color w:val="243B53"/>
                 <w:sz w:val="16"/>
               </w:rPr>
-              <w:t>Gerobak Angkringan Kayu Fungsional</w:t>
+              <w:t>Paket Lesehan Karpet &amp; Meja Lipat</w:t>
             </w:r>
           </w:p>
         </w:tc>
@@ -1754,267 +2014,7 @@
                 <w:color w:val="243B53"/>
                 <w:sz w:val="16"/>
               </w:rPr>
-              <w:t>Gerobak kayu mahoni custom 180x80 cm + etalase kaca sate 2 rak + lampu</w:t>
-            </w:r>
-          </w:p>
-        </w:tc>
-        <w:tc>
-          <w:tcPr>
-            <w:tcW w:type="dxa" w:w="1247"/>
-            <w:shd w:val="clear" w:color="auto" w:fill="F0F4F8"/>
-            <w:tcMar>
-              <w:top w:w="32" w:type="dxa"/>
-              <w:bottom w:w="32" w:type="dxa"/>
-              <w:left w:w="60" w:type="dxa"/>
-              <w:right w:w="60" w:type="dxa"/>
-            </w:tcMar>
-            <w:tcBorders>
-              <w:top w:val="none"/>
-              <w:left w:val="none"/>
-              <w:bottom w:val="single" w:sz="4" w:space="0" w:color="D9E2EC"/>
-              <w:right w:val="none"/>
-            </w:tcBorders>
-          </w:tcPr>
-          <w:p>
-            <w:pPr>
-              <w:jc w:val="center"/>
-            </w:pPr>
-            <w:r>
-              <w:rPr>
-                <w:rFonts w:ascii="Arial" w:hAnsi="Arial"/>
-                <w:color w:val="243B53"/>
-                <w:sz w:val="16"/>
-              </w:rPr>
-              <w:t>1 unit</w:t>
-            </w:r>
-          </w:p>
-        </w:tc>
-        <w:tc>
-          <w:tcPr>
-            <w:tcW w:type="dxa" w:w="2041"/>
-            <w:shd w:val="clear" w:color="auto" w:fill="F0F4F8"/>
-            <w:tcMar>
-              <w:top w:w="32" w:type="dxa"/>
-              <w:bottom w:w="32" w:type="dxa"/>
-              <w:left w:w="60" w:type="dxa"/>
-              <w:right w:w="60" w:type="dxa"/>
-            </w:tcMar>
-            <w:tcBorders>
-              <w:top w:val="none"/>
-              <w:left w:val="none"/>
-              <w:bottom w:val="single" w:sz="4" w:space="0" w:color="D9E2EC"/>
-              <w:right w:val="none"/>
-            </w:tcBorders>
-          </w:tcPr>
-          <w:p>
-            <w:pPr>
-              <w:jc w:val="right"/>
-            </w:pPr>
-            <w:r>
-              <w:rPr>
-                <w:rFonts w:ascii="Arial" w:hAnsi="Arial"/>
-                <w:color w:val="243B53"/>
-                <w:sz w:val="16"/>
-              </w:rPr>
-              <w:t>Rp 3.200.000</w:t>
-            </w:r>
-          </w:p>
-        </w:tc>
-      </w:tr>
-      <w:tr>
-        <w:trPr>
-          <w:cantSplit/>
-        </w:trPr>
-        <w:tc>
-          <w:tcPr>
-            <w:tcW w:type="dxa" w:w="2721"/>
-            <w:shd w:val="clear" w:color="auto" w:fill="FFFFFF"/>
-            <w:tcMar>
-              <w:top w:w="32" w:type="dxa"/>
-              <w:bottom w:w="32" w:type="dxa"/>
-              <w:left w:w="60" w:type="dxa"/>
-              <w:right w:w="60" w:type="dxa"/>
-            </w:tcMar>
-            <w:tcBorders>
-              <w:top w:val="none"/>
-              <w:left w:val="none"/>
-              <w:bottom w:val="single" w:sz="4" w:space="0" w:color="D9E2EC"/>
-              <w:right w:val="none"/>
-            </w:tcBorders>
-          </w:tcPr>
-          <w:p>
-            <w:pPr>
-              <w:jc w:val="left"/>
-            </w:pPr>
-            <w:r>
-              <w:rPr>
-                <w:rFonts w:ascii="Arial" w:hAnsi="Arial"/>
-                <w:b/>
-                <w:color w:val="243B53"/>
-                <w:sz w:val="16"/>
-              </w:rPr>
-              <w:t>Panggangan Arang Stainless &amp; Blower</w:t>
-            </w:r>
-          </w:p>
-        </w:tc>
-        <w:tc>
-          <w:tcPr>
-            <w:tcW w:type="dxa" w:w="3685"/>
-            <w:shd w:val="clear" w:color="auto" w:fill="FFFFFF"/>
-            <w:tcMar>
-              <w:top w:w="32" w:type="dxa"/>
-              <w:bottom w:w="32" w:type="dxa"/>
-              <w:left w:w="60" w:type="dxa"/>
-              <w:right w:w="60" w:type="dxa"/>
-            </w:tcMar>
-            <w:tcBorders>
-              <w:top w:val="none"/>
-              <w:left w:val="none"/>
-              <w:bottom w:val="single" w:sz="4" w:space="0" w:color="D9E2EC"/>
-              <w:right w:val="none"/>
-            </w:tcBorders>
-          </w:tcPr>
-          <w:p>
-            <w:pPr>
-              <w:jc w:val="left"/>
-            </w:pPr>
-            <w:r>
-              <w:rPr>
-                <w:rFonts w:ascii="Arial" w:hAnsi="Arial"/>
-                <w:color w:val="243B53"/>
-                <w:sz w:val="16"/>
-              </w:rPr>
-              <w:t>Panggangan sate arang panjang 75 cm, kisi stainless, blower DC mini, jepitan</w:t>
-            </w:r>
-          </w:p>
-        </w:tc>
-        <w:tc>
-          <w:tcPr>
-            <w:tcW w:type="dxa" w:w="1247"/>
-            <w:shd w:val="clear" w:color="auto" w:fill="FFFFFF"/>
-            <w:tcMar>
-              <w:top w:w="32" w:type="dxa"/>
-              <w:bottom w:w="32" w:type="dxa"/>
-              <w:left w:w="60" w:type="dxa"/>
-              <w:right w:w="60" w:type="dxa"/>
-            </w:tcMar>
-            <w:tcBorders>
-              <w:top w:val="none"/>
-              <w:left w:val="none"/>
-              <w:bottom w:val="single" w:sz="4" w:space="0" w:color="D9E2EC"/>
-              <w:right w:val="none"/>
-            </w:tcBorders>
-          </w:tcPr>
-          <w:p>
-            <w:pPr>
-              <w:jc w:val="center"/>
-            </w:pPr>
-            <w:r>
-              <w:rPr>
-                <w:rFonts w:ascii="Arial" w:hAnsi="Arial"/>
-                <w:color w:val="243B53"/>
-                <w:sz w:val="16"/>
-              </w:rPr>
-              <w:t>1 set</w:t>
-            </w:r>
-          </w:p>
-        </w:tc>
-        <w:tc>
-          <w:tcPr>
-            <w:tcW w:type="dxa" w:w="2041"/>
-            <w:shd w:val="clear" w:color="auto" w:fill="FFFFFF"/>
-            <w:tcMar>
-              <w:top w:w="32" w:type="dxa"/>
-              <w:bottom w:w="32" w:type="dxa"/>
-              <w:left w:w="60" w:type="dxa"/>
-              <w:right w:w="60" w:type="dxa"/>
-            </w:tcMar>
-            <w:tcBorders>
-              <w:top w:val="none"/>
-              <w:left w:val="none"/>
-              <w:bottom w:val="single" w:sz="4" w:space="0" w:color="D9E2EC"/>
-              <w:right w:val="none"/>
-            </w:tcBorders>
-          </w:tcPr>
-          <w:p>
-            <w:pPr>
-              <w:jc w:val="right"/>
-            </w:pPr>
-            <w:r>
-              <w:rPr>
-                <w:rFonts w:ascii="Arial" w:hAnsi="Arial"/>
-                <w:color w:val="243B53"/>
-                <w:sz w:val="16"/>
-              </w:rPr>
-              <w:t>Rp 650.000</w:t>
-            </w:r>
-          </w:p>
-        </w:tc>
-      </w:tr>
-      <w:tr>
-        <w:trPr>
-          <w:cantSplit/>
-        </w:trPr>
-        <w:tc>
-          <w:tcPr>
-            <w:tcW w:type="dxa" w:w="2721"/>
-            <w:shd w:val="clear" w:color="auto" w:fill="F0F4F8"/>
-            <w:tcMar>
-              <w:top w:w="32" w:type="dxa"/>
-              <w:bottom w:w="32" w:type="dxa"/>
-              <w:left w:w="60" w:type="dxa"/>
-              <w:right w:w="60" w:type="dxa"/>
-            </w:tcMar>
-            <w:tcBorders>
-              <w:top w:val="none"/>
-              <w:left w:val="none"/>
-              <w:bottom w:val="single" w:sz="4" w:space="0" w:color="D9E2EC"/>
-              <w:right w:val="none"/>
-            </w:tcBorders>
-          </w:tcPr>
-          <w:p>
-            <w:pPr>
-              <w:jc w:val="left"/>
-            </w:pPr>
-            <w:r>
-              <w:rPr>
-                <w:rFonts w:ascii="Arial" w:hAnsi="Arial"/>
-                <w:b/>
-                <w:color w:val="243B53"/>
-                <w:sz w:val="16"/>
-              </w:rPr>
-              <w:t>Peralatan Masak Dapur &amp; Wedangan</w:t>
-            </w:r>
-          </w:p>
-        </w:tc>
-        <w:tc>
-          <w:tcPr>
-            <w:tcW w:type="dxa" w:w="3685"/>
-            <w:shd w:val="clear" w:color="auto" w:fill="F0F4F8"/>
-            <w:tcMar>
-              <w:top w:w="32" w:type="dxa"/>
-              <w:bottom w:w="32" w:type="dxa"/>
-              <w:left w:w="60" w:type="dxa"/>
-              <w:right w:w="60" w:type="dxa"/>
-            </w:tcMar>
-            <w:tcBorders>
-              <w:top w:val="none"/>
-              <w:left w:val="none"/>
-              <w:bottom w:val="single" w:sz="4" w:space="0" w:color="D9E2EC"/>
-              <w:right w:val="none"/>
-            </w:tcBorders>
-          </w:tcPr>
-          <w:p>
-            <w:pPr>
-              <w:jc w:val="left"/>
-            </w:pPr>
-            <w:r>
-              <w:rPr>
-                <w:rFonts w:ascii="Arial" w:hAnsi="Arial"/>
-                <w:color w:val="243B53"/>
-                <w:sz w:val="16"/>
-              </w:rPr>
-              <w:t>Kompor gas 1 tungku, wajan baja mendoan, 2 ceret stainless, 2 tabung LPG 3kg</w:t>
+              <w:t>2 Karpet spons tebal waterproof 2x2m, tikar rapi, 4 meja lipat pendek</w:t>
             </w:r>
           </w:p>
         </w:tc>
@@ -2076,7 +2076,7 @@
                 <w:color w:val="243B53"/>
                 <w:sz w:val="16"/>
               </w:rPr>
-              <w:t>Rp 850.000</w:t>
+              <w:t>Rp 500.000</w:t>
             </w:r>
           </w:p>
         </w:tc>
@@ -2113,7 +2113,7 @@
                 <w:color w:val="243B53"/>
                 <w:sz w:val="16"/>
               </w:rPr>
-              <w:t>Paket Lesehan Karpet &amp; Meja Lipat</w:t>
+              <w:t>Cooler Box &amp; Wadah Saji Piring Seng</w:t>
             </w:r>
           </w:p>
         </w:tc>
@@ -2144,7 +2144,7 @@
                 <w:color w:val="243B53"/>
                 <w:sz w:val="16"/>
               </w:rPr>
-              <w:t>3 Karpet spons waterproof 2x2m, tikar, 6 meja lipat pendek &amp; bantal duduk</w:t>
+              <w:t>Cooler box insulasi susu &amp; daging, piring seng blirik, keranjang bambu, cangkir</w:t>
             </w:r>
           </w:p>
         </w:tc>
@@ -2206,7 +2206,7 @@
                 <w:color w:val="243B53"/>
                 <w:sz w:val="16"/>
               </w:rPr>
-              <w:t>Rp 1.100.000</w:t>
+              <w:t>Rp 400.000</w:t>
             </w:r>
           </w:p>
         </w:tc>
@@ -2243,7 +2243,7 @@
                 <w:color w:val="243B53"/>
                 <w:sz w:val="16"/>
               </w:rPr>
-              <w:t>Cooler Box Heavy Duty 45 Liter</w:t>
+              <w:t>Instalasi Listrik 900VA &amp; Festoon</w:t>
             </w:r>
           </w:p>
         </w:tc>
@@ -2274,7 +2274,7 @@
                 <w:color w:val="243B53"/>
                 <w:sz w:val="16"/>
               </w:rPr>
-              <w:t>Kotak pendingin insulasi tebal penampung susu murni segar &amp; fillet ayam taichan</w:t>
+              <w:t>Kabel outdoor waterproof, stopkontak cas hp, lampu gantung warm white</w:t>
             </w:r>
           </w:p>
         </w:tc>
@@ -2305,7 +2305,7 @@
                 <w:color w:val="243B53"/>
                 <w:sz w:val="16"/>
               </w:rPr>
-              <w:t>1 unit</w:t>
+              <w:t>1 paket</w:t>
             </w:r>
           </w:p>
         </w:tc>
@@ -2336,7 +2336,7 @@
                 <w:color w:val="243B53"/>
                 <w:sz w:val="16"/>
               </w:rPr>
-              <w:t>Rp 450.000</w:t>
+              <w:t>Rp 200.000</w:t>
             </w:r>
           </w:p>
         </w:tc>
@@ -2373,7 +2373,7 @@
                 <w:color w:val="243B53"/>
                 <w:sz w:val="16"/>
               </w:rPr>
-              <w:t>Wadah Saji Piring Seng, Cangkir &amp; Baki</w:t>
+              <w:t>Stok Bahan Baku Awal (Inventory)</w:t>
             </w:r>
           </w:p>
         </w:tc>
@@ -2404,7 +2404,7 @@
                 <w:color w:val="243B53"/>
                 <w:sz w:val="16"/>
               </w:rPr>
-              <w:t>Piring seng taichan blirik, keranjang anyam bambu, cangkir jadul, toples display</w:t>
+              <w:t>Fillet ayam taichan, aneka sate, mendoan, beras, kopi lokal, sachet, susu segar</w:t>
             </w:r>
           </w:p>
         </w:tc>
@@ -2466,7 +2466,7 @@
                 <w:color w:val="243B53"/>
                 <w:sz w:val="16"/>
               </w:rPr>
-              <w:t>Rp 650.000</w:t>
+              <w:t>Rp 600.000</w:t>
             </w:r>
           </w:p>
         </w:tc>
@@ -2503,7 +2503,7 @@
                 <w:color w:val="243B53"/>
                 <w:sz w:val="16"/>
               </w:rPr>
-              <w:t>Instalasi Listrik 900-1300VA &amp; Festoon</w:t>
+              <w:t>Cadangan Kas Operasional (Buffer)</w:t>
             </w:r>
           </w:p>
         </w:tc>
@@ -2534,7 +2534,7 @@
                 <w:color w:val="243B53"/>
                 <w:sz w:val="16"/>
               </w:rPr>
-              <w:t>Kabel outdoor waterproof, stopkontak colokan cas, lampu gantung warm white</w:t>
+              <w:t>Dana cadangan kas darurat kontinjensi operasional &amp; likuiditas awal</w:t>
             </w:r>
           </w:p>
         </w:tc>
@@ -2596,397 +2596,7 @@
                 <w:color w:val="243B53"/>
                 <w:sz w:val="16"/>
               </w:rPr>
-              <w:t>Rp 600.000</w:t>
-            </w:r>
-          </w:p>
-        </w:tc>
-      </w:tr>
-      <w:tr>
-        <w:trPr>
-          <w:cantSplit/>
-        </w:trPr>
-        <w:tc>
-          <w:tcPr>
-            <w:tcW w:type="dxa" w:w="2721"/>
-            <w:shd w:val="clear" w:color="auto" w:fill="FFFFFF"/>
-            <w:tcMar>
-              <w:top w:w="32" w:type="dxa"/>
-              <w:bottom w:w="32" w:type="dxa"/>
-              <w:left w:w="60" w:type="dxa"/>
-              <w:right w:w="60" w:type="dxa"/>
-            </w:tcMar>
-            <w:tcBorders>
-              <w:top w:val="none"/>
-              <w:left w:val="none"/>
-              <w:bottom w:val="single" w:sz="4" w:space="0" w:color="D9E2EC"/>
-              <w:right w:val="none"/>
-            </w:tcBorders>
-          </w:tcPr>
-          <w:p>
-            <w:pPr>
-              <w:jc w:val="left"/>
-            </w:pPr>
-            <w:r>
-              <w:rPr>
-                <w:rFonts w:ascii="Arial" w:hAnsi="Arial"/>
-                <w:b/>
-                <w:color w:val="243B53"/>
-                <w:sz w:val="16"/>
-              </w:rPr>
-              <w:t>Sound Bluetooth &amp; Spanduk Nama</w:t>
-            </w:r>
-          </w:p>
-        </w:tc>
-        <w:tc>
-          <w:tcPr>
-            <w:tcW w:type="dxa" w:w="3685"/>
-            <w:shd w:val="clear" w:color="auto" w:fill="FFFFFF"/>
-            <w:tcMar>
-              <w:top w:w="32" w:type="dxa"/>
-              <w:bottom w:w="32" w:type="dxa"/>
-              <w:left w:w="60" w:type="dxa"/>
-              <w:right w:w="60" w:type="dxa"/>
-            </w:tcMar>
-            <w:tcBorders>
-              <w:top w:val="none"/>
-              <w:left w:val="none"/>
-              <w:bottom w:val="single" w:sz="4" w:space="0" w:color="D9E2EC"/>
-              <w:right w:val="none"/>
-            </w:tcBorders>
-          </w:tcPr>
-          <w:p>
-            <w:pPr>
-              <w:jc w:val="left"/>
-            </w:pPr>
-            <w:r>
-              <w:rPr>
-                <w:rFonts w:ascii="Arial" w:hAnsi="Arial"/>
-                <w:color w:val="243B53"/>
-                <w:sz w:val="16"/>
-              </w:rPr>
-              <w:t>Speaker portable bluetooth musik santai + spanduk MMT merk Jangkar Kopi</w:t>
-            </w:r>
-          </w:p>
-        </w:tc>
-        <w:tc>
-          <w:tcPr>
-            <w:tcW w:type="dxa" w:w="1247"/>
-            <w:shd w:val="clear" w:color="auto" w:fill="FFFFFF"/>
-            <w:tcMar>
-              <w:top w:w="32" w:type="dxa"/>
-              <w:bottom w:w="32" w:type="dxa"/>
-              <w:left w:w="60" w:type="dxa"/>
-              <w:right w:w="60" w:type="dxa"/>
-            </w:tcMar>
-            <w:tcBorders>
-              <w:top w:val="none"/>
-              <w:left w:val="none"/>
-              <w:bottom w:val="single" w:sz="4" w:space="0" w:color="D9E2EC"/>
-              <w:right w:val="none"/>
-            </w:tcBorders>
-          </w:tcPr>
-          <w:p>
-            <w:pPr>
-              <w:jc w:val="center"/>
-            </w:pPr>
-            <w:r>
-              <w:rPr>
-                <w:rFonts w:ascii="Arial" w:hAnsi="Arial"/>
-                <w:color w:val="243B53"/>
-                <w:sz w:val="16"/>
-              </w:rPr>
-              <w:t>1 paket</w:t>
-            </w:r>
-          </w:p>
-        </w:tc>
-        <w:tc>
-          <w:tcPr>
-            <w:tcW w:type="dxa" w:w="2041"/>
-            <w:shd w:val="clear" w:color="auto" w:fill="FFFFFF"/>
-            <w:tcMar>
-              <w:top w:w="32" w:type="dxa"/>
-              <w:bottom w:w="32" w:type="dxa"/>
-              <w:left w:w="60" w:type="dxa"/>
-              <w:right w:w="60" w:type="dxa"/>
-            </w:tcMar>
-            <w:tcBorders>
-              <w:top w:val="none"/>
-              <w:left w:val="none"/>
-              <w:bottom w:val="single" w:sz="4" w:space="0" w:color="D9E2EC"/>
-              <w:right w:val="none"/>
-            </w:tcBorders>
-          </w:tcPr>
-          <w:p>
-            <w:pPr>
-              <w:jc w:val="right"/>
-            </w:pPr>
-            <w:r>
-              <w:rPr>
-                <w:rFonts w:ascii="Arial" w:hAnsi="Arial"/>
-                <w:color w:val="243B53"/>
-                <w:sz w:val="16"/>
-              </w:rPr>
-              <w:t>Rp 500.000</w:t>
-            </w:r>
-          </w:p>
-        </w:tc>
-      </w:tr>
-      <w:tr>
-        <w:trPr>
-          <w:cantSplit/>
-        </w:trPr>
-        <w:tc>
-          <w:tcPr>
-            <w:tcW w:type="dxa" w:w="2721"/>
-            <w:shd w:val="clear" w:color="auto" w:fill="F0F4F8"/>
-            <w:tcMar>
-              <w:top w:w="32" w:type="dxa"/>
-              <w:bottom w:w="32" w:type="dxa"/>
-              <w:left w:w="60" w:type="dxa"/>
-              <w:right w:w="60" w:type="dxa"/>
-            </w:tcMar>
-            <w:tcBorders>
-              <w:top w:val="none"/>
-              <w:left w:val="none"/>
-              <w:bottom w:val="single" w:sz="4" w:space="0" w:color="D9E2EC"/>
-              <w:right w:val="none"/>
-            </w:tcBorders>
-          </w:tcPr>
-          <w:p>
-            <w:pPr>
-              <w:jc w:val="left"/>
-            </w:pPr>
-            <w:r>
-              <w:rPr>
-                <w:rFonts w:ascii="Arial" w:hAnsi="Arial"/>
-                <w:b/>
-                <w:color w:val="243B53"/>
-                <w:sz w:val="16"/>
-              </w:rPr>
-              <w:t>Stok Bahan Baku Awal (Inventory)</w:t>
-            </w:r>
-          </w:p>
-        </w:tc>
-        <w:tc>
-          <w:tcPr>
-            <w:tcW w:type="dxa" w:w="3685"/>
-            <w:shd w:val="clear" w:color="auto" w:fill="F0F4F8"/>
-            <w:tcMar>
-              <w:top w:w="32" w:type="dxa"/>
-              <w:bottom w:w="32" w:type="dxa"/>
-              <w:left w:w="60" w:type="dxa"/>
-              <w:right w:w="60" w:type="dxa"/>
-            </w:tcMar>
-            <w:tcBorders>
-              <w:top w:val="none"/>
-              <w:left w:val="none"/>
-              <w:bottom w:val="single" w:sz="4" w:space="0" w:color="D9E2EC"/>
-              <w:right w:val="none"/>
-            </w:tcBorders>
-          </w:tcPr>
-          <w:p>
-            <w:pPr>
-              <w:jc w:val="left"/>
-            </w:pPr>
-            <w:r>
-              <w:rPr>
-                <w:rFonts w:ascii="Arial" w:hAnsi="Arial"/>
-                <w:color w:val="243B53"/>
-                <w:sz w:val="16"/>
-              </w:rPr>
-              <w:t>Fillet ayam taichan, aneka sate, mendoan, beras, kopi lokal, sachet, susu segar</w:t>
-            </w:r>
-          </w:p>
-        </w:tc>
-        <w:tc>
-          <w:tcPr>
-            <w:tcW w:type="dxa" w:w="1247"/>
-            <w:shd w:val="clear" w:color="auto" w:fill="F0F4F8"/>
-            <w:tcMar>
-              <w:top w:w="32" w:type="dxa"/>
-              <w:bottom w:w="32" w:type="dxa"/>
-              <w:left w:w="60" w:type="dxa"/>
-              <w:right w:w="60" w:type="dxa"/>
-            </w:tcMar>
-            <w:tcBorders>
-              <w:top w:val="none"/>
-              <w:left w:val="none"/>
-              <w:bottom w:val="single" w:sz="4" w:space="0" w:color="D9E2EC"/>
-              <w:right w:val="none"/>
-            </w:tcBorders>
-          </w:tcPr>
-          <w:p>
-            <w:pPr>
-              <w:jc w:val="center"/>
-            </w:pPr>
-            <w:r>
-              <w:rPr>
-                <w:rFonts w:ascii="Arial" w:hAnsi="Arial"/>
-                <w:color w:val="243B53"/>
-                <w:sz w:val="16"/>
-              </w:rPr>
-              <w:t>1 paket</w:t>
-            </w:r>
-          </w:p>
-        </w:tc>
-        <w:tc>
-          <w:tcPr>
-            <w:tcW w:type="dxa" w:w="2041"/>
-            <w:shd w:val="clear" w:color="auto" w:fill="F0F4F8"/>
-            <w:tcMar>
-              <w:top w:w="32" w:type="dxa"/>
-              <w:bottom w:w="32" w:type="dxa"/>
-              <w:left w:w="60" w:type="dxa"/>
-              <w:right w:w="60" w:type="dxa"/>
-            </w:tcMar>
-            <w:tcBorders>
-              <w:top w:val="none"/>
-              <w:left w:val="none"/>
-              <w:bottom w:val="single" w:sz="4" w:space="0" w:color="D9E2EC"/>
-              <w:right w:val="none"/>
-            </w:tcBorders>
-          </w:tcPr>
-          <w:p>
-            <w:pPr>
-              <w:jc w:val="right"/>
-            </w:pPr>
-            <w:r>
-              <w:rPr>
-                <w:rFonts w:ascii="Arial" w:hAnsi="Arial"/>
-                <w:color w:val="243B53"/>
-                <w:sz w:val="16"/>
-              </w:rPr>
-              <w:t>Rp 2.000.000</w:t>
-            </w:r>
-          </w:p>
-        </w:tc>
-      </w:tr>
-      <w:tr>
-        <w:trPr>
-          <w:cantSplit/>
-        </w:trPr>
-        <w:tc>
-          <w:tcPr>
-            <w:tcW w:type="dxa" w:w="2721"/>
-            <w:shd w:val="clear" w:color="auto" w:fill="FFFFFF"/>
-            <w:tcMar>
-              <w:top w:w="32" w:type="dxa"/>
-              <w:bottom w:w="32" w:type="dxa"/>
-              <w:left w:w="60" w:type="dxa"/>
-              <w:right w:w="60" w:type="dxa"/>
-            </w:tcMar>
-            <w:tcBorders>
-              <w:top w:val="none"/>
-              <w:left w:val="none"/>
-              <w:bottom w:val="single" w:sz="4" w:space="0" w:color="D9E2EC"/>
-              <w:right w:val="none"/>
-            </w:tcBorders>
-          </w:tcPr>
-          <w:p>
-            <w:pPr>
-              <w:jc w:val="left"/>
-            </w:pPr>
-            <w:r>
-              <w:rPr>
-                <w:rFonts w:ascii="Arial" w:hAnsi="Arial"/>
-                <w:b/>
-                <w:color w:val="243B53"/>
-                <w:sz w:val="16"/>
-              </w:rPr>
-              <w:t>Cadangan Kas Operasional (Buffer)</w:t>
-            </w:r>
-          </w:p>
-        </w:tc>
-        <w:tc>
-          <w:tcPr>
-            <w:tcW w:type="dxa" w:w="3685"/>
-            <w:shd w:val="clear" w:color="auto" w:fill="FFFFFF"/>
-            <w:tcMar>
-              <w:top w:w="32" w:type="dxa"/>
-              <w:bottom w:w="32" w:type="dxa"/>
-              <w:left w:w="60" w:type="dxa"/>
-              <w:right w:w="60" w:type="dxa"/>
-            </w:tcMar>
-            <w:tcBorders>
-              <w:top w:val="none"/>
-              <w:left w:val="none"/>
-              <w:bottom w:val="single" w:sz="4" w:space="0" w:color="D9E2EC"/>
-              <w:right w:val="none"/>
-            </w:tcBorders>
-          </w:tcPr>
-          <w:p>
-            <w:pPr>
-              <w:jc w:val="left"/>
-            </w:pPr>
-            <w:r>
-              <w:rPr>
-                <w:rFonts w:ascii="Arial" w:hAnsi="Arial"/>
-                <w:color w:val="243B53"/>
-                <w:sz w:val="16"/>
-              </w:rPr>
-              <w:t>Dana cadangan kontinjensi kas darurat &amp; likuiditas operasional 1-2 bulan</w:t>
-            </w:r>
-          </w:p>
-        </w:tc>
-        <w:tc>
-          <w:tcPr>
-            <w:tcW w:type="dxa" w:w="1247"/>
-            <w:shd w:val="clear" w:color="auto" w:fill="FFFFFF"/>
-            <w:tcMar>
-              <w:top w:w="32" w:type="dxa"/>
-              <w:bottom w:w="32" w:type="dxa"/>
-              <w:left w:w="60" w:type="dxa"/>
-              <w:right w:w="60" w:type="dxa"/>
-            </w:tcMar>
-            <w:tcBorders>
-              <w:top w:val="none"/>
-              <w:left w:val="none"/>
-              <w:bottom w:val="single" w:sz="4" w:space="0" w:color="D9E2EC"/>
-              <w:right w:val="none"/>
-            </w:tcBorders>
-          </w:tcPr>
-          <w:p>
-            <w:pPr>
-              <w:jc w:val="center"/>
-            </w:pPr>
-            <w:r>
-              <w:rPr>
-                <w:rFonts w:ascii="Arial" w:hAnsi="Arial"/>
-                <w:color w:val="243B53"/>
-                <w:sz w:val="16"/>
-              </w:rPr>
-              <w:t>1 paket</w:t>
-            </w:r>
-          </w:p>
-        </w:tc>
-        <w:tc>
-          <w:tcPr>
-            <w:tcW w:type="dxa" w:w="2041"/>
-            <w:shd w:val="clear" w:color="auto" w:fill="FFFFFF"/>
-            <w:tcMar>
-              <w:top w:w="32" w:type="dxa"/>
-              <w:bottom w:w="32" w:type="dxa"/>
-              <w:left w:w="60" w:type="dxa"/>
-              <w:right w:w="60" w:type="dxa"/>
-            </w:tcMar>
-            <w:tcBorders>
-              <w:top w:val="none"/>
-              <w:left w:val="none"/>
-              <w:bottom w:val="single" w:sz="4" w:space="0" w:color="D9E2EC"/>
-              <w:right w:val="none"/>
-            </w:tcBorders>
-          </w:tcPr>
-          <w:p>
-            <w:pPr>
-              <w:jc w:val="right"/>
-            </w:pPr>
-            <w:r>
-              <w:rPr>
-                <w:rFonts w:ascii="Arial" w:hAnsi="Arial"/>
-                <w:color w:val="243B53"/>
-                <w:sz w:val="16"/>
-              </w:rPr>
-              <w:t>Rp 2.000.000</w:t>
+              <w:t>Rp 400.000</w:t>
             </w:r>
           </w:p>
         </w:tc>
@@ -3093,7 +2703,7 @@
                 <w:color w:val="102A43"/>
                 <w:sz w:val="18"/>
               </w:rPr>
-              <w:t>Rp 20.000.000</w:t>
+              <w:t>Rp 10.000.000</w:t>
             </w:r>
           </w:p>
         </w:tc>
@@ -5376,7 +4986,7 @@
                 <w:color w:val="FFFFFF"/>
                 <w:sz w:val="16"/>
               </w:rPr>
-              <w:t>Agresif (Ramai Malam Minggu)</w:t>
+              <w:t>Agresif (Ramai Akhir Pekan)</w:t>
             </w:r>
           </w:p>
         </w:tc>
@@ -5445,7 +5055,7 @@
                 <w:color w:val="243B53"/>
                 <w:sz w:val="16"/>
               </w:rPr>
-              <w:t>25 orang / hari</w:t>
+              <w:t>20 orang / hari</w:t>
             </w:r>
           </w:p>
         </w:tc>
@@ -5477,7 +5087,7 @@
                 <w:color w:val="243B53"/>
                 <w:sz w:val="16"/>
               </w:rPr>
-              <w:t>40 orang / hari</w:t>
+              <w:t>30 orang / hari</w:t>
             </w:r>
           </w:p>
         </w:tc>
@@ -5509,7 +5119,7 @@
                 <w:color w:val="243B53"/>
                 <w:sz w:val="16"/>
               </w:rPr>
-              <w:t>60 orang / hari</w:t>
+              <w:t>45 orang / hari</w:t>
             </w:r>
           </w:p>
         </w:tc>
@@ -5578,7 +5188,39 @@
                 <w:color w:val="243B53"/>
                 <w:sz w:val="16"/>
               </w:rPr>
-              <w:t>Rp 16.000 / orang</w:t>
+              <w:t>Rp 15.000 / orang</w:t>
+            </w:r>
+          </w:p>
+        </w:tc>
+        <w:tc>
+          <w:tcPr>
+            <w:tcW w:type="dxa" w:w="2268"/>
+            <w:shd w:val="clear" w:color="auto" w:fill="FFFFFF"/>
+            <w:tcMar>
+              <w:top w:w="35" w:type="dxa"/>
+              <w:bottom w:w="35" w:type="dxa"/>
+              <w:left w:w="50" w:type="dxa"/>
+              <w:right w:w="50" w:type="dxa"/>
+            </w:tcMar>
+            <w:tcBorders>
+              <w:top w:val="none"/>
+              <w:left w:val="none"/>
+              <w:bottom w:val="single" w:sz="4" w:space="0" w:color="D9E2EC"/>
+              <w:right w:val="none"/>
+            </w:tcBorders>
+          </w:tcPr>
+          <w:p>
+            <w:pPr>
+              <w:jc w:val="right"/>
+            </w:pPr>
+            <w:r>
+              <w:rPr>
+                <w:rFonts w:ascii="Arial" w:hAnsi="Arial"/>
+                <w:b w:val="0"/>
+                <w:color w:val="243B53"/>
+                <w:sz w:val="16"/>
+              </w:rPr>
+              <w:t>Rp 16.700 / orang</w:t>
             </w:r>
           </w:p>
         </w:tc>
@@ -5611,38 +5253,6 @@
                 <w:sz w:val="16"/>
               </w:rPr>
               <w:t>Rp 18.000 / orang</w:t>
-            </w:r>
-          </w:p>
-        </w:tc>
-        <w:tc>
-          <w:tcPr>
-            <w:tcW w:type="dxa" w:w="2268"/>
-            <w:shd w:val="clear" w:color="auto" w:fill="FFFFFF"/>
-            <w:tcMar>
-              <w:top w:w="35" w:type="dxa"/>
-              <w:bottom w:w="35" w:type="dxa"/>
-              <w:left w:w="50" w:type="dxa"/>
-              <w:right w:w="50" w:type="dxa"/>
-            </w:tcMar>
-            <w:tcBorders>
-              <w:top w:val="none"/>
-              <w:left w:val="none"/>
-              <w:bottom w:val="single" w:sz="4" w:space="0" w:color="D9E2EC"/>
-              <w:right w:val="none"/>
-            </w:tcBorders>
-          </w:tcPr>
-          <w:p>
-            <w:pPr>
-              <w:jc w:val="right"/>
-            </w:pPr>
-            <w:r>
-              <w:rPr>
-                <w:rFonts w:ascii="Arial" w:hAnsi="Arial"/>
-                <w:b w:val="0"/>
-                <w:color w:val="243B53"/>
-                <w:sz w:val="16"/>
-              </w:rPr>
-              <w:t>Rp 20.000 / orang</w:t>
             </w:r>
           </w:p>
         </w:tc>
@@ -5711,7 +5321,7 @@
                 <w:color w:val="243B53"/>
                 <w:sz w:val="16"/>
               </w:rPr>
-              <w:t>Rp 400.000 / hari</w:t>
+              <w:t>Rp 300.000 / hari</w:t>
             </w:r>
           </w:p>
         </w:tc>
@@ -5743,7 +5353,7 @@
                 <w:color w:val="243B53"/>
                 <w:sz w:val="16"/>
               </w:rPr>
-              <w:t>Rp 720.000 / hari</w:t>
+              <w:t>Rp 500.000 / hari</w:t>
             </w:r>
           </w:p>
         </w:tc>
@@ -5775,7 +5385,7 @@
                 <w:color w:val="243B53"/>
                 <w:sz w:val="16"/>
               </w:rPr>
-              <w:t>Rp 1.200.000 / hari</w:t>
+              <w:t>Rp 810.000 / hari</w:t>
             </w:r>
           </w:p>
         </w:tc>
@@ -5844,7 +5454,7 @@
                 <w:color w:val="243B53"/>
                 <w:sz w:val="16"/>
               </w:rPr>
-              <w:t>Rp 12.000.000</w:t>
+              <w:t>Rp 9.000.000</w:t>
             </w:r>
           </w:p>
         </w:tc>
@@ -5876,7 +5486,7 @@
                 <w:color w:val="243B53"/>
                 <w:sz w:val="16"/>
               </w:rPr>
-              <w:t>Rp 21.600.000</w:t>
+              <w:t>Rp 15.000.000</w:t>
             </w:r>
           </w:p>
         </w:tc>
@@ -5908,7 +5518,7 @@
                 <w:color w:val="243B53"/>
                 <w:sz w:val="16"/>
               </w:rPr>
-              <w:t>Rp 36.000.000</w:t>
+              <w:t>Rp 24.300.000</w:t>
             </w:r>
           </w:p>
         </w:tc>
@@ -5977,7 +5587,7 @@
                 <w:color w:val="243B53"/>
                 <w:sz w:val="16"/>
               </w:rPr>
-              <w:t>Rp 5.400.000</w:t>
+              <w:t>Rp 3.960.000</w:t>
             </w:r>
           </w:p>
         </w:tc>
@@ -6009,7 +5619,7 @@
                 <w:color w:val="243B53"/>
                 <w:sz w:val="16"/>
               </w:rPr>
-              <w:t>Rp 9.500.000</w:t>
+              <w:t>Rp 6.600.000</w:t>
             </w:r>
           </w:p>
         </w:tc>
@@ -6041,7 +5651,7 @@
                 <w:color w:val="243B53"/>
                 <w:sz w:val="16"/>
               </w:rPr>
-              <w:t>Rp 15.500.000</w:t>
+              <w:t>Rp 10.700.000</w:t>
             </w:r>
           </w:p>
         </w:tc>
@@ -6110,7 +5720,7 @@
                 <w:color w:val="243B53"/>
                 <w:sz w:val="16"/>
               </w:rPr>
-              <w:t>Rp 6.600.000</w:t>
+              <w:t>Rp 5.040.000</w:t>
             </w:r>
           </w:p>
         </w:tc>
@@ -6142,7 +5752,7 @@
                 <w:color w:val="243B53"/>
                 <w:sz w:val="16"/>
               </w:rPr>
-              <w:t>Rp 12.100.000</w:t>
+              <w:t>Rp 8.400.000</w:t>
             </w:r>
           </w:p>
         </w:tc>
@@ -6174,7 +5784,7 @@
                 <w:color w:val="243B53"/>
                 <w:sz w:val="16"/>
               </w:rPr>
-              <w:t>Rp 20.500.000</w:t>
+              <w:t>Rp 13.600.000</w:t>
             </w:r>
           </w:p>
         </w:tc>
@@ -6243,7 +5853,7 @@
                 <w:color w:val="243B53"/>
                 <w:sz w:val="16"/>
               </w:rPr>
-              <w:t>Rp 2.800.000</w:t>
+              <w:t>Rp 1.840.000</w:t>
             </w:r>
           </w:p>
         </w:tc>
@@ -6275,7 +5885,7 @@
                 <w:color w:val="243B53"/>
                 <w:sz w:val="16"/>
               </w:rPr>
-              <w:t>Rp 4.900.000</w:t>
+              <w:t>Rp 2.400.000</w:t>
             </w:r>
           </w:p>
         </w:tc>
@@ -6307,7 +5917,7 @@
                 <w:color w:val="243B53"/>
                 <w:sz w:val="16"/>
               </w:rPr>
-              <w:t>Rp 6.500.000</w:t>
+              <w:t>Rp 3.600.000</w:t>
             </w:r>
           </w:p>
         </w:tc>
@@ -6376,7 +5986,7 @@
                 <w:color w:val="243B53"/>
                 <w:sz w:val="16"/>
               </w:rPr>
-              <w:t>Rp 3.800.000</w:t>
+              <w:t>Rp 3.200.000</w:t>
             </w:r>
           </w:p>
         </w:tc>
@@ -6408,7 +6018,7 @@
                 <w:color w:val="243B53"/>
                 <w:sz w:val="16"/>
               </w:rPr>
-              <w:t>Rp 7.200.000</w:t>
+              <w:t>Rp 6.000.000</w:t>
             </w:r>
           </w:p>
         </w:tc>
@@ -6440,7 +6050,7 @@
                 <w:color w:val="243B53"/>
                 <w:sz w:val="16"/>
               </w:rPr>
-              <w:t>Rp 14.000.000</w:t>
+              <w:t>Rp 10.000.000</w:t>
             </w:r>
           </w:p>
         </w:tc>
@@ -6509,7 +6119,7 @@
                 <w:color w:val="102A43"/>
                 <w:sz w:val="16"/>
               </w:rPr>
-              <w:t>Rp 1.520.000 / bulan</w:t>
+              <w:t>Rp 1.280.000 / bulan</w:t>
             </w:r>
           </w:p>
         </w:tc>
@@ -6541,7 +6151,7 @@
                 <w:color w:val="102A43"/>
                 <w:sz w:val="16"/>
               </w:rPr>
-              <w:t>Rp 2.880.000 / bulan</w:t>
+              <w:t>Rp 2.400.000 / bulan</w:t>
             </w:r>
           </w:p>
         </w:tc>
@@ -6573,7 +6183,7 @@
                 <w:color w:val="102A43"/>
                 <w:sz w:val="16"/>
               </w:rPr>
-              <w:t>Rp 5.600.000 / bulan</w:t>
+              <w:t>Rp 4.000.000 / bulan</w:t>
             </w:r>
           </w:p>
         </w:tc>
@@ -6642,7 +6252,7 @@
                 <w:color w:val="243B53"/>
                 <w:sz w:val="16"/>
               </w:rPr>
-              <w:t>Rp 2.280.000 / bulan</w:t>
+              <w:t>Rp 1.920.000 / bulan</w:t>
             </w:r>
           </w:p>
         </w:tc>
@@ -6674,7 +6284,7 @@
                 <w:color w:val="243B53"/>
                 <w:sz w:val="16"/>
               </w:rPr>
-              <w:t>Rp 4.320.000 / bulan</w:t>
+              <w:t>Rp 3.600.000 / bulan</w:t>
             </w:r>
           </w:p>
         </w:tc>
@@ -6706,7 +6316,7 @@
                 <w:color w:val="243B53"/>
                 <w:sz w:val="16"/>
               </w:rPr>
-              <w:t>Rp 8.400.000 / bulan</w:t>
+              <w:t>Rp 6.000.000 / bulan</w:t>
             </w:r>
           </w:p>
         </w:tc>
@@ -6775,7 +6385,7 @@
                 <w:color w:val="102A43"/>
                 <w:sz w:val="16"/>
               </w:rPr>
-              <w:t>13,1 Bulan</w:t>
+              <w:t>7,8 Bulan</w:t>
             </w:r>
           </w:p>
         </w:tc>
@@ -6807,7 +6417,7 @@
                 <w:color w:val="102A43"/>
                 <w:sz w:val="16"/>
               </w:rPr>
-              <w:t>6,9 Bulan (~7 Bulan)</w:t>
+              <w:t>4,1 Bulan (~4 Bulan)</w:t>
             </w:r>
           </w:p>
         </w:tc>
@@ -6839,7 +6449,7 @@
                 <w:color w:val="102A43"/>
                 <w:sz w:val="16"/>
               </w:rPr>
-              <w:t>3,6 Bulan</w:t>
+              <w:t>2,5 Bulan</w:t>
             </w:r>
           </w:p>
         </w:tc>
@@ -6877,7 +6487,7 @@
           <w:color w:val="B45309"/>
           <w:sz w:val="21"/>
         </w:rPr>
-        <w:t>6.1 Struktur Penawaran Kemitraan Modal Rp 20.000.000</w:t>
+        <w:t>6.1 Struktur Penawaran Kemitraan Modal Rp 10.000.000</w:t>
       </w:r>
     </w:p>
     <w:p>
@@ -6958,7 +6568,7 @@
                 <w:color w:val="243B53"/>
                 <w:sz w:val="18"/>
               </w:rPr>
-              <w:t>Terbuka opsi 1 Mitra Tunggal Penuh (Rp 20.000.000), 2 Slot Kemitraan (@ Rp 10.000.000), atau Sindikasi 4 Slot Ringan (@ Rp 5.000.000/slot).</w:t>
+              <w:t>Terbuka opsi 1 Mitra Tunggal Penuh (Rp 10.000.000), 2 Slot Kemitraan (@ Rp 5.000.000), atau Sindikasi 4 Slot Ringan (@ Rp 2.500.000/slot).</w:t>
             </w:r>
           </w:p>
           <w:p>
@@ -7066,7 +6676,7 @@
           <w:color w:val="243B53"/>
           <w:sz w:val="19"/>
         </w:rPr>
-        <w:t>Jangkar Kopi &amp; Angkringan adalah jawaban atas kebutuhan ruang temu warga yang bersahaja, bersih, dan berbiaya terjangkau di koridor Cikedal - Menes. Dengan modal lean Rp 20.000.000, beban sewa lahan terkunci aman 1 tahun (Rp 6 Jt), dan menu arang tradisional yang digemari masyarakat, usaha ini diproyeksikan mencapai titik impas dalam tempo 6,9 bulan (~7 bulan) dan siap berkembang menjadi ikon kuliner malam rakyat.</w:t>
+        <w:t>Jangkar Kopi &amp; Angkringan adalah jawaban atas kebutuhan ruang temu warga yang bersahaja, bersih, dan berbiaya terjangkau di koridor Cikedal - Menes. Dengan modal lean Rp 10.000.000, beban sewa lahan terkunci aman 1 tahun (Rp 6 Jt), dan menu arang tradisional yang digemari masyarakat, usaha ini diproyeksikan mencapai titik impas dalam tempo sangat cepat yakni 4,1 bulan (~4 bulan) dan siap berkembang menjadi ikon kuliner malam rakyat.</w:t>
       </w:r>
     </w:p>
     <w:p>
@@ -7231,9 +6841,9 @@
                 <w:color w:val="243B53"/>
                 <w:sz w:val="18"/>
               </w:rPr>
-              <w:t>[   ] 1 Slot Sindikasi (Rp 5.000.000)      [   ] 1 Slot Kemitraan (Rp 10.000.000)</w:t>
+              <w:t>[   ] 1 Slot Sindikasi (Rp 2.500.000)      [   ] 1 Slot Kemitraan (Rp 5.000.000)</w:t>
               <w:br/>
-              <w:t xml:space="preserve">                              [   ] Mitra Tunggal Penuh (Rp 20.000.000)</w:t>
+              <w:t xml:space="preserve">                              [   ] Mitra Tunggal Penuh (Rp 10.000.000)</w:t>
             </w:r>
           </w:p>
         </w:tc>

</xml_diff>

<commit_message>
feat: adopt frozen food grill skewers menu for Jangkar Kopi initial phase
</commit_message>
<xml_diff>
--- a/PROPOSAL_INVESTASI_JANGKAR_KOPI.docx
+++ b/PROPOSAL_INVESTASI_JANGKAR_KOPI.docx
@@ -83,7 +83,7 @@
           <w:color w:val="243B53"/>
           <w:sz w:val="19"/>
         </w:rPr>
-        <w:t>Proposal Rencana Bisnis Sederhana (Lean MVP) — Menghadirkan Ruang Temu Lesehan Rakyat yang Hangat, Bersahaja, dan Egaliter di Koridor Strategis Cikedal - Menes, Pandeglang, Banten. Memadukan Kelezatan Sate Taichan &amp; Aneka Sate Bakar Arang Batok Kelapa, Nasi Bakar Daun Pisang, Kopi Tubruk Robusta Khas Daerah Banten, dan Wedangan Susu Murni Segar Tanpa Beban Biaya Mesin Mewah.</w:t>
+        <w:t>Proposal Rencana Bisnis Sederhana (Lean MVP) — Menghadirkan Ruang Temu Lesehan Rakyat yang Hangat, Bersahaja, dan Egaliter di Koridor Strategis Cikedal - Menes, Pandeglang, Banten. Memadukan Kelezatan Aneka Sate Frozen Food Bakar Arang (Dumpling Keju, Otak-Otak Ikan, Sate Cumi Olahan, Sosis Bakar, Bakso Sapi Bakar), Nasi Kucing &amp; Mendoan Hangat, Kopi Tubruk Robusta Khas Daerah Banten, dan Wedangan Susu Murni Segar Tanpa Beban Biaya Mesin Mewah.</w:t>
       </w:r>
     </w:p>
     <w:tbl>
@@ -286,7 +286,7 @@
                 <w:color w:val="243B53"/>
                 <w:sz w:val="18"/>
               </w:rPr>
-              <w:t>Panggangan Arang Batok Tradisional + Kopi Tubruk Lokal &amp; Varian Sachet Populer.</w:t>
+              <w:t>Panggangan Arang Batok Tradisional + Aneka Frozen Food Bakar, Kopi Tubruk Lokal &amp; Sachet.</w:t>
             </w:r>
           </w:p>
           <w:p>
@@ -700,7 +700,7 @@
           <w:color w:val="243B53"/>
           <w:sz w:val="19"/>
         </w:rPr>
-        <w:t>Pencahayaan dirancang menggunakan lampu gantung festoon warm white (3000K) yang temaram lembut, dipadu aroma asap bakaran sate ayam bumbu rempah dari arang batok kelapa yang menyebar ke jalan raya, menciptakan daya pikat panca indra (sensory branding) yang mengundang pengendara untuk menepi.</w:t>
+        <w:t>Pencahayaan dirancang menggunakan lampu gantung festoon warm white (3000K) yang temaram lembut, dipadu aroma gurih aneka sate frozen food (sosis, bakso, dumpling, otak-otak, cumi) bakar arang batok kelapa yang menyebar ke jalan raya, menciptakan daya pikat panca indra (sensory branding) yang mengundang pengendara untuk menepi.</w:t>
       </w:r>
     </w:p>
     <w:p>
@@ -796,7 +796,7 @@
                 <w:color w:val="243B53"/>
                 <w:sz w:val="18"/>
               </w:rPr>
-              <w:t>Menempatkan gerobak kayu etalase kaca display sate higienis, panggangan arang batok stainless, ceret wedangan, dan kompor mendoan menghadap ke jalan raya agar asap bakaran gurih memancing selera.</w:t>
+              <w:t>Menempatkan gerobak kayu etalase kaca display sate frozen food higienis, panggangan arang batok stainless, ceret wedangan, dan kompor mendoan menghadap ke jalan raya agar aroma asap bakaran gurih memancing selera.</w:t>
             </w:r>
           </w:p>
           <w:p>
@@ -888,7 +888,7 @@
           <w:color w:val="B45309"/>
           <w:sz w:val="21"/>
         </w:rPr>
-        <w:t>2.3 Simplifikasi Minuman: Kopi Tubruk Lokal &amp; Varian Sachet Siap Seduh</w:t>
+        <w:t>2.3 Efisiensi Menu: Sate Frozen Food Bakar Arang &amp; Minuman Rakyat</w:t>
       </w:r>
     </w:p>
     <w:p>
@@ -904,7 +904,7 @@
           <w:color w:val="243B53"/>
           <w:sz w:val="19"/>
         </w:rPr>
-        <w:t>Menghilangkan mesin espresso dan penggilingan manual di Fase 1 memberikan efisiensi luar biasa:</w:t>
+        <w:t>Penerapan strategi menu berbasis frozen food dan minuman siap seduh di Fase 1 memberikan keunggulan operasional luar biasa:</w:t>
       </w:r>
     </w:p>
     <w:p>
@@ -920,7 +920,7 @@
           <w:color w:val="243B53"/>
           <w:sz w:val="19"/>
         </w:rPr>
-        <w:t>1. Kopi Tubruk Robusta Khas Daerah Banten: Menggunakan bubuk kopi sangrai lokal lereng Gunung Karang yang telah digiling halus siap seduh. Menghasilkan seduhan kopi hitam beraroma tebal, mantap, dan autentik dengan harga jual sangat bersahabat (Rp 4.000 / gelas).</w:t>
+        <w:t>1. Aneka Sate Frozen Food Bakar Arang: Pilihan makanan utama difokuskan pada olahan beku bermutu (dumpling keju lumer, otak-otak ikan singapura, sate cumi flower, sosis bakar, bakso sapi bakar). Sangat praktis tanpa marinasi rumit, tahan lama disimpan beku di cooler box tanpa risiko basi (zero food waste), dan dibakar hangat dengan saus bakar gurih.</w:t>
       </w:r>
     </w:p>
     <w:p>
@@ -936,7 +936,7 @@
           <w:color w:val="243B53"/>
           <w:sz w:val="19"/>
         </w:rPr>
-        <w:t>2. Varian Kopi Sachet Populer: Menyediakan pilihan favorit masyarakat (Good Day Mocacinno, Kapal Api Spesial, Indocafe Coffeemix, Kopi Tubruk Gajah, Luwak White Koffie) seharga Rp 4.000 / gelas.</w:t>
+        <w:t>2. Kopi Tubruk Lokal &amp; Sachet Populer: Menggunakan bubuk sangrai Robusta lereng Gunung Karang siap seduh (Rp 4.000) serta varian sachet favorit masyarakat (Good Day, Kapal Api, Indocafe, Luwak White Koffie).</w:t>
       </w:r>
     </w:p>
     <w:p>
@@ -952,7 +952,7 @@
           <w:color w:val="243B53"/>
           <w:sz w:val="19"/>
         </w:rPr>
-        <w:t>3. Wedangan Susu Murni &amp; Minuman Dingin: Tetap mempertahankan sajian susu sapi murni segar hangat/es dalam gelas mug jadul, wedang jahe merah susu rempah, serta es sirup sachet (Nutrisari, Extra Joss Susu) seharga Rp 5.000 – Rp 9.000.</w:t>
+        <w:t>3. Wedangan Susu Murni &amp; Minuman Segar: Menyajikan susu sapi murni hangat/es dalam mug jadul, wedang jahe merah susu rempah, serta es sirup sachet segar (Rp 5.000 – Rp 9.000).</w:t>
       </w:r>
     </w:p>
     <w:p>
@@ -1208,7 +1208,7 @@
           <w:color w:val="243B53"/>
           <w:sz w:val="19"/>
         </w:rPr>
-        <w:t>• Daya Tarik Sate Taichan Bakar Arang: Satu-satunya angkringan di area ini yang menyajikan Sate Taichan paha ayam gurih dengan sambal rawit uleg jeruk limau segar yang dibakar langsung di atas arang batok kelapa.</w:t>
+        <w:t>• Daya Tarik Aneka Sate Frozen Food Bakar Arang: Menghadirkan ragam sate sosis bakar, bakso sapi bakar bumbu lada hitam, dumpling keju lumer, otak-otak singapura, dan sate cumi olahan yang dibakar hangat di atas arang batok kelapa dengan saus bakar gurih yang sangat disukai pemuda desa dan santri.</w:t>
       </w:r>
     </w:p>
     <w:p>
@@ -1624,7 +1624,7 @@
                 <w:color w:val="243B53"/>
                 <w:sz w:val="16"/>
               </w:rPr>
-              <w:t>Gerobak kayu custom 150x75 cm + etalase kaca display sate higienis</w:t>
+              <w:t>Gerobak kayu custom 150x75 cm + etalase kaca display sate frozen food higienis</w:t>
             </w:r>
           </w:p>
         </w:tc>
@@ -2144,7 +2144,7 @@
                 <w:color w:val="243B53"/>
                 <w:sz w:val="16"/>
               </w:rPr>
-              <w:t>Cooler box insulasi susu &amp; daging, piring seng blirik, keranjang bambu, cangkir</w:t>
+              <w:t>Cooler box insulasi sate frozen food &amp; susu, piring seng blirik, wadah saji</w:t>
             </w:r>
           </w:p>
         </w:tc>
@@ -2404,7 +2404,7 @@
                 <w:color w:val="243B53"/>
                 <w:sz w:val="16"/>
               </w:rPr>
-              <w:t>Fillet ayam taichan, aneka sate, mendoan, beras, kopi lokal, sachet, susu segar</w:t>
+              <w:t>Aneka frozen food (dumpling, otak-otak, cumi, sosis, bakso), mendoan, kopi, sachet, susu</w:t>
             </w:r>
           </w:p>
         </w:tc>
@@ -2757,7 +2757,7 @@
           <w:color w:val="243B53"/>
           <w:sz w:val="19"/>
         </w:rPr>
-        <w:t>Menu Jangkar Kopi memadukan hidangan angkringan favorit dengan harga bersahabat dan margin laba kotor sehat antara 45% hingga 65%:</w:t>
+        <w:t>Menu Jangkar Kopi memadukan aneka sate frozen food bakar arang dengan kudapan dan minuman rakyat, berharga murah dan ber-margin laba kotor sehat antara 46% hingga 65%:</w:t>
       </w:r>
     </w:p>
     <w:tbl>
@@ -2941,7 +2941,7 @@
                 <w:color w:val="243B53"/>
                 <w:sz w:val="15"/>
               </w:rPr>
-              <w:t>Sate Taichan Paha Ayam (5 Tusuk)</w:t>
+              <w:t>Sosis Bakar Sapi/Ayam (Saus BBQ &amp; Mayo)</w:t>
             </w:r>
           </w:p>
         </w:tc>
@@ -2972,1303 +2972,7 @@
                 <w:color w:val="243B53"/>
                 <w:sz w:val="15"/>
               </w:rPr>
-              <w:t>Daging paha ayam 100g, bumbu marinasi, sambal rawit jeruk</w:t>
-            </w:r>
-          </w:p>
-        </w:tc>
-        <w:tc>
-          <w:tcPr>
-            <w:tcW w:type="dxa" w:w="1247"/>
-            <w:shd w:val="clear" w:color="auto" w:fill="F0F4F8"/>
-            <w:tcMar>
-              <w:top w:w="28" w:type="dxa"/>
-              <w:bottom w:w="28" w:type="dxa"/>
-              <w:left w:w="50" w:type="dxa"/>
-              <w:right w:w="50" w:type="dxa"/>
-            </w:tcMar>
-            <w:tcBorders>
-              <w:top w:val="none"/>
-              <w:left w:val="none"/>
-              <w:bottom w:val="single" w:sz="4" w:space="0" w:color="D9E2EC"/>
-              <w:right w:val="none"/>
-            </w:tcBorders>
-          </w:tcPr>
-          <w:p>
-            <w:pPr>
-              <w:jc w:val="center"/>
-            </w:pPr>
-            <w:r>
-              <w:rPr>
-                <w:rFonts w:ascii="Arial" w:hAnsi="Arial"/>
-                <w:color w:val="243B53"/>
-                <w:sz w:val="15"/>
-              </w:rPr>
-              <w:t>Rp 6.000</w:t>
-            </w:r>
-          </w:p>
-        </w:tc>
-        <w:tc>
-          <w:tcPr>
-            <w:tcW w:type="dxa" w:w="1247"/>
-            <w:shd w:val="clear" w:color="auto" w:fill="F0F4F8"/>
-            <w:tcMar>
-              <w:top w:w="28" w:type="dxa"/>
-              <w:bottom w:w="28" w:type="dxa"/>
-              <w:left w:w="50" w:type="dxa"/>
-              <w:right w:w="50" w:type="dxa"/>
-            </w:tcMar>
-            <w:tcBorders>
-              <w:top w:val="none"/>
-              <w:left w:val="none"/>
-              <w:bottom w:val="single" w:sz="4" w:space="0" w:color="D9E2EC"/>
-              <w:right w:val="none"/>
-            </w:tcBorders>
-          </w:tcPr>
-          <w:p>
-            <w:pPr>
-              <w:jc w:val="center"/>
-            </w:pPr>
-            <w:r>
-              <w:rPr>
-                <w:rFonts w:ascii="Arial" w:hAnsi="Arial"/>
-                <w:color w:val="243B53"/>
-                <w:sz w:val="15"/>
-              </w:rPr>
-              <w:t>Rp 12.000</w:t>
-            </w:r>
-          </w:p>
-        </w:tc>
-        <w:tc>
-          <w:tcPr>
-            <w:tcW w:type="dxa" w:w="1587"/>
-            <w:shd w:val="clear" w:color="auto" w:fill="F0F4F8"/>
-            <w:tcMar>
-              <w:top w:w="28" w:type="dxa"/>
-              <w:bottom w:w="28" w:type="dxa"/>
-              <w:left w:w="50" w:type="dxa"/>
-              <w:right w:w="50" w:type="dxa"/>
-            </w:tcMar>
-            <w:tcBorders>
-              <w:top w:val="none"/>
-              <w:left w:val="none"/>
-              <w:bottom w:val="single" w:sz="4" w:space="0" w:color="D9E2EC"/>
-              <w:right w:val="none"/>
-            </w:tcBorders>
-          </w:tcPr>
-          <w:p>
-            <w:pPr>
-              <w:jc w:val="right"/>
-            </w:pPr>
-            <w:r>
-              <w:rPr>
-                <w:rFonts w:ascii="Arial" w:hAnsi="Arial"/>
-                <w:b/>
-                <w:color w:val="166534"/>
-                <w:sz w:val="15"/>
-              </w:rPr>
-              <w:t>Rp 6.000 (50,0%)</w:t>
-            </w:r>
-          </w:p>
-        </w:tc>
-      </w:tr>
-      <w:tr>
-        <w:trPr>
-          <w:cantSplit/>
-        </w:trPr>
-        <w:tc>
-          <w:tcPr>
-            <w:tcW w:type="dxa" w:w="2438"/>
-            <w:shd w:val="clear" w:color="auto" w:fill="FFFFFF"/>
-            <w:tcMar>
-              <w:top w:w="28" w:type="dxa"/>
-              <w:bottom w:w="28" w:type="dxa"/>
-              <w:left w:w="50" w:type="dxa"/>
-              <w:right w:w="50" w:type="dxa"/>
-            </w:tcMar>
-            <w:tcBorders>
-              <w:top w:val="none"/>
-              <w:left w:val="none"/>
-              <w:bottom w:val="single" w:sz="4" w:space="0" w:color="D9E2EC"/>
-              <w:right w:val="none"/>
-            </w:tcBorders>
-          </w:tcPr>
-          <w:p>
-            <w:pPr>
-              <w:jc w:val="left"/>
-            </w:pPr>
-            <w:r>
-              <w:rPr>
-                <w:rFonts w:ascii="Arial" w:hAnsi="Arial"/>
-                <w:b/>
-                <w:color w:val="243B53"/>
-                <w:sz w:val="15"/>
-              </w:rPr>
-              <w:t>Sate Usus Ayam Bumbu Kuning</w:t>
-            </w:r>
-          </w:p>
-        </w:tc>
-        <w:tc>
-          <w:tcPr>
-            <w:tcW w:type="dxa" w:w="3175"/>
-            <w:shd w:val="clear" w:color="auto" w:fill="FFFFFF"/>
-            <w:tcMar>
-              <w:top w:w="28" w:type="dxa"/>
-              <w:bottom w:w="28" w:type="dxa"/>
-              <w:left w:w="50" w:type="dxa"/>
-              <w:right w:w="50" w:type="dxa"/>
-            </w:tcMar>
-            <w:tcBorders>
-              <w:top w:val="none"/>
-              <w:left w:val="none"/>
-              <w:bottom w:val="single" w:sz="4" w:space="0" w:color="D9E2EC"/>
-              <w:right w:val="none"/>
-            </w:tcBorders>
-          </w:tcPr>
-          <w:p>
-            <w:pPr>
-              <w:jc w:val="left"/>
-            </w:pPr>
-            <w:r>
-              <w:rPr>
-                <w:rFonts w:ascii="Arial" w:hAnsi="Arial"/>
-                <w:color w:val="243B53"/>
-                <w:sz w:val="15"/>
-              </w:rPr>
-              <w:t>Usus rebus bumbu kuning, oles bakar arang batok, tusuk</w:t>
-            </w:r>
-          </w:p>
-        </w:tc>
-        <w:tc>
-          <w:tcPr>
-            <w:tcW w:type="dxa" w:w="1247"/>
-            <w:shd w:val="clear" w:color="auto" w:fill="FFFFFF"/>
-            <w:tcMar>
-              <w:top w:w="28" w:type="dxa"/>
-              <w:bottom w:w="28" w:type="dxa"/>
-              <w:left w:w="50" w:type="dxa"/>
-              <w:right w:w="50" w:type="dxa"/>
-            </w:tcMar>
-            <w:tcBorders>
-              <w:top w:val="none"/>
-              <w:left w:val="none"/>
-              <w:bottom w:val="single" w:sz="4" w:space="0" w:color="D9E2EC"/>
-              <w:right w:val="none"/>
-            </w:tcBorders>
-          </w:tcPr>
-          <w:p>
-            <w:pPr>
-              <w:jc w:val="center"/>
-            </w:pPr>
-            <w:r>
-              <w:rPr>
-                <w:rFonts w:ascii="Arial" w:hAnsi="Arial"/>
-                <w:color w:val="243B53"/>
-                <w:sz w:val="15"/>
-              </w:rPr>
-              <w:t>Rp 850</w:t>
-            </w:r>
-          </w:p>
-        </w:tc>
-        <w:tc>
-          <w:tcPr>
-            <w:tcW w:type="dxa" w:w="1247"/>
-            <w:shd w:val="clear" w:color="auto" w:fill="FFFFFF"/>
-            <w:tcMar>
-              <w:top w:w="28" w:type="dxa"/>
-              <w:bottom w:w="28" w:type="dxa"/>
-              <w:left w:w="50" w:type="dxa"/>
-              <w:right w:w="50" w:type="dxa"/>
-            </w:tcMar>
-            <w:tcBorders>
-              <w:top w:val="none"/>
-              <w:left w:val="none"/>
-              <w:bottom w:val="single" w:sz="4" w:space="0" w:color="D9E2EC"/>
-              <w:right w:val="none"/>
-            </w:tcBorders>
-          </w:tcPr>
-          <w:p>
-            <w:pPr>
-              <w:jc w:val="center"/>
-            </w:pPr>
-            <w:r>
-              <w:rPr>
-                <w:rFonts w:ascii="Arial" w:hAnsi="Arial"/>
-                <w:color w:val="243B53"/>
-                <w:sz w:val="15"/>
-              </w:rPr>
-              <w:t>Rp 2.000</w:t>
-            </w:r>
-          </w:p>
-        </w:tc>
-        <w:tc>
-          <w:tcPr>
-            <w:tcW w:type="dxa" w:w="1587"/>
-            <w:shd w:val="clear" w:color="auto" w:fill="FFFFFF"/>
-            <w:tcMar>
-              <w:top w:w="28" w:type="dxa"/>
-              <w:bottom w:w="28" w:type="dxa"/>
-              <w:left w:w="50" w:type="dxa"/>
-              <w:right w:w="50" w:type="dxa"/>
-            </w:tcMar>
-            <w:tcBorders>
-              <w:top w:val="none"/>
-              <w:left w:val="none"/>
-              <w:bottom w:val="single" w:sz="4" w:space="0" w:color="D9E2EC"/>
-              <w:right w:val="none"/>
-            </w:tcBorders>
-          </w:tcPr>
-          <w:p>
-            <w:pPr>
-              <w:jc w:val="right"/>
-            </w:pPr>
-            <w:r>
-              <w:rPr>
-                <w:rFonts w:ascii="Arial" w:hAnsi="Arial"/>
-                <w:b/>
-                <w:color w:val="166534"/>
-                <w:sz w:val="15"/>
-              </w:rPr>
-              <w:t>Rp 1.150 (57,5%)</w:t>
-            </w:r>
-          </w:p>
-        </w:tc>
-      </w:tr>
-      <w:tr>
-        <w:trPr>
-          <w:cantSplit/>
-        </w:trPr>
-        <w:tc>
-          <w:tcPr>
-            <w:tcW w:type="dxa" w:w="2438"/>
-            <w:shd w:val="clear" w:color="auto" w:fill="F0F4F8"/>
-            <w:tcMar>
-              <w:top w:w="28" w:type="dxa"/>
-              <w:bottom w:w="28" w:type="dxa"/>
-              <w:left w:w="50" w:type="dxa"/>
-              <w:right w:w="50" w:type="dxa"/>
-            </w:tcMar>
-            <w:tcBorders>
-              <w:top w:val="none"/>
-              <w:left w:val="none"/>
-              <w:bottom w:val="single" w:sz="4" w:space="0" w:color="D9E2EC"/>
-              <w:right w:val="none"/>
-            </w:tcBorders>
-          </w:tcPr>
-          <w:p>
-            <w:pPr>
-              <w:jc w:val="left"/>
-            </w:pPr>
-            <w:r>
-              <w:rPr>
-                <w:rFonts w:ascii="Arial" w:hAnsi="Arial"/>
-                <w:b/>
-                <w:color w:val="243B53"/>
-                <w:sz w:val="15"/>
-              </w:rPr>
-              <w:t>Sate Kulit Ayam Bakar Gurih</w:t>
-            </w:r>
-          </w:p>
-        </w:tc>
-        <w:tc>
-          <w:tcPr>
-            <w:tcW w:type="dxa" w:w="3175"/>
-            <w:shd w:val="clear" w:color="auto" w:fill="F0F4F8"/>
-            <w:tcMar>
-              <w:top w:w="28" w:type="dxa"/>
-              <w:bottom w:w="28" w:type="dxa"/>
-              <w:left w:w="50" w:type="dxa"/>
-              <w:right w:w="50" w:type="dxa"/>
-            </w:tcMar>
-            <w:tcBorders>
-              <w:top w:val="none"/>
-              <w:left w:val="none"/>
-              <w:bottom w:val="single" w:sz="4" w:space="0" w:color="D9E2EC"/>
-              <w:right w:val="none"/>
-            </w:tcBorders>
-          </w:tcPr>
-          <w:p>
-            <w:pPr>
-              <w:jc w:val="left"/>
-            </w:pPr>
-            <w:r>
-              <w:rPr>
-                <w:rFonts w:ascii="Arial" w:hAnsi="Arial"/>
-                <w:color w:val="243B53"/>
-                <w:sz w:val="15"/>
-              </w:rPr>
-              <w:t>Kulit ayam bumbu rempah bakar kecap manis gurih</w:t>
-            </w:r>
-          </w:p>
-        </w:tc>
-        <w:tc>
-          <w:tcPr>
-            <w:tcW w:type="dxa" w:w="1247"/>
-            <w:shd w:val="clear" w:color="auto" w:fill="F0F4F8"/>
-            <w:tcMar>
-              <w:top w:w="28" w:type="dxa"/>
-              <w:bottom w:w="28" w:type="dxa"/>
-              <w:left w:w="50" w:type="dxa"/>
-              <w:right w:w="50" w:type="dxa"/>
-            </w:tcMar>
-            <w:tcBorders>
-              <w:top w:val="none"/>
-              <w:left w:val="none"/>
-              <w:bottom w:val="single" w:sz="4" w:space="0" w:color="D9E2EC"/>
-              <w:right w:val="none"/>
-            </w:tcBorders>
-          </w:tcPr>
-          <w:p>
-            <w:pPr>
-              <w:jc w:val="center"/>
-            </w:pPr>
-            <w:r>
-              <w:rPr>
-                <w:rFonts w:ascii="Arial" w:hAnsi="Arial"/>
-                <w:color w:val="243B53"/>
-                <w:sz w:val="15"/>
-              </w:rPr>
-              <w:t>Rp 900</w:t>
-            </w:r>
-          </w:p>
-        </w:tc>
-        <w:tc>
-          <w:tcPr>
-            <w:tcW w:type="dxa" w:w="1247"/>
-            <w:shd w:val="clear" w:color="auto" w:fill="F0F4F8"/>
-            <w:tcMar>
-              <w:top w:w="28" w:type="dxa"/>
-              <w:bottom w:w="28" w:type="dxa"/>
-              <w:left w:w="50" w:type="dxa"/>
-              <w:right w:w="50" w:type="dxa"/>
-            </w:tcMar>
-            <w:tcBorders>
-              <w:top w:val="none"/>
-              <w:left w:val="none"/>
-              <w:bottom w:val="single" w:sz="4" w:space="0" w:color="D9E2EC"/>
-              <w:right w:val="none"/>
-            </w:tcBorders>
-          </w:tcPr>
-          <w:p>
-            <w:pPr>
-              <w:jc w:val="center"/>
-            </w:pPr>
-            <w:r>
-              <w:rPr>
-                <w:rFonts w:ascii="Arial" w:hAnsi="Arial"/>
-                <w:color w:val="243B53"/>
-                <w:sz w:val="15"/>
-              </w:rPr>
-              <w:t>Rp 2.500</w:t>
-            </w:r>
-          </w:p>
-        </w:tc>
-        <w:tc>
-          <w:tcPr>
-            <w:tcW w:type="dxa" w:w="1587"/>
-            <w:shd w:val="clear" w:color="auto" w:fill="F0F4F8"/>
-            <w:tcMar>
-              <w:top w:w="28" w:type="dxa"/>
-              <w:bottom w:w="28" w:type="dxa"/>
-              <w:left w:w="50" w:type="dxa"/>
-              <w:right w:w="50" w:type="dxa"/>
-            </w:tcMar>
-            <w:tcBorders>
-              <w:top w:val="none"/>
-              <w:left w:val="none"/>
-              <w:bottom w:val="single" w:sz="4" w:space="0" w:color="D9E2EC"/>
-              <w:right w:val="none"/>
-            </w:tcBorders>
-          </w:tcPr>
-          <w:p>
-            <w:pPr>
-              <w:jc w:val="right"/>
-            </w:pPr>
-            <w:r>
-              <w:rPr>
-                <w:rFonts w:ascii="Arial" w:hAnsi="Arial"/>
-                <w:b/>
-                <w:color w:val="166534"/>
-                <w:sz w:val="15"/>
-              </w:rPr>
-              <w:t>Rp 1.600 (64,0%)</w:t>
-            </w:r>
-          </w:p>
-        </w:tc>
-      </w:tr>
-      <w:tr>
-        <w:trPr>
-          <w:cantSplit/>
-        </w:trPr>
-        <w:tc>
-          <w:tcPr>
-            <w:tcW w:type="dxa" w:w="2438"/>
-            <w:shd w:val="clear" w:color="auto" w:fill="FFFFFF"/>
-            <w:tcMar>
-              <w:top w:w="28" w:type="dxa"/>
-              <w:bottom w:w="28" w:type="dxa"/>
-              <w:left w:w="50" w:type="dxa"/>
-              <w:right w:w="50" w:type="dxa"/>
-            </w:tcMar>
-            <w:tcBorders>
-              <w:top w:val="none"/>
-              <w:left w:val="none"/>
-              <w:bottom w:val="single" w:sz="4" w:space="0" w:color="D9E2EC"/>
-              <w:right w:val="none"/>
-            </w:tcBorders>
-          </w:tcPr>
-          <w:p>
-            <w:pPr>
-              <w:jc w:val="left"/>
-            </w:pPr>
-            <w:r>
-              <w:rPr>
-                <w:rFonts w:ascii="Arial" w:hAnsi="Arial"/>
-                <w:b/>
-                <w:color w:val="243B53"/>
-                <w:sz w:val="15"/>
-              </w:rPr>
-              <w:t>Sate Telur Puyuh Bacem (4 Butir)</w:t>
-            </w:r>
-          </w:p>
-        </w:tc>
-        <w:tc>
-          <w:tcPr>
-            <w:tcW w:type="dxa" w:w="3175"/>
-            <w:shd w:val="clear" w:color="auto" w:fill="FFFFFF"/>
-            <w:tcMar>
-              <w:top w:w="28" w:type="dxa"/>
-              <w:bottom w:w="28" w:type="dxa"/>
-              <w:left w:w="50" w:type="dxa"/>
-              <w:right w:w="50" w:type="dxa"/>
-            </w:tcMar>
-            <w:tcBorders>
-              <w:top w:val="none"/>
-              <w:left w:val="none"/>
-              <w:bottom w:val="single" w:sz="4" w:space="0" w:color="D9E2EC"/>
-              <w:right w:val="none"/>
-            </w:tcBorders>
-          </w:tcPr>
-          <w:p>
-            <w:pPr>
-              <w:jc w:val="left"/>
-            </w:pPr>
-            <w:r>
-              <w:rPr>
-                <w:rFonts w:ascii="Arial" w:hAnsi="Arial"/>
-                <w:color w:val="243B53"/>
-                <w:sz w:val="15"/>
-              </w:rPr>
-              <w:t>Telur puyuh bacem rempah gula aren, bakar hangat</w:t>
-            </w:r>
-          </w:p>
-        </w:tc>
-        <w:tc>
-          <w:tcPr>
-            <w:tcW w:type="dxa" w:w="1247"/>
-            <w:shd w:val="clear" w:color="auto" w:fill="FFFFFF"/>
-            <w:tcMar>
-              <w:top w:w="28" w:type="dxa"/>
-              <w:bottom w:w="28" w:type="dxa"/>
-              <w:left w:w="50" w:type="dxa"/>
-              <w:right w:w="50" w:type="dxa"/>
-            </w:tcMar>
-            <w:tcBorders>
-              <w:top w:val="none"/>
-              <w:left w:val="none"/>
-              <w:bottom w:val="single" w:sz="4" w:space="0" w:color="D9E2EC"/>
-              <w:right w:val="none"/>
-            </w:tcBorders>
-          </w:tcPr>
-          <w:p>
-            <w:pPr>
-              <w:jc w:val="center"/>
-            </w:pPr>
-            <w:r>
-              <w:rPr>
-                <w:rFonts w:ascii="Arial" w:hAnsi="Arial"/>
-                <w:color w:val="243B53"/>
-                <w:sz w:val="15"/>
-              </w:rPr>
-              <w:t>Rp 2.000</w:t>
-            </w:r>
-          </w:p>
-        </w:tc>
-        <w:tc>
-          <w:tcPr>
-            <w:tcW w:type="dxa" w:w="1247"/>
-            <w:shd w:val="clear" w:color="auto" w:fill="FFFFFF"/>
-            <w:tcMar>
-              <w:top w:w="28" w:type="dxa"/>
-              <w:bottom w:w="28" w:type="dxa"/>
-              <w:left w:w="50" w:type="dxa"/>
-              <w:right w:w="50" w:type="dxa"/>
-            </w:tcMar>
-            <w:tcBorders>
-              <w:top w:val="none"/>
-              <w:left w:val="none"/>
-              <w:bottom w:val="single" w:sz="4" w:space="0" w:color="D9E2EC"/>
-              <w:right w:val="none"/>
-            </w:tcBorders>
-          </w:tcPr>
-          <w:p>
-            <w:pPr>
-              <w:jc w:val="center"/>
-            </w:pPr>
-            <w:r>
-              <w:rPr>
-                <w:rFonts w:ascii="Arial" w:hAnsi="Arial"/>
-                <w:color w:val="243B53"/>
-                <w:sz w:val="15"/>
-              </w:rPr>
-              <w:t>Rp 3.500</w:t>
-            </w:r>
-          </w:p>
-        </w:tc>
-        <w:tc>
-          <w:tcPr>
-            <w:tcW w:type="dxa" w:w="1587"/>
-            <w:shd w:val="clear" w:color="auto" w:fill="FFFFFF"/>
-            <w:tcMar>
-              <w:top w:w="28" w:type="dxa"/>
-              <w:bottom w:w="28" w:type="dxa"/>
-              <w:left w:w="50" w:type="dxa"/>
-              <w:right w:w="50" w:type="dxa"/>
-            </w:tcMar>
-            <w:tcBorders>
-              <w:top w:val="none"/>
-              <w:left w:val="none"/>
-              <w:bottom w:val="single" w:sz="4" w:space="0" w:color="D9E2EC"/>
-              <w:right w:val="none"/>
-            </w:tcBorders>
-          </w:tcPr>
-          <w:p>
-            <w:pPr>
-              <w:jc w:val="right"/>
-            </w:pPr>
-            <w:r>
-              <w:rPr>
-                <w:rFonts w:ascii="Arial" w:hAnsi="Arial"/>
-                <w:b/>
-                <w:color w:val="166534"/>
-                <w:sz w:val="15"/>
-              </w:rPr>
-              <w:t>Rp 1.500 (42,8%)</w:t>
-            </w:r>
-          </w:p>
-        </w:tc>
-      </w:tr>
-      <w:tr>
-        <w:trPr>
-          <w:cantSplit/>
-        </w:trPr>
-        <w:tc>
-          <w:tcPr>
-            <w:tcW w:type="dxa" w:w="2438"/>
-            <w:shd w:val="clear" w:color="auto" w:fill="F0F4F8"/>
-            <w:tcMar>
-              <w:top w:w="28" w:type="dxa"/>
-              <w:bottom w:w="28" w:type="dxa"/>
-              <w:left w:w="50" w:type="dxa"/>
-              <w:right w:w="50" w:type="dxa"/>
-            </w:tcMar>
-            <w:tcBorders>
-              <w:top w:val="none"/>
-              <w:left w:val="none"/>
-              <w:bottom w:val="single" w:sz="4" w:space="0" w:color="D9E2EC"/>
-              <w:right w:val="none"/>
-            </w:tcBorders>
-          </w:tcPr>
-          <w:p>
-            <w:pPr>
-              <w:jc w:val="left"/>
-            </w:pPr>
-            <w:r>
-              <w:rPr>
-                <w:rFonts w:ascii="Arial" w:hAnsi="Arial"/>
-                <w:b/>
-                <w:color w:val="243B53"/>
-                <w:sz w:val="15"/>
-              </w:rPr>
-              <w:t>Nasi Bakar Daun Pisang Kemangi</w:t>
-            </w:r>
-          </w:p>
-        </w:tc>
-        <w:tc>
-          <w:tcPr>
-            <w:tcW w:type="dxa" w:w="3175"/>
-            <w:shd w:val="clear" w:color="auto" w:fill="F0F4F8"/>
-            <w:tcMar>
-              <w:top w:w="28" w:type="dxa"/>
-              <w:bottom w:w="28" w:type="dxa"/>
-              <w:left w:w="50" w:type="dxa"/>
-              <w:right w:w="50" w:type="dxa"/>
-            </w:tcMar>
-            <w:tcBorders>
-              <w:top w:val="none"/>
-              <w:left w:val="none"/>
-              <w:bottom w:val="single" w:sz="4" w:space="0" w:color="D9E2EC"/>
-              <w:right w:val="none"/>
-            </w:tcBorders>
-          </w:tcPr>
-          <w:p>
-            <w:pPr>
-              <w:jc w:val="left"/>
-            </w:pPr>
-            <w:r>
-              <w:rPr>
-                <w:rFonts w:ascii="Arial" w:hAnsi="Arial"/>
-                <w:color w:val="243B53"/>
-                <w:sz w:val="15"/>
-              </w:rPr>
-              <w:t>Nasi gurih pandan daun pisang, suwir ayam pedas kemangi</w:t>
-            </w:r>
-          </w:p>
-        </w:tc>
-        <w:tc>
-          <w:tcPr>
-            <w:tcW w:type="dxa" w:w="1247"/>
-            <w:shd w:val="clear" w:color="auto" w:fill="F0F4F8"/>
-            <w:tcMar>
-              <w:top w:w="28" w:type="dxa"/>
-              <w:bottom w:w="28" w:type="dxa"/>
-              <w:left w:w="50" w:type="dxa"/>
-              <w:right w:w="50" w:type="dxa"/>
-            </w:tcMar>
-            <w:tcBorders>
-              <w:top w:val="none"/>
-              <w:left w:val="none"/>
-              <w:bottom w:val="single" w:sz="4" w:space="0" w:color="D9E2EC"/>
-              <w:right w:val="none"/>
-            </w:tcBorders>
-          </w:tcPr>
-          <w:p>
-            <w:pPr>
-              <w:jc w:val="center"/>
-            </w:pPr>
-            <w:r>
-              <w:rPr>
-                <w:rFonts w:ascii="Arial" w:hAnsi="Arial"/>
-                <w:color w:val="243B53"/>
-                <w:sz w:val="15"/>
-              </w:rPr>
-              <w:t>Rp 3.800</w:t>
-            </w:r>
-          </w:p>
-        </w:tc>
-        <w:tc>
-          <w:tcPr>
-            <w:tcW w:type="dxa" w:w="1247"/>
-            <w:shd w:val="clear" w:color="auto" w:fill="F0F4F8"/>
-            <w:tcMar>
-              <w:top w:w="28" w:type="dxa"/>
-              <w:bottom w:w="28" w:type="dxa"/>
-              <w:left w:w="50" w:type="dxa"/>
-              <w:right w:w="50" w:type="dxa"/>
-            </w:tcMar>
-            <w:tcBorders>
-              <w:top w:val="none"/>
-              <w:left w:val="none"/>
-              <w:bottom w:val="single" w:sz="4" w:space="0" w:color="D9E2EC"/>
-              <w:right w:val="none"/>
-            </w:tcBorders>
-          </w:tcPr>
-          <w:p>
-            <w:pPr>
-              <w:jc w:val="center"/>
-            </w:pPr>
-            <w:r>
-              <w:rPr>
-                <w:rFonts w:ascii="Arial" w:hAnsi="Arial"/>
-                <w:color w:val="243B53"/>
-                <w:sz w:val="15"/>
-              </w:rPr>
-              <w:t>Rp 7.000</w:t>
-            </w:r>
-          </w:p>
-        </w:tc>
-        <w:tc>
-          <w:tcPr>
-            <w:tcW w:type="dxa" w:w="1587"/>
-            <w:shd w:val="clear" w:color="auto" w:fill="F0F4F8"/>
-            <w:tcMar>
-              <w:top w:w="28" w:type="dxa"/>
-              <w:bottom w:w="28" w:type="dxa"/>
-              <w:left w:w="50" w:type="dxa"/>
-              <w:right w:w="50" w:type="dxa"/>
-            </w:tcMar>
-            <w:tcBorders>
-              <w:top w:val="none"/>
-              <w:left w:val="none"/>
-              <w:bottom w:val="single" w:sz="4" w:space="0" w:color="D9E2EC"/>
-              <w:right w:val="none"/>
-            </w:tcBorders>
-          </w:tcPr>
-          <w:p>
-            <w:pPr>
-              <w:jc w:val="right"/>
-            </w:pPr>
-            <w:r>
-              <w:rPr>
-                <w:rFonts w:ascii="Arial" w:hAnsi="Arial"/>
-                <w:b/>
-                <w:color w:val="166534"/>
-                <w:sz w:val="15"/>
-              </w:rPr>
-              <w:t>Rp 3.200 (45,7%)</w:t>
-            </w:r>
-          </w:p>
-        </w:tc>
-      </w:tr>
-      <w:tr>
-        <w:trPr>
-          <w:cantSplit/>
-        </w:trPr>
-        <w:tc>
-          <w:tcPr>
-            <w:tcW w:type="dxa" w:w="2438"/>
-            <w:shd w:val="clear" w:color="auto" w:fill="FFFFFF"/>
-            <w:tcMar>
-              <w:top w:w="28" w:type="dxa"/>
-              <w:bottom w:w="28" w:type="dxa"/>
-              <w:left w:w="50" w:type="dxa"/>
-              <w:right w:w="50" w:type="dxa"/>
-            </w:tcMar>
-            <w:tcBorders>
-              <w:top w:val="none"/>
-              <w:left w:val="none"/>
-              <w:bottom w:val="single" w:sz="4" w:space="0" w:color="D9E2EC"/>
-              <w:right w:val="none"/>
-            </w:tcBorders>
-          </w:tcPr>
-          <w:p>
-            <w:pPr>
-              <w:jc w:val="left"/>
-            </w:pPr>
-            <w:r>
-              <w:rPr>
-                <w:rFonts w:ascii="Arial" w:hAnsi="Arial"/>
-                <w:b/>
-                <w:color w:val="243B53"/>
-                <w:sz w:val="15"/>
-              </w:rPr>
-              <w:t>Nasi Kucing Teri / Tongkol Orek</w:t>
-            </w:r>
-          </w:p>
-        </w:tc>
-        <w:tc>
-          <w:tcPr>
-            <w:tcW w:type="dxa" w:w="3175"/>
-            <w:shd w:val="clear" w:color="auto" w:fill="FFFFFF"/>
-            <w:tcMar>
-              <w:top w:w="28" w:type="dxa"/>
-              <w:bottom w:w="28" w:type="dxa"/>
-              <w:left w:w="50" w:type="dxa"/>
-              <w:right w:w="50" w:type="dxa"/>
-            </w:tcMar>
-            <w:tcBorders>
-              <w:top w:val="none"/>
-              <w:left w:val="none"/>
-              <w:bottom w:val="single" w:sz="4" w:space="0" w:color="D9E2EC"/>
-              <w:right w:val="none"/>
-            </w:tcBorders>
-          </w:tcPr>
-          <w:p>
-            <w:pPr>
-              <w:jc w:val="left"/>
-            </w:pPr>
-            <w:r>
-              <w:rPr>
-                <w:rFonts w:ascii="Arial" w:hAnsi="Arial"/>
-                <w:color w:val="243B53"/>
-                <w:sz w:val="15"/>
-              </w:rPr>
-              <w:t>Nasi pulen sambal tongkol balado / orek tempe gurih</w:t>
-            </w:r>
-          </w:p>
-        </w:tc>
-        <w:tc>
-          <w:tcPr>
-            <w:tcW w:type="dxa" w:w="1247"/>
-            <w:shd w:val="clear" w:color="auto" w:fill="FFFFFF"/>
-            <w:tcMar>
-              <w:top w:w="28" w:type="dxa"/>
-              <w:bottom w:w="28" w:type="dxa"/>
-              <w:left w:w="50" w:type="dxa"/>
-              <w:right w:w="50" w:type="dxa"/>
-            </w:tcMar>
-            <w:tcBorders>
-              <w:top w:val="none"/>
-              <w:left w:val="none"/>
-              <w:bottom w:val="single" w:sz="4" w:space="0" w:color="D9E2EC"/>
-              <w:right w:val="none"/>
-            </w:tcBorders>
-          </w:tcPr>
-          <w:p>
-            <w:pPr>
-              <w:jc w:val="center"/>
-            </w:pPr>
-            <w:r>
-              <w:rPr>
-                <w:rFonts w:ascii="Arial" w:hAnsi="Arial"/>
-                <w:color w:val="243B53"/>
-                <w:sz w:val="15"/>
-              </w:rPr>
-              <w:t>Rp 1.600</w:t>
-            </w:r>
-          </w:p>
-        </w:tc>
-        <w:tc>
-          <w:tcPr>
-            <w:tcW w:type="dxa" w:w="1247"/>
-            <w:shd w:val="clear" w:color="auto" w:fill="FFFFFF"/>
-            <w:tcMar>
-              <w:top w:w="28" w:type="dxa"/>
-              <w:bottom w:w="28" w:type="dxa"/>
-              <w:left w:w="50" w:type="dxa"/>
-              <w:right w:w="50" w:type="dxa"/>
-            </w:tcMar>
-            <w:tcBorders>
-              <w:top w:val="none"/>
-              <w:left w:val="none"/>
-              <w:bottom w:val="single" w:sz="4" w:space="0" w:color="D9E2EC"/>
-              <w:right w:val="none"/>
-            </w:tcBorders>
-          </w:tcPr>
-          <w:p>
-            <w:pPr>
-              <w:jc w:val="center"/>
-            </w:pPr>
-            <w:r>
-              <w:rPr>
-                <w:rFonts w:ascii="Arial" w:hAnsi="Arial"/>
-                <w:color w:val="243B53"/>
-                <w:sz w:val="15"/>
-              </w:rPr>
-              <w:t>Rp 3.000</w:t>
-            </w:r>
-          </w:p>
-        </w:tc>
-        <w:tc>
-          <w:tcPr>
-            <w:tcW w:type="dxa" w:w="1587"/>
-            <w:shd w:val="clear" w:color="auto" w:fill="FFFFFF"/>
-            <w:tcMar>
-              <w:top w:w="28" w:type="dxa"/>
-              <w:bottom w:w="28" w:type="dxa"/>
-              <w:left w:w="50" w:type="dxa"/>
-              <w:right w:w="50" w:type="dxa"/>
-            </w:tcMar>
-            <w:tcBorders>
-              <w:top w:val="none"/>
-              <w:left w:val="none"/>
-              <w:bottom w:val="single" w:sz="4" w:space="0" w:color="D9E2EC"/>
-              <w:right w:val="none"/>
-            </w:tcBorders>
-          </w:tcPr>
-          <w:p>
-            <w:pPr>
-              <w:jc w:val="right"/>
-            </w:pPr>
-            <w:r>
-              <w:rPr>
-                <w:rFonts w:ascii="Arial" w:hAnsi="Arial"/>
-                <w:b/>
-                <w:color w:val="166534"/>
-                <w:sz w:val="15"/>
-              </w:rPr>
-              <w:t>Rp 1.400 (46,7%)</w:t>
-            </w:r>
-          </w:p>
-        </w:tc>
-      </w:tr>
-      <w:tr>
-        <w:trPr>
-          <w:cantSplit/>
-        </w:trPr>
-        <w:tc>
-          <w:tcPr>
-            <w:tcW w:type="dxa" w:w="2438"/>
-            <w:shd w:val="clear" w:color="auto" w:fill="F0F4F8"/>
-            <w:tcMar>
-              <w:top w:w="28" w:type="dxa"/>
-              <w:bottom w:w="28" w:type="dxa"/>
-              <w:left w:w="50" w:type="dxa"/>
-              <w:right w:w="50" w:type="dxa"/>
-            </w:tcMar>
-            <w:tcBorders>
-              <w:top w:val="none"/>
-              <w:left w:val="none"/>
-              <w:bottom w:val="single" w:sz="4" w:space="0" w:color="D9E2EC"/>
-              <w:right w:val="none"/>
-            </w:tcBorders>
-          </w:tcPr>
-          <w:p>
-            <w:pPr>
-              <w:jc w:val="left"/>
-            </w:pPr>
-            <w:r>
-              <w:rPr>
-                <w:rFonts w:ascii="Arial" w:hAnsi="Arial"/>
-                <w:b/>
-                <w:color w:val="243B53"/>
-                <w:sz w:val="15"/>
-              </w:rPr>
-              <w:t>Tempe Mendoan Hangat (3 Lembar)</w:t>
-            </w:r>
-          </w:p>
-        </w:tc>
-        <w:tc>
-          <w:tcPr>
-            <w:tcW w:type="dxa" w:w="3175"/>
-            <w:shd w:val="clear" w:color="auto" w:fill="F0F4F8"/>
-            <w:tcMar>
-              <w:top w:w="28" w:type="dxa"/>
-              <w:bottom w:w="28" w:type="dxa"/>
-              <w:left w:w="50" w:type="dxa"/>
-              <w:right w:w="50" w:type="dxa"/>
-            </w:tcMar>
-            <w:tcBorders>
-              <w:top w:val="none"/>
-              <w:left w:val="none"/>
-              <w:bottom w:val="single" w:sz="4" w:space="0" w:color="D9E2EC"/>
-              <w:right w:val="none"/>
-            </w:tcBorders>
-          </w:tcPr>
-          <w:p>
-            <w:pPr>
-              <w:jc w:val="left"/>
-            </w:pPr>
-            <w:r>
-              <w:rPr>
-                <w:rFonts w:ascii="Arial" w:hAnsi="Arial"/>
-                <w:color w:val="243B53"/>
-                <w:sz w:val="15"/>
-              </w:rPr>
-              <w:t>Tempe mendoan kedelai lokal, tepung daun bawang, kecap rawit</w:t>
-            </w:r>
-          </w:p>
-        </w:tc>
-        <w:tc>
-          <w:tcPr>
-            <w:tcW w:type="dxa" w:w="1247"/>
-            <w:shd w:val="clear" w:color="auto" w:fill="F0F4F8"/>
-            <w:tcMar>
-              <w:top w:w="28" w:type="dxa"/>
-              <w:bottom w:w="28" w:type="dxa"/>
-              <w:left w:w="50" w:type="dxa"/>
-              <w:right w:w="50" w:type="dxa"/>
-            </w:tcMar>
-            <w:tcBorders>
-              <w:top w:val="none"/>
-              <w:left w:val="none"/>
-              <w:bottom w:val="single" w:sz="4" w:space="0" w:color="D9E2EC"/>
-              <w:right w:val="none"/>
-            </w:tcBorders>
-          </w:tcPr>
-          <w:p>
-            <w:pPr>
-              <w:jc w:val="center"/>
-            </w:pPr>
-            <w:r>
-              <w:rPr>
-                <w:rFonts w:ascii="Arial" w:hAnsi="Arial"/>
-                <w:color w:val="243B53"/>
-                <w:sz w:val="15"/>
-              </w:rPr>
-              <w:t>Rp 2.500</w:t>
-            </w:r>
-          </w:p>
-        </w:tc>
-        <w:tc>
-          <w:tcPr>
-            <w:tcW w:type="dxa" w:w="1247"/>
-            <w:shd w:val="clear" w:color="auto" w:fill="F0F4F8"/>
-            <w:tcMar>
-              <w:top w:w="28" w:type="dxa"/>
-              <w:bottom w:w="28" w:type="dxa"/>
-              <w:left w:w="50" w:type="dxa"/>
-              <w:right w:w="50" w:type="dxa"/>
-            </w:tcMar>
-            <w:tcBorders>
-              <w:top w:val="none"/>
-              <w:left w:val="none"/>
-              <w:bottom w:val="single" w:sz="4" w:space="0" w:color="D9E2EC"/>
-              <w:right w:val="none"/>
-            </w:tcBorders>
-          </w:tcPr>
-          <w:p>
-            <w:pPr>
-              <w:jc w:val="center"/>
-            </w:pPr>
-            <w:r>
-              <w:rPr>
-                <w:rFonts w:ascii="Arial" w:hAnsi="Arial"/>
-                <w:color w:val="243B53"/>
-                <w:sz w:val="15"/>
-              </w:rPr>
-              <w:t>Rp 5.000</w:t>
-            </w:r>
-          </w:p>
-        </w:tc>
-        <w:tc>
-          <w:tcPr>
-            <w:tcW w:type="dxa" w:w="1587"/>
-            <w:shd w:val="clear" w:color="auto" w:fill="F0F4F8"/>
-            <w:tcMar>
-              <w:top w:w="28" w:type="dxa"/>
-              <w:bottom w:w="28" w:type="dxa"/>
-              <w:left w:w="50" w:type="dxa"/>
-              <w:right w:w="50" w:type="dxa"/>
-            </w:tcMar>
-            <w:tcBorders>
-              <w:top w:val="none"/>
-              <w:left w:val="none"/>
-              <w:bottom w:val="single" w:sz="4" w:space="0" w:color="D9E2EC"/>
-              <w:right w:val="none"/>
-            </w:tcBorders>
-          </w:tcPr>
-          <w:p>
-            <w:pPr>
-              <w:jc w:val="right"/>
-            </w:pPr>
-            <w:r>
-              <w:rPr>
-                <w:rFonts w:ascii="Arial" w:hAnsi="Arial"/>
-                <w:b/>
-                <w:color w:val="166534"/>
-                <w:sz w:val="15"/>
-              </w:rPr>
-              <w:t>Rp 2.500 (50,0%)</w:t>
-            </w:r>
-          </w:p>
-        </w:tc>
-      </w:tr>
-      <w:tr>
-        <w:trPr>
-          <w:cantSplit/>
-        </w:trPr>
-        <w:tc>
-          <w:tcPr>
-            <w:tcW w:type="dxa" w:w="2438"/>
-            <w:shd w:val="clear" w:color="auto" w:fill="FFFFFF"/>
-            <w:tcMar>
-              <w:top w:w="28" w:type="dxa"/>
-              <w:bottom w:w="28" w:type="dxa"/>
-              <w:left w:w="50" w:type="dxa"/>
-              <w:right w:w="50" w:type="dxa"/>
-            </w:tcMar>
-            <w:tcBorders>
-              <w:top w:val="none"/>
-              <w:left w:val="none"/>
-              <w:bottom w:val="single" w:sz="4" w:space="0" w:color="D9E2EC"/>
-              <w:right w:val="none"/>
-            </w:tcBorders>
-          </w:tcPr>
-          <w:p>
-            <w:pPr>
-              <w:jc w:val="left"/>
-            </w:pPr>
-            <w:r>
-              <w:rPr>
-                <w:rFonts w:ascii="Arial" w:hAnsi="Arial"/>
-                <w:b/>
-                <w:color w:val="243B53"/>
-                <w:sz w:val="15"/>
-              </w:rPr>
-              <w:t>Kopi Tubruk Robusta Khas Banten</w:t>
-            </w:r>
-          </w:p>
-        </w:tc>
-        <w:tc>
-          <w:tcPr>
-            <w:tcW w:type="dxa" w:w="3175"/>
-            <w:shd w:val="clear" w:color="auto" w:fill="FFFFFF"/>
-            <w:tcMar>
-              <w:top w:w="28" w:type="dxa"/>
-              <w:bottom w:w="28" w:type="dxa"/>
-              <w:left w:w="50" w:type="dxa"/>
-              <w:right w:w="50" w:type="dxa"/>
-            </w:tcMar>
-            <w:tcBorders>
-              <w:top w:val="none"/>
-              <w:left w:val="none"/>
-              <w:bottom w:val="single" w:sz="4" w:space="0" w:color="D9E2EC"/>
-              <w:right w:val="none"/>
-            </w:tcBorders>
-          </w:tcPr>
-          <w:p>
-            <w:pPr>
-              <w:jc w:val="left"/>
-            </w:pPr>
-            <w:r>
-              <w:rPr>
-                <w:rFonts w:ascii="Arial" w:hAnsi="Arial"/>
-                <w:color w:val="243B53"/>
-                <w:sz w:val="15"/>
-              </w:rPr>
-              <w:t>Bubuk kopi Robusta lokal sangrai siap seduh, gula pasir/aren</w:t>
-            </w:r>
-          </w:p>
-        </w:tc>
-        <w:tc>
-          <w:tcPr>
-            <w:tcW w:type="dxa" w:w="1247"/>
-            <w:shd w:val="clear" w:color="auto" w:fill="FFFFFF"/>
-            <w:tcMar>
-              <w:top w:w="28" w:type="dxa"/>
-              <w:bottom w:w="28" w:type="dxa"/>
-              <w:left w:w="50" w:type="dxa"/>
-              <w:right w:w="50" w:type="dxa"/>
-            </w:tcMar>
-            <w:tcBorders>
-              <w:top w:val="none"/>
-              <w:left w:val="none"/>
-              <w:bottom w:val="single" w:sz="4" w:space="0" w:color="D9E2EC"/>
-              <w:right w:val="none"/>
-            </w:tcBorders>
-          </w:tcPr>
-          <w:p>
-            <w:pPr>
-              <w:jc w:val="center"/>
-            </w:pPr>
-            <w:r>
-              <w:rPr>
-                <w:rFonts w:ascii="Arial" w:hAnsi="Arial"/>
-                <w:color w:val="243B53"/>
-                <w:sz w:val="15"/>
-              </w:rPr>
-              <w:t>Rp 1.400</w:t>
-            </w:r>
-          </w:p>
-        </w:tc>
-        <w:tc>
-          <w:tcPr>
-            <w:tcW w:type="dxa" w:w="1247"/>
-            <w:shd w:val="clear" w:color="auto" w:fill="FFFFFF"/>
-            <w:tcMar>
-              <w:top w:w="28" w:type="dxa"/>
-              <w:bottom w:w="28" w:type="dxa"/>
-              <w:left w:w="50" w:type="dxa"/>
-              <w:right w:w="50" w:type="dxa"/>
-            </w:tcMar>
-            <w:tcBorders>
-              <w:top w:val="none"/>
-              <w:left w:val="none"/>
-              <w:bottom w:val="single" w:sz="4" w:space="0" w:color="D9E2EC"/>
-              <w:right w:val="none"/>
-            </w:tcBorders>
-          </w:tcPr>
-          <w:p>
-            <w:pPr>
-              <w:jc w:val="center"/>
-            </w:pPr>
-            <w:r>
-              <w:rPr>
-                <w:rFonts w:ascii="Arial" w:hAnsi="Arial"/>
-                <w:color w:val="243B53"/>
-                <w:sz w:val="15"/>
-              </w:rPr>
-              <w:t>Rp 4.000</w:t>
-            </w:r>
-          </w:p>
-        </w:tc>
-        <w:tc>
-          <w:tcPr>
-            <w:tcW w:type="dxa" w:w="1587"/>
-            <w:shd w:val="clear" w:color="auto" w:fill="FFFFFF"/>
-            <w:tcMar>
-              <w:top w:w="28" w:type="dxa"/>
-              <w:bottom w:w="28" w:type="dxa"/>
-              <w:left w:w="50" w:type="dxa"/>
-              <w:right w:w="50" w:type="dxa"/>
-            </w:tcMar>
-            <w:tcBorders>
-              <w:top w:val="none"/>
-              <w:left w:val="none"/>
-              <w:bottom w:val="single" w:sz="4" w:space="0" w:color="D9E2EC"/>
-              <w:right w:val="none"/>
-            </w:tcBorders>
-          </w:tcPr>
-          <w:p>
-            <w:pPr>
-              <w:jc w:val="right"/>
-            </w:pPr>
-            <w:r>
-              <w:rPr>
-                <w:rFonts w:ascii="Arial" w:hAnsi="Arial"/>
-                <w:b/>
-                <w:color w:val="166534"/>
-                <w:sz w:val="15"/>
-              </w:rPr>
-              <w:t>Rp 2.600 (65,0%)</w:t>
-            </w:r>
-          </w:p>
-        </w:tc>
-      </w:tr>
-      <w:tr>
-        <w:trPr>
-          <w:cantSplit/>
-        </w:trPr>
-        <w:tc>
-          <w:tcPr>
-            <w:tcW w:type="dxa" w:w="2438"/>
-            <w:shd w:val="clear" w:color="auto" w:fill="F0F4F8"/>
-            <w:tcMar>
-              <w:top w:w="28" w:type="dxa"/>
-              <w:bottom w:w="28" w:type="dxa"/>
-              <w:left w:w="50" w:type="dxa"/>
-              <w:right w:w="50" w:type="dxa"/>
-            </w:tcMar>
-            <w:tcBorders>
-              <w:top w:val="none"/>
-              <w:left w:val="none"/>
-              <w:bottom w:val="single" w:sz="4" w:space="0" w:color="D9E2EC"/>
-              <w:right w:val="none"/>
-            </w:tcBorders>
-          </w:tcPr>
-          <w:p>
-            <w:pPr>
-              <w:jc w:val="left"/>
-            </w:pPr>
-            <w:r>
-              <w:rPr>
-                <w:rFonts w:ascii="Arial" w:hAnsi="Arial"/>
-                <w:b/>
-                <w:color w:val="243B53"/>
-                <w:sz w:val="15"/>
-              </w:rPr>
-              <w:t>Kopi Sachet Populer Siap Seduh</w:t>
-            </w:r>
-          </w:p>
-        </w:tc>
-        <w:tc>
-          <w:tcPr>
-            <w:tcW w:type="dxa" w:w="3175"/>
-            <w:shd w:val="clear" w:color="auto" w:fill="F0F4F8"/>
-            <w:tcMar>
-              <w:top w:w="28" w:type="dxa"/>
-              <w:bottom w:w="28" w:type="dxa"/>
-              <w:left w:w="50" w:type="dxa"/>
-              <w:right w:w="50" w:type="dxa"/>
-            </w:tcMar>
-            <w:tcBorders>
-              <w:top w:val="none"/>
-              <w:left w:val="none"/>
-              <w:bottom w:val="single" w:sz="4" w:space="0" w:color="D9E2EC"/>
-              <w:right w:val="none"/>
-            </w:tcBorders>
-          </w:tcPr>
-          <w:p>
-            <w:pPr>
-              <w:jc w:val="left"/>
-            </w:pPr>
-            <w:r>
-              <w:rPr>
-                <w:rFonts w:ascii="Arial" w:hAnsi="Arial"/>
-                <w:color w:val="243B53"/>
-                <w:sz w:val="15"/>
-              </w:rPr>
-              <w:t>Good Day / Kapal Api / Indocafe / Luwak White Koffie</w:t>
+              <w:t>Sosis sapi/ayam olahan, oles mentega, saus BBQ bakar arang</w:t>
             </w:r>
           </w:p>
         </w:tc>
@@ -4399,7 +3103,7 @@
                 <w:color w:val="243B53"/>
                 <w:sz w:val="15"/>
               </w:rPr>
-              <w:t>Es / Hangat Minuman Sachet Segar</w:t>
+              <w:t>Bakso Sapi Bakar Arang (4 Butir)</w:t>
             </w:r>
           </w:p>
         </w:tc>
@@ -4430,7 +3134,7 @@
                 <w:color w:val="243B53"/>
                 <w:sz w:val="15"/>
               </w:rPr>
-              <w:t>Nutrisari Jeruk / Extra Joss Susu / Kuku Bima Susu</w:t>
+              <w:t>Bakso sapi olahan kenyal, bumbu kecap lada hitam bakar arang</w:t>
             </w:r>
           </w:p>
         </w:tc>
@@ -4461,7 +3165,979 @@
                 <w:color w:val="243B53"/>
                 <w:sz w:val="15"/>
               </w:rPr>
+              <w:t>Rp 1.600</w:t>
+            </w:r>
+          </w:p>
+        </w:tc>
+        <w:tc>
+          <w:tcPr>
+            <w:tcW w:type="dxa" w:w="1247"/>
+            <w:shd w:val="clear" w:color="auto" w:fill="FFFFFF"/>
+            <w:tcMar>
+              <w:top w:w="28" w:type="dxa"/>
+              <w:bottom w:w="28" w:type="dxa"/>
+              <w:left w:w="50" w:type="dxa"/>
+              <w:right w:w="50" w:type="dxa"/>
+            </w:tcMar>
+            <w:tcBorders>
+              <w:top w:val="none"/>
+              <w:left w:val="none"/>
+              <w:bottom w:val="single" w:sz="4" w:space="0" w:color="D9E2EC"/>
+              <w:right w:val="none"/>
+            </w:tcBorders>
+          </w:tcPr>
+          <w:p>
+            <w:pPr>
+              <w:jc w:val="center"/>
+            </w:pPr>
+            <w:r>
+              <w:rPr>
+                <w:rFonts w:ascii="Arial" w:hAnsi="Arial"/>
+                <w:color w:val="243B53"/>
+                <w:sz w:val="15"/>
+              </w:rPr>
+              <w:t>Rp 3.500</w:t>
+            </w:r>
+          </w:p>
+        </w:tc>
+        <w:tc>
+          <w:tcPr>
+            <w:tcW w:type="dxa" w:w="1587"/>
+            <w:shd w:val="clear" w:color="auto" w:fill="FFFFFF"/>
+            <w:tcMar>
+              <w:top w:w="28" w:type="dxa"/>
+              <w:bottom w:w="28" w:type="dxa"/>
+              <w:left w:w="50" w:type="dxa"/>
+              <w:right w:w="50" w:type="dxa"/>
+            </w:tcMar>
+            <w:tcBorders>
+              <w:top w:val="none"/>
+              <w:left w:val="none"/>
+              <w:bottom w:val="single" w:sz="4" w:space="0" w:color="D9E2EC"/>
+              <w:right w:val="none"/>
+            </w:tcBorders>
+          </w:tcPr>
+          <w:p>
+            <w:pPr>
+              <w:jc w:val="right"/>
+            </w:pPr>
+            <w:r>
+              <w:rPr>
+                <w:rFonts w:ascii="Arial" w:hAnsi="Arial"/>
+                <w:b/>
+                <w:color w:val="166534"/>
+                <w:sz w:val="15"/>
+              </w:rPr>
+              <w:t>Rp 1.900 (54,2%)</w:t>
+            </w:r>
+          </w:p>
+        </w:tc>
+      </w:tr>
+      <w:tr>
+        <w:trPr>
+          <w:cantSplit/>
+        </w:trPr>
+        <w:tc>
+          <w:tcPr>
+            <w:tcW w:type="dxa" w:w="2438"/>
+            <w:shd w:val="clear" w:color="auto" w:fill="F0F4F8"/>
+            <w:tcMar>
+              <w:top w:w="28" w:type="dxa"/>
+              <w:bottom w:w="28" w:type="dxa"/>
+              <w:left w:w="50" w:type="dxa"/>
+              <w:right w:w="50" w:type="dxa"/>
+            </w:tcMar>
+            <w:tcBorders>
+              <w:top w:val="none"/>
+              <w:left w:val="none"/>
+              <w:bottom w:val="single" w:sz="4" w:space="0" w:color="D9E2EC"/>
+              <w:right w:val="none"/>
+            </w:tcBorders>
+          </w:tcPr>
+          <w:p>
+            <w:pPr>
+              <w:jc w:val="left"/>
+            </w:pPr>
+            <w:r>
+              <w:rPr>
+                <w:rFonts w:ascii="Arial" w:hAnsi="Arial"/>
+                <w:b/>
+                <w:color w:val="243B53"/>
+                <w:sz w:val="15"/>
+              </w:rPr>
+              <w:t>Dumpling Ayam / Keju Lumer (3 Pcs)</w:t>
+            </w:r>
+          </w:p>
+        </w:tc>
+        <w:tc>
+          <w:tcPr>
+            <w:tcW w:type="dxa" w:w="3175"/>
+            <w:shd w:val="clear" w:color="auto" w:fill="F0F4F8"/>
+            <w:tcMar>
+              <w:top w:w="28" w:type="dxa"/>
+              <w:bottom w:w="28" w:type="dxa"/>
+              <w:left w:w="50" w:type="dxa"/>
+              <w:right w:w="50" w:type="dxa"/>
+            </w:tcMar>
+            <w:tcBorders>
+              <w:top w:val="none"/>
+              <w:left w:val="none"/>
+              <w:bottom w:val="single" w:sz="4" w:space="0" w:color="D9E2EC"/>
+              <w:right w:val="none"/>
+            </w:tcBorders>
+          </w:tcPr>
+          <w:p>
+            <w:pPr>
+              <w:jc w:val="left"/>
+            </w:pPr>
+            <w:r>
+              <w:rPr>
+                <w:rFonts w:ascii="Arial" w:hAnsi="Arial"/>
+                <w:color w:val="243B53"/>
+                <w:sz w:val="15"/>
+              </w:rPr>
+              <w:t>Dumpling beku olahan isi ayam/keju lumer bakar arang batok</w:t>
+            </w:r>
+          </w:p>
+        </w:tc>
+        <w:tc>
+          <w:tcPr>
+            <w:tcW w:type="dxa" w:w="1247"/>
+            <w:shd w:val="clear" w:color="auto" w:fill="F0F4F8"/>
+            <w:tcMar>
+              <w:top w:w="28" w:type="dxa"/>
+              <w:bottom w:w="28" w:type="dxa"/>
+              <w:left w:w="50" w:type="dxa"/>
+              <w:right w:w="50" w:type="dxa"/>
+            </w:tcMar>
+            <w:tcBorders>
+              <w:top w:val="none"/>
+              <w:left w:val="none"/>
+              <w:bottom w:val="single" w:sz="4" w:space="0" w:color="D9E2EC"/>
+              <w:right w:val="none"/>
+            </w:tcBorders>
+          </w:tcPr>
+          <w:p>
+            <w:pPr>
+              <w:jc w:val="center"/>
+            </w:pPr>
+            <w:r>
+              <w:rPr>
+                <w:rFonts w:ascii="Arial" w:hAnsi="Arial"/>
+                <w:color w:val="243B53"/>
+                <w:sz w:val="15"/>
+              </w:rPr>
               <w:t>Rp 2.200</w:t>
+            </w:r>
+          </w:p>
+        </w:tc>
+        <w:tc>
+          <w:tcPr>
+            <w:tcW w:type="dxa" w:w="1247"/>
+            <w:shd w:val="clear" w:color="auto" w:fill="F0F4F8"/>
+            <w:tcMar>
+              <w:top w:w="28" w:type="dxa"/>
+              <w:bottom w:w="28" w:type="dxa"/>
+              <w:left w:w="50" w:type="dxa"/>
+              <w:right w:w="50" w:type="dxa"/>
+            </w:tcMar>
+            <w:tcBorders>
+              <w:top w:val="none"/>
+              <w:left w:val="none"/>
+              <w:bottom w:val="single" w:sz="4" w:space="0" w:color="D9E2EC"/>
+              <w:right w:val="none"/>
+            </w:tcBorders>
+          </w:tcPr>
+          <w:p>
+            <w:pPr>
+              <w:jc w:val="center"/>
+            </w:pPr>
+            <w:r>
+              <w:rPr>
+                <w:rFonts w:ascii="Arial" w:hAnsi="Arial"/>
+                <w:color w:val="243B53"/>
+                <w:sz w:val="15"/>
+              </w:rPr>
+              <w:t>Rp 5.000</w:t>
+            </w:r>
+          </w:p>
+        </w:tc>
+        <w:tc>
+          <w:tcPr>
+            <w:tcW w:type="dxa" w:w="1587"/>
+            <w:shd w:val="clear" w:color="auto" w:fill="F0F4F8"/>
+            <w:tcMar>
+              <w:top w:w="28" w:type="dxa"/>
+              <w:bottom w:w="28" w:type="dxa"/>
+              <w:left w:w="50" w:type="dxa"/>
+              <w:right w:w="50" w:type="dxa"/>
+            </w:tcMar>
+            <w:tcBorders>
+              <w:top w:val="none"/>
+              <w:left w:val="none"/>
+              <w:bottom w:val="single" w:sz="4" w:space="0" w:color="D9E2EC"/>
+              <w:right w:val="none"/>
+            </w:tcBorders>
+          </w:tcPr>
+          <w:p>
+            <w:pPr>
+              <w:jc w:val="right"/>
+            </w:pPr>
+            <w:r>
+              <w:rPr>
+                <w:rFonts w:ascii="Arial" w:hAnsi="Arial"/>
+                <w:b/>
+                <w:color w:val="166534"/>
+                <w:sz w:val="15"/>
+              </w:rPr>
+              <w:t>Rp 2.800 (56,0%)</w:t>
+            </w:r>
+          </w:p>
+        </w:tc>
+      </w:tr>
+      <w:tr>
+        <w:trPr>
+          <w:cantSplit/>
+        </w:trPr>
+        <w:tc>
+          <w:tcPr>
+            <w:tcW w:type="dxa" w:w="2438"/>
+            <w:shd w:val="clear" w:color="auto" w:fill="FFFFFF"/>
+            <w:tcMar>
+              <w:top w:w="28" w:type="dxa"/>
+              <w:bottom w:w="28" w:type="dxa"/>
+              <w:left w:w="50" w:type="dxa"/>
+              <w:right w:w="50" w:type="dxa"/>
+            </w:tcMar>
+            <w:tcBorders>
+              <w:top w:val="none"/>
+              <w:left w:val="none"/>
+              <w:bottom w:val="single" w:sz="4" w:space="0" w:color="D9E2EC"/>
+              <w:right w:val="none"/>
+            </w:tcBorders>
+          </w:tcPr>
+          <w:p>
+            <w:pPr>
+              <w:jc w:val="left"/>
+            </w:pPr>
+            <w:r>
+              <w:rPr>
+                <w:rFonts w:ascii="Arial" w:hAnsi="Arial"/>
+                <w:b/>
+                <w:color w:val="243B53"/>
+                <w:sz w:val="15"/>
+              </w:rPr>
+              <w:t>Otak-Otak Ikan Bakar (Singapura)</w:t>
+            </w:r>
+          </w:p>
+        </w:tc>
+        <w:tc>
+          <w:tcPr>
+            <w:tcW w:type="dxa" w:w="3175"/>
+            <w:shd w:val="clear" w:color="auto" w:fill="FFFFFF"/>
+            <w:tcMar>
+              <w:top w:w="28" w:type="dxa"/>
+              <w:bottom w:w="28" w:type="dxa"/>
+              <w:left w:w="50" w:type="dxa"/>
+              <w:right w:w="50" w:type="dxa"/>
+            </w:tcMar>
+            <w:tcBorders>
+              <w:top w:val="none"/>
+              <w:left w:val="none"/>
+              <w:bottom w:val="single" w:sz="4" w:space="0" w:color="D9E2EC"/>
+              <w:right w:val="none"/>
+            </w:tcBorders>
+          </w:tcPr>
+          <w:p>
+            <w:pPr>
+              <w:jc w:val="left"/>
+            </w:pPr>
+            <w:r>
+              <w:rPr>
+                <w:rFonts w:ascii="Arial" w:hAnsi="Arial"/>
+                <w:color w:val="243B53"/>
+                <w:sz w:val="15"/>
+              </w:rPr>
+              <w:t>Otak-otak ikan olahan gurih kerat silang, bumbu oles pedas manis</w:t>
+            </w:r>
+          </w:p>
+        </w:tc>
+        <w:tc>
+          <w:tcPr>
+            <w:tcW w:type="dxa" w:w="1247"/>
+            <w:shd w:val="clear" w:color="auto" w:fill="FFFFFF"/>
+            <w:tcMar>
+              <w:top w:w="28" w:type="dxa"/>
+              <w:bottom w:w="28" w:type="dxa"/>
+              <w:left w:w="50" w:type="dxa"/>
+              <w:right w:w="50" w:type="dxa"/>
+            </w:tcMar>
+            <w:tcBorders>
+              <w:top w:val="none"/>
+              <w:left w:val="none"/>
+              <w:bottom w:val="single" w:sz="4" w:space="0" w:color="D9E2EC"/>
+              <w:right w:val="none"/>
+            </w:tcBorders>
+          </w:tcPr>
+          <w:p>
+            <w:pPr>
+              <w:jc w:val="center"/>
+            </w:pPr>
+            <w:r>
+              <w:rPr>
+                <w:rFonts w:ascii="Arial" w:hAnsi="Arial"/>
+                <w:color w:val="243B53"/>
+                <w:sz w:val="15"/>
+              </w:rPr>
+              <w:t>Rp 1.500</w:t>
+            </w:r>
+          </w:p>
+        </w:tc>
+        <w:tc>
+          <w:tcPr>
+            <w:tcW w:type="dxa" w:w="1247"/>
+            <w:shd w:val="clear" w:color="auto" w:fill="FFFFFF"/>
+            <w:tcMar>
+              <w:top w:w="28" w:type="dxa"/>
+              <w:bottom w:w="28" w:type="dxa"/>
+              <w:left w:w="50" w:type="dxa"/>
+              <w:right w:w="50" w:type="dxa"/>
+            </w:tcMar>
+            <w:tcBorders>
+              <w:top w:val="none"/>
+              <w:left w:val="none"/>
+              <w:bottom w:val="single" w:sz="4" w:space="0" w:color="D9E2EC"/>
+              <w:right w:val="none"/>
+            </w:tcBorders>
+          </w:tcPr>
+          <w:p>
+            <w:pPr>
+              <w:jc w:val="center"/>
+            </w:pPr>
+            <w:r>
+              <w:rPr>
+                <w:rFonts w:ascii="Arial" w:hAnsi="Arial"/>
+                <w:color w:val="243B53"/>
+                <w:sz w:val="15"/>
+              </w:rPr>
+              <w:t>Rp 3.500</w:t>
+            </w:r>
+          </w:p>
+        </w:tc>
+        <w:tc>
+          <w:tcPr>
+            <w:tcW w:type="dxa" w:w="1587"/>
+            <w:shd w:val="clear" w:color="auto" w:fill="FFFFFF"/>
+            <w:tcMar>
+              <w:top w:w="28" w:type="dxa"/>
+              <w:bottom w:w="28" w:type="dxa"/>
+              <w:left w:w="50" w:type="dxa"/>
+              <w:right w:w="50" w:type="dxa"/>
+            </w:tcMar>
+            <w:tcBorders>
+              <w:top w:val="none"/>
+              <w:left w:val="none"/>
+              <w:bottom w:val="single" w:sz="4" w:space="0" w:color="D9E2EC"/>
+              <w:right w:val="none"/>
+            </w:tcBorders>
+          </w:tcPr>
+          <w:p>
+            <w:pPr>
+              <w:jc w:val="right"/>
+            </w:pPr>
+            <w:r>
+              <w:rPr>
+                <w:rFonts w:ascii="Arial" w:hAnsi="Arial"/>
+                <w:b/>
+                <w:color w:val="166534"/>
+                <w:sz w:val="15"/>
+              </w:rPr>
+              <w:t>Rp 2.000 (57,1%)</w:t>
+            </w:r>
+          </w:p>
+        </w:tc>
+      </w:tr>
+      <w:tr>
+        <w:trPr>
+          <w:cantSplit/>
+        </w:trPr>
+        <w:tc>
+          <w:tcPr>
+            <w:tcW w:type="dxa" w:w="2438"/>
+            <w:shd w:val="clear" w:color="auto" w:fill="F0F4F8"/>
+            <w:tcMar>
+              <w:top w:w="28" w:type="dxa"/>
+              <w:bottom w:w="28" w:type="dxa"/>
+              <w:left w:w="50" w:type="dxa"/>
+              <w:right w:w="50" w:type="dxa"/>
+            </w:tcMar>
+            <w:tcBorders>
+              <w:top w:val="none"/>
+              <w:left w:val="none"/>
+              <w:bottom w:val="single" w:sz="4" w:space="0" w:color="D9E2EC"/>
+              <w:right w:val="none"/>
+            </w:tcBorders>
+          </w:tcPr>
+          <w:p>
+            <w:pPr>
+              <w:jc w:val="left"/>
+            </w:pPr>
+            <w:r>
+              <w:rPr>
+                <w:rFonts w:ascii="Arial" w:hAnsi="Arial"/>
+                <w:b/>
+                <w:color w:val="243B53"/>
+                <w:sz w:val="15"/>
+              </w:rPr>
+              <w:t>Sate Cumi Olahan Bakar (Squid Flower)</w:t>
+            </w:r>
+          </w:p>
+        </w:tc>
+        <w:tc>
+          <w:tcPr>
+            <w:tcW w:type="dxa" w:w="3175"/>
+            <w:shd w:val="clear" w:color="auto" w:fill="F0F4F8"/>
+            <w:tcMar>
+              <w:top w:w="28" w:type="dxa"/>
+              <w:bottom w:w="28" w:type="dxa"/>
+              <w:left w:w="50" w:type="dxa"/>
+              <w:right w:w="50" w:type="dxa"/>
+            </w:tcMar>
+            <w:tcBorders>
+              <w:top w:val="none"/>
+              <w:left w:val="none"/>
+              <w:bottom w:val="single" w:sz="4" w:space="0" w:color="D9E2EC"/>
+              <w:right w:val="none"/>
+            </w:tcBorders>
+          </w:tcPr>
+          <w:p>
+            <w:pPr>
+              <w:jc w:val="left"/>
+            </w:pPr>
+            <w:r>
+              <w:rPr>
+                <w:rFonts w:ascii="Arial" w:hAnsi="Arial"/>
+                <w:color w:val="243B53"/>
+                <w:sz w:val="15"/>
+              </w:rPr>
+              <w:t>Olahan daging cumi flower bakar arang saus kecap pedas gurih</w:t>
+            </w:r>
+          </w:p>
+        </w:tc>
+        <w:tc>
+          <w:tcPr>
+            <w:tcW w:type="dxa" w:w="1247"/>
+            <w:shd w:val="clear" w:color="auto" w:fill="F0F4F8"/>
+            <w:tcMar>
+              <w:top w:w="28" w:type="dxa"/>
+              <w:bottom w:w="28" w:type="dxa"/>
+              <w:left w:w="50" w:type="dxa"/>
+              <w:right w:w="50" w:type="dxa"/>
+            </w:tcMar>
+            <w:tcBorders>
+              <w:top w:val="none"/>
+              <w:left w:val="none"/>
+              <w:bottom w:val="single" w:sz="4" w:space="0" w:color="D9E2EC"/>
+              <w:right w:val="none"/>
+            </w:tcBorders>
+          </w:tcPr>
+          <w:p>
+            <w:pPr>
+              <w:jc w:val="center"/>
+            </w:pPr>
+            <w:r>
+              <w:rPr>
+                <w:rFonts w:ascii="Arial" w:hAnsi="Arial"/>
+                <w:color w:val="243B53"/>
+                <w:sz w:val="15"/>
+              </w:rPr>
+              <w:t>Rp 2.000</w:t>
+            </w:r>
+          </w:p>
+        </w:tc>
+        <w:tc>
+          <w:tcPr>
+            <w:tcW w:type="dxa" w:w="1247"/>
+            <w:shd w:val="clear" w:color="auto" w:fill="F0F4F8"/>
+            <w:tcMar>
+              <w:top w:w="28" w:type="dxa"/>
+              <w:bottom w:w="28" w:type="dxa"/>
+              <w:left w:w="50" w:type="dxa"/>
+              <w:right w:w="50" w:type="dxa"/>
+            </w:tcMar>
+            <w:tcBorders>
+              <w:top w:val="none"/>
+              <w:left w:val="none"/>
+              <w:bottom w:val="single" w:sz="4" w:space="0" w:color="D9E2EC"/>
+              <w:right w:val="none"/>
+            </w:tcBorders>
+          </w:tcPr>
+          <w:p>
+            <w:pPr>
+              <w:jc w:val="center"/>
+            </w:pPr>
+            <w:r>
+              <w:rPr>
+                <w:rFonts w:ascii="Arial" w:hAnsi="Arial"/>
+                <w:color w:val="243B53"/>
+                <w:sz w:val="15"/>
+              </w:rPr>
+              <w:t>Rp 4.500</w:t>
+            </w:r>
+          </w:p>
+        </w:tc>
+        <w:tc>
+          <w:tcPr>
+            <w:tcW w:type="dxa" w:w="1587"/>
+            <w:shd w:val="clear" w:color="auto" w:fill="F0F4F8"/>
+            <w:tcMar>
+              <w:top w:w="28" w:type="dxa"/>
+              <w:bottom w:w="28" w:type="dxa"/>
+              <w:left w:w="50" w:type="dxa"/>
+              <w:right w:w="50" w:type="dxa"/>
+            </w:tcMar>
+            <w:tcBorders>
+              <w:top w:val="none"/>
+              <w:left w:val="none"/>
+              <w:bottom w:val="single" w:sz="4" w:space="0" w:color="D9E2EC"/>
+              <w:right w:val="none"/>
+            </w:tcBorders>
+          </w:tcPr>
+          <w:p>
+            <w:pPr>
+              <w:jc w:val="right"/>
+            </w:pPr>
+            <w:r>
+              <w:rPr>
+                <w:rFonts w:ascii="Arial" w:hAnsi="Arial"/>
+                <w:b/>
+                <w:color w:val="166534"/>
+                <w:sz w:val="15"/>
+              </w:rPr>
+              <w:t>Rp 2.500 (55,5%)</w:t>
+            </w:r>
+          </w:p>
+        </w:tc>
+      </w:tr>
+      <w:tr>
+        <w:trPr>
+          <w:cantSplit/>
+        </w:trPr>
+        <w:tc>
+          <w:tcPr>
+            <w:tcW w:type="dxa" w:w="2438"/>
+            <w:shd w:val="clear" w:color="auto" w:fill="FFFFFF"/>
+            <w:tcMar>
+              <w:top w:w="28" w:type="dxa"/>
+              <w:bottom w:w="28" w:type="dxa"/>
+              <w:left w:w="50" w:type="dxa"/>
+              <w:right w:w="50" w:type="dxa"/>
+            </w:tcMar>
+            <w:tcBorders>
+              <w:top w:val="none"/>
+              <w:left w:val="none"/>
+              <w:bottom w:val="single" w:sz="4" w:space="0" w:color="D9E2EC"/>
+              <w:right w:val="none"/>
+            </w:tcBorders>
+          </w:tcPr>
+          <w:p>
+            <w:pPr>
+              <w:jc w:val="left"/>
+            </w:pPr>
+            <w:r>
+              <w:rPr>
+                <w:rFonts w:ascii="Arial" w:hAnsi="Arial"/>
+                <w:b/>
+                <w:color w:val="243B53"/>
+                <w:sz w:val="15"/>
+              </w:rPr>
+              <w:t>Fish Roll / Crab Stick Olahan Bakar</w:t>
+            </w:r>
+          </w:p>
+        </w:tc>
+        <w:tc>
+          <w:tcPr>
+            <w:tcW w:type="dxa" w:w="3175"/>
+            <w:shd w:val="clear" w:color="auto" w:fill="FFFFFF"/>
+            <w:tcMar>
+              <w:top w:w="28" w:type="dxa"/>
+              <w:bottom w:w="28" w:type="dxa"/>
+              <w:left w:w="50" w:type="dxa"/>
+              <w:right w:w="50" w:type="dxa"/>
+            </w:tcMar>
+            <w:tcBorders>
+              <w:top w:val="none"/>
+              <w:left w:val="none"/>
+              <w:bottom w:val="single" w:sz="4" w:space="0" w:color="D9E2EC"/>
+              <w:right w:val="none"/>
+            </w:tcBorders>
+          </w:tcPr>
+          <w:p>
+            <w:pPr>
+              <w:jc w:val="left"/>
+            </w:pPr>
+            <w:r>
+              <w:rPr>
+                <w:rFonts w:ascii="Arial" w:hAnsi="Arial"/>
+                <w:color w:val="243B53"/>
+                <w:sz w:val="15"/>
+              </w:rPr>
+              <w:t>Olahan ikan kani stik bumbu rempah arang batok kelapa</w:t>
+            </w:r>
+          </w:p>
+        </w:tc>
+        <w:tc>
+          <w:tcPr>
+            <w:tcW w:type="dxa" w:w="1247"/>
+            <w:shd w:val="clear" w:color="auto" w:fill="FFFFFF"/>
+            <w:tcMar>
+              <w:top w:w="28" w:type="dxa"/>
+              <w:bottom w:w="28" w:type="dxa"/>
+              <w:left w:w="50" w:type="dxa"/>
+              <w:right w:w="50" w:type="dxa"/>
+            </w:tcMar>
+            <w:tcBorders>
+              <w:top w:val="none"/>
+              <w:left w:val="none"/>
+              <w:bottom w:val="single" w:sz="4" w:space="0" w:color="D9E2EC"/>
+              <w:right w:val="none"/>
+            </w:tcBorders>
+          </w:tcPr>
+          <w:p>
+            <w:pPr>
+              <w:jc w:val="center"/>
+            </w:pPr>
+            <w:r>
+              <w:rPr>
+                <w:rFonts w:ascii="Arial" w:hAnsi="Arial"/>
+                <w:color w:val="243B53"/>
+                <w:sz w:val="15"/>
+              </w:rPr>
+              <w:t>Rp 1.400</w:t>
+            </w:r>
+          </w:p>
+        </w:tc>
+        <w:tc>
+          <w:tcPr>
+            <w:tcW w:type="dxa" w:w="1247"/>
+            <w:shd w:val="clear" w:color="auto" w:fill="FFFFFF"/>
+            <w:tcMar>
+              <w:top w:w="28" w:type="dxa"/>
+              <w:bottom w:w="28" w:type="dxa"/>
+              <w:left w:w="50" w:type="dxa"/>
+              <w:right w:w="50" w:type="dxa"/>
+            </w:tcMar>
+            <w:tcBorders>
+              <w:top w:val="none"/>
+              <w:left w:val="none"/>
+              <w:bottom w:val="single" w:sz="4" w:space="0" w:color="D9E2EC"/>
+              <w:right w:val="none"/>
+            </w:tcBorders>
+          </w:tcPr>
+          <w:p>
+            <w:pPr>
+              <w:jc w:val="center"/>
+            </w:pPr>
+            <w:r>
+              <w:rPr>
+                <w:rFonts w:ascii="Arial" w:hAnsi="Arial"/>
+                <w:color w:val="243B53"/>
+                <w:sz w:val="15"/>
+              </w:rPr>
+              <w:t>Rp 3.000</w:t>
+            </w:r>
+          </w:p>
+        </w:tc>
+        <w:tc>
+          <w:tcPr>
+            <w:tcW w:type="dxa" w:w="1587"/>
+            <w:shd w:val="clear" w:color="auto" w:fill="FFFFFF"/>
+            <w:tcMar>
+              <w:top w:w="28" w:type="dxa"/>
+              <w:bottom w:w="28" w:type="dxa"/>
+              <w:left w:w="50" w:type="dxa"/>
+              <w:right w:w="50" w:type="dxa"/>
+            </w:tcMar>
+            <w:tcBorders>
+              <w:top w:val="none"/>
+              <w:left w:val="none"/>
+              <w:bottom w:val="single" w:sz="4" w:space="0" w:color="D9E2EC"/>
+              <w:right w:val="none"/>
+            </w:tcBorders>
+          </w:tcPr>
+          <w:p>
+            <w:pPr>
+              <w:jc w:val="right"/>
+            </w:pPr>
+            <w:r>
+              <w:rPr>
+                <w:rFonts w:ascii="Arial" w:hAnsi="Arial"/>
+                <w:b/>
+                <w:color w:val="166534"/>
+                <w:sz w:val="15"/>
+              </w:rPr>
+              <w:t>Rp 1.600 (53,3%)</w:t>
+            </w:r>
+          </w:p>
+        </w:tc>
+      </w:tr>
+      <w:tr>
+        <w:trPr>
+          <w:cantSplit/>
+        </w:trPr>
+        <w:tc>
+          <w:tcPr>
+            <w:tcW w:type="dxa" w:w="2438"/>
+            <w:shd w:val="clear" w:color="auto" w:fill="F0F4F8"/>
+            <w:tcMar>
+              <w:top w:w="28" w:type="dxa"/>
+              <w:bottom w:w="28" w:type="dxa"/>
+              <w:left w:w="50" w:type="dxa"/>
+              <w:right w:w="50" w:type="dxa"/>
+            </w:tcMar>
+            <w:tcBorders>
+              <w:top w:val="none"/>
+              <w:left w:val="none"/>
+              <w:bottom w:val="single" w:sz="4" w:space="0" w:color="D9E2EC"/>
+              <w:right w:val="none"/>
+            </w:tcBorders>
+          </w:tcPr>
+          <w:p>
+            <w:pPr>
+              <w:jc w:val="left"/>
+            </w:pPr>
+            <w:r>
+              <w:rPr>
+                <w:rFonts w:ascii="Arial" w:hAnsi="Arial"/>
+                <w:b/>
+                <w:color w:val="243B53"/>
+                <w:sz w:val="15"/>
+              </w:rPr>
+              <w:t>Nasi Kucing Teri / Orek Tempe</w:t>
+            </w:r>
+          </w:p>
+        </w:tc>
+        <w:tc>
+          <w:tcPr>
+            <w:tcW w:type="dxa" w:w="3175"/>
+            <w:shd w:val="clear" w:color="auto" w:fill="F0F4F8"/>
+            <w:tcMar>
+              <w:top w:w="28" w:type="dxa"/>
+              <w:bottom w:w="28" w:type="dxa"/>
+              <w:left w:w="50" w:type="dxa"/>
+              <w:right w:w="50" w:type="dxa"/>
+            </w:tcMar>
+            <w:tcBorders>
+              <w:top w:val="none"/>
+              <w:left w:val="none"/>
+              <w:bottom w:val="single" w:sz="4" w:space="0" w:color="D9E2EC"/>
+              <w:right w:val="none"/>
+            </w:tcBorders>
+          </w:tcPr>
+          <w:p>
+            <w:pPr>
+              <w:jc w:val="left"/>
+            </w:pPr>
+            <w:r>
+              <w:rPr>
+                <w:rFonts w:ascii="Arial" w:hAnsi="Arial"/>
+                <w:color w:val="243B53"/>
+                <w:sz w:val="15"/>
+              </w:rPr>
+              <w:t>Nasi pulen sambal teri balado / orek tempe bungkus daun pisang</w:t>
+            </w:r>
+          </w:p>
+        </w:tc>
+        <w:tc>
+          <w:tcPr>
+            <w:tcW w:type="dxa" w:w="1247"/>
+            <w:shd w:val="clear" w:color="auto" w:fill="F0F4F8"/>
+            <w:tcMar>
+              <w:top w:w="28" w:type="dxa"/>
+              <w:bottom w:w="28" w:type="dxa"/>
+              <w:left w:w="50" w:type="dxa"/>
+              <w:right w:w="50" w:type="dxa"/>
+            </w:tcMar>
+            <w:tcBorders>
+              <w:top w:val="none"/>
+              <w:left w:val="none"/>
+              <w:bottom w:val="single" w:sz="4" w:space="0" w:color="D9E2EC"/>
+              <w:right w:val="none"/>
+            </w:tcBorders>
+          </w:tcPr>
+          <w:p>
+            <w:pPr>
+              <w:jc w:val="center"/>
+            </w:pPr>
+            <w:r>
+              <w:rPr>
+                <w:rFonts w:ascii="Arial" w:hAnsi="Arial"/>
+                <w:color w:val="243B53"/>
+                <w:sz w:val="15"/>
+              </w:rPr>
+              <w:t>Rp 1.600</w:t>
+            </w:r>
+          </w:p>
+        </w:tc>
+        <w:tc>
+          <w:tcPr>
+            <w:tcW w:type="dxa" w:w="1247"/>
+            <w:shd w:val="clear" w:color="auto" w:fill="F0F4F8"/>
+            <w:tcMar>
+              <w:top w:w="28" w:type="dxa"/>
+              <w:bottom w:w="28" w:type="dxa"/>
+              <w:left w:w="50" w:type="dxa"/>
+              <w:right w:w="50" w:type="dxa"/>
+            </w:tcMar>
+            <w:tcBorders>
+              <w:top w:val="none"/>
+              <w:left w:val="none"/>
+              <w:bottom w:val="single" w:sz="4" w:space="0" w:color="D9E2EC"/>
+              <w:right w:val="none"/>
+            </w:tcBorders>
+          </w:tcPr>
+          <w:p>
+            <w:pPr>
+              <w:jc w:val="center"/>
+            </w:pPr>
+            <w:r>
+              <w:rPr>
+                <w:rFonts w:ascii="Arial" w:hAnsi="Arial"/>
+                <w:color w:val="243B53"/>
+                <w:sz w:val="15"/>
+              </w:rPr>
+              <w:t>Rp 3.000</w:t>
+            </w:r>
+          </w:p>
+        </w:tc>
+        <w:tc>
+          <w:tcPr>
+            <w:tcW w:type="dxa" w:w="1587"/>
+            <w:shd w:val="clear" w:color="auto" w:fill="F0F4F8"/>
+            <w:tcMar>
+              <w:top w:w="28" w:type="dxa"/>
+              <w:bottom w:w="28" w:type="dxa"/>
+              <w:left w:w="50" w:type="dxa"/>
+              <w:right w:w="50" w:type="dxa"/>
+            </w:tcMar>
+            <w:tcBorders>
+              <w:top w:val="none"/>
+              <w:left w:val="none"/>
+              <w:bottom w:val="single" w:sz="4" w:space="0" w:color="D9E2EC"/>
+              <w:right w:val="none"/>
+            </w:tcBorders>
+          </w:tcPr>
+          <w:p>
+            <w:pPr>
+              <w:jc w:val="right"/>
+            </w:pPr>
+            <w:r>
+              <w:rPr>
+                <w:rFonts w:ascii="Arial" w:hAnsi="Arial"/>
+                <w:b/>
+                <w:color w:val="166534"/>
+                <w:sz w:val="15"/>
+              </w:rPr>
+              <w:t>Rp 1.400 (46,7%)</w:t>
+            </w:r>
+          </w:p>
+        </w:tc>
+      </w:tr>
+      <w:tr>
+        <w:trPr>
+          <w:cantSplit/>
+        </w:trPr>
+        <w:tc>
+          <w:tcPr>
+            <w:tcW w:type="dxa" w:w="2438"/>
+            <w:shd w:val="clear" w:color="auto" w:fill="FFFFFF"/>
+            <w:tcMar>
+              <w:top w:w="28" w:type="dxa"/>
+              <w:bottom w:w="28" w:type="dxa"/>
+              <w:left w:w="50" w:type="dxa"/>
+              <w:right w:w="50" w:type="dxa"/>
+            </w:tcMar>
+            <w:tcBorders>
+              <w:top w:val="none"/>
+              <w:left w:val="none"/>
+              <w:bottom w:val="single" w:sz="4" w:space="0" w:color="D9E2EC"/>
+              <w:right w:val="none"/>
+            </w:tcBorders>
+          </w:tcPr>
+          <w:p>
+            <w:pPr>
+              <w:jc w:val="left"/>
+            </w:pPr>
+            <w:r>
+              <w:rPr>
+                <w:rFonts w:ascii="Arial" w:hAnsi="Arial"/>
+                <w:b/>
+                <w:color w:val="243B53"/>
+                <w:sz w:val="15"/>
+              </w:rPr>
+              <w:t>Tempe Mendoan Hangat (3 Lembar)</w:t>
+            </w:r>
+          </w:p>
+        </w:tc>
+        <w:tc>
+          <w:tcPr>
+            <w:tcW w:type="dxa" w:w="3175"/>
+            <w:shd w:val="clear" w:color="auto" w:fill="FFFFFF"/>
+            <w:tcMar>
+              <w:top w:w="28" w:type="dxa"/>
+              <w:bottom w:w="28" w:type="dxa"/>
+              <w:left w:w="50" w:type="dxa"/>
+              <w:right w:w="50" w:type="dxa"/>
+            </w:tcMar>
+            <w:tcBorders>
+              <w:top w:val="none"/>
+              <w:left w:val="none"/>
+              <w:bottom w:val="single" w:sz="4" w:space="0" w:color="D9E2EC"/>
+              <w:right w:val="none"/>
+            </w:tcBorders>
+          </w:tcPr>
+          <w:p>
+            <w:pPr>
+              <w:jc w:val="left"/>
+            </w:pPr>
+            <w:r>
+              <w:rPr>
+                <w:rFonts w:ascii="Arial" w:hAnsi="Arial"/>
+                <w:color w:val="243B53"/>
+                <w:sz w:val="15"/>
+              </w:rPr>
+              <w:t>Tempe kedelai lokal, adonan tepung daun bawang, kecap rawit</w:t>
+            </w:r>
+          </w:p>
+        </w:tc>
+        <w:tc>
+          <w:tcPr>
+            <w:tcW w:type="dxa" w:w="1247"/>
+            <w:shd w:val="clear" w:color="auto" w:fill="FFFFFF"/>
+            <w:tcMar>
+              <w:top w:w="28" w:type="dxa"/>
+              <w:bottom w:w="28" w:type="dxa"/>
+              <w:left w:w="50" w:type="dxa"/>
+              <w:right w:w="50" w:type="dxa"/>
+            </w:tcMar>
+            <w:tcBorders>
+              <w:top w:val="none"/>
+              <w:left w:val="none"/>
+              <w:bottom w:val="single" w:sz="4" w:space="0" w:color="D9E2EC"/>
+              <w:right w:val="none"/>
+            </w:tcBorders>
+          </w:tcPr>
+          <w:p>
+            <w:pPr>
+              <w:jc w:val="center"/>
+            </w:pPr>
+            <w:r>
+              <w:rPr>
+                <w:rFonts w:ascii="Arial" w:hAnsi="Arial"/>
+                <w:color w:val="243B53"/>
+                <w:sz w:val="15"/>
+              </w:rPr>
+              <w:t>Rp 2.500</w:t>
             </w:r>
           </w:p>
         </w:tc>
@@ -4524,7 +4200,7 @@
                 <w:color w:val="166534"/>
                 <w:sz w:val="15"/>
               </w:rPr>
-              <w:t>Rp 2.800 (56,0%)</w:t>
+              <w:t>Rp 2.500 (50,0%)</w:t>
             </w:r>
           </w:p>
         </w:tc>
@@ -4561,7 +4237,7 @@
                 <w:color w:val="243B53"/>
                 <w:sz w:val="15"/>
               </w:rPr>
-              <w:t>Susu Murni Segar (Mug Jadul)</w:t>
+              <w:t>Kopi Tubruk Robusta Khas Banten</w:t>
             </w:r>
           </w:p>
         </w:tc>
@@ -4592,7 +4268,7 @@
                 <w:color w:val="243B53"/>
                 <w:sz w:val="15"/>
               </w:rPr>
-              <w:t>Susu sapi murni pasteurisasi 200ml, manis hangat / es dingin</w:t>
+              <w:t>Bubuk kopi Robusta lokal sangrai siap seduh, gula pasir/aren</w:t>
             </w:r>
           </w:p>
         </w:tc>
@@ -4623,7 +4299,7 @@
                 <w:color w:val="243B53"/>
                 <w:sz w:val="15"/>
               </w:rPr>
-              <w:t>Rp 3.500</w:t>
+              <w:t>Rp 1.400</w:t>
             </w:r>
           </w:p>
         </w:tc>
@@ -4654,7 +4330,7 @@
                 <w:color w:val="243B53"/>
                 <w:sz w:val="15"/>
               </w:rPr>
-              <w:t>Rp 8.000</w:t>
+              <w:t>Rp 4.000</w:t>
             </w:r>
           </w:p>
         </w:tc>
@@ -4686,7 +4362,7 @@
                 <w:color w:val="166534"/>
                 <w:sz w:val="15"/>
               </w:rPr>
-              <w:t>Rp 4.500 (56,2%)</w:t>
+              <w:t>Rp 2.600 (65,0%)</w:t>
             </w:r>
           </w:p>
         </w:tc>
@@ -4723,7 +4399,7 @@
                 <w:color w:val="243B53"/>
                 <w:sz w:val="15"/>
               </w:rPr>
-              <w:t>Wedang Jahe Merah Susu Rempah</w:t>
+              <w:t>Kopi Sachet Populer Siap Seduh</w:t>
             </w:r>
           </w:p>
         </w:tc>
@@ -4754,7 +4430,38 @@
                 <w:color w:val="243B53"/>
                 <w:sz w:val="15"/>
               </w:rPr>
-              <w:t>Susu segar 180ml, jahe merah geprek, serai wangi, cengkeh</w:t>
+              <w:t>Good Day / Kapal Api / Indocafe / Luwak White Koffie</w:t>
+            </w:r>
+          </w:p>
+        </w:tc>
+        <w:tc>
+          <w:tcPr>
+            <w:tcW w:type="dxa" w:w="1247"/>
+            <w:shd w:val="clear" w:color="auto" w:fill="FFFFFF"/>
+            <w:tcMar>
+              <w:top w:w="28" w:type="dxa"/>
+              <w:bottom w:w="28" w:type="dxa"/>
+              <w:left w:w="50" w:type="dxa"/>
+              <w:right w:w="50" w:type="dxa"/>
+            </w:tcMar>
+            <w:tcBorders>
+              <w:top w:val="none"/>
+              <w:left w:val="none"/>
+              <w:bottom w:val="single" w:sz="4" w:space="0" w:color="D9E2EC"/>
+              <w:right w:val="none"/>
+            </w:tcBorders>
+          </w:tcPr>
+          <w:p>
+            <w:pPr>
+              <w:jc w:val="center"/>
+            </w:pPr>
+            <w:r>
+              <w:rPr>
+                <w:rFonts w:ascii="Arial" w:hAnsi="Arial"/>
+                <w:color w:val="243B53"/>
+                <w:sz w:val="15"/>
+              </w:rPr>
+              <w:t>Rp 1.800</w:t>
             </w:r>
           </w:p>
         </w:tc>
@@ -4791,6 +4498,268 @@
         </w:tc>
         <w:tc>
           <w:tcPr>
+            <w:tcW w:type="dxa" w:w="1587"/>
+            <w:shd w:val="clear" w:color="auto" w:fill="FFFFFF"/>
+            <w:tcMar>
+              <w:top w:w="28" w:type="dxa"/>
+              <w:bottom w:w="28" w:type="dxa"/>
+              <w:left w:w="50" w:type="dxa"/>
+              <w:right w:w="50" w:type="dxa"/>
+            </w:tcMar>
+            <w:tcBorders>
+              <w:top w:val="none"/>
+              <w:left w:val="none"/>
+              <w:bottom w:val="single" w:sz="4" w:space="0" w:color="D9E2EC"/>
+              <w:right w:val="none"/>
+            </w:tcBorders>
+          </w:tcPr>
+          <w:p>
+            <w:pPr>
+              <w:jc w:val="right"/>
+            </w:pPr>
+            <w:r>
+              <w:rPr>
+                <w:rFonts w:ascii="Arial" w:hAnsi="Arial"/>
+                <w:b/>
+                <w:color w:val="166534"/>
+                <w:sz w:val="15"/>
+              </w:rPr>
+              <w:t>Rp 2.200 (55,0%)</w:t>
+            </w:r>
+          </w:p>
+        </w:tc>
+      </w:tr>
+      <w:tr>
+        <w:trPr>
+          <w:cantSplit/>
+        </w:trPr>
+        <w:tc>
+          <w:tcPr>
+            <w:tcW w:type="dxa" w:w="2438"/>
+            <w:shd w:val="clear" w:color="auto" w:fill="F0F4F8"/>
+            <w:tcMar>
+              <w:top w:w="28" w:type="dxa"/>
+              <w:bottom w:w="28" w:type="dxa"/>
+              <w:left w:w="50" w:type="dxa"/>
+              <w:right w:w="50" w:type="dxa"/>
+            </w:tcMar>
+            <w:tcBorders>
+              <w:top w:val="none"/>
+              <w:left w:val="none"/>
+              <w:bottom w:val="single" w:sz="4" w:space="0" w:color="D9E2EC"/>
+              <w:right w:val="none"/>
+            </w:tcBorders>
+          </w:tcPr>
+          <w:p>
+            <w:pPr>
+              <w:jc w:val="left"/>
+            </w:pPr>
+            <w:r>
+              <w:rPr>
+                <w:rFonts w:ascii="Arial" w:hAnsi="Arial"/>
+                <w:b/>
+                <w:color w:val="243B53"/>
+                <w:sz w:val="15"/>
+              </w:rPr>
+              <w:t>Es / Hangat Minuman Sachet Segar</w:t>
+            </w:r>
+          </w:p>
+        </w:tc>
+        <w:tc>
+          <w:tcPr>
+            <w:tcW w:type="dxa" w:w="3175"/>
+            <w:shd w:val="clear" w:color="auto" w:fill="F0F4F8"/>
+            <w:tcMar>
+              <w:top w:w="28" w:type="dxa"/>
+              <w:bottom w:w="28" w:type="dxa"/>
+              <w:left w:w="50" w:type="dxa"/>
+              <w:right w:w="50" w:type="dxa"/>
+            </w:tcMar>
+            <w:tcBorders>
+              <w:top w:val="none"/>
+              <w:left w:val="none"/>
+              <w:bottom w:val="single" w:sz="4" w:space="0" w:color="D9E2EC"/>
+              <w:right w:val="none"/>
+            </w:tcBorders>
+          </w:tcPr>
+          <w:p>
+            <w:pPr>
+              <w:jc w:val="left"/>
+            </w:pPr>
+            <w:r>
+              <w:rPr>
+                <w:rFonts w:ascii="Arial" w:hAnsi="Arial"/>
+                <w:color w:val="243B53"/>
+                <w:sz w:val="15"/>
+              </w:rPr>
+              <w:t>Nutrisari Jeruk / Extra Joss Susu / Kuku Bima Susu</w:t>
+            </w:r>
+          </w:p>
+        </w:tc>
+        <w:tc>
+          <w:tcPr>
+            <w:tcW w:type="dxa" w:w="1247"/>
+            <w:shd w:val="clear" w:color="auto" w:fill="F0F4F8"/>
+            <w:tcMar>
+              <w:top w:w="28" w:type="dxa"/>
+              <w:bottom w:w="28" w:type="dxa"/>
+              <w:left w:w="50" w:type="dxa"/>
+              <w:right w:w="50" w:type="dxa"/>
+            </w:tcMar>
+            <w:tcBorders>
+              <w:top w:val="none"/>
+              <w:left w:val="none"/>
+              <w:bottom w:val="single" w:sz="4" w:space="0" w:color="D9E2EC"/>
+              <w:right w:val="none"/>
+            </w:tcBorders>
+          </w:tcPr>
+          <w:p>
+            <w:pPr>
+              <w:jc w:val="center"/>
+            </w:pPr>
+            <w:r>
+              <w:rPr>
+                <w:rFonts w:ascii="Arial" w:hAnsi="Arial"/>
+                <w:color w:val="243B53"/>
+                <w:sz w:val="15"/>
+              </w:rPr>
+              <w:t>Rp 2.200</w:t>
+            </w:r>
+          </w:p>
+        </w:tc>
+        <w:tc>
+          <w:tcPr>
+            <w:tcW w:type="dxa" w:w="1247"/>
+            <w:shd w:val="clear" w:color="auto" w:fill="F0F4F8"/>
+            <w:tcMar>
+              <w:top w:w="28" w:type="dxa"/>
+              <w:bottom w:w="28" w:type="dxa"/>
+              <w:left w:w="50" w:type="dxa"/>
+              <w:right w:w="50" w:type="dxa"/>
+            </w:tcMar>
+            <w:tcBorders>
+              <w:top w:val="none"/>
+              <w:left w:val="none"/>
+              <w:bottom w:val="single" w:sz="4" w:space="0" w:color="D9E2EC"/>
+              <w:right w:val="none"/>
+            </w:tcBorders>
+          </w:tcPr>
+          <w:p>
+            <w:pPr>
+              <w:jc w:val="center"/>
+            </w:pPr>
+            <w:r>
+              <w:rPr>
+                <w:rFonts w:ascii="Arial" w:hAnsi="Arial"/>
+                <w:color w:val="243B53"/>
+                <w:sz w:val="15"/>
+              </w:rPr>
+              <w:t>Rp 5.000</w:t>
+            </w:r>
+          </w:p>
+        </w:tc>
+        <w:tc>
+          <w:tcPr>
+            <w:tcW w:type="dxa" w:w="1587"/>
+            <w:shd w:val="clear" w:color="auto" w:fill="F0F4F8"/>
+            <w:tcMar>
+              <w:top w:w="28" w:type="dxa"/>
+              <w:bottom w:w="28" w:type="dxa"/>
+              <w:left w:w="50" w:type="dxa"/>
+              <w:right w:w="50" w:type="dxa"/>
+            </w:tcMar>
+            <w:tcBorders>
+              <w:top w:val="none"/>
+              <w:left w:val="none"/>
+              <w:bottom w:val="single" w:sz="4" w:space="0" w:color="D9E2EC"/>
+              <w:right w:val="none"/>
+            </w:tcBorders>
+          </w:tcPr>
+          <w:p>
+            <w:pPr>
+              <w:jc w:val="right"/>
+            </w:pPr>
+            <w:r>
+              <w:rPr>
+                <w:rFonts w:ascii="Arial" w:hAnsi="Arial"/>
+                <w:b/>
+                <w:color w:val="166534"/>
+                <w:sz w:val="15"/>
+              </w:rPr>
+              <w:t>Rp 2.800 (56,0%)</w:t>
+            </w:r>
+          </w:p>
+        </w:tc>
+      </w:tr>
+      <w:tr>
+        <w:trPr>
+          <w:cantSplit/>
+        </w:trPr>
+        <w:tc>
+          <w:tcPr>
+            <w:tcW w:type="dxa" w:w="2438"/>
+            <w:shd w:val="clear" w:color="auto" w:fill="FFFFFF"/>
+            <w:tcMar>
+              <w:top w:w="28" w:type="dxa"/>
+              <w:bottom w:w="28" w:type="dxa"/>
+              <w:left w:w="50" w:type="dxa"/>
+              <w:right w:w="50" w:type="dxa"/>
+            </w:tcMar>
+            <w:tcBorders>
+              <w:top w:val="none"/>
+              <w:left w:val="none"/>
+              <w:bottom w:val="single" w:sz="4" w:space="0" w:color="D9E2EC"/>
+              <w:right w:val="none"/>
+            </w:tcBorders>
+          </w:tcPr>
+          <w:p>
+            <w:pPr>
+              <w:jc w:val="left"/>
+            </w:pPr>
+            <w:r>
+              <w:rPr>
+                <w:rFonts w:ascii="Arial" w:hAnsi="Arial"/>
+                <w:b/>
+                <w:color w:val="243B53"/>
+                <w:sz w:val="15"/>
+              </w:rPr>
+              <w:t>Susu Murni Segar / Wedang Jahe Rempah</w:t>
+            </w:r>
+          </w:p>
+        </w:tc>
+        <w:tc>
+          <w:tcPr>
+            <w:tcW w:type="dxa" w:w="3175"/>
+            <w:shd w:val="clear" w:color="auto" w:fill="FFFFFF"/>
+            <w:tcMar>
+              <w:top w:w="28" w:type="dxa"/>
+              <w:bottom w:w="28" w:type="dxa"/>
+              <w:left w:w="50" w:type="dxa"/>
+              <w:right w:w="50" w:type="dxa"/>
+            </w:tcMar>
+            <w:tcBorders>
+              <w:top w:val="none"/>
+              <w:left w:val="none"/>
+              <w:bottom w:val="single" w:sz="4" w:space="0" w:color="D9E2EC"/>
+              <w:right w:val="none"/>
+            </w:tcBorders>
+          </w:tcPr>
+          <w:p>
+            <w:pPr>
+              <w:jc w:val="left"/>
+            </w:pPr>
+            <w:r>
+              <w:rPr>
+                <w:rFonts w:ascii="Arial" w:hAnsi="Arial"/>
+                <w:color w:val="243B53"/>
+                <w:sz w:val="15"/>
+              </w:rPr>
+              <w:t>Susu sapi murni pasteurisasi / jahe merah rempah (Mug jadul)</w:t>
+            </w:r>
+          </w:p>
+        </w:tc>
+        <w:tc>
+          <w:tcPr>
             <w:tcW w:type="dxa" w:w="1247"/>
             <w:shd w:val="clear" w:color="auto" w:fill="FFFFFF"/>
             <w:tcMar>
@@ -4816,7 +4785,38 @@
                 <w:color w:val="243B53"/>
                 <w:sz w:val="15"/>
               </w:rPr>
-              <w:t>Rp 9.000</w:t>
+              <w:t>Rp 3.800</w:t>
+            </w:r>
+          </w:p>
+        </w:tc>
+        <w:tc>
+          <w:tcPr>
+            <w:tcW w:type="dxa" w:w="1247"/>
+            <w:shd w:val="clear" w:color="auto" w:fill="FFFFFF"/>
+            <w:tcMar>
+              <w:top w:w="28" w:type="dxa"/>
+              <w:bottom w:w="28" w:type="dxa"/>
+              <w:left w:w="50" w:type="dxa"/>
+              <w:right w:w="50" w:type="dxa"/>
+            </w:tcMar>
+            <w:tcBorders>
+              <w:top w:val="none"/>
+              <w:left w:val="none"/>
+              <w:bottom w:val="single" w:sz="4" w:space="0" w:color="D9E2EC"/>
+              <w:right w:val="none"/>
+            </w:tcBorders>
+          </w:tcPr>
+          <w:p>
+            <w:pPr>
+              <w:jc w:val="center"/>
+            </w:pPr>
+            <w:r>
+              <w:rPr>
+                <w:rFonts w:ascii="Arial" w:hAnsi="Arial"/>
+                <w:color w:val="243B53"/>
+                <w:sz w:val="15"/>
+              </w:rPr>
+              <w:t>Rp 8.500</w:t>
             </w:r>
           </w:p>
         </w:tc>
@@ -4848,7 +4848,7 @@
                 <w:color w:val="166534"/>
                 <w:sz w:val="15"/>
               </w:rPr>
-              <w:t>Rp 5.000 (55,5%)</w:t>
+              <w:t>Rp 4.700 (55,3%)</w:t>
             </w:r>
           </w:p>
         </w:tc>

</xml_diff>

<commit_message>
feat: emphasize 100% comfortable padded floor seating and portable tables
</commit_message>
<xml_diff>
--- a/PROPOSAL_INVESTASI_JANGKAR_KOPI.docx
+++ b/PROPOSAL_INVESTASI_JANGKAR_KOPI.docx
@@ -263,7 +263,7 @@
                 <w:color w:val="243B53"/>
                 <w:sz w:val="18"/>
               </w:rPr>
-              <w:t>100% Lesehan Karpet Spons Tebal Waterproof + Meja Pendek Lipat (Inklusif &amp; Merakyat).</w:t>
+              <w:t>100% Lesehan Alas Tebal Nyaman (Karpet Busa Empuk) + Meja Lipat Portabel.</w:t>
             </w:r>
           </w:p>
           <w:p>
@@ -633,7 +633,7 @@
           <w:color w:val="243B53"/>
           <w:sz w:val="19"/>
         </w:rPr>
-        <w:t>Dengan mengalihkan fokus dari pengadaan mesin espresso impor dan set kursi camping mahal ke gerobak kayu fungsional, panggangan arang batok alami, dan lesehan karpet bersih, Jangkar Kopi dapat dieksekusi dalam tempo 10–14 hari kerja. Risiko kerugian ditekan seminimal mungkin, sementara potensi perputaran uang harian langsung aktif sejak hari pertama.</w:t>
+        <w:t>Dengan menunda pembelian set kursi camping dan mesin espresso impor, serta memfokuskan fasilitas duduk pada alas tebal yang nyaman (karpet busa empuk waterproof) dan meja lipat kecil portabel, Jangkar Kopi menekan belanja modal awal secara drastis sehingga dapat dieksekusi dalam tempo 10–14 hari kerja. Risiko kerugian ditekan seminimal mungkin, sementara perputaran uang harian langsung aktif sejak hari pertama.</w:t>
       </w:r>
     </w:p>
     <w:p>
@@ -668,7 +668,7 @@
           <w:color w:val="B45309"/>
           <w:sz w:val="21"/>
         </w:rPr>
-        <w:t>2.1 Konsep Tempat: Lesehan Rakyat yang Hangat &amp; Inklusif</w:t>
+        <w:t>2.1 Konsep Tempat: 100% Lesehan Alas Tebal Nyaman &amp; Meja Lipat Portabel</w:t>
       </w:r>
     </w:p>
     <w:p>
@@ -684,7 +684,7 @@
           <w:color w:val="243B53"/>
           <w:sz w:val="19"/>
         </w:rPr>
-        <w:t>Jangkar Kopi mengusung konsep lesehan bersih beralas karpet spons tebal waterproof yang dipadu dengan meja lipat pendek. Format duduk lesehan melingkar terbukti secara sosiologis mampu meruntuhkan batas status sosial. Pelanggan dapat duduk santai, menyandarkan badan, dan menikmati hidangan tanpa merasa canggung.</w:t>
+        <w:t>Jangkar Kopi mengusung konsep 100% lesehan bersih beralas tebal yang nyaman (karpet spons/busa empuk waterproof dilapisi tikar rapi) dipadu meja lipat kecil portabel yang praktis dan kokoh. Format duduk lesehan melingkar terbukti secara sosiologis mampu meruntuhkan batas status sosial. Pelanggan dapat duduk santai berselonjor dan menikmati hidangan tanpa merasa canggung atau terintimidasi.</w:t>
       </w:r>
     </w:p>
     <w:p>
@@ -819,7 +819,7 @@
                 <w:color w:val="243B53"/>
                 <w:sz w:val="18"/>
               </w:rPr>
-              <w:t>Hamparan 3 lembar karpet spons tebal waterproof beralas tikar rapi, dilengkapi 6 unit meja lipat pendek (kayu/plastik kokoh) dan bantal lesehan. Mampu menampung 18 hingga 22 orang tamu sekaligus.</w:t>
+              <w:t>Hamparan alas tebal nyaman (karpet busa empuk waterproof dilapisi tikar rapi), dilengkapi 6 unit meja lipat kecil portabel yang ringan, kokoh, dan praktis dipindahkan. Mampu menampung 18 hingga 22 orang tamu sekaligus.</w:t>
             </w:r>
           </w:p>
           <w:p>
@@ -1983,7 +1983,7 @@
                 <w:color w:val="243B53"/>
                 <w:sz w:val="16"/>
               </w:rPr>
-              <w:t>Paket Lesehan Karpet &amp; Meja Lipat</w:t>
+              <w:t>Alas Tebal Nyaman &amp; Meja Lipat</w:t>
             </w:r>
           </w:p>
         </w:tc>
@@ -2014,7 +2014,7 @@
                 <w:color w:val="243B53"/>
                 <w:sz w:val="16"/>
               </w:rPr>
-              <w:t>2 Karpet spons tebal waterproof 2x2m, tikar rapi, 4 meja lipat pendek</w:t>
+              <w:t>2 Karpet busa/spons tebal empuk waterproof 2x2m, tikar rapi, 4-6 meja lipat portabel</w:t>
             </w:r>
           </w:p>
         </w:tc>
@@ -6629,7 +6629,7 @@
                 <w:color w:val="B45309"/>
                 <w:sz w:val="18"/>
               </w:rPr>
-              <w:t xml:space="preserve">• Roadmap Ekspansi Fase 2: </w:t>
+              <w:t xml:space="preserve">• Roadmap Ekspansi Bertahap: </w:t>
             </w:r>
             <w:r>
               <w:rPr>
@@ -6637,7 +6637,7 @@
                 <w:color w:val="243B53"/>
                 <w:sz w:val="18"/>
               </w:rPr>
-              <w:t>Penambahan kursi lipat camping dan mesin kopi espresso komersial akan didanai mandiri dari laba ditahan operasional setelah 3 bulan berjalan stabil, tanpa membebani modal awal investor.</w:t>
+              <w:t>Fasilitas kursi lipat camping dan mesin espresso komersial sengaja ditunda di awal. Pengadaan fasilitas lanjutan tersebut akan didanai mandiri dari laba ditahan operasional setelah 3 bulan berjalan stabil, tanpa membebani modal awal investor.</w:t>
             </w:r>
           </w:p>
         </w:tc>

</xml_diff>

<commit_message>
feat: scale Jangkar Kopi capital to Rp 15M lean MVP with 6.25-month BEP
</commit_message>
<xml_diff>
--- a/PROPOSAL_INVESTASI_JANGKAR_KOPI.docx
+++ b/PROPOSAL_INVESTASI_JANGKAR_KOPI.docx
@@ -148,7 +148,7 @@
                 <w:color w:val="243B53"/>
                 <w:sz w:val="18"/>
               </w:rPr>
-              <w:t>Rp 10.000.000 (Sepuluh Juta Rupiah) — Hemat, Efisien &amp; Tervalidasi.</w:t>
+              <w:t>Rp 15.000.000 (Lima Belas Juta Rupiah) — Seimbang, Kokoh &amp; Terukur.</w:t>
             </w:r>
           </w:p>
           <w:p>
@@ -171,7 +171,7 @@
                 <w:color w:val="243B53"/>
                 <w:sz w:val="18"/>
               </w:rPr>
-              <w:t>1 Investor Penuh (Rp 10 Jt)  |  2 Slot (@ Rp 5 Jt)  |  4 Slot Sindikasi (@ Rp 2,5 Jt).</w:t>
+              <w:t>1 Mitra Penuh (Rp 15 Jt)  |  2 Slot (@ Rp 7,5 Jt)  |  3 Slot (@ Rp 5 Jt)  |  5 Slot (@ Rp 3 Jt).</w:t>
             </w:r>
           </w:p>
           <w:p>
@@ -240,7 +240,7 @@
                 <w:color w:val="243B53"/>
                 <w:sz w:val="18"/>
               </w:rPr>
-              <w:t>4,1 Bulan (~4 Bulan) pada Skenario Moderat; 2,5 Bulan pada Skenario Agresif.</w:t>
+              <w:t>6,25 Bulan (~6 Bulan) pada Skenario Moderat; 3,8 Bulan pada Skenario Agresif.</w:t>
             </w:r>
           </w:p>
           <w:p>
@@ -1275,7 +1275,7 @@
           <w:color w:val="102A43"/>
           <w:sz w:val="26"/>
         </w:rPr>
-        <w:t>4. RENCANA ANGGARAN BIAYA &amp; ALOKASI MODAL LEAN MVP (RP 10 JT)</w:t>
+        <w:t>4. RENCANA ANGGARAN BIAYA &amp; ALOKASI MODAL LEAN MVP (RP 15 JT)</w:t>
       </w:r>
     </w:p>
     <w:p>
@@ -1291,7 +1291,7 @@
           <w:color w:val="243B53"/>
           <w:sz w:val="19"/>
         </w:rPr>
-        <w:t>Total kebutuhan belanja modal (CAPEX) dan modal kerja awal Jangkar Kopi dialokasikan tepat sebesar Rp 10.000.000 (Sepuluh Juta Rupiah). Anggaran ini mengalokasikan sewa lahan terbuka selama 1 tahun di muka sebesar Rp 6.000.000, serta memanfaatkan sisa dana Rp 4.000.000 secara cermat dan efisien untuk pengadaan gerobak fungsional, panggangan arang, peralatan dapur wedangan, paket lesehan, wadah saji, stok awal, dan cadangan kas darurat.</w:t>
+        <w:t>Total kebutuhan belanja modal (CAPEX) dan modal kerja awal Jangkar Kopi dialokasikan tepat sebesar Rp 15.000.000 (Lima Belas Juta Rupiah). Anggaran ini mengalokasikan sewa lahan terbuka selama 1 tahun di muka sebesar Rp 6.000.000 (40%), serta memanfaatkan sisa dana Rp 9.000.000 (60%) secara optimal untuk penyiapan kanopi terpal pelindung cuaca, gerobak kayu custom etalase kaca, panggangan arang batok, peralatan dapur wedangan, fasilitas lesehan alas tebal nyaman, wadah saji piring seng, instalasi listrik festoon, stok bahan baku awal yang memadai, dan cadangan kas darurat yang kokoh.</w:t>
       </w:r>
     </w:p>
     <w:p>
@@ -1306,7 +1306,7 @@
           <w:color w:val="B45309"/>
           <w:sz w:val="21"/>
         </w:rPr>
-        <w:t>4.1 Tabel Rincian Belanja Modal Awal (Tepat Rp 10.000.000)</w:t>
+        <w:t>4.1 Tabel Rincian Belanja Modal Awal (Tepat Rp 15.000.000)</w:t>
       </w:r>
     </w:p>
     <w:tbl>
@@ -1593,7 +1593,7 @@
                 <w:color w:val="243B53"/>
                 <w:sz w:val="16"/>
               </w:rPr>
-              <w:t>Gerobak Angkringan Kayu Fungsional</w:t>
+              <w:t>Penyiapan Lahan &amp; Kanopi Terpal</w:t>
             </w:r>
           </w:p>
         </w:tc>
@@ -1624,267 +1624,7 @@
                 <w:color w:val="243B53"/>
                 <w:sz w:val="16"/>
               </w:rPr>
-              <w:t>Gerobak kayu custom 150x75 cm + etalase kaca display sate frozen food higienis</w:t>
-            </w:r>
-          </w:p>
-        </w:tc>
-        <w:tc>
-          <w:tcPr>
-            <w:tcW w:type="dxa" w:w="1247"/>
-            <w:shd w:val="clear" w:color="auto" w:fill="FFFFFF"/>
-            <w:tcMar>
-              <w:top w:w="32" w:type="dxa"/>
-              <w:bottom w:w="32" w:type="dxa"/>
-              <w:left w:w="60" w:type="dxa"/>
-              <w:right w:w="60" w:type="dxa"/>
-            </w:tcMar>
-            <w:tcBorders>
-              <w:top w:val="none"/>
-              <w:left w:val="none"/>
-              <w:bottom w:val="single" w:sz="4" w:space="0" w:color="D9E2EC"/>
-              <w:right w:val="none"/>
-            </w:tcBorders>
-          </w:tcPr>
-          <w:p>
-            <w:pPr>
-              <w:jc w:val="center"/>
-            </w:pPr>
-            <w:r>
-              <w:rPr>
-                <w:rFonts w:ascii="Arial" w:hAnsi="Arial"/>
-                <w:color w:val="243B53"/>
-                <w:sz w:val="16"/>
-              </w:rPr>
-              <w:t>1 unit</w:t>
-            </w:r>
-          </w:p>
-        </w:tc>
-        <w:tc>
-          <w:tcPr>
-            <w:tcW w:type="dxa" w:w="2041"/>
-            <w:shd w:val="clear" w:color="auto" w:fill="FFFFFF"/>
-            <w:tcMar>
-              <w:top w:w="32" w:type="dxa"/>
-              <w:bottom w:w="32" w:type="dxa"/>
-              <w:left w:w="60" w:type="dxa"/>
-              <w:right w:w="60" w:type="dxa"/>
-            </w:tcMar>
-            <w:tcBorders>
-              <w:top w:val="none"/>
-              <w:left w:val="none"/>
-              <w:bottom w:val="single" w:sz="4" w:space="0" w:color="D9E2EC"/>
-              <w:right w:val="none"/>
-            </w:tcBorders>
-          </w:tcPr>
-          <w:p>
-            <w:pPr>
-              <w:jc w:val="right"/>
-            </w:pPr>
-            <w:r>
-              <w:rPr>
-                <w:rFonts w:ascii="Arial" w:hAnsi="Arial"/>
-                <w:color w:val="243B53"/>
-                <w:sz w:val="16"/>
-              </w:rPr>
-              <w:t>Rp 1.500.000</w:t>
-            </w:r>
-          </w:p>
-        </w:tc>
-      </w:tr>
-      <w:tr>
-        <w:trPr>
-          <w:cantSplit/>
-        </w:trPr>
-        <w:tc>
-          <w:tcPr>
-            <w:tcW w:type="dxa" w:w="2721"/>
-            <w:shd w:val="clear" w:color="auto" w:fill="F0F4F8"/>
-            <w:tcMar>
-              <w:top w:w="32" w:type="dxa"/>
-              <w:bottom w:w="32" w:type="dxa"/>
-              <w:left w:w="60" w:type="dxa"/>
-              <w:right w:w="60" w:type="dxa"/>
-            </w:tcMar>
-            <w:tcBorders>
-              <w:top w:val="none"/>
-              <w:left w:val="none"/>
-              <w:bottom w:val="single" w:sz="4" w:space="0" w:color="D9E2EC"/>
-              <w:right w:val="none"/>
-            </w:tcBorders>
-          </w:tcPr>
-          <w:p>
-            <w:pPr>
-              <w:jc w:val="left"/>
-            </w:pPr>
-            <w:r>
-              <w:rPr>
-                <w:rFonts w:ascii="Arial" w:hAnsi="Arial"/>
-                <w:b/>
-                <w:color w:val="243B53"/>
-                <w:sz w:val="16"/>
-              </w:rPr>
-              <w:t>Panggangan Arang Stainless &amp; Blower</w:t>
-            </w:r>
-          </w:p>
-        </w:tc>
-        <w:tc>
-          <w:tcPr>
-            <w:tcW w:type="dxa" w:w="3685"/>
-            <w:shd w:val="clear" w:color="auto" w:fill="F0F4F8"/>
-            <w:tcMar>
-              <w:top w:w="32" w:type="dxa"/>
-              <w:bottom w:w="32" w:type="dxa"/>
-              <w:left w:w="60" w:type="dxa"/>
-              <w:right w:w="60" w:type="dxa"/>
-            </w:tcMar>
-            <w:tcBorders>
-              <w:top w:val="none"/>
-              <w:left w:val="none"/>
-              <w:bottom w:val="single" w:sz="4" w:space="0" w:color="D9E2EC"/>
-              <w:right w:val="none"/>
-            </w:tcBorders>
-          </w:tcPr>
-          <w:p>
-            <w:pPr>
-              <w:jc w:val="left"/>
-            </w:pPr>
-            <w:r>
-              <w:rPr>
-                <w:rFonts w:ascii="Arial" w:hAnsi="Arial"/>
-                <w:color w:val="243B53"/>
-                <w:sz w:val="16"/>
-              </w:rPr>
-              <w:t>Panggangan sate arang batok panjang 65 cm, kisi stainless, blower DC mini, jepitan</w:t>
-            </w:r>
-          </w:p>
-        </w:tc>
-        <w:tc>
-          <w:tcPr>
-            <w:tcW w:type="dxa" w:w="1247"/>
-            <w:shd w:val="clear" w:color="auto" w:fill="F0F4F8"/>
-            <w:tcMar>
-              <w:top w:w="32" w:type="dxa"/>
-              <w:bottom w:w="32" w:type="dxa"/>
-              <w:left w:w="60" w:type="dxa"/>
-              <w:right w:w="60" w:type="dxa"/>
-            </w:tcMar>
-            <w:tcBorders>
-              <w:top w:val="none"/>
-              <w:left w:val="none"/>
-              <w:bottom w:val="single" w:sz="4" w:space="0" w:color="D9E2EC"/>
-              <w:right w:val="none"/>
-            </w:tcBorders>
-          </w:tcPr>
-          <w:p>
-            <w:pPr>
-              <w:jc w:val="center"/>
-            </w:pPr>
-            <w:r>
-              <w:rPr>
-                <w:rFonts w:ascii="Arial" w:hAnsi="Arial"/>
-                <w:color w:val="243B53"/>
-                <w:sz w:val="16"/>
-              </w:rPr>
-              <w:t>1 set</w:t>
-            </w:r>
-          </w:p>
-        </w:tc>
-        <w:tc>
-          <w:tcPr>
-            <w:tcW w:type="dxa" w:w="2041"/>
-            <w:shd w:val="clear" w:color="auto" w:fill="F0F4F8"/>
-            <w:tcMar>
-              <w:top w:w="32" w:type="dxa"/>
-              <w:bottom w:w="32" w:type="dxa"/>
-              <w:left w:w="60" w:type="dxa"/>
-              <w:right w:w="60" w:type="dxa"/>
-            </w:tcMar>
-            <w:tcBorders>
-              <w:top w:val="none"/>
-              <w:left w:val="none"/>
-              <w:bottom w:val="single" w:sz="4" w:space="0" w:color="D9E2EC"/>
-              <w:right w:val="none"/>
-            </w:tcBorders>
-          </w:tcPr>
-          <w:p>
-            <w:pPr>
-              <w:jc w:val="right"/>
-            </w:pPr>
-            <w:r>
-              <w:rPr>
-                <w:rFonts w:ascii="Arial" w:hAnsi="Arial"/>
-                <w:color w:val="243B53"/>
-                <w:sz w:val="16"/>
-              </w:rPr>
-              <w:t>Rp 350.000</w:t>
-            </w:r>
-          </w:p>
-        </w:tc>
-      </w:tr>
-      <w:tr>
-        <w:trPr>
-          <w:cantSplit/>
-        </w:trPr>
-        <w:tc>
-          <w:tcPr>
-            <w:tcW w:type="dxa" w:w="2721"/>
-            <w:shd w:val="clear" w:color="auto" w:fill="FFFFFF"/>
-            <w:tcMar>
-              <w:top w:w="32" w:type="dxa"/>
-              <w:bottom w:w="32" w:type="dxa"/>
-              <w:left w:w="60" w:type="dxa"/>
-              <w:right w:w="60" w:type="dxa"/>
-            </w:tcMar>
-            <w:tcBorders>
-              <w:top w:val="none"/>
-              <w:left w:val="none"/>
-              <w:bottom w:val="single" w:sz="4" w:space="0" w:color="D9E2EC"/>
-              <w:right w:val="none"/>
-            </w:tcBorders>
-          </w:tcPr>
-          <w:p>
-            <w:pPr>
-              <w:jc w:val="left"/>
-            </w:pPr>
-            <w:r>
-              <w:rPr>
-                <w:rFonts w:ascii="Arial" w:hAnsi="Arial"/>
-                <w:b/>
-                <w:color w:val="243B53"/>
-                <w:sz w:val="16"/>
-              </w:rPr>
-              <w:t>Peralatan Masak Dapur &amp; Wedangan</w:t>
-            </w:r>
-          </w:p>
-        </w:tc>
-        <w:tc>
-          <w:tcPr>
-            <w:tcW w:type="dxa" w:w="3685"/>
-            <w:shd w:val="clear" w:color="auto" w:fill="FFFFFF"/>
-            <w:tcMar>
-              <w:top w:w="32" w:type="dxa"/>
-              <w:bottom w:w="32" w:type="dxa"/>
-              <w:left w:w="60" w:type="dxa"/>
-              <w:right w:w="60" w:type="dxa"/>
-            </w:tcMar>
-            <w:tcBorders>
-              <w:top w:val="none"/>
-              <w:left w:val="none"/>
-              <w:bottom w:val="single" w:sz="4" w:space="0" w:color="D9E2EC"/>
-              <w:right w:val="none"/>
-            </w:tcBorders>
-          </w:tcPr>
-          <w:p>
-            <w:pPr>
-              <w:jc w:val="left"/>
-            </w:pPr>
-            <w:r>
-              <w:rPr>
-                <w:rFonts w:ascii="Arial" w:hAnsi="Arial"/>
-                <w:color w:val="243B53"/>
-                <w:sz w:val="16"/>
-              </w:rPr>
-              <w:t>Kompor gas 1 tungku, wajan baja mendoan, ceret wedang stainless, tabung LPG 3kg</w:t>
+              <w:t>Kanopi terpal all-weather pelindung embun/gerimis &amp; perataan koral split</w:t>
             </w:r>
           </w:p>
         </w:tc>
@@ -1946,7 +1686,267 @@
                 <w:color w:val="243B53"/>
                 <w:sz w:val="16"/>
               </w:rPr>
-              <w:t>Rp 450.000</w:t>
+              <w:t>Rp 1.000.000</w:t>
+            </w:r>
+          </w:p>
+        </w:tc>
+      </w:tr>
+      <w:tr>
+        <w:trPr>
+          <w:cantSplit/>
+        </w:trPr>
+        <w:tc>
+          <w:tcPr>
+            <w:tcW w:type="dxa" w:w="2721"/>
+            <w:shd w:val="clear" w:color="auto" w:fill="F0F4F8"/>
+            <w:tcMar>
+              <w:top w:w="32" w:type="dxa"/>
+              <w:bottom w:w="32" w:type="dxa"/>
+              <w:left w:w="60" w:type="dxa"/>
+              <w:right w:w="60" w:type="dxa"/>
+            </w:tcMar>
+            <w:tcBorders>
+              <w:top w:val="none"/>
+              <w:left w:val="none"/>
+              <w:bottom w:val="single" w:sz="4" w:space="0" w:color="D9E2EC"/>
+              <w:right w:val="none"/>
+            </w:tcBorders>
+          </w:tcPr>
+          <w:p>
+            <w:pPr>
+              <w:jc w:val="left"/>
+            </w:pPr>
+            <w:r>
+              <w:rPr>
+                <w:rFonts w:ascii="Arial" w:hAnsi="Arial"/>
+                <w:b/>
+                <w:color w:val="243B53"/>
+                <w:sz w:val="16"/>
+              </w:rPr>
+              <w:t>Gerobak Angkringan Kayu Custom</w:t>
+            </w:r>
+          </w:p>
+        </w:tc>
+        <w:tc>
+          <w:tcPr>
+            <w:tcW w:type="dxa" w:w="3685"/>
+            <w:shd w:val="clear" w:color="auto" w:fill="F0F4F8"/>
+            <w:tcMar>
+              <w:top w:w="32" w:type="dxa"/>
+              <w:bottom w:w="32" w:type="dxa"/>
+              <w:left w:w="60" w:type="dxa"/>
+              <w:right w:w="60" w:type="dxa"/>
+            </w:tcMar>
+            <w:tcBorders>
+              <w:top w:val="none"/>
+              <w:left w:val="none"/>
+              <w:bottom w:val="single" w:sz="4" w:space="0" w:color="D9E2EC"/>
+              <w:right w:val="none"/>
+            </w:tcBorders>
+          </w:tcPr>
+          <w:p>
+            <w:pPr>
+              <w:jc w:val="left"/>
+            </w:pPr>
+            <w:r>
+              <w:rPr>
+                <w:rFonts w:ascii="Arial" w:hAnsi="Arial"/>
+                <w:color w:val="243B53"/>
+                <w:sz w:val="16"/>
+              </w:rPr>
+              <w:t>Gerobak kayu custom 160x75 cm + etalase kaca display sate frozen food</w:t>
+            </w:r>
+          </w:p>
+        </w:tc>
+        <w:tc>
+          <w:tcPr>
+            <w:tcW w:type="dxa" w:w="1247"/>
+            <w:shd w:val="clear" w:color="auto" w:fill="F0F4F8"/>
+            <w:tcMar>
+              <w:top w:w="32" w:type="dxa"/>
+              <w:bottom w:w="32" w:type="dxa"/>
+              <w:left w:w="60" w:type="dxa"/>
+              <w:right w:w="60" w:type="dxa"/>
+            </w:tcMar>
+            <w:tcBorders>
+              <w:top w:val="none"/>
+              <w:left w:val="none"/>
+              <w:bottom w:val="single" w:sz="4" w:space="0" w:color="D9E2EC"/>
+              <w:right w:val="none"/>
+            </w:tcBorders>
+          </w:tcPr>
+          <w:p>
+            <w:pPr>
+              <w:jc w:val="center"/>
+            </w:pPr>
+            <w:r>
+              <w:rPr>
+                <w:rFonts w:ascii="Arial" w:hAnsi="Arial"/>
+                <w:color w:val="243B53"/>
+                <w:sz w:val="16"/>
+              </w:rPr>
+              <w:t>1 unit</w:t>
+            </w:r>
+          </w:p>
+        </w:tc>
+        <w:tc>
+          <w:tcPr>
+            <w:tcW w:type="dxa" w:w="2041"/>
+            <w:shd w:val="clear" w:color="auto" w:fill="F0F4F8"/>
+            <w:tcMar>
+              <w:top w:w="32" w:type="dxa"/>
+              <w:bottom w:w="32" w:type="dxa"/>
+              <w:left w:w="60" w:type="dxa"/>
+              <w:right w:w="60" w:type="dxa"/>
+            </w:tcMar>
+            <w:tcBorders>
+              <w:top w:val="none"/>
+              <w:left w:val="none"/>
+              <w:bottom w:val="single" w:sz="4" w:space="0" w:color="D9E2EC"/>
+              <w:right w:val="none"/>
+            </w:tcBorders>
+          </w:tcPr>
+          <w:p>
+            <w:pPr>
+              <w:jc w:val="right"/>
+            </w:pPr>
+            <w:r>
+              <w:rPr>
+                <w:rFonts w:ascii="Arial" w:hAnsi="Arial"/>
+                <w:color w:val="243B53"/>
+                <w:sz w:val="16"/>
+              </w:rPr>
+              <w:t>Rp 2.000.000</w:t>
+            </w:r>
+          </w:p>
+        </w:tc>
+      </w:tr>
+      <w:tr>
+        <w:trPr>
+          <w:cantSplit/>
+        </w:trPr>
+        <w:tc>
+          <w:tcPr>
+            <w:tcW w:type="dxa" w:w="2721"/>
+            <w:shd w:val="clear" w:color="auto" w:fill="FFFFFF"/>
+            <w:tcMar>
+              <w:top w:w="32" w:type="dxa"/>
+              <w:bottom w:w="32" w:type="dxa"/>
+              <w:left w:w="60" w:type="dxa"/>
+              <w:right w:w="60" w:type="dxa"/>
+            </w:tcMar>
+            <w:tcBorders>
+              <w:top w:val="none"/>
+              <w:left w:val="none"/>
+              <w:bottom w:val="single" w:sz="4" w:space="0" w:color="D9E2EC"/>
+              <w:right w:val="none"/>
+            </w:tcBorders>
+          </w:tcPr>
+          <w:p>
+            <w:pPr>
+              <w:jc w:val="left"/>
+            </w:pPr>
+            <w:r>
+              <w:rPr>
+                <w:rFonts w:ascii="Arial" w:hAnsi="Arial"/>
+                <w:b/>
+                <w:color w:val="243B53"/>
+                <w:sz w:val="16"/>
+              </w:rPr>
+              <w:t>Panggangan Arang Stainless &amp; Dapur</w:t>
+            </w:r>
+          </w:p>
+        </w:tc>
+        <w:tc>
+          <w:tcPr>
+            <w:tcW w:type="dxa" w:w="3685"/>
+            <w:shd w:val="clear" w:color="auto" w:fill="FFFFFF"/>
+            <w:tcMar>
+              <w:top w:w="32" w:type="dxa"/>
+              <w:bottom w:w="32" w:type="dxa"/>
+              <w:left w:w="60" w:type="dxa"/>
+              <w:right w:w="60" w:type="dxa"/>
+            </w:tcMar>
+            <w:tcBorders>
+              <w:top w:val="none"/>
+              <w:left w:val="none"/>
+              <w:bottom w:val="single" w:sz="4" w:space="0" w:color="D9E2EC"/>
+              <w:right w:val="none"/>
+            </w:tcBorders>
+          </w:tcPr>
+          <w:p>
+            <w:pPr>
+              <w:jc w:val="left"/>
+            </w:pPr>
+            <w:r>
+              <w:rPr>
+                <w:rFonts w:ascii="Arial" w:hAnsi="Arial"/>
+                <w:color w:val="243B53"/>
+                <w:sz w:val="16"/>
+              </w:rPr>
+              <w:t>Panggangan arang 65cm, blower DC, kompor gas, wajan mendoan, ceret, LPG</w:t>
+            </w:r>
+          </w:p>
+        </w:tc>
+        <w:tc>
+          <w:tcPr>
+            <w:tcW w:type="dxa" w:w="1247"/>
+            <w:shd w:val="clear" w:color="auto" w:fill="FFFFFF"/>
+            <w:tcMar>
+              <w:top w:w="32" w:type="dxa"/>
+              <w:bottom w:w="32" w:type="dxa"/>
+              <w:left w:w="60" w:type="dxa"/>
+              <w:right w:w="60" w:type="dxa"/>
+            </w:tcMar>
+            <w:tcBorders>
+              <w:top w:val="none"/>
+              <w:left w:val="none"/>
+              <w:bottom w:val="single" w:sz="4" w:space="0" w:color="D9E2EC"/>
+              <w:right w:val="none"/>
+            </w:tcBorders>
+          </w:tcPr>
+          <w:p>
+            <w:pPr>
+              <w:jc w:val="center"/>
+            </w:pPr>
+            <w:r>
+              <w:rPr>
+                <w:rFonts w:ascii="Arial" w:hAnsi="Arial"/>
+                <w:color w:val="243B53"/>
+                <w:sz w:val="16"/>
+              </w:rPr>
+              <w:t>1 paket</w:t>
+            </w:r>
+          </w:p>
+        </w:tc>
+        <w:tc>
+          <w:tcPr>
+            <w:tcW w:type="dxa" w:w="2041"/>
+            <w:shd w:val="clear" w:color="auto" w:fill="FFFFFF"/>
+            <w:tcMar>
+              <w:top w:w="32" w:type="dxa"/>
+              <w:bottom w:w="32" w:type="dxa"/>
+              <w:left w:w="60" w:type="dxa"/>
+              <w:right w:w="60" w:type="dxa"/>
+            </w:tcMar>
+            <w:tcBorders>
+              <w:top w:val="none"/>
+              <w:left w:val="none"/>
+              <w:bottom w:val="single" w:sz="4" w:space="0" w:color="D9E2EC"/>
+              <w:right w:val="none"/>
+            </w:tcBorders>
+          </w:tcPr>
+          <w:p>
+            <w:pPr>
+              <w:jc w:val="right"/>
+            </w:pPr>
+            <w:r>
+              <w:rPr>
+                <w:rFonts w:ascii="Arial" w:hAnsi="Arial"/>
+                <w:color w:val="243B53"/>
+                <w:sz w:val="16"/>
+              </w:rPr>
+              <w:t>Rp 1.000.000</w:t>
             </w:r>
           </w:p>
         </w:tc>
@@ -2014,7 +2014,7 @@
                 <w:color w:val="243B53"/>
                 <w:sz w:val="16"/>
               </w:rPr>
-              <w:t>2 Karpet busa/spons tebal empuk waterproof 2x2m, tikar rapi, 4-6 meja lipat portabel</w:t>
+              <w:t>3 Karpet busa/spons tebal empuk waterproof 2x2m, tikar rapi, 6 meja portabel</w:t>
             </w:r>
           </w:p>
         </w:tc>
@@ -2076,7 +2076,7 @@
                 <w:color w:val="243B53"/>
                 <w:sz w:val="16"/>
               </w:rPr>
-              <w:t>Rp 500.000</w:t>
+              <w:t>Rp 800.000</w:t>
             </w:r>
           </w:p>
         </w:tc>
@@ -2144,267 +2144,7 @@
                 <w:color w:val="243B53"/>
                 <w:sz w:val="16"/>
               </w:rPr>
-              <w:t>Cooler box insulasi sate frozen food &amp; susu, piring seng blirik, wadah saji</w:t>
-            </w:r>
-          </w:p>
-        </w:tc>
-        <w:tc>
-          <w:tcPr>
-            <w:tcW w:type="dxa" w:w="1247"/>
-            <w:shd w:val="clear" w:color="auto" w:fill="FFFFFF"/>
-            <w:tcMar>
-              <w:top w:w="32" w:type="dxa"/>
-              <w:bottom w:w="32" w:type="dxa"/>
-              <w:left w:w="60" w:type="dxa"/>
-              <w:right w:w="60" w:type="dxa"/>
-            </w:tcMar>
-            <w:tcBorders>
-              <w:top w:val="none"/>
-              <w:left w:val="none"/>
-              <w:bottom w:val="single" w:sz="4" w:space="0" w:color="D9E2EC"/>
-              <w:right w:val="none"/>
-            </w:tcBorders>
-          </w:tcPr>
-          <w:p>
-            <w:pPr>
-              <w:jc w:val="center"/>
-            </w:pPr>
-            <w:r>
-              <w:rPr>
-                <w:rFonts w:ascii="Arial" w:hAnsi="Arial"/>
-                <w:color w:val="243B53"/>
-                <w:sz w:val="16"/>
-              </w:rPr>
-              <w:t>1 paket</w:t>
-            </w:r>
-          </w:p>
-        </w:tc>
-        <w:tc>
-          <w:tcPr>
-            <w:tcW w:type="dxa" w:w="2041"/>
-            <w:shd w:val="clear" w:color="auto" w:fill="FFFFFF"/>
-            <w:tcMar>
-              <w:top w:w="32" w:type="dxa"/>
-              <w:bottom w:w="32" w:type="dxa"/>
-              <w:left w:w="60" w:type="dxa"/>
-              <w:right w:w="60" w:type="dxa"/>
-            </w:tcMar>
-            <w:tcBorders>
-              <w:top w:val="none"/>
-              <w:left w:val="none"/>
-              <w:bottom w:val="single" w:sz="4" w:space="0" w:color="D9E2EC"/>
-              <w:right w:val="none"/>
-            </w:tcBorders>
-          </w:tcPr>
-          <w:p>
-            <w:pPr>
-              <w:jc w:val="right"/>
-            </w:pPr>
-            <w:r>
-              <w:rPr>
-                <w:rFonts w:ascii="Arial" w:hAnsi="Arial"/>
-                <w:color w:val="243B53"/>
-                <w:sz w:val="16"/>
-              </w:rPr>
-              <w:t>Rp 400.000</w:t>
-            </w:r>
-          </w:p>
-        </w:tc>
-      </w:tr>
-      <w:tr>
-        <w:trPr>
-          <w:cantSplit/>
-        </w:trPr>
-        <w:tc>
-          <w:tcPr>
-            <w:tcW w:type="dxa" w:w="2721"/>
-            <w:shd w:val="clear" w:color="auto" w:fill="F0F4F8"/>
-            <w:tcMar>
-              <w:top w:w="32" w:type="dxa"/>
-              <w:bottom w:w="32" w:type="dxa"/>
-              <w:left w:w="60" w:type="dxa"/>
-              <w:right w:w="60" w:type="dxa"/>
-            </w:tcMar>
-            <w:tcBorders>
-              <w:top w:val="none"/>
-              <w:left w:val="none"/>
-              <w:bottom w:val="single" w:sz="4" w:space="0" w:color="D9E2EC"/>
-              <w:right w:val="none"/>
-            </w:tcBorders>
-          </w:tcPr>
-          <w:p>
-            <w:pPr>
-              <w:jc w:val="left"/>
-            </w:pPr>
-            <w:r>
-              <w:rPr>
-                <w:rFonts w:ascii="Arial" w:hAnsi="Arial"/>
-                <w:b/>
-                <w:color w:val="243B53"/>
-                <w:sz w:val="16"/>
-              </w:rPr>
-              <w:t>Instalasi Listrik 900VA &amp; Festoon</w:t>
-            </w:r>
-          </w:p>
-        </w:tc>
-        <w:tc>
-          <w:tcPr>
-            <w:tcW w:type="dxa" w:w="3685"/>
-            <w:shd w:val="clear" w:color="auto" w:fill="F0F4F8"/>
-            <w:tcMar>
-              <w:top w:w="32" w:type="dxa"/>
-              <w:bottom w:w="32" w:type="dxa"/>
-              <w:left w:w="60" w:type="dxa"/>
-              <w:right w:w="60" w:type="dxa"/>
-            </w:tcMar>
-            <w:tcBorders>
-              <w:top w:val="none"/>
-              <w:left w:val="none"/>
-              <w:bottom w:val="single" w:sz="4" w:space="0" w:color="D9E2EC"/>
-              <w:right w:val="none"/>
-            </w:tcBorders>
-          </w:tcPr>
-          <w:p>
-            <w:pPr>
-              <w:jc w:val="left"/>
-            </w:pPr>
-            <w:r>
-              <w:rPr>
-                <w:rFonts w:ascii="Arial" w:hAnsi="Arial"/>
-                <w:color w:val="243B53"/>
-                <w:sz w:val="16"/>
-              </w:rPr>
-              <w:t>Kabel outdoor waterproof, stopkontak cas hp, lampu gantung warm white</w:t>
-            </w:r>
-          </w:p>
-        </w:tc>
-        <w:tc>
-          <w:tcPr>
-            <w:tcW w:type="dxa" w:w="1247"/>
-            <w:shd w:val="clear" w:color="auto" w:fill="F0F4F8"/>
-            <w:tcMar>
-              <w:top w:w="32" w:type="dxa"/>
-              <w:bottom w:w="32" w:type="dxa"/>
-              <w:left w:w="60" w:type="dxa"/>
-              <w:right w:w="60" w:type="dxa"/>
-            </w:tcMar>
-            <w:tcBorders>
-              <w:top w:val="none"/>
-              <w:left w:val="none"/>
-              <w:bottom w:val="single" w:sz="4" w:space="0" w:color="D9E2EC"/>
-              <w:right w:val="none"/>
-            </w:tcBorders>
-          </w:tcPr>
-          <w:p>
-            <w:pPr>
-              <w:jc w:val="center"/>
-            </w:pPr>
-            <w:r>
-              <w:rPr>
-                <w:rFonts w:ascii="Arial" w:hAnsi="Arial"/>
-                <w:color w:val="243B53"/>
-                <w:sz w:val="16"/>
-              </w:rPr>
-              <w:t>1 paket</w:t>
-            </w:r>
-          </w:p>
-        </w:tc>
-        <w:tc>
-          <w:tcPr>
-            <w:tcW w:type="dxa" w:w="2041"/>
-            <w:shd w:val="clear" w:color="auto" w:fill="F0F4F8"/>
-            <w:tcMar>
-              <w:top w:w="32" w:type="dxa"/>
-              <w:bottom w:w="32" w:type="dxa"/>
-              <w:left w:w="60" w:type="dxa"/>
-              <w:right w:w="60" w:type="dxa"/>
-            </w:tcMar>
-            <w:tcBorders>
-              <w:top w:val="none"/>
-              <w:left w:val="none"/>
-              <w:bottom w:val="single" w:sz="4" w:space="0" w:color="D9E2EC"/>
-              <w:right w:val="none"/>
-            </w:tcBorders>
-          </w:tcPr>
-          <w:p>
-            <w:pPr>
-              <w:jc w:val="right"/>
-            </w:pPr>
-            <w:r>
-              <w:rPr>
-                <w:rFonts w:ascii="Arial" w:hAnsi="Arial"/>
-                <w:color w:val="243B53"/>
-                <w:sz w:val="16"/>
-              </w:rPr>
-              <w:t>Rp 200.000</w:t>
-            </w:r>
-          </w:p>
-        </w:tc>
-      </w:tr>
-      <w:tr>
-        <w:trPr>
-          <w:cantSplit/>
-        </w:trPr>
-        <w:tc>
-          <w:tcPr>
-            <w:tcW w:type="dxa" w:w="2721"/>
-            <w:shd w:val="clear" w:color="auto" w:fill="FFFFFF"/>
-            <w:tcMar>
-              <w:top w:w="32" w:type="dxa"/>
-              <w:bottom w:w="32" w:type="dxa"/>
-              <w:left w:w="60" w:type="dxa"/>
-              <w:right w:w="60" w:type="dxa"/>
-            </w:tcMar>
-            <w:tcBorders>
-              <w:top w:val="none"/>
-              <w:left w:val="none"/>
-              <w:bottom w:val="single" w:sz="4" w:space="0" w:color="D9E2EC"/>
-              <w:right w:val="none"/>
-            </w:tcBorders>
-          </w:tcPr>
-          <w:p>
-            <w:pPr>
-              <w:jc w:val="left"/>
-            </w:pPr>
-            <w:r>
-              <w:rPr>
-                <w:rFonts w:ascii="Arial" w:hAnsi="Arial"/>
-                <w:b/>
-                <w:color w:val="243B53"/>
-                <w:sz w:val="16"/>
-              </w:rPr>
-              <w:t>Stok Bahan Baku Awal (Inventory)</w:t>
-            </w:r>
-          </w:p>
-        </w:tc>
-        <w:tc>
-          <w:tcPr>
-            <w:tcW w:type="dxa" w:w="3685"/>
-            <w:shd w:val="clear" w:color="auto" w:fill="FFFFFF"/>
-            <w:tcMar>
-              <w:top w:w="32" w:type="dxa"/>
-              <w:bottom w:w="32" w:type="dxa"/>
-              <w:left w:w="60" w:type="dxa"/>
-              <w:right w:w="60" w:type="dxa"/>
-            </w:tcMar>
-            <w:tcBorders>
-              <w:top w:val="none"/>
-              <w:left w:val="none"/>
-              <w:bottom w:val="single" w:sz="4" w:space="0" w:color="D9E2EC"/>
-              <w:right w:val="none"/>
-            </w:tcBorders>
-          </w:tcPr>
-          <w:p>
-            <w:pPr>
-              <w:jc w:val="left"/>
-            </w:pPr>
-            <w:r>
-              <w:rPr>
-                <w:rFonts w:ascii="Arial" w:hAnsi="Arial"/>
-                <w:color w:val="243B53"/>
-                <w:sz w:val="16"/>
-              </w:rPr>
-              <w:t>Aneka frozen food (dumpling, otak-otak, cumi, sosis, bakso), mendoan, kopi, sachet, susu</w:t>
+              <w:t>Cooler box 35-45L penampung frozen food &amp; susu, piring seng blirik, toples</w:t>
             </w:r>
           </w:p>
         </w:tc>
@@ -2503,7 +2243,7 @@
                 <w:color w:val="243B53"/>
                 <w:sz w:val="16"/>
               </w:rPr>
-              <w:t>Cadangan Kas Operasional (Buffer)</w:t>
+              <w:t>Instalasi Listrik, Festoon &amp; Audio</w:t>
             </w:r>
           </w:p>
         </w:tc>
@@ -2534,7 +2274,7 @@
                 <w:color w:val="243B53"/>
                 <w:sz w:val="16"/>
               </w:rPr>
-              <w:t>Dana cadangan kas darurat kontinjensi operasional &amp; likuiditas awal</w:t>
+              <w:t>Kabel outdoor waterproof, stopkontak cas hp, lampu festoon warm, mini speaker</w:t>
             </w:r>
           </w:p>
         </w:tc>
@@ -2596,7 +2336,267 @@
                 <w:color w:val="243B53"/>
                 <w:sz w:val="16"/>
               </w:rPr>
-              <w:t>Rp 400.000</w:t>
+              <w:t>Rp 600.000</w:t>
+            </w:r>
+          </w:p>
+        </w:tc>
+      </w:tr>
+      <w:tr>
+        <w:trPr>
+          <w:cantSplit/>
+        </w:trPr>
+        <w:tc>
+          <w:tcPr>
+            <w:tcW w:type="dxa" w:w="2721"/>
+            <w:shd w:val="clear" w:color="auto" w:fill="FFFFFF"/>
+            <w:tcMar>
+              <w:top w:w="32" w:type="dxa"/>
+              <w:bottom w:w="32" w:type="dxa"/>
+              <w:left w:w="60" w:type="dxa"/>
+              <w:right w:w="60" w:type="dxa"/>
+            </w:tcMar>
+            <w:tcBorders>
+              <w:top w:val="none"/>
+              <w:left w:val="none"/>
+              <w:bottom w:val="single" w:sz="4" w:space="0" w:color="D9E2EC"/>
+              <w:right w:val="none"/>
+            </w:tcBorders>
+          </w:tcPr>
+          <w:p>
+            <w:pPr>
+              <w:jc w:val="left"/>
+            </w:pPr>
+            <w:r>
+              <w:rPr>
+                <w:rFonts w:ascii="Arial" w:hAnsi="Arial"/>
+                <w:b/>
+                <w:color w:val="243B53"/>
+                <w:sz w:val="16"/>
+              </w:rPr>
+              <w:t>Stok Bahan Baku Awal (Inventory)</w:t>
+            </w:r>
+          </w:p>
+        </w:tc>
+        <w:tc>
+          <w:tcPr>
+            <w:tcW w:type="dxa" w:w="3685"/>
+            <w:shd w:val="clear" w:color="auto" w:fill="FFFFFF"/>
+            <w:tcMar>
+              <w:top w:w="32" w:type="dxa"/>
+              <w:bottom w:w="32" w:type="dxa"/>
+              <w:left w:w="60" w:type="dxa"/>
+              <w:right w:w="60" w:type="dxa"/>
+            </w:tcMar>
+            <w:tcBorders>
+              <w:top w:val="none"/>
+              <w:left w:val="none"/>
+              <w:bottom w:val="single" w:sz="4" w:space="0" w:color="D9E2EC"/>
+              <w:right w:val="none"/>
+            </w:tcBorders>
+          </w:tcPr>
+          <w:p>
+            <w:pPr>
+              <w:jc w:val="left"/>
+            </w:pPr>
+            <w:r>
+              <w:rPr>
+                <w:rFonts w:ascii="Arial" w:hAnsi="Arial"/>
+                <w:color w:val="243B53"/>
+                <w:sz w:val="16"/>
+              </w:rPr>
+              <w:t>Aneka frozen food (dumpling, otak-otak, cumi, sosis, bakso), mendoan, kopi, susu</w:t>
+            </w:r>
+          </w:p>
+        </w:tc>
+        <w:tc>
+          <w:tcPr>
+            <w:tcW w:type="dxa" w:w="1247"/>
+            <w:shd w:val="clear" w:color="auto" w:fill="FFFFFF"/>
+            <w:tcMar>
+              <w:top w:w="32" w:type="dxa"/>
+              <w:bottom w:w="32" w:type="dxa"/>
+              <w:left w:w="60" w:type="dxa"/>
+              <w:right w:w="60" w:type="dxa"/>
+            </w:tcMar>
+            <w:tcBorders>
+              <w:top w:val="none"/>
+              <w:left w:val="none"/>
+              <w:bottom w:val="single" w:sz="4" w:space="0" w:color="D9E2EC"/>
+              <w:right w:val="none"/>
+            </w:tcBorders>
+          </w:tcPr>
+          <w:p>
+            <w:pPr>
+              <w:jc w:val="center"/>
+            </w:pPr>
+            <w:r>
+              <w:rPr>
+                <w:rFonts w:ascii="Arial" w:hAnsi="Arial"/>
+                <w:color w:val="243B53"/>
+                <w:sz w:val="16"/>
+              </w:rPr>
+              <w:t>1 paket</w:t>
+            </w:r>
+          </w:p>
+        </w:tc>
+        <w:tc>
+          <w:tcPr>
+            <w:tcW w:type="dxa" w:w="2041"/>
+            <w:shd w:val="clear" w:color="auto" w:fill="FFFFFF"/>
+            <w:tcMar>
+              <w:top w:w="32" w:type="dxa"/>
+              <w:bottom w:w="32" w:type="dxa"/>
+              <w:left w:w="60" w:type="dxa"/>
+              <w:right w:w="60" w:type="dxa"/>
+            </w:tcMar>
+            <w:tcBorders>
+              <w:top w:val="none"/>
+              <w:left w:val="none"/>
+              <w:bottom w:val="single" w:sz="4" w:space="0" w:color="D9E2EC"/>
+              <w:right w:val="none"/>
+            </w:tcBorders>
+          </w:tcPr>
+          <w:p>
+            <w:pPr>
+              <w:jc w:val="right"/>
+            </w:pPr>
+            <w:r>
+              <w:rPr>
+                <w:rFonts w:ascii="Arial" w:hAnsi="Arial"/>
+                <w:color w:val="243B53"/>
+                <w:sz w:val="16"/>
+              </w:rPr>
+              <w:t>Rp 1.500.000</w:t>
+            </w:r>
+          </w:p>
+        </w:tc>
+      </w:tr>
+      <w:tr>
+        <w:trPr>
+          <w:cantSplit/>
+        </w:trPr>
+        <w:tc>
+          <w:tcPr>
+            <w:tcW w:type="dxa" w:w="2721"/>
+            <w:shd w:val="clear" w:color="auto" w:fill="F0F4F8"/>
+            <w:tcMar>
+              <w:top w:w="32" w:type="dxa"/>
+              <w:bottom w:w="32" w:type="dxa"/>
+              <w:left w:w="60" w:type="dxa"/>
+              <w:right w:w="60" w:type="dxa"/>
+            </w:tcMar>
+            <w:tcBorders>
+              <w:top w:val="none"/>
+              <w:left w:val="none"/>
+              <w:bottom w:val="single" w:sz="4" w:space="0" w:color="D9E2EC"/>
+              <w:right w:val="none"/>
+            </w:tcBorders>
+          </w:tcPr>
+          <w:p>
+            <w:pPr>
+              <w:jc w:val="left"/>
+            </w:pPr>
+            <w:r>
+              <w:rPr>
+                <w:rFonts w:ascii="Arial" w:hAnsi="Arial"/>
+                <w:b/>
+                <w:color w:val="243B53"/>
+                <w:sz w:val="16"/>
+              </w:rPr>
+              <w:t>Cadangan Kas Operasional (Buffer)</w:t>
+            </w:r>
+          </w:p>
+        </w:tc>
+        <w:tc>
+          <w:tcPr>
+            <w:tcW w:type="dxa" w:w="3685"/>
+            <w:shd w:val="clear" w:color="auto" w:fill="F0F4F8"/>
+            <w:tcMar>
+              <w:top w:w="32" w:type="dxa"/>
+              <w:bottom w:w="32" w:type="dxa"/>
+              <w:left w:w="60" w:type="dxa"/>
+              <w:right w:w="60" w:type="dxa"/>
+            </w:tcMar>
+            <w:tcBorders>
+              <w:top w:val="none"/>
+              <w:left w:val="none"/>
+              <w:bottom w:val="single" w:sz="4" w:space="0" w:color="D9E2EC"/>
+              <w:right w:val="none"/>
+            </w:tcBorders>
+          </w:tcPr>
+          <w:p>
+            <w:pPr>
+              <w:jc w:val="left"/>
+            </w:pPr>
+            <w:r>
+              <w:rPr>
+                <w:rFonts w:ascii="Arial" w:hAnsi="Arial"/>
+                <w:color w:val="243B53"/>
+                <w:sz w:val="16"/>
+              </w:rPr>
+              <w:t>Dana cadangan kas darurat kontinjensi operasional &amp; likuiditas awal 1-2 bulan</w:t>
+            </w:r>
+          </w:p>
+        </w:tc>
+        <w:tc>
+          <w:tcPr>
+            <w:tcW w:type="dxa" w:w="1247"/>
+            <w:shd w:val="clear" w:color="auto" w:fill="F0F4F8"/>
+            <w:tcMar>
+              <w:top w:w="32" w:type="dxa"/>
+              <w:bottom w:w="32" w:type="dxa"/>
+              <w:left w:w="60" w:type="dxa"/>
+              <w:right w:w="60" w:type="dxa"/>
+            </w:tcMar>
+            <w:tcBorders>
+              <w:top w:val="none"/>
+              <w:left w:val="none"/>
+              <w:bottom w:val="single" w:sz="4" w:space="0" w:color="D9E2EC"/>
+              <w:right w:val="none"/>
+            </w:tcBorders>
+          </w:tcPr>
+          <w:p>
+            <w:pPr>
+              <w:jc w:val="center"/>
+            </w:pPr>
+            <w:r>
+              <w:rPr>
+                <w:rFonts w:ascii="Arial" w:hAnsi="Arial"/>
+                <w:color w:val="243B53"/>
+                <w:sz w:val="16"/>
+              </w:rPr>
+              <w:t>1 paket</w:t>
+            </w:r>
+          </w:p>
+        </w:tc>
+        <w:tc>
+          <w:tcPr>
+            <w:tcW w:type="dxa" w:w="2041"/>
+            <w:shd w:val="clear" w:color="auto" w:fill="F0F4F8"/>
+            <w:tcMar>
+              <w:top w:w="32" w:type="dxa"/>
+              <w:bottom w:w="32" w:type="dxa"/>
+              <w:left w:w="60" w:type="dxa"/>
+              <w:right w:w="60" w:type="dxa"/>
+            </w:tcMar>
+            <w:tcBorders>
+              <w:top w:val="none"/>
+              <w:left w:val="none"/>
+              <w:bottom w:val="single" w:sz="4" w:space="0" w:color="D9E2EC"/>
+              <w:right w:val="none"/>
+            </w:tcBorders>
+          </w:tcPr>
+          <w:p>
+            <w:pPr>
+              <w:jc w:val="right"/>
+            </w:pPr>
+            <w:r>
+              <w:rPr>
+                <w:rFonts w:ascii="Arial" w:hAnsi="Arial"/>
+                <w:color w:val="243B53"/>
+                <w:sz w:val="16"/>
+              </w:rPr>
+              <w:t>Rp 1.500.000</w:t>
             </w:r>
           </w:p>
         </w:tc>
@@ -2703,7 +2703,7 @@
                 <w:color w:val="102A43"/>
                 <w:sz w:val="18"/>
               </w:rPr>
-              <w:t>Rp 10.000.000</w:t>
+              <w:t>Rp 15.000.000</w:t>
             </w:r>
           </w:p>
         </w:tc>
@@ -6385,7 +6385,7 @@
                 <w:color w:val="102A43"/>
                 <w:sz w:val="16"/>
               </w:rPr>
-              <w:t>7,8 Bulan</w:t>
+              <w:t>11,7 Bulan</w:t>
             </w:r>
           </w:p>
         </w:tc>
@@ -6417,7 +6417,7 @@
                 <w:color w:val="102A43"/>
                 <w:sz w:val="16"/>
               </w:rPr>
-              <w:t>4,1 Bulan (~4 Bulan)</w:t>
+              <w:t>6,25 Bulan (~6 Bulan)</w:t>
             </w:r>
           </w:p>
         </w:tc>
@@ -6449,7 +6449,7 @@
                 <w:color w:val="102A43"/>
                 <w:sz w:val="16"/>
               </w:rPr>
-              <w:t>2,5 Bulan</w:t>
+              <w:t>3,8 Bulan</w:t>
             </w:r>
           </w:p>
         </w:tc>
@@ -6487,7 +6487,7 @@
           <w:color w:val="B45309"/>
           <w:sz w:val="21"/>
         </w:rPr>
-        <w:t>6.1 Struktur Penawaran Kemitraan Modal Rp 10.000.000</w:t>
+        <w:t>6.1 Struktur Penawaran Kemitraan Modal Rp 15.000.000</w:t>
       </w:r>
     </w:p>
     <w:p>
@@ -6568,7 +6568,7 @@
                 <w:color w:val="243B53"/>
                 <w:sz w:val="18"/>
               </w:rPr>
-              <w:t>Terbuka opsi 1 Mitra Tunggal Penuh (Rp 10.000.000), 2 Slot Kemitraan (@ Rp 5.000.000), atau Sindikasi 4 Slot Ringan (@ Rp 2.500.000/slot).</w:t>
+              <w:t>Terbuka opsi 1 Mitra Tunggal Penuh (Rp 15.000.000), 2 Slot Kemitraan (@ Rp 7.500.000), 3 Slot Kemitraan (@ Rp 5.000.000), atau Sindikasi 5 Slot Ringan (@ Rp 3.000.000/slot).</w:t>
             </w:r>
           </w:p>
           <w:p>
@@ -6676,7 +6676,7 @@
           <w:color w:val="243B53"/>
           <w:sz w:val="19"/>
         </w:rPr>
-        <w:t>Jangkar Kopi &amp; Angkringan adalah jawaban atas kebutuhan ruang temu warga yang bersahaja, bersih, dan berbiaya terjangkau di koridor Cikedal - Menes. Dengan modal lean Rp 10.000.000, beban sewa lahan terkunci aman 1 tahun (Rp 6 Jt), dan menu arang tradisional yang digemari masyarakat, usaha ini diproyeksikan mencapai titik impas dalam tempo sangat cepat yakni 4,1 bulan (~4 bulan) dan siap berkembang menjadi ikon kuliner malam rakyat.</w:t>
+        <w:t>Jangkar Kopi &amp; Angkringan adalah jawaban atas kebutuhan ruang temu warga yang bersahaja, bersih, dan berbiaya terjangkau di koridor Cikedal - Menes. Dengan modal lean Rp 15.000.000, beban sewa lahan terkunci aman 1 tahun (Rp 6 Jt), stok awal dan cadangan kas yang solid, serta menu arang tradisional yang digemari masyarakat, usaha ini diproyeksikan mencapai titik impas dalam tempo 6,25 bulan (~6 bulan) dan siap berkembang menjadi ikon kuliner malam rakyat.</w:t>
       </w:r>
     </w:p>
     <w:p>
@@ -6841,9 +6841,9 @@
                 <w:color w:val="243B53"/>
                 <w:sz w:val="18"/>
               </w:rPr>
-              <w:t>[   ] 1 Slot Sindikasi (Rp 2.500.000)      [   ] 1 Slot Kemitraan (Rp 5.000.000)</w:t>
+              <w:t>[   ] 1 Slot Sindikasi (Rp 3.000.000)      [   ] 1 Slot Kemitraan (Rp 5.000.000)</w:t>
               <w:br/>
-              <w:t xml:space="preserve">                              [   ] Mitra Tunggal Penuh (Rp 10.000.000)</w:t>
+              <w:t xml:space="preserve">                              [   ] 1 Slot Kemitraan (Rp 7.500.000)      [   ] Mitra Tunggal Penuh (Rp 15.000.000)</w:t>
             </w:r>
           </w:p>
         </w:tc>

</xml_diff>

<commit_message>
feat: optimize 2x6m tent asset and allocate tarp roof to Rp 15M capex
</commit_message>
<xml_diff>
--- a/PROPOSAL_INVESTASI_JANGKAR_KOPI.docx
+++ b/PROPOSAL_INVESTASI_JANGKAR_KOPI.docx
@@ -834,7 +834,7 @@
                 <w:color w:val="B45309"/>
                 <w:sz w:val="18"/>
               </w:rPr>
-              <w:t xml:space="preserve">• Perlindungan Cuaca (All-Weather Tarpaulin): </w:t>
+              <w:t xml:space="preserve">• Perlindungan Cuaca (Tenda 2×6m Milik Sendiri + Atap Terpal Baru): </w:t>
             </w:r>
             <w:r>
               <w:rPr>
@@ -842,7 +842,7 @@
                 <w:color w:val="243B53"/>
                 <w:sz w:val="18"/>
               </w:rPr>
-              <w:t>Dilengkapi naungan kanopi terpal rangka pipa ringan yang melindungi seluruh area lesehan dari tetesan embun malam dan gerimis hujan, serta mudah digulung/dirapikan saat jam operasional usai.</w:t>
+              <w:t>Memanfaatkan aset rangka tenda 2×6 meter milik pribadi inisiator yang dilengkapi atap kain terpal tebal waterproof (A12 heavy duty) baru untuk memproteksi area lesehan dan dapur dari embun malam serta gerimis hujan tanpa perlu biaya beli rangka baru.</w:t>
             </w:r>
           </w:p>
           <w:p>
@@ -1291,7 +1291,7 @@
           <w:color w:val="243B53"/>
           <w:sz w:val="19"/>
         </w:rPr>
-        <w:t>Total kebutuhan belanja modal (CAPEX) dan modal kerja awal Jangkar Kopi dialokasikan tepat sebesar Rp 15.000.000 (Lima Belas Juta Rupiah). Anggaran ini mengalokasikan sewa lahan terbuka selama 1 tahun di muka sebesar Rp 6.000.000 (40%), serta memanfaatkan sisa dana Rp 9.000.000 (60%) secara optimal untuk penyiapan kanopi terpal pelindung cuaca, gerobak kayu custom etalase kaca, panggangan arang batok, peralatan dapur wedangan, fasilitas lesehan alas tebal nyaman, wadah saji piring seng, instalasi listrik festoon, stok bahan baku awal yang memadai, dan cadangan kas darurat yang kokoh.</w:t>
+        <w:t>Total kebutuhan belanja modal (CAPEX) dan modal kerja awal Jangkar Kopi dialokasikan tepat sebesar Rp 15.000.000 (Lima Belas Juta Rupiah). Anggaran ini mengalokasikan sewa lahan terbuka selama 1 tahun di muka sebesar Rp 6.000.000 (40%), serta memanfaatkan sisa dana Rp 9.000.000 (60%) secara optimal untuk pengadaan atap terpal waterproof pada rangka tenda 2×6 meter milik pribadi inisiator, gerobak kayu custom etalase kaca, panggangan arang batok, peralatan dapur wedangan, fasilitas lesehan alas tebal nyaman, wadah saji piring seng, instalasi listrik festoon, stok bahan baku awal yang diperkuat (Rp 1.600.000), dan cadangan kas darurat yang kokoh (Rp 2.000.000).</w:t>
       </w:r>
     </w:p>
     <w:p>
@@ -1593,7 +1593,7 @@
                 <w:color w:val="243B53"/>
                 <w:sz w:val="16"/>
               </w:rPr>
-              <w:t>Penyiapan Lahan &amp; Kanopi Terpal</w:t>
+              <w:t>Atap Terpal Tenda 2×6m &amp; Lahan</w:t>
             </w:r>
           </w:p>
         </w:tc>
@@ -1624,7 +1624,7 @@
                 <w:color w:val="243B53"/>
                 <w:sz w:val="16"/>
               </w:rPr>
-              <w:t>Kanopi terpal all-weather pelindung embun/gerimis &amp; perataan koral split</w:t>
+              <w:t>Terpal tebal waterproof A12 rangka tenda 2x6m (rangka milik sendiri) &amp; koral</w:t>
             </w:r>
           </w:p>
         </w:tc>
@@ -1686,7 +1686,7 @@
                 <w:color w:val="243B53"/>
                 <w:sz w:val="16"/>
               </w:rPr>
-              <w:t>Rp 1.000.000</w:t>
+              <w:t>Rp 400.000</w:t>
             </w:r>
           </w:p>
         </w:tc>
@@ -2466,7 +2466,7 @@
                 <w:color w:val="243B53"/>
                 <w:sz w:val="16"/>
               </w:rPr>
-              <w:t>Rp 1.500.000</w:t>
+              <w:t>Rp 1.600.000</w:t>
             </w:r>
           </w:p>
         </w:tc>
@@ -2596,7 +2596,7 @@
                 <w:color w:val="243B53"/>
                 <w:sz w:val="16"/>
               </w:rPr>
-              <w:t>Rp 1.500.000</w:t>
+              <w:t>Rp 2.000.000</w:t>
             </w:r>
           </w:p>
         </w:tc>

</xml_diff>

<commit_message>
feat: simplify equipment to mini fan, 4 portable tables, and rattan plates with paper lining
</commit_message>
<xml_diff>
--- a/PROPOSAL_INVESTASI_JANGKAR_KOPI.docx
+++ b/PROPOSAL_INVESTASI_JANGKAR_KOPI.docx
@@ -668,7 +668,7 @@
           <w:color w:val="B45309"/>
           <w:sz w:val="21"/>
         </w:rPr>
-        <w:t>2.1 Konsep Tempat: 100% Lesehan Alas Tebal Nyaman &amp; Meja Lipat Portabel</w:t>
+        <w:t>2.1 Konsep Tempat: 100% Lesehan Alas Tebal Nyaman &amp; 4 Meja Lipat Portabel</w:t>
       </w:r>
     </w:p>
     <w:p>
@@ -684,7 +684,7 @@
           <w:color w:val="243B53"/>
           <w:sz w:val="19"/>
         </w:rPr>
-        <w:t>Jangkar Kopi mengusung konsep 100% lesehan bersih beralas tebal yang nyaman (karpet spons/busa empuk waterproof dilapisi tikar rapi) dipadu meja lipat kecil portabel yang praktis dan kokoh. Format duduk lesehan melingkar terbukti secara sosiologis mampu meruntuhkan batas status sosial. Pelanggan dapat duduk santai berselonjor dan menikmati hidangan tanpa merasa canggung atau terintimidasi.</w:t>
+        <w:t>Jangkar Kopi mengusung konsep 100% lesehan bersih beralas tebal yang nyaman (karpet spons/busa empuk waterproof dilapisi tikar rapi) dipadu 4 unit meja lipat kecil portabel yang praktis dan kokoh. Hidangan disajikan di atas piring anyaman rotan beralas kertas nasi coklat, menghadirkan estetika angkringan tradisional yang otentik sekaligus sangat higienis dan praktis tanpa repot mencuci piring berminyak di malam hari (zero washing). Format duduk lesehan melingkar terbukti secara sosiologis mampu meruntuhkan batas status sosial. Pelanggan dapat duduk santai berselonjor menikmati hidangan tanpa merasa canggung atau terintimidasi.</w:t>
       </w:r>
     </w:p>
     <w:p>
@@ -796,7 +796,7 @@
                 <w:color w:val="243B53"/>
                 <w:sz w:val="18"/>
               </w:rPr>
-              <w:t>Menempatkan gerobak kayu etalase kaca display sate frozen food higienis, panggangan arang batok stainless, ceret wedangan, dan kompor mendoan menghadap ke jalan raya agar aroma asap bakaran gurih memancing selera.</w:t>
+              <w:t>Menempatkan gerobak kayu etalase kaca display sate frozen food higienis, panggangan arang batok stainless dengan hembusan kipas angin kecil, ceret wedangan, dan kompor mendoan menghadap ke jalan raya agar aroma asap bakaran gurih memancing selera.</w:t>
             </w:r>
           </w:p>
           <w:p>
@@ -819,7 +819,7 @@
                 <w:color w:val="243B53"/>
                 <w:sz w:val="18"/>
               </w:rPr>
-              <w:t>Hamparan alas tebal nyaman (karpet busa empuk waterproof dilapisi tikar rapi), dilengkapi 6 unit meja lipat kecil portabel yang ringan, kokoh, dan praktis dipindahkan. Mampu menampung 18 hingga 22 orang tamu sekaligus.</w:t>
+              <w:t>Hamparan alas tebal nyaman (karpet busa empuk waterproof dilapisi tikar rapi), dilengkapi 4 unit meja lipat kecil portabel yang ringan, kokoh, dan praktis dipindahkan. Mampu menampung 16 hingga 20 orang tamu sekaligus.</w:t>
             </w:r>
           </w:p>
           <w:p>
@@ -1291,7 +1291,7 @@
           <w:color w:val="243B53"/>
           <w:sz w:val="19"/>
         </w:rPr>
-        <w:t>Total kebutuhan belanja modal (CAPEX) dan modal kerja awal Jangkar Kopi dialokasikan tepat sebesar Rp 15.000.000 (Lima Belas Juta Rupiah). Anggaran ini mengalokasikan sewa lahan terbuka selama 1 tahun di muka sebesar Rp 6.000.000 (40%), serta memanfaatkan sisa dana Rp 9.000.000 (60%) secara optimal untuk pengadaan atap terpal waterproof pada rangka tenda 2×6 meter milik pribadi inisiator, gerobak kayu custom etalase kaca, panggangan arang batok, peralatan dapur wedangan, fasilitas lesehan alas tebal nyaman, wadah saji piring seng, instalasi listrik festoon, stok bahan baku awal yang diperkuat (Rp 1.600.000), dan cadangan kas darurat yang kokoh (Rp 2.000.000).</w:t>
+        <w:t>Total kebutuhan belanja modal (CAPEX) dan modal kerja awal Jangkar Kopi dialokasikan tepat sebesar Rp 15.000.000 (Lima Belas Juta Rupiah). Anggaran ini mengalokasikan sewa lahan terbuka selama 1 tahun di muka sebesar Rp 6.000.000 (40%), serta memanfaatkan sisa dana Rp 9.000.000 (60%) secara optimal untuk pengadaan atap terpal waterproof pada rangka tenda 2×6 meter milik pribadi inisiator, gerobak kayu custom etalase kaca, panggangan arang batok dengan kipas angin kecil, peralatan dapur wedangan, fasilitas lesehan alas tebal nyaman dengan 4 meja lipat portabel, wadah saji piring anyaman rotan beralas kertas nasi, instalasi listrik festoon, stok bahan baku awal yang diperkuat (Rp 1.600.000), dan cadangan kas darurat yang kokoh (Rp 2.000.000).</w:t>
       </w:r>
     </w:p>
     <w:p>
@@ -1884,7 +1884,7 @@
                 <w:color w:val="243B53"/>
                 <w:sz w:val="16"/>
               </w:rPr>
-              <w:t>Panggangan arang 65cm, blower DC, kompor gas, wajan mendoan, ceret, LPG</w:t>
+              <w:t>Panggangan arang 65cm, kipas angin kecil, kompor gas, wajan mendoan, ceret, LPG</w:t>
             </w:r>
           </w:p>
         </w:tc>
@@ -1983,7 +1983,7 @@
                 <w:color w:val="243B53"/>
                 <w:sz w:val="16"/>
               </w:rPr>
-              <w:t>Alas Tebal Nyaman &amp; Meja Lipat</w:t>
+              <w:t>Alas Tebal Nyaman &amp; 4 Meja Lipat</w:t>
             </w:r>
           </w:p>
         </w:tc>
@@ -2014,7 +2014,7 @@
                 <w:color w:val="243B53"/>
                 <w:sz w:val="16"/>
               </w:rPr>
-              <w:t>3 Karpet busa/spons tebal empuk waterproof 2x2m, tikar rapi, 6 meja portabel</w:t>
+              <w:t>3 Karpet busa/spons tebal empuk waterproof 2x2m, tikar rapi, 4 meja portabel</w:t>
             </w:r>
           </w:p>
         </w:tc>
@@ -2113,7 +2113,7 @@
                 <w:color w:val="243B53"/>
                 <w:sz w:val="16"/>
               </w:rPr>
-              <w:t>Cooler Box &amp; Wadah Saji Piring Seng</w:t>
+              <w:t>Cooler Box &amp; Wadah Saji Piring Rotan</w:t>
             </w:r>
           </w:p>
         </w:tc>
@@ -2144,7 +2144,7 @@
                 <w:color w:val="243B53"/>
                 <w:sz w:val="16"/>
               </w:rPr>
-              <w:t>Cooler box 35-45L penampung frozen food &amp; susu, piring seng blirik, toples</w:t>
+              <w:t>Cooler box 35-45L penampung frozen food &amp; susu, piring rotan &amp; kertas nasi</w:t>
             </w:r>
           </w:p>
         </w:tc>

</xml_diff>

<commit_message>
feat: replace jars with small sambal bowls and explicitly specify regional robusta coffee powder in capex
</commit_message>
<xml_diff>
--- a/PROPOSAL_INVESTASI_JANGKAR_KOPI.docx
+++ b/PROPOSAL_INVESTASI_JANGKAR_KOPI.docx
@@ -1291,7 +1291,7 @@
           <w:color w:val="243B53"/>
           <w:sz w:val="19"/>
         </w:rPr>
-        <w:t>Total kebutuhan belanja modal (CAPEX) dan modal kerja awal Jangkar Kopi dialokasikan tepat sebesar Rp 15.000.000 (Lima Belas Juta Rupiah). Anggaran ini mengalokasikan sewa lahan terbuka selama 1 tahun di muka sebesar Rp 6.000.000 (40%), serta memanfaatkan sisa dana Rp 9.000.000 (60%) secara optimal untuk pengadaan atap terpal waterproof pada rangka tenda 2×6 meter milik pribadi inisiator, gerobak kayu custom etalase kaca, panggangan arang batok dengan kipas angin kecil, peralatan dapur wedangan, fasilitas lesehan alas tebal nyaman dengan 4 meja lipat portabel, wadah saji piring anyaman rotan beralas kertas nasi, instalasi listrik festoon, stok bahan baku awal yang diperkuat (Rp 1.600.000), dan cadangan kas darurat yang kokoh (Rp 2.000.000).</w:t>
+        <w:t>Total kebutuhan belanja modal (CAPEX) dan modal kerja awal Jangkar Kopi dialokasikan tepat sebesar Rp 15.000.000 (Lima Belas Juta Rupiah). Anggaran ini mengalokasikan sewa lahan terbuka selama 1 tahun di muka sebesar Rp 6.000.000 (40%), serta memanfaatkan sisa dana Rp 9.000.000 (60%) secara optimal untuk pengadaan atap terpal waterproof pada rangka tenda 2×6 meter milik pribadi inisiator, gerobak kayu custom etalase kaca, panggangan arang batok dengan kipas angin kecil, peralatan dapur wedangan, fasilitas lesehan alas tebal nyaman dengan 4 meja lipat portabel, wadah saji piring anyaman rotan beralas kertas nasi &amp; mangkuk plastik kecil sambal, instalasi listrik festoon, stok bahan baku awal yang diperkuat termasuk bubuk kopi Robusta lokal khas daerah (Rp 1.600.000), dan cadangan kas darurat yang kokoh (Rp 2.000.000).</w:t>
       </w:r>
     </w:p>
     <w:p>
@@ -2113,7 +2113,7 @@
                 <w:color w:val="243B53"/>
                 <w:sz w:val="16"/>
               </w:rPr>
-              <w:t>Cooler Box &amp; Wadah Saji Piring Rotan</w:t>
+              <w:t>Cooler Box, Piring Rotan &amp; Mangkuk</w:t>
             </w:r>
           </w:p>
         </w:tc>
@@ -2144,7 +2144,7 @@
                 <w:color w:val="243B53"/>
                 <w:sz w:val="16"/>
               </w:rPr>
-              <w:t>Cooler box 35-45L penampung frozen food &amp; susu, piring rotan &amp; kertas nasi</w:t>
+              <w:t>Cooler box 35-45L, piring rotan, kertas nasi, mangkuk plastik kecil sambal</w:t>
             </w:r>
           </w:p>
         </w:tc>
@@ -2404,7 +2404,7 @@
                 <w:color w:val="243B53"/>
                 <w:sz w:val="16"/>
               </w:rPr>
-              <w:t>Aneka frozen food (dumpling, otak-otak, cumi, sosis, bakso), mendoan, kopi, susu</w:t>
+              <w:t>Frozen food sate, bubuk kopi Robusta lokal khas daerah, kopi sachet, susu</w:t>
             </w:r>
           </w:p>
         </w:tc>

</xml_diff>

<commit_message>
feat: add comprehensive initial food menu and 3 signature jangkar coffees description
</commit_message>
<xml_diff>
--- a/PROPOSAL_INVESTASI_JANGKAR_KOPI.docx
+++ b/PROPOSAL_INVESTASI_JANGKAR_KOPI.docx
@@ -888,7 +888,7 @@
           <w:color w:val="B45309"/>
           <w:sz w:val="21"/>
         </w:rPr>
-        <w:t>2.3 Efisiensi Menu: Sate Frozen Food Bakar Arang &amp; Minuman Rakyat</w:t>
+        <w:t>2.3 Menu Makanan Awal: Aneka Sate Frozen Food Bakar Arang &amp; Kudapan</w:t>
       </w:r>
     </w:p>
     <w:p>
@@ -904,7 +904,7 @@
           <w:color w:val="243B53"/>
           <w:sz w:val="19"/>
         </w:rPr>
-        <w:t>Penerapan strategi menu berbasis frozen food dan minuman siap seduh di Fase 1 memberikan keunggulan operasional luar biasa:</w:t>
+        <w:t>Menu makanan awal Jangkar Kopi difokuskan pada olahan siap bakar yang praktis, higienis, dan zero food waste:</w:t>
       </w:r>
     </w:p>
     <w:p>
@@ -920,7 +920,7 @@
           <w:color w:val="243B53"/>
           <w:sz w:val="19"/>
         </w:rPr>
-        <w:t>1. Aneka Sate Frozen Food Bakar Arang: Pilihan makanan utama difokuskan pada olahan beku bermutu (dumpling keju lumer, otak-otak ikan singapura, sate cumi flower, sosis bakar, bakso sapi bakar). Sangat praktis tanpa marinasi rumit, tahan lama disimpan beku di cooler box tanpa risiko basi (zero food waste), dan dibakar hangat dengan saus bakar gurih.</w:t>
+        <w:t>• Aneka Sate Frozen Food Bakar Arang: Dumpling ayam &amp; dumpling keju lumer (meleleh gurih saat digigit), sate cumi flower, otak-otak singapura kerat silang, sosis sapi bakar BBQ, bakso sapi bakar arang lada hitam, dan fish roll. Seluruhnya dipanggang hangat di atas bara batok kelapa beralas piring rotan &amp; kertas nasi coklat dengan cocolan sambal kecap rawit pedas dan saus bakar spesial dalam mangkuk plastik kecil.</w:t>
       </w:r>
     </w:p>
     <w:p>
@@ -936,7 +936,22 @@
           <w:color w:val="243B53"/>
           <w:sz w:val="19"/>
         </w:rPr>
-        <w:t>2. Kopi Tubruk Lokal &amp; Sachet Populer: Menggunakan bubuk sangrai Robusta lereng Gunung Karang siap seduh (Rp 4.000) serta varian sachet favorit masyarakat (Good Day, Kapal Api, Indocafe, Luwak White Koffie).</w:t>
+        <w:t>• Kudapan Tradisional: Nasi kucing teri balado / orek tempe bungkus daun pisang yang dipanaskan di atas bara panggangan, serta tempe mendoan hangat daun bawang yang renyah dan gurih.</w:t>
+      </w:r>
+    </w:p>
+    <w:p>
+      <w:pPr>
+        <w:keepNext/>
+        <w:spacing w:before="160" w:after="60"/>
+      </w:pPr>
+      <w:r>
+        <w:rPr>
+          <w:rFonts w:ascii="Arial" w:hAnsi="Arial"/>
+          <w:b/>
+          <w:color w:val="B45309"/>
+          <w:sz w:val="21"/>
+        </w:rPr>
+        <w:t>2.4 Signature Menu Kopi Jangkar &amp; Minuman Rakyat (Ikon Minuman Usaha)</w:t>
       </w:r>
     </w:p>
     <w:p>
@@ -952,7 +967,71 @@
           <w:color w:val="243B53"/>
           <w:sz w:val="19"/>
         </w:rPr>
-        <w:t>3. Wedangan Susu Murni &amp; Minuman Segar: Menyajikan susu sapi murni hangat/es dalam mug jadul, wedang jahe merah susu rempah, serta es sirup sachet segar (Rp 5.000 – Rp 9.000).</w:t>
+        <w:t>Sebagai pembeda utama, Jangkar Kopi menghadirkan menu signature kopi khas daerah dan minuman rakyat:</w:t>
+      </w:r>
+    </w:p>
+    <w:p>
+      <w:pPr>
+        <w:spacing w:before="0" w:after="60" w:line="276" w:lineRule="auto"/>
+        <w:jc w:val="both"/>
+      </w:pPr>
+      <w:r>
+        <w:rPr>
+          <w:rFonts w:ascii="Arial" w:hAnsi="Arial"/>
+          <w:b w:val="0"/>
+          <w:i w:val="0"/>
+          <w:color w:val="243B53"/>
+          <w:sz w:val="19"/>
+        </w:rPr>
+        <w:t>1. Kopi Hitam Tubruk 'Jangkar Asli' (Signature Utama): Bubuk kopi Robusta sangrai tradisional khas lereng Gunung Karang Pandeglang, diseduh tubruk panas dengan air mendidih murni. Berkarakter aroma smoky alami, body pekat (bold), dan rasa pahit gurih mantap khas Banten Barat, dengan pilihan gula aren Malingping murni atau gula pasir terpisah (Rp 4.000).</w:t>
+      </w:r>
+    </w:p>
+    <w:p>
+      <w:pPr>
+        <w:spacing w:before="0" w:after="60" w:line="276" w:lineRule="auto"/>
+        <w:jc w:val="both"/>
+      </w:pPr>
+      <w:r>
+        <w:rPr>
+          <w:rFonts w:ascii="Arial" w:hAnsi="Arial"/>
+          <w:b w:val="0"/>
+          <w:i w:val="0"/>
+          <w:color w:val="243B53"/>
+          <w:sz w:val="19"/>
+        </w:rPr>
+        <w:t>2. Kopi Susu 'Jangkar Dermaga' (Signature Modern): Perpaduan seduhan pekat Robusta lokal Gunung Karang dengan susu segar gurih dan lelehan gula aren murni khas Pandeglang. Menghadirkan rasa manis legit yang lembut dan seimbang, disajikan hangat maupun es dingin segar (Rp 6.000).</w:t>
+      </w:r>
+    </w:p>
+    <w:p>
+      <w:pPr>
+        <w:spacing w:before="0" w:after="60" w:line="276" w:lineRule="auto"/>
+        <w:jc w:val="both"/>
+      </w:pPr>
+      <w:r>
+        <w:rPr>
+          <w:rFonts w:ascii="Arial" w:hAnsi="Arial"/>
+          <w:b w:val="0"/>
+          <w:i w:val="0"/>
+          <w:color w:val="243B53"/>
+          <w:sz w:val="19"/>
+        </w:rPr>
+        <w:t>3. Kopi Jahe Rempah 'Jangkar Samudra' (Signature Penghangat): Seduhan kopi Robusta lokal berpadu rebusan jahe merah geprek, serai, dan kayu manis alami dalam mug jadul. Menjadi primadona pekerja malam, santri, dan pelintas jalur Labuan-Pandeglang untuk memulihkan stamina (Rp 7.000).</w:t>
+      </w:r>
+    </w:p>
+    <w:p>
+      <w:pPr>
+        <w:spacing w:before="0" w:after="60" w:line="276" w:lineRule="auto"/>
+        <w:jc w:val="both"/>
+      </w:pPr>
+      <w:r>
+        <w:rPr>
+          <w:rFonts w:ascii="Arial" w:hAnsi="Arial"/>
+          <w:b w:val="0"/>
+          <w:i w:val="0"/>
+          <w:color w:val="243B53"/>
+          <w:sz w:val="19"/>
+        </w:rPr>
+        <w:t>4. Minuman Rakyat Pendamping: Susu murni segar, wedang jahe susu, es sirup sachet (Nutrisari, Extra Joss Susu), dan varian kopi sachet populer (Good Day, Kapal Api, Indocafe, Luwak White Koffie) seharga Rp 4.000 – Rp 8.500.</w:t>
       </w:r>
     </w:p>
     <w:p>
@@ -4237,7 +4316,7 @@
                 <w:color w:val="243B53"/>
                 <w:sz w:val="15"/>
               </w:rPr>
-              <w:t>Kopi Tubruk Robusta Khas Banten</w:t>
+              <w:t>Kopi Tubruk 'Jangkar Asli' (Signature)</w:t>
             </w:r>
           </w:p>
         </w:tc>
@@ -4268,7 +4347,7 @@
                 <w:color w:val="243B53"/>
                 <w:sz w:val="15"/>
               </w:rPr>
-              <w:t>Bubuk kopi Robusta lokal sangrai siap seduh, gula pasir/aren</w:t>
+              <w:t>Bubuk Robusta sangrai lereng Gn. Karang, gula aren/pasir</w:t>
             </w:r>
           </w:p>
         </w:tc>
@@ -4723,7 +4802,7 @@
                 <w:color w:val="243B53"/>
                 <w:sz w:val="15"/>
               </w:rPr>
-              <w:t>Susu Murni Segar / Wedang Jahe Rempah</w:t>
+              <w:t>Susu Murni / Kopi Rempah Samudra</w:t>
             </w:r>
           </w:p>
         </w:tc>
@@ -4754,7 +4833,7 @@
                 <w:color w:val="243B53"/>
                 <w:sz w:val="15"/>
               </w:rPr>
-              <w:t>Susu sapi murni pasteurisasi / jahe merah rempah (Mug jadul)</w:t>
+              <w:t>Susu sapi murni / Robusta jahe merah rempah (Mug jadul)</w:t>
             </w:r>
           </w:p>
         </w:tc>

</xml_diff>

<commit_message>
feat: integrate verified wholesale raw material market prices and kartonan margin analysis
</commit_message>
<xml_diff>
--- a/PROPOSAL_INVESTASI_JANGKAR_KOPI.docx
+++ b/PROPOSAL_INVESTASI_JANGKAR_KOPI.docx
@@ -2836,7 +2836,7 @@
           <w:color w:val="243B53"/>
           <w:sz w:val="19"/>
         </w:rPr>
-        <w:t>Menu Jangkar Kopi memadukan aneka sate frozen food bakar arang dengan kudapan dan minuman rakyat, berharga murah dan ber-margin laba kotor sehat antara 46% hingga 65%:</w:t>
+        <w:t>Kalkulasi HPP divalidasi langsung dari harga grosir pasar distributor (CEDEA Dumpling Keju 500g @Rp 29rb-35rb isi 25 pcs, CEDEA Otak-Otak Singapore 500g @Rp 30rb-35rb, CEDEA Fish Roll 250g @Rp 15.900, serta kopi sachet kartonan dus Kapal Api @Rp 1.083/sachet dan Good Day @Rp 1.590/sachet). Seluruh menu ber-margin laba kotor sehat antara 46% hingga 65% (melampaui 70% pada pembelian kartonan):</w:t>
       </w:r>
     </w:p>
     <w:tbl>
@@ -2862,8 +2862,8 @@
             <w:tcW w:type="dxa" w:w="2438"/>
             <w:shd w:val="clear" w:color="auto" w:fill="102A43"/>
             <w:tcMar>
-              <w:top w:w="55" w:type="dxa"/>
-              <w:bottom w:w="55" w:type="dxa"/>
+              <w:top w:w="45" w:type="dxa"/>
+              <w:bottom w:w="45" w:type="dxa"/>
               <w:left w:w="60" w:type="dxa"/>
               <w:right w:w="60" w:type="dxa"/>
             </w:tcMar>
@@ -2888,8 +2888,8 @@
             <w:tcW w:type="dxa" w:w="3175"/>
             <w:shd w:val="clear" w:color="auto" w:fill="102A43"/>
             <w:tcMar>
-              <w:top w:w="55" w:type="dxa"/>
-              <w:bottom w:w="55" w:type="dxa"/>
+              <w:top w:w="45" w:type="dxa"/>
+              <w:bottom w:w="45" w:type="dxa"/>
               <w:left w:w="60" w:type="dxa"/>
               <w:right w:w="60" w:type="dxa"/>
             </w:tcMar>
@@ -2914,8 +2914,8 @@
             <w:tcW w:type="dxa" w:w="1247"/>
             <w:shd w:val="clear" w:color="auto" w:fill="102A43"/>
             <w:tcMar>
-              <w:top w:w="55" w:type="dxa"/>
-              <w:bottom w:w="55" w:type="dxa"/>
+              <w:top w:w="45" w:type="dxa"/>
+              <w:bottom w:w="45" w:type="dxa"/>
               <w:left w:w="60" w:type="dxa"/>
               <w:right w:w="60" w:type="dxa"/>
             </w:tcMar>
@@ -2940,8 +2940,8 @@
             <w:tcW w:type="dxa" w:w="1247"/>
             <w:shd w:val="clear" w:color="auto" w:fill="102A43"/>
             <w:tcMar>
-              <w:top w:w="55" w:type="dxa"/>
-              <w:bottom w:w="55" w:type="dxa"/>
+              <w:top w:w="45" w:type="dxa"/>
+              <w:bottom w:w="45" w:type="dxa"/>
               <w:left w:w="60" w:type="dxa"/>
               <w:right w:w="60" w:type="dxa"/>
             </w:tcMar>
@@ -2966,8 +2966,8 @@
             <w:tcW w:type="dxa" w:w="1587"/>
             <w:shd w:val="clear" w:color="auto" w:fill="102A43"/>
             <w:tcMar>
-              <w:top w:w="55" w:type="dxa"/>
-              <w:bottom w:w="55" w:type="dxa"/>
+              <w:top w:w="45" w:type="dxa"/>
+              <w:bottom w:w="45" w:type="dxa"/>
               <w:left w:w="60" w:type="dxa"/>
               <w:right w:w="60" w:type="dxa"/>
             </w:tcMar>
@@ -2997,10 +2997,10 @@
             <w:tcW w:type="dxa" w:w="2438"/>
             <w:shd w:val="clear" w:color="auto" w:fill="F0F4F8"/>
             <w:tcMar>
-              <w:top w:w="28" w:type="dxa"/>
-              <w:bottom w:w="28" w:type="dxa"/>
-              <w:left w:w="50" w:type="dxa"/>
-              <w:right w:w="50" w:type="dxa"/>
+              <w:top w:w="16" w:type="dxa"/>
+              <w:bottom w:w="16" w:type="dxa"/>
+              <w:left w:w="45" w:type="dxa"/>
+              <w:right w:w="45" w:type="dxa"/>
             </w:tcMar>
             <w:tcBorders>
               <w:top w:val="none"/>
@@ -3029,10 +3029,10 @@
             <w:tcW w:type="dxa" w:w="3175"/>
             <w:shd w:val="clear" w:color="auto" w:fill="F0F4F8"/>
             <w:tcMar>
-              <w:top w:w="28" w:type="dxa"/>
-              <w:bottom w:w="28" w:type="dxa"/>
-              <w:left w:w="50" w:type="dxa"/>
-              <w:right w:w="50" w:type="dxa"/>
+              <w:top w:w="16" w:type="dxa"/>
+              <w:bottom w:w="16" w:type="dxa"/>
+              <w:left w:w="45" w:type="dxa"/>
+              <w:right w:w="45" w:type="dxa"/>
             </w:tcMar>
             <w:tcBorders>
               <w:top w:val="none"/>
@@ -3060,10 +3060,10 @@
             <w:tcW w:type="dxa" w:w="1247"/>
             <w:shd w:val="clear" w:color="auto" w:fill="F0F4F8"/>
             <w:tcMar>
-              <w:top w:w="28" w:type="dxa"/>
-              <w:bottom w:w="28" w:type="dxa"/>
-              <w:left w:w="50" w:type="dxa"/>
-              <w:right w:w="50" w:type="dxa"/>
+              <w:top w:w="16" w:type="dxa"/>
+              <w:bottom w:w="16" w:type="dxa"/>
+              <w:left w:w="45" w:type="dxa"/>
+              <w:right w:w="45" w:type="dxa"/>
             </w:tcMar>
             <w:tcBorders>
               <w:top w:val="none"/>
@@ -3091,10 +3091,10 @@
             <w:tcW w:type="dxa" w:w="1247"/>
             <w:shd w:val="clear" w:color="auto" w:fill="F0F4F8"/>
             <w:tcMar>
-              <w:top w:w="28" w:type="dxa"/>
-              <w:bottom w:w="28" w:type="dxa"/>
-              <w:left w:w="50" w:type="dxa"/>
-              <w:right w:w="50" w:type="dxa"/>
+              <w:top w:w="16" w:type="dxa"/>
+              <w:bottom w:w="16" w:type="dxa"/>
+              <w:left w:w="45" w:type="dxa"/>
+              <w:right w:w="45" w:type="dxa"/>
             </w:tcMar>
             <w:tcBorders>
               <w:top w:val="none"/>
@@ -3122,10 +3122,10 @@
             <w:tcW w:type="dxa" w:w="1587"/>
             <w:shd w:val="clear" w:color="auto" w:fill="F0F4F8"/>
             <w:tcMar>
-              <w:top w:w="28" w:type="dxa"/>
-              <w:bottom w:w="28" w:type="dxa"/>
-              <w:left w:w="50" w:type="dxa"/>
-              <w:right w:w="50" w:type="dxa"/>
+              <w:top w:w="16" w:type="dxa"/>
+              <w:bottom w:w="16" w:type="dxa"/>
+              <w:left w:w="45" w:type="dxa"/>
+              <w:right w:w="45" w:type="dxa"/>
             </w:tcMar>
             <w:tcBorders>
               <w:top w:val="none"/>
@@ -3159,10 +3159,10 @@
             <w:tcW w:type="dxa" w:w="2438"/>
             <w:shd w:val="clear" w:color="auto" w:fill="FFFFFF"/>
             <w:tcMar>
-              <w:top w:w="28" w:type="dxa"/>
-              <w:bottom w:w="28" w:type="dxa"/>
-              <w:left w:w="50" w:type="dxa"/>
-              <w:right w:w="50" w:type="dxa"/>
+              <w:top w:w="16" w:type="dxa"/>
+              <w:bottom w:w="16" w:type="dxa"/>
+              <w:left w:w="45" w:type="dxa"/>
+              <w:right w:w="45" w:type="dxa"/>
             </w:tcMar>
             <w:tcBorders>
               <w:top w:val="none"/>
@@ -3191,10 +3191,10 @@
             <w:tcW w:type="dxa" w:w="3175"/>
             <w:shd w:val="clear" w:color="auto" w:fill="FFFFFF"/>
             <w:tcMar>
-              <w:top w:w="28" w:type="dxa"/>
-              <w:bottom w:w="28" w:type="dxa"/>
-              <w:left w:w="50" w:type="dxa"/>
-              <w:right w:w="50" w:type="dxa"/>
+              <w:top w:w="16" w:type="dxa"/>
+              <w:bottom w:w="16" w:type="dxa"/>
+              <w:left w:w="45" w:type="dxa"/>
+              <w:right w:w="45" w:type="dxa"/>
             </w:tcMar>
             <w:tcBorders>
               <w:top w:val="none"/>
@@ -3222,10 +3222,10 @@
             <w:tcW w:type="dxa" w:w="1247"/>
             <w:shd w:val="clear" w:color="auto" w:fill="FFFFFF"/>
             <w:tcMar>
-              <w:top w:w="28" w:type="dxa"/>
-              <w:bottom w:w="28" w:type="dxa"/>
-              <w:left w:w="50" w:type="dxa"/>
-              <w:right w:w="50" w:type="dxa"/>
+              <w:top w:w="16" w:type="dxa"/>
+              <w:bottom w:w="16" w:type="dxa"/>
+              <w:left w:w="45" w:type="dxa"/>
+              <w:right w:w="45" w:type="dxa"/>
             </w:tcMar>
             <w:tcBorders>
               <w:top w:val="none"/>
@@ -3253,10 +3253,10 @@
             <w:tcW w:type="dxa" w:w="1247"/>
             <w:shd w:val="clear" w:color="auto" w:fill="FFFFFF"/>
             <w:tcMar>
-              <w:top w:w="28" w:type="dxa"/>
-              <w:bottom w:w="28" w:type="dxa"/>
-              <w:left w:w="50" w:type="dxa"/>
-              <w:right w:w="50" w:type="dxa"/>
+              <w:top w:w="16" w:type="dxa"/>
+              <w:bottom w:w="16" w:type="dxa"/>
+              <w:left w:w="45" w:type="dxa"/>
+              <w:right w:w="45" w:type="dxa"/>
             </w:tcMar>
             <w:tcBorders>
               <w:top w:val="none"/>
@@ -3284,10 +3284,10 @@
             <w:tcW w:type="dxa" w:w="1587"/>
             <w:shd w:val="clear" w:color="auto" w:fill="FFFFFF"/>
             <w:tcMar>
-              <w:top w:w="28" w:type="dxa"/>
-              <w:bottom w:w="28" w:type="dxa"/>
-              <w:left w:w="50" w:type="dxa"/>
-              <w:right w:w="50" w:type="dxa"/>
+              <w:top w:w="16" w:type="dxa"/>
+              <w:bottom w:w="16" w:type="dxa"/>
+              <w:left w:w="45" w:type="dxa"/>
+              <w:right w:w="45" w:type="dxa"/>
             </w:tcMar>
             <w:tcBorders>
               <w:top w:val="none"/>
@@ -3321,10 +3321,10 @@
             <w:tcW w:type="dxa" w:w="2438"/>
             <w:shd w:val="clear" w:color="auto" w:fill="F0F4F8"/>
             <w:tcMar>
-              <w:top w:w="28" w:type="dxa"/>
-              <w:bottom w:w="28" w:type="dxa"/>
-              <w:left w:w="50" w:type="dxa"/>
-              <w:right w:w="50" w:type="dxa"/>
+              <w:top w:w="16" w:type="dxa"/>
+              <w:bottom w:w="16" w:type="dxa"/>
+              <w:left w:w="45" w:type="dxa"/>
+              <w:right w:w="45" w:type="dxa"/>
             </w:tcMar>
             <w:tcBorders>
               <w:top w:val="none"/>
@@ -3353,10 +3353,10 @@
             <w:tcW w:type="dxa" w:w="3175"/>
             <w:shd w:val="clear" w:color="auto" w:fill="F0F4F8"/>
             <w:tcMar>
-              <w:top w:w="28" w:type="dxa"/>
-              <w:bottom w:w="28" w:type="dxa"/>
-              <w:left w:w="50" w:type="dxa"/>
-              <w:right w:w="50" w:type="dxa"/>
+              <w:top w:w="16" w:type="dxa"/>
+              <w:bottom w:w="16" w:type="dxa"/>
+              <w:left w:w="45" w:type="dxa"/>
+              <w:right w:w="45" w:type="dxa"/>
             </w:tcMar>
             <w:tcBorders>
               <w:top w:val="none"/>
@@ -3375,7 +3375,7 @@
                 <w:color w:val="243B53"/>
                 <w:sz w:val="15"/>
               </w:rPr>
-              <w:t>Dumpling beku olahan isi ayam/keju lumer bakar arang batok</w:t>
+              <w:t>CEDEA Dumpling beku isi keju lumer bakar arang batok</w:t>
             </w:r>
           </w:p>
         </w:tc>
@@ -3384,10 +3384,10 @@
             <w:tcW w:type="dxa" w:w="1247"/>
             <w:shd w:val="clear" w:color="auto" w:fill="F0F4F8"/>
             <w:tcMar>
-              <w:top w:w="28" w:type="dxa"/>
-              <w:bottom w:w="28" w:type="dxa"/>
-              <w:left w:w="50" w:type="dxa"/>
-              <w:right w:w="50" w:type="dxa"/>
+              <w:top w:w="16" w:type="dxa"/>
+              <w:bottom w:w="16" w:type="dxa"/>
+              <w:left w:w="45" w:type="dxa"/>
+              <w:right w:w="45" w:type="dxa"/>
             </w:tcMar>
             <w:tcBorders>
               <w:top w:val="none"/>
@@ -3415,10 +3415,10 @@
             <w:tcW w:type="dxa" w:w="1247"/>
             <w:shd w:val="clear" w:color="auto" w:fill="F0F4F8"/>
             <w:tcMar>
-              <w:top w:w="28" w:type="dxa"/>
-              <w:bottom w:w="28" w:type="dxa"/>
-              <w:left w:w="50" w:type="dxa"/>
-              <w:right w:w="50" w:type="dxa"/>
+              <w:top w:w="16" w:type="dxa"/>
+              <w:bottom w:w="16" w:type="dxa"/>
+              <w:left w:w="45" w:type="dxa"/>
+              <w:right w:w="45" w:type="dxa"/>
             </w:tcMar>
             <w:tcBorders>
               <w:top w:val="none"/>
@@ -3446,10 +3446,10 @@
             <w:tcW w:type="dxa" w:w="1587"/>
             <w:shd w:val="clear" w:color="auto" w:fill="F0F4F8"/>
             <w:tcMar>
-              <w:top w:w="28" w:type="dxa"/>
-              <w:bottom w:w="28" w:type="dxa"/>
-              <w:left w:w="50" w:type="dxa"/>
-              <w:right w:w="50" w:type="dxa"/>
+              <w:top w:w="16" w:type="dxa"/>
+              <w:bottom w:w="16" w:type="dxa"/>
+              <w:left w:w="45" w:type="dxa"/>
+              <w:right w:w="45" w:type="dxa"/>
             </w:tcMar>
             <w:tcBorders>
               <w:top w:val="none"/>
@@ -3483,10 +3483,10 @@
             <w:tcW w:type="dxa" w:w="2438"/>
             <w:shd w:val="clear" w:color="auto" w:fill="FFFFFF"/>
             <w:tcMar>
-              <w:top w:w="28" w:type="dxa"/>
-              <w:bottom w:w="28" w:type="dxa"/>
-              <w:left w:w="50" w:type="dxa"/>
-              <w:right w:w="50" w:type="dxa"/>
+              <w:top w:w="16" w:type="dxa"/>
+              <w:bottom w:w="16" w:type="dxa"/>
+              <w:left w:w="45" w:type="dxa"/>
+              <w:right w:w="45" w:type="dxa"/>
             </w:tcMar>
             <w:tcBorders>
               <w:top w:val="none"/>
@@ -3506,7 +3506,7 @@
                 <w:color w:val="243B53"/>
                 <w:sz w:val="15"/>
               </w:rPr>
-              <w:t>Otak-Otak Ikan Bakar (Singapura)</w:t>
+              <w:t>Otak-Otak Singapore Bakar Arang</w:t>
             </w:r>
           </w:p>
         </w:tc>
@@ -3515,10 +3515,10 @@
             <w:tcW w:type="dxa" w:w="3175"/>
             <w:shd w:val="clear" w:color="auto" w:fill="FFFFFF"/>
             <w:tcMar>
-              <w:top w:w="28" w:type="dxa"/>
-              <w:bottom w:w="28" w:type="dxa"/>
-              <w:left w:w="50" w:type="dxa"/>
-              <w:right w:w="50" w:type="dxa"/>
+              <w:top w:w="16" w:type="dxa"/>
+              <w:bottom w:w="16" w:type="dxa"/>
+              <w:left w:w="45" w:type="dxa"/>
+              <w:right w:w="45" w:type="dxa"/>
             </w:tcMar>
             <w:tcBorders>
               <w:top w:val="none"/>
@@ -3537,7 +3537,7 @@
                 <w:color w:val="243B53"/>
                 <w:sz w:val="15"/>
               </w:rPr>
-              <w:t>Otak-otak ikan olahan gurih kerat silang, bumbu oles pedas manis</w:t>
+              <w:t>CEDEA / Minaku otak-otak bakar kerat silang pedas manis</w:t>
             </w:r>
           </w:p>
         </w:tc>
@@ -3546,10 +3546,10 @@
             <w:tcW w:type="dxa" w:w="1247"/>
             <w:shd w:val="clear" w:color="auto" w:fill="FFFFFF"/>
             <w:tcMar>
-              <w:top w:w="28" w:type="dxa"/>
-              <w:bottom w:w="28" w:type="dxa"/>
-              <w:left w:w="50" w:type="dxa"/>
-              <w:right w:w="50" w:type="dxa"/>
+              <w:top w:w="16" w:type="dxa"/>
+              <w:bottom w:w="16" w:type="dxa"/>
+              <w:left w:w="45" w:type="dxa"/>
+              <w:right w:w="45" w:type="dxa"/>
             </w:tcMar>
             <w:tcBorders>
               <w:top w:val="none"/>
@@ -3577,10 +3577,10 @@
             <w:tcW w:type="dxa" w:w="1247"/>
             <w:shd w:val="clear" w:color="auto" w:fill="FFFFFF"/>
             <w:tcMar>
-              <w:top w:w="28" w:type="dxa"/>
-              <w:bottom w:w="28" w:type="dxa"/>
-              <w:left w:w="50" w:type="dxa"/>
-              <w:right w:w="50" w:type="dxa"/>
+              <w:top w:w="16" w:type="dxa"/>
+              <w:bottom w:w="16" w:type="dxa"/>
+              <w:left w:w="45" w:type="dxa"/>
+              <w:right w:w="45" w:type="dxa"/>
             </w:tcMar>
             <w:tcBorders>
               <w:top w:val="none"/>
@@ -3608,10 +3608,10 @@
             <w:tcW w:type="dxa" w:w="1587"/>
             <w:shd w:val="clear" w:color="auto" w:fill="FFFFFF"/>
             <w:tcMar>
-              <w:top w:w="28" w:type="dxa"/>
-              <w:bottom w:w="28" w:type="dxa"/>
-              <w:left w:w="50" w:type="dxa"/>
-              <w:right w:w="50" w:type="dxa"/>
+              <w:top w:w="16" w:type="dxa"/>
+              <w:bottom w:w="16" w:type="dxa"/>
+              <w:left w:w="45" w:type="dxa"/>
+              <w:right w:w="45" w:type="dxa"/>
             </w:tcMar>
             <w:tcBorders>
               <w:top w:val="none"/>
@@ -3645,10 +3645,10 @@
             <w:tcW w:type="dxa" w:w="2438"/>
             <w:shd w:val="clear" w:color="auto" w:fill="F0F4F8"/>
             <w:tcMar>
-              <w:top w:w="28" w:type="dxa"/>
-              <w:bottom w:w="28" w:type="dxa"/>
-              <w:left w:w="50" w:type="dxa"/>
-              <w:right w:w="50" w:type="dxa"/>
+              <w:top w:w="16" w:type="dxa"/>
+              <w:bottom w:w="16" w:type="dxa"/>
+              <w:left w:w="45" w:type="dxa"/>
+              <w:right w:w="45" w:type="dxa"/>
             </w:tcMar>
             <w:tcBorders>
               <w:top w:val="none"/>
@@ -3677,10 +3677,10 @@
             <w:tcW w:type="dxa" w:w="3175"/>
             <w:shd w:val="clear" w:color="auto" w:fill="F0F4F8"/>
             <w:tcMar>
-              <w:top w:w="28" w:type="dxa"/>
-              <w:bottom w:w="28" w:type="dxa"/>
-              <w:left w:w="50" w:type="dxa"/>
-              <w:right w:w="50" w:type="dxa"/>
+              <w:top w:w="16" w:type="dxa"/>
+              <w:bottom w:w="16" w:type="dxa"/>
+              <w:left w:w="45" w:type="dxa"/>
+              <w:right w:w="45" w:type="dxa"/>
             </w:tcMar>
             <w:tcBorders>
               <w:top w:val="none"/>
@@ -3708,10 +3708,10 @@
             <w:tcW w:type="dxa" w:w="1247"/>
             <w:shd w:val="clear" w:color="auto" w:fill="F0F4F8"/>
             <w:tcMar>
-              <w:top w:w="28" w:type="dxa"/>
-              <w:bottom w:w="28" w:type="dxa"/>
-              <w:left w:w="50" w:type="dxa"/>
-              <w:right w:w="50" w:type="dxa"/>
+              <w:top w:w="16" w:type="dxa"/>
+              <w:bottom w:w="16" w:type="dxa"/>
+              <w:left w:w="45" w:type="dxa"/>
+              <w:right w:w="45" w:type="dxa"/>
             </w:tcMar>
             <w:tcBorders>
               <w:top w:val="none"/>
@@ -3739,10 +3739,10 @@
             <w:tcW w:type="dxa" w:w="1247"/>
             <w:shd w:val="clear" w:color="auto" w:fill="F0F4F8"/>
             <w:tcMar>
-              <w:top w:w="28" w:type="dxa"/>
-              <w:bottom w:w="28" w:type="dxa"/>
-              <w:left w:w="50" w:type="dxa"/>
-              <w:right w:w="50" w:type="dxa"/>
+              <w:top w:w="16" w:type="dxa"/>
+              <w:bottom w:w="16" w:type="dxa"/>
+              <w:left w:w="45" w:type="dxa"/>
+              <w:right w:w="45" w:type="dxa"/>
             </w:tcMar>
             <w:tcBorders>
               <w:top w:val="none"/>
@@ -3770,10 +3770,10 @@
             <w:tcW w:type="dxa" w:w="1587"/>
             <w:shd w:val="clear" w:color="auto" w:fill="F0F4F8"/>
             <w:tcMar>
-              <w:top w:w="28" w:type="dxa"/>
-              <w:bottom w:w="28" w:type="dxa"/>
-              <w:left w:w="50" w:type="dxa"/>
-              <w:right w:w="50" w:type="dxa"/>
+              <w:top w:w="16" w:type="dxa"/>
+              <w:bottom w:w="16" w:type="dxa"/>
+              <w:left w:w="45" w:type="dxa"/>
+              <w:right w:w="45" w:type="dxa"/>
             </w:tcMar>
             <w:tcBorders>
               <w:top w:val="none"/>
@@ -3807,10 +3807,10 @@
             <w:tcW w:type="dxa" w:w="2438"/>
             <w:shd w:val="clear" w:color="auto" w:fill="FFFFFF"/>
             <w:tcMar>
-              <w:top w:w="28" w:type="dxa"/>
-              <w:bottom w:w="28" w:type="dxa"/>
-              <w:left w:w="50" w:type="dxa"/>
-              <w:right w:w="50" w:type="dxa"/>
+              <w:top w:w="16" w:type="dxa"/>
+              <w:bottom w:w="16" w:type="dxa"/>
+              <w:left w:w="45" w:type="dxa"/>
+              <w:right w:w="45" w:type="dxa"/>
             </w:tcMar>
             <w:tcBorders>
               <w:top w:val="none"/>
@@ -3839,10 +3839,10 @@
             <w:tcW w:type="dxa" w:w="3175"/>
             <w:shd w:val="clear" w:color="auto" w:fill="FFFFFF"/>
             <w:tcMar>
-              <w:top w:w="28" w:type="dxa"/>
-              <w:bottom w:w="28" w:type="dxa"/>
-              <w:left w:w="50" w:type="dxa"/>
-              <w:right w:w="50" w:type="dxa"/>
+              <w:top w:w="16" w:type="dxa"/>
+              <w:bottom w:w="16" w:type="dxa"/>
+              <w:left w:w="45" w:type="dxa"/>
+              <w:right w:w="45" w:type="dxa"/>
             </w:tcMar>
             <w:tcBorders>
               <w:top w:val="none"/>
@@ -3861,7 +3861,7 @@
                 <w:color w:val="243B53"/>
                 <w:sz w:val="15"/>
               </w:rPr>
-              <w:t>Olahan ikan kani stik bumbu rempah arang batok kelapa</w:t>
+              <w:t>CEDEA Fish roll / kani stik rempah arang batok kelapa</w:t>
             </w:r>
           </w:p>
         </w:tc>
@@ -3870,10 +3870,10 @@
             <w:tcW w:type="dxa" w:w="1247"/>
             <w:shd w:val="clear" w:color="auto" w:fill="FFFFFF"/>
             <w:tcMar>
-              <w:top w:w="28" w:type="dxa"/>
-              <w:bottom w:w="28" w:type="dxa"/>
-              <w:left w:w="50" w:type="dxa"/>
-              <w:right w:w="50" w:type="dxa"/>
+              <w:top w:w="16" w:type="dxa"/>
+              <w:bottom w:w="16" w:type="dxa"/>
+              <w:left w:w="45" w:type="dxa"/>
+              <w:right w:w="45" w:type="dxa"/>
             </w:tcMar>
             <w:tcBorders>
               <w:top w:val="none"/>
@@ -3901,10 +3901,10 @@
             <w:tcW w:type="dxa" w:w="1247"/>
             <w:shd w:val="clear" w:color="auto" w:fill="FFFFFF"/>
             <w:tcMar>
-              <w:top w:w="28" w:type="dxa"/>
-              <w:bottom w:w="28" w:type="dxa"/>
-              <w:left w:w="50" w:type="dxa"/>
-              <w:right w:w="50" w:type="dxa"/>
+              <w:top w:w="16" w:type="dxa"/>
+              <w:bottom w:w="16" w:type="dxa"/>
+              <w:left w:w="45" w:type="dxa"/>
+              <w:right w:w="45" w:type="dxa"/>
             </w:tcMar>
             <w:tcBorders>
               <w:top w:val="none"/>
@@ -3932,10 +3932,10 @@
             <w:tcW w:type="dxa" w:w="1587"/>
             <w:shd w:val="clear" w:color="auto" w:fill="FFFFFF"/>
             <w:tcMar>
-              <w:top w:w="28" w:type="dxa"/>
-              <w:bottom w:w="28" w:type="dxa"/>
-              <w:left w:w="50" w:type="dxa"/>
-              <w:right w:w="50" w:type="dxa"/>
+              <w:top w:w="16" w:type="dxa"/>
+              <w:bottom w:w="16" w:type="dxa"/>
+              <w:left w:w="45" w:type="dxa"/>
+              <w:right w:w="45" w:type="dxa"/>
             </w:tcMar>
             <w:tcBorders>
               <w:top w:val="none"/>
@@ -3969,10 +3969,10 @@
             <w:tcW w:type="dxa" w:w="2438"/>
             <w:shd w:val="clear" w:color="auto" w:fill="F0F4F8"/>
             <w:tcMar>
-              <w:top w:w="28" w:type="dxa"/>
-              <w:bottom w:w="28" w:type="dxa"/>
-              <w:left w:w="50" w:type="dxa"/>
-              <w:right w:w="50" w:type="dxa"/>
+              <w:top w:w="16" w:type="dxa"/>
+              <w:bottom w:w="16" w:type="dxa"/>
+              <w:left w:w="45" w:type="dxa"/>
+              <w:right w:w="45" w:type="dxa"/>
             </w:tcMar>
             <w:tcBorders>
               <w:top w:val="none"/>
@@ -4001,10 +4001,10 @@
             <w:tcW w:type="dxa" w:w="3175"/>
             <w:shd w:val="clear" w:color="auto" w:fill="F0F4F8"/>
             <w:tcMar>
-              <w:top w:w="28" w:type="dxa"/>
-              <w:bottom w:w="28" w:type="dxa"/>
-              <w:left w:w="50" w:type="dxa"/>
-              <w:right w:w="50" w:type="dxa"/>
+              <w:top w:w="16" w:type="dxa"/>
+              <w:bottom w:w="16" w:type="dxa"/>
+              <w:left w:w="45" w:type="dxa"/>
+              <w:right w:w="45" w:type="dxa"/>
             </w:tcMar>
             <w:tcBorders>
               <w:top w:val="none"/>
@@ -4032,10 +4032,10 @@
             <w:tcW w:type="dxa" w:w="1247"/>
             <w:shd w:val="clear" w:color="auto" w:fill="F0F4F8"/>
             <w:tcMar>
-              <w:top w:w="28" w:type="dxa"/>
-              <w:bottom w:w="28" w:type="dxa"/>
-              <w:left w:w="50" w:type="dxa"/>
-              <w:right w:w="50" w:type="dxa"/>
+              <w:top w:w="16" w:type="dxa"/>
+              <w:bottom w:w="16" w:type="dxa"/>
+              <w:left w:w="45" w:type="dxa"/>
+              <w:right w:w="45" w:type="dxa"/>
             </w:tcMar>
             <w:tcBorders>
               <w:top w:val="none"/>
@@ -4063,10 +4063,10 @@
             <w:tcW w:type="dxa" w:w="1247"/>
             <w:shd w:val="clear" w:color="auto" w:fill="F0F4F8"/>
             <w:tcMar>
-              <w:top w:w="28" w:type="dxa"/>
-              <w:bottom w:w="28" w:type="dxa"/>
-              <w:left w:w="50" w:type="dxa"/>
-              <w:right w:w="50" w:type="dxa"/>
+              <w:top w:w="16" w:type="dxa"/>
+              <w:bottom w:w="16" w:type="dxa"/>
+              <w:left w:w="45" w:type="dxa"/>
+              <w:right w:w="45" w:type="dxa"/>
             </w:tcMar>
             <w:tcBorders>
               <w:top w:val="none"/>
@@ -4094,10 +4094,10 @@
             <w:tcW w:type="dxa" w:w="1587"/>
             <w:shd w:val="clear" w:color="auto" w:fill="F0F4F8"/>
             <w:tcMar>
-              <w:top w:w="28" w:type="dxa"/>
-              <w:bottom w:w="28" w:type="dxa"/>
-              <w:left w:w="50" w:type="dxa"/>
-              <w:right w:w="50" w:type="dxa"/>
+              <w:top w:w="16" w:type="dxa"/>
+              <w:bottom w:w="16" w:type="dxa"/>
+              <w:left w:w="45" w:type="dxa"/>
+              <w:right w:w="45" w:type="dxa"/>
             </w:tcMar>
             <w:tcBorders>
               <w:top w:val="none"/>
@@ -4131,10 +4131,10 @@
             <w:tcW w:type="dxa" w:w="2438"/>
             <w:shd w:val="clear" w:color="auto" w:fill="FFFFFF"/>
             <w:tcMar>
-              <w:top w:w="28" w:type="dxa"/>
-              <w:bottom w:w="28" w:type="dxa"/>
-              <w:left w:w="50" w:type="dxa"/>
-              <w:right w:w="50" w:type="dxa"/>
+              <w:top w:w="16" w:type="dxa"/>
+              <w:bottom w:w="16" w:type="dxa"/>
+              <w:left w:w="45" w:type="dxa"/>
+              <w:right w:w="45" w:type="dxa"/>
             </w:tcMar>
             <w:tcBorders>
               <w:top w:val="none"/>
@@ -4163,10 +4163,10 @@
             <w:tcW w:type="dxa" w:w="3175"/>
             <w:shd w:val="clear" w:color="auto" w:fill="FFFFFF"/>
             <w:tcMar>
-              <w:top w:w="28" w:type="dxa"/>
-              <w:bottom w:w="28" w:type="dxa"/>
-              <w:left w:w="50" w:type="dxa"/>
-              <w:right w:w="50" w:type="dxa"/>
+              <w:top w:w="16" w:type="dxa"/>
+              <w:bottom w:w="16" w:type="dxa"/>
+              <w:left w:w="45" w:type="dxa"/>
+              <w:right w:w="45" w:type="dxa"/>
             </w:tcMar>
             <w:tcBorders>
               <w:top w:val="none"/>
@@ -4194,10 +4194,10 @@
             <w:tcW w:type="dxa" w:w="1247"/>
             <w:shd w:val="clear" w:color="auto" w:fill="FFFFFF"/>
             <w:tcMar>
-              <w:top w:w="28" w:type="dxa"/>
-              <w:bottom w:w="28" w:type="dxa"/>
-              <w:left w:w="50" w:type="dxa"/>
-              <w:right w:w="50" w:type="dxa"/>
+              <w:top w:w="16" w:type="dxa"/>
+              <w:bottom w:w="16" w:type="dxa"/>
+              <w:left w:w="45" w:type="dxa"/>
+              <w:right w:w="45" w:type="dxa"/>
             </w:tcMar>
             <w:tcBorders>
               <w:top w:val="none"/>
@@ -4225,10 +4225,10 @@
             <w:tcW w:type="dxa" w:w="1247"/>
             <w:shd w:val="clear" w:color="auto" w:fill="FFFFFF"/>
             <w:tcMar>
-              <w:top w:w="28" w:type="dxa"/>
-              <w:bottom w:w="28" w:type="dxa"/>
-              <w:left w:w="50" w:type="dxa"/>
-              <w:right w:w="50" w:type="dxa"/>
+              <w:top w:w="16" w:type="dxa"/>
+              <w:bottom w:w="16" w:type="dxa"/>
+              <w:left w:w="45" w:type="dxa"/>
+              <w:right w:w="45" w:type="dxa"/>
             </w:tcMar>
             <w:tcBorders>
               <w:top w:val="none"/>
@@ -4256,10 +4256,10 @@
             <w:tcW w:type="dxa" w:w="1587"/>
             <w:shd w:val="clear" w:color="auto" w:fill="FFFFFF"/>
             <w:tcMar>
-              <w:top w:w="28" w:type="dxa"/>
-              <w:bottom w:w="28" w:type="dxa"/>
-              <w:left w:w="50" w:type="dxa"/>
-              <w:right w:w="50" w:type="dxa"/>
+              <w:top w:w="16" w:type="dxa"/>
+              <w:bottom w:w="16" w:type="dxa"/>
+              <w:left w:w="45" w:type="dxa"/>
+              <w:right w:w="45" w:type="dxa"/>
             </w:tcMar>
             <w:tcBorders>
               <w:top w:val="none"/>
@@ -4293,10 +4293,10 @@
             <w:tcW w:type="dxa" w:w="2438"/>
             <w:shd w:val="clear" w:color="auto" w:fill="F0F4F8"/>
             <w:tcMar>
-              <w:top w:w="28" w:type="dxa"/>
-              <w:bottom w:w="28" w:type="dxa"/>
-              <w:left w:w="50" w:type="dxa"/>
-              <w:right w:w="50" w:type="dxa"/>
+              <w:top w:w="16" w:type="dxa"/>
+              <w:bottom w:w="16" w:type="dxa"/>
+              <w:left w:w="45" w:type="dxa"/>
+              <w:right w:w="45" w:type="dxa"/>
             </w:tcMar>
             <w:tcBorders>
               <w:top w:val="none"/>
@@ -4325,10 +4325,10 @@
             <w:tcW w:type="dxa" w:w="3175"/>
             <w:shd w:val="clear" w:color="auto" w:fill="F0F4F8"/>
             <w:tcMar>
-              <w:top w:w="28" w:type="dxa"/>
-              <w:bottom w:w="28" w:type="dxa"/>
-              <w:left w:w="50" w:type="dxa"/>
-              <w:right w:w="50" w:type="dxa"/>
+              <w:top w:w="16" w:type="dxa"/>
+              <w:bottom w:w="16" w:type="dxa"/>
+              <w:left w:w="45" w:type="dxa"/>
+              <w:right w:w="45" w:type="dxa"/>
             </w:tcMar>
             <w:tcBorders>
               <w:top w:val="none"/>
@@ -4356,10 +4356,10 @@
             <w:tcW w:type="dxa" w:w="1247"/>
             <w:shd w:val="clear" w:color="auto" w:fill="F0F4F8"/>
             <w:tcMar>
-              <w:top w:w="28" w:type="dxa"/>
-              <w:bottom w:w="28" w:type="dxa"/>
-              <w:left w:w="50" w:type="dxa"/>
-              <w:right w:w="50" w:type="dxa"/>
+              <w:top w:w="16" w:type="dxa"/>
+              <w:bottom w:w="16" w:type="dxa"/>
+              <w:left w:w="45" w:type="dxa"/>
+              <w:right w:w="45" w:type="dxa"/>
             </w:tcMar>
             <w:tcBorders>
               <w:top w:val="none"/>
@@ -4387,10 +4387,10 @@
             <w:tcW w:type="dxa" w:w="1247"/>
             <w:shd w:val="clear" w:color="auto" w:fill="F0F4F8"/>
             <w:tcMar>
-              <w:top w:w="28" w:type="dxa"/>
-              <w:bottom w:w="28" w:type="dxa"/>
-              <w:left w:w="50" w:type="dxa"/>
-              <w:right w:w="50" w:type="dxa"/>
+              <w:top w:w="16" w:type="dxa"/>
+              <w:bottom w:w="16" w:type="dxa"/>
+              <w:left w:w="45" w:type="dxa"/>
+              <w:right w:w="45" w:type="dxa"/>
             </w:tcMar>
             <w:tcBorders>
               <w:top w:val="none"/>
@@ -4418,10 +4418,10 @@
             <w:tcW w:type="dxa" w:w="1587"/>
             <w:shd w:val="clear" w:color="auto" w:fill="F0F4F8"/>
             <w:tcMar>
-              <w:top w:w="28" w:type="dxa"/>
-              <w:bottom w:w="28" w:type="dxa"/>
-              <w:left w:w="50" w:type="dxa"/>
-              <w:right w:w="50" w:type="dxa"/>
+              <w:top w:w="16" w:type="dxa"/>
+              <w:bottom w:w="16" w:type="dxa"/>
+              <w:left w:w="45" w:type="dxa"/>
+              <w:right w:w="45" w:type="dxa"/>
             </w:tcMar>
             <w:tcBorders>
               <w:top w:val="none"/>
@@ -4455,10 +4455,10 @@
             <w:tcW w:type="dxa" w:w="2438"/>
             <w:shd w:val="clear" w:color="auto" w:fill="FFFFFF"/>
             <w:tcMar>
-              <w:top w:w="28" w:type="dxa"/>
-              <w:bottom w:w="28" w:type="dxa"/>
-              <w:left w:w="50" w:type="dxa"/>
-              <w:right w:w="50" w:type="dxa"/>
+              <w:top w:w="16" w:type="dxa"/>
+              <w:bottom w:w="16" w:type="dxa"/>
+              <w:left w:w="45" w:type="dxa"/>
+              <w:right w:w="45" w:type="dxa"/>
             </w:tcMar>
             <w:tcBorders>
               <w:top w:val="none"/>
@@ -4478,7 +4478,7 @@
                 <w:color w:val="243B53"/>
                 <w:sz w:val="15"/>
               </w:rPr>
-              <w:t>Kopi Sachet Populer Siap Seduh</w:t>
+              <w:t>Kopi Sachet Populer (Renceng/Dus)</w:t>
             </w:r>
           </w:p>
         </w:tc>
@@ -4487,10 +4487,10 @@
             <w:tcW w:type="dxa" w:w="3175"/>
             <w:shd w:val="clear" w:color="auto" w:fill="FFFFFF"/>
             <w:tcMar>
-              <w:top w:w="28" w:type="dxa"/>
-              <w:bottom w:w="28" w:type="dxa"/>
-              <w:left w:w="50" w:type="dxa"/>
-              <w:right w:w="50" w:type="dxa"/>
+              <w:top w:w="16" w:type="dxa"/>
+              <w:bottom w:w="16" w:type="dxa"/>
+              <w:left w:w="45" w:type="dxa"/>
+              <w:right w:w="45" w:type="dxa"/>
             </w:tcMar>
             <w:tcBorders>
               <w:top w:val="none"/>
@@ -4518,10 +4518,10 @@
             <w:tcW w:type="dxa" w:w="1247"/>
             <w:shd w:val="clear" w:color="auto" w:fill="FFFFFF"/>
             <w:tcMar>
-              <w:top w:w="28" w:type="dxa"/>
-              <w:bottom w:w="28" w:type="dxa"/>
-              <w:left w:w="50" w:type="dxa"/>
-              <w:right w:w="50" w:type="dxa"/>
+              <w:top w:w="16" w:type="dxa"/>
+              <w:bottom w:w="16" w:type="dxa"/>
+              <w:left w:w="45" w:type="dxa"/>
+              <w:right w:w="45" w:type="dxa"/>
             </w:tcMar>
             <w:tcBorders>
               <w:top w:val="none"/>
@@ -4549,10 +4549,10 @@
             <w:tcW w:type="dxa" w:w="1247"/>
             <w:shd w:val="clear" w:color="auto" w:fill="FFFFFF"/>
             <w:tcMar>
-              <w:top w:w="28" w:type="dxa"/>
-              <w:bottom w:w="28" w:type="dxa"/>
-              <w:left w:w="50" w:type="dxa"/>
-              <w:right w:w="50" w:type="dxa"/>
+              <w:top w:w="16" w:type="dxa"/>
+              <w:bottom w:w="16" w:type="dxa"/>
+              <w:left w:w="45" w:type="dxa"/>
+              <w:right w:w="45" w:type="dxa"/>
             </w:tcMar>
             <w:tcBorders>
               <w:top w:val="none"/>
@@ -4580,10 +4580,10 @@
             <w:tcW w:type="dxa" w:w="1587"/>
             <w:shd w:val="clear" w:color="auto" w:fill="FFFFFF"/>
             <w:tcMar>
-              <w:top w:w="28" w:type="dxa"/>
-              <w:bottom w:w="28" w:type="dxa"/>
-              <w:left w:w="50" w:type="dxa"/>
-              <w:right w:w="50" w:type="dxa"/>
+              <w:top w:w="16" w:type="dxa"/>
+              <w:bottom w:w="16" w:type="dxa"/>
+              <w:left w:w="45" w:type="dxa"/>
+              <w:right w:w="45" w:type="dxa"/>
             </w:tcMar>
             <w:tcBorders>
               <w:top w:val="none"/>
@@ -4617,10 +4617,10 @@
             <w:tcW w:type="dxa" w:w="2438"/>
             <w:shd w:val="clear" w:color="auto" w:fill="F0F4F8"/>
             <w:tcMar>
-              <w:top w:w="28" w:type="dxa"/>
-              <w:bottom w:w="28" w:type="dxa"/>
-              <w:left w:w="50" w:type="dxa"/>
-              <w:right w:w="50" w:type="dxa"/>
+              <w:top w:w="16" w:type="dxa"/>
+              <w:bottom w:w="16" w:type="dxa"/>
+              <w:left w:w="45" w:type="dxa"/>
+              <w:right w:w="45" w:type="dxa"/>
             </w:tcMar>
             <w:tcBorders>
               <w:top w:val="none"/>
@@ -4649,10 +4649,10 @@
             <w:tcW w:type="dxa" w:w="3175"/>
             <w:shd w:val="clear" w:color="auto" w:fill="F0F4F8"/>
             <w:tcMar>
-              <w:top w:w="28" w:type="dxa"/>
-              <w:bottom w:w="28" w:type="dxa"/>
-              <w:left w:w="50" w:type="dxa"/>
-              <w:right w:w="50" w:type="dxa"/>
+              <w:top w:w="16" w:type="dxa"/>
+              <w:bottom w:w="16" w:type="dxa"/>
+              <w:left w:w="45" w:type="dxa"/>
+              <w:right w:w="45" w:type="dxa"/>
             </w:tcMar>
             <w:tcBorders>
               <w:top w:val="none"/>
@@ -4680,10 +4680,10 @@
             <w:tcW w:type="dxa" w:w="1247"/>
             <w:shd w:val="clear" w:color="auto" w:fill="F0F4F8"/>
             <w:tcMar>
-              <w:top w:w="28" w:type="dxa"/>
-              <w:bottom w:w="28" w:type="dxa"/>
-              <w:left w:w="50" w:type="dxa"/>
-              <w:right w:w="50" w:type="dxa"/>
+              <w:top w:w="16" w:type="dxa"/>
+              <w:bottom w:w="16" w:type="dxa"/>
+              <w:left w:w="45" w:type="dxa"/>
+              <w:right w:w="45" w:type="dxa"/>
             </w:tcMar>
             <w:tcBorders>
               <w:top w:val="none"/>
@@ -4711,10 +4711,10 @@
             <w:tcW w:type="dxa" w:w="1247"/>
             <w:shd w:val="clear" w:color="auto" w:fill="F0F4F8"/>
             <w:tcMar>
-              <w:top w:w="28" w:type="dxa"/>
-              <w:bottom w:w="28" w:type="dxa"/>
-              <w:left w:w="50" w:type="dxa"/>
-              <w:right w:w="50" w:type="dxa"/>
+              <w:top w:w="16" w:type="dxa"/>
+              <w:bottom w:w="16" w:type="dxa"/>
+              <w:left w:w="45" w:type="dxa"/>
+              <w:right w:w="45" w:type="dxa"/>
             </w:tcMar>
             <w:tcBorders>
               <w:top w:val="none"/>
@@ -4742,10 +4742,10 @@
             <w:tcW w:type="dxa" w:w="1587"/>
             <w:shd w:val="clear" w:color="auto" w:fill="F0F4F8"/>
             <w:tcMar>
-              <w:top w:w="28" w:type="dxa"/>
-              <w:bottom w:w="28" w:type="dxa"/>
-              <w:left w:w="50" w:type="dxa"/>
-              <w:right w:w="50" w:type="dxa"/>
+              <w:top w:w="16" w:type="dxa"/>
+              <w:bottom w:w="16" w:type="dxa"/>
+              <w:left w:w="45" w:type="dxa"/>
+              <w:right w:w="45" w:type="dxa"/>
             </w:tcMar>
             <w:tcBorders>
               <w:top w:val="none"/>
@@ -4779,10 +4779,10 @@
             <w:tcW w:type="dxa" w:w="2438"/>
             <w:shd w:val="clear" w:color="auto" w:fill="FFFFFF"/>
             <w:tcMar>
-              <w:top w:w="28" w:type="dxa"/>
-              <w:bottom w:w="28" w:type="dxa"/>
-              <w:left w:w="50" w:type="dxa"/>
-              <w:right w:w="50" w:type="dxa"/>
+              <w:top w:w="16" w:type="dxa"/>
+              <w:bottom w:w="16" w:type="dxa"/>
+              <w:left w:w="45" w:type="dxa"/>
+              <w:right w:w="45" w:type="dxa"/>
             </w:tcMar>
             <w:tcBorders>
               <w:top w:val="none"/>
@@ -4811,10 +4811,10 @@
             <w:tcW w:type="dxa" w:w="3175"/>
             <w:shd w:val="clear" w:color="auto" w:fill="FFFFFF"/>
             <w:tcMar>
-              <w:top w:w="28" w:type="dxa"/>
-              <w:bottom w:w="28" w:type="dxa"/>
-              <w:left w:w="50" w:type="dxa"/>
-              <w:right w:w="50" w:type="dxa"/>
+              <w:top w:w="16" w:type="dxa"/>
+              <w:bottom w:w="16" w:type="dxa"/>
+              <w:left w:w="45" w:type="dxa"/>
+              <w:right w:w="45" w:type="dxa"/>
             </w:tcMar>
             <w:tcBorders>
               <w:top w:val="none"/>
@@ -4842,10 +4842,10 @@
             <w:tcW w:type="dxa" w:w="1247"/>
             <w:shd w:val="clear" w:color="auto" w:fill="FFFFFF"/>
             <w:tcMar>
-              <w:top w:w="28" w:type="dxa"/>
-              <w:bottom w:w="28" w:type="dxa"/>
-              <w:left w:w="50" w:type="dxa"/>
-              <w:right w:w="50" w:type="dxa"/>
+              <w:top w:w="16" w:type="dxa"/>
+              <w:bottom w:w="16" w:type="dxa"/>
+              <w:left w:w="45" w:type="dxa"/>
+              <w:right w:w="45" w:type="dxa"/>
             </w:tcMar>
             <w:tcBorders>
               <w:top w:val="none"/>
@@ -4873,10 +4873,10 @@
             <w:tcW w:type="dxa" w:w="1247"/>
             <w:shd w:val="clear" w:color="auto" w:fill="FFFFFF"/>
             <w:tcMar>
-              <w:top w:w="28" w:type="dxa"/>
-              <w:bottom w:w="28" w:type="dxa"/>
-              <w:left w:w="50" w:type="dxa"/>
-              <w:right w:w="50" w:type="dxa"/>
+              <w:top w:w="16" w:type="dxa"/>
+              <w:bottom w:w="16" w:type="dxa"/>
+              <w:left w:w="45" w:type="dxa"/>
+              <w:right w:w="45" w:type="dxa"/>
             </w:tcMar>
             <w:tcBorders>
               <w:top w:val="none"/>
@@ -4904,10 +4904,10 @@
             <w:tcW w:type="dxa" w:w="1587"/>
             <w:shd w:val="clear" w:color="auto" w:fill="FFFFFF"/>
             <w:tcMar>
-              <w:top w:w="28" w:type="dxa"/>
-              <w:bottom w:w="28" w:type="dxa"/>
-              <w:left w:w="50" w:type="dxa"/>
-              <w:right w:w="50" w:type="dxa"/>
+              <w:top w:w="16" w:type="dxa"/>
+              <w:bottom w:w="16" w:type="dxa"/>
+              <w:left w:w="45" w:type="dxa"/>
+              <w:right w:w="45" w:type="dxa"/>
             </w:tcMar>
             <w:tcBorders>
               <w:top w:val="none"/>
@@ -4970,8 +4970,8 @@
             <w:tcW w:type="dxa" w:w="2891"/>
             <w:shd w:val="clear" w:color="auto" w:fill="102A43"/>
             <w:tcMar>
-              <w:top w:w="50" w:type="dxa"/>
-              <w:bottom w:w="50" w:type="dxa"/>
+              <w:top w:w="32" w:type="dxa"/>
+              <w:bottom w:w="32" w:type="dxa"/>
               <w:left w:w="50" w:type="dxa"/>
               <w:right w:w="50" w:type="dxa"/>
             </w:tcMar>
@@ -4996,8 +4996,8 @@
             <w:tcW w:type="dxa" w:w="2268"/>
             <w:shd w:val="clear" w:color="auto" w:fill="102A43"/>
             <w:tcMar>
-              <w:top w:w="50" w:type="dxa"/>
-              <w:bottom w:w="50" w:type="dxa"/>
+              <w:top w:w="32" w:type="dxa"/>
+              <w:bottom w:w="32" w:type="dxa"/>
               <w:left w:w="50" w:type="dxa"/>
               <w:right w:w="50" w:type="dxa"/>
             </w:tcMar>
@@ -5022,8 +5022,8 @@
             <w:tcW w:type="dxa" w:w="2268"/>
             <w:shd w:val="clear" w:color="auto" w:fill="102A43"/>
             <w:tcMar>
-              <w:top w:w="50" w:type="dxa"/>
-              <w:bottom w:w="50" w:type="dxa"/>
+              <w:top w:w="32" w:type="dxa"/>
+              <w:bottom w:w="32" w:type="dxa"/>
               <w:left w:w="50" w:type="dxa"/>
               <w:right w:w="50" w:type="dxa"/>
             </w:tcMar>
@@ -5048,8 +5048,8 @@
             <w:tcW w:type="dxa" w:w="2268"/>
             <w:shd w:val="clear" w:color="auto" w:fill="102A43"/>
             <w:tcMar>
-              <w:top w:w="50" w:type="dxa"/>
-              <w:bottom w:w="50" w:type="dxa"/>
+              <w:top w:w="32" w:type="dxa"/>
+              <w:bottom w:w="32" w:type="dxa"/>
               <w:left w:w="50" w:type="dxa"/>
               <w:right w:w="50" w:type="dxa"/>
             </w:tcMar>
@@ -5079,8 +5079,8 @@
             <w:tcW w:type="dxa" w:w="2891"/>
             <w:shd w:val="clear" w:color="auto" w:fill="F0F4F8"/>
             <w:tcMar>
-              <w:top w:w="35" w:type="dxa"/>
-              <w:bottom w:w="35" w:type="dxa"/>
+              <w:top w:w="18" w:type="dxa"/>
+              <w:bottom w:w="18" w:type="dxa"/>
               <w:left w:w="50" w:type="dxa"/>
               <w:right w:w="50" w:type="dxa"/>
             </w:tcMar>
@@ -5111,8 +5111,8 @@
             <w:tcW w:type="dxa" w:w="2268"/>
             <w:shd w:val="clear" w:color="auto" w:fill="F0F4F8"/>
             <w:tcMar>
-              <w:top w:w="35" w:type="dxa"/>
-              <w:bottom w:w="35" w:type="dxa"/>
+              <w:top w:w="18" w:type="dxa"/>
+              <w:bottom w:w="18" w:type="dxa"/>
               <w:left w:w="50" w:type="dxa"/>
               <w:right w:w="50" w:type="dxa"/>
             </w:tcMar>
@@ -5143,8 +5143,8 @@
             <w:tcW w:type="dxa" w:w="2268"/>
             <w:shd w:val="clear" w:color="auto" w:fill="F0F4F8"/>
             <w:tcMar>
-              <w:top w:w="35" w:type="dxa"/>
-              <w:bottom w:w="35" w:type="dxa"/>
+              <w:top w:w="18" w:type="dxa"/>
+              <w:bottom w:w="18" w:type="dxa"/>
               <w:left w:w="50" w:type="dxa"/>
               <w:right w:w="50" w:type="dxa"/>
             </w:tcMar>
@@ -5175,8 +5175,8 @@
             <w:tcW w:type="dxa" w:w="2268"/>
             <w:shd w:val="clear" w:color="auto" w:fill="F0F4F8"/>
             <w:tcMar>
-              <w:top w:w="35" w:type="dxa"/>
-              <w:bottom w:w="35" w:type="dxa"/>
+              <w:top w:w="18" w:type="dxa"/>
+              <w:bottom w:w="18" w:type="dxa"/>
               <w:left w:w="50" w:type="dxa"/>
               <w:right w:w="50" w:type="dxa"/>
             </w:tcMar>
@@ -5212,8 +5212,8 @@
             <w:tcW w:type="dxa" w:w="2891"/>
             <w:shd w:val="clear" w:color="auto" w:fill="FFFFFF"/>
             <w:tcMar>
-              <w:top w:w="35" w:type="dxa"/>
-              <w:bottom w:w="35" w:type="dxa"/>
+              <w:top w:w="18" w:type="dxa"/>
+              <w:bottom w:w="18" w:type="dxa"/>
               <w:left w:w="50" w:type="dxa"/>
               <w:right w:w="50" w:type="dxa"/>
             </w:tcMar>
@@ -5244,8 +5244,8 @@
             <w:tcW w:type="dxa" w:w="2268"/>
             <w:shd w:val="clear" w:color="auto" w:fill="FFFFFF"/>
             <w:tcMar>
-              <w:top w:w="35" w:type="dxa"/>
-              <w:bottom w:w="35" w:type="dxa"/>
+              <w:top w:w="18" w:type="dxa"/>
+              <w:bottom w:w="18" w:type="dxa"/>
               <w:left w:w="50" w:type="dxa"/>
               <w:right w:w="50" w:type="dxa"/>
             </w:tcMar>
@@ -5276,8 +5276,8 @@
             <w:tcW w:type="dxa" w:w="2268"/>
             <w:shd w:val="clear" w:color="auto" w:fill="FFFFFF"/>
             <w:tcMar>
-              <w:top w:w="35" w:type="dxa"/>
-              <w:bottom w:w="35" w:type="dxa"/>
+              <w:top w:w="18" w:type="dxa"/>
+              <w:bottom w:w="18" w:type="dxa"/>
               <w:left w:w="50" w:type="dxa"/>
               <w:right w:w="50" w:type="dxa"/>
             </w:tcMar>
@@ -5308,8 +5308,8 @@
             <w:tcW w:type="dxa" w:w="2268"/>
             <w:shd w:val="clear" w:color="auto" w:fill="FFFFFF"/>
             <w:tcMar>
-              <w:top w:w="35" w:type="dxa"/>
-              <w:bottom w:w="35" w:type="dxa"/>
+              <w:top w:w="18" w:type="dxa"/>
+              <w:bottom w:w="18" w:type="dxa"/>
               <w:left w:w="50" w:type="dxa"/>
               <w:right w:w="50" w:type="dxa"/>
             </w:tcMar>
@@ -5345,8 +5345,8 @@
             <w:tcW w:type="dxa" w:w="2891"/>
             <w:shd w:val="clear" w:color="auto" w:fill="F0F4F8"/>
             <w:tcMar>
-              <w:top w:w="35" w:type="dxa"/>
-              <w:bottom w:w="35" w:type="dxa"/>
+              <w:top w:w="18" w:type="dxa"/>
+              <w:bottom w:w="18" w:type="dxa"/>
               <w:left w:w="50" w:type="dxa"/>
               <w:right w:w="50" w:type="dxa"/>
             </w:tcMar>
@@ -5377,8 +5377,8 @@
             <w:tcW w:type="dxa" w:w="2268"/>
             <w:shd w:val="clear" w:color="auto" w:fill="F0F4F8"/>
             <w:tcMar>
-              <w:top w:w="35" w:type="dxa"/>
-              <w:bottom w:w="35" w:type="dxa"/>
+              <w:top w:w="18" w:type="dxa"/>
+              <w:bottom w:w="18" w:type="dxa"/>
               <w:left w:w="50" w:type="dxa"/>
               <w:right w:w="50" w:type="dxa"/>
             </w:tcMar>
@@ -5409,8 +5409,8 @@
             <w:tcW w:type="dxa" w:w="2268"/>
             <w:shd w:val="clear" w:color="auto" w:fill="F0F4F8"/>
             <w:tcMar>
-              <w:top w:w="35" w:type="dxa"/>
-              <w:bottom w:w="35" w:type="dxa"/>
+              <w:top w:w="18" w:type="dxa"/>
+              <w:bottom w:w="18" w:type="dxa"/>
               <w:left w:w="50" w:type="dxa"/>
               <w:right w:w="50" w:type="dxa"/>
             </w:tcMar>
@@ -5441,8 +5441,8 @@
             <w:tcW w:type="dxa" w:w="2268"/>
             <w:shd w:val="clear" w:color="auto" w:fill="F0F4F8"/>
             <w:tcMar>
-              <w:top w:w="35" w:type="dxa"/>
-              <w:bottom w:w="35" w:type="dxa"/>
+              <w:top w:w="18" w:type="dxa"/>
+              <w:bottom w:w="18" w:type="dxa"/>
               <w:left w:w="50" w:type="dxa"/>
               <w:right w:w="50" w:type="dxa"/>
             </w:tcMar>
@@ -5478,8 +5478,8 @@
             <w:tcW w:type="dxa" w:w="2891"/>
             <w:shd w:val="clear" w:color="auto" w:fill="FFFFFF"/>
             <w:tcMar>
-              <w:top w:w="35" w:type="dxa"/>
-              <w:bottom w:w="35" w:type="dxa"/>
+              <w:top w:w="18" w:type="dxa"/>
+              <w:bottom w:w="18" w:type="dxa"/>
               <w:left w:w="50" w:type="dxa"/>
               <w:right w:w="50" w:type="dxa"/>
             </w:tcMar>
@@ -5510,8 +5510,8 @@
             <w:tcW w:type="dxa" w:w="2268"/>
             <w:shd w:val="clear" w:color="auto" w:fill="FFFFFF"/>
             <w:tcMar>
-              <w:top w:w="35" w:type="dxa"/>
-              <w:bottom w:w="35" w:type="dxa"/>
+              <w:top w:w="18" w:type="dxa"/>
+              <w:bottom w:w="18" w:type="dxa"/>
               <w:left w:w="50" w:type="dxa"/>
               <w:right w:w="50" w:type="dxa"/>
             </w:tcMar>
@@ -5542,8 +5542,8 @@
             <w:tcW w:type="dxa" w:w="2268"/>
             <w:shd w:val="clear" w:color="auto" w:fill="FFFFFF"/>
             <w:tcMar>
-              <w:top w:w="35" w:type="dxa"/>
-              <w:bottom w:w="35" w:type="dxa"/>
+              <w:top w:w="18" w:type="dxa"/>
+              <w:bottom w:w="18" w:type="dxa"/>
               <w:left w:w="50" w:type="dxa"/>
               <w:right w:w="50" w:type="dxa"/>
             </w:tcMar>
@@ -5574,8 +5574,8 @@
             <w:tcW w:type="dxa" w:w="2268"/>
             <w:shd w:val="clear" w:color="auto" w:fill="FFFFFF"/>
             <w:tcMar>
-              <w:top w:w="35" w:type="dxa"/>
-              <w:bottom w:w="35" w:type="dxa"/>
+              <w:top w:w="18" w:type="dxa"/>
+              <w:bottom w:w="18" w:type="dxa"/>
               <w:left w:w="50" w:type="dxa"/>
               <w:right w:w="50" w:type="dxa"/>
             </w:tcMar>
@@ -5611,8 +5611,8 @@
             <w:tcW w:type="dxa" w:w="2891"/>
             <w:shd w:val="clear" w:color="auto" w:fill="F0F4F8"/>
             <w:tcMar>
-              <w:top w:w="35" w:type="dxa"/>
-              <w:bottom w:w="35" w:type="dxa"/>
+              <w:top w:w="18" w:type="dxa"/>
+              <w:bottom w:w="18" w:type="dxa"/>
               <w:left w:w="50" w:type="dxa"/>
               <w:right w:w="50" w:type="dxa"/>
             </w:tcMar>
@@ -5643,8 +5643,8 @@
             <w:tcW w:type="dxa" w:w="2268"/>
             <w:shd w:val="clear" w:color="auto" w:fill="F0F4F8"/>
             <w:tcMar>
-              <w:top w:w="35" w:type="dxa"/>
-              <w:bottom w:w="35" w:type="dxa"/>
+              <w:top w:w="18" w:type="dxa"/>
+              <w:bottom w:w="18" w:type="dxa"/>
               <w:left w:w="50" w:type="dxa"/>
               <w:right w:w="50" w:type="dxa"/>
             </w:tcMar>
@@ -5675,8 +5675,8 @@
             <w:tcW w:type="dxa" w:w="2268"/>
             <w:shd w:val="clear" w:color="auto" w:fill="F0F4F8"/>
             <w:tcMar>
-              <w:top w:w="35" w:type="dxa"/>
-              <w:bottom w:w="35" w:type="dxa"/>
+              <w:top w:w="18" w:type="dxa"/>
+              <w:bottom w:w="18" w:type="dxa"/>
               <w:left w:w="50" w:type="dxa"/>
               <w:right w:w="50" w:type="dxa"/>
             </w:tcMar>
@@ -5707,8 +5707,8 @@
             <w:tcW w:type="dxa" w:w="2268"/>
             <w:shd w:val="clear" w:color="auto" w:fill="F0F4F8"/>
             <w:tcMar>
-              <w:top w:w="35" w:type="dxa"/>
-              <w:bottom w:w="35" w:type="dxa"/>
+              <w:top w:w="18" w:type="dxa"/>
+              <w:bottom w:w="18" w:type="dxa"/>
               <w:left w:w="50" w:type="dxa"/>
               <w:right w:w="50" w:type="dxa"/>
             </w:tcMar>
@@ -5744,8 +5744,8 @@
             <w:tcW w:type="dxa" w:w="2891"/>
             <w:shd w:val="clear" w:color="auto" w:fill="FFFFFF"/>
             <w:tcMar>
-              <w:top w:w="35" w:type="dxa"/>
-              <w:bottom w:w="35" w:type="dxa"/>
+              <w:top w:w="18" w:type="dxa"/>
+              <w:bottom w:w="18" w:type="dxa"/>
               <w:left w:w="50" w:type="dxa"/>
               <w:right w:w="50" w:type="dxa"/>
             </w:tcMar>
@@ -5776,8 +5776,8 @@
             <w:tcW w:type="dxa" w:w="2268"/>
             <w:shd w:val="clear" w:color="auto" w:fill="FFFFFF"/>
             <w:tcMar>
-              <w:top w:w="35" w:type="dxa"/>
-              <w:bottom w:w="35" w:type="dxa"/>
+              <w:top w:w="18" w:type="dxa"/>
+              <w:bottom w:w="18" w:type="dxa"/>
               <w:left w:w="50" w:type="dxa"/>
               <w:right w:w="50" w:type="dxa"/>
             </w:tcMar>
@@ -5808,8 +5808,8 @@
             <w:tcW w:type="dxa" w:w="2268"/>
             <w:shd w:val="clear" w:color="auto" w:fill="FFFFFF"/>
             <w:tcMar>
-              <w:top w:w="35" w:type="dxa"/>
-              <w:bottom w:w="35" w:type="dxa"/>
+              <w:top w:w="18" w:type="dxa"/>
+              <w:bottom w:w="18" w:type="dxa"/>
               <w:left w:w="50" w:type="dxa"/>
               <w:right w:w="50" w:type="dxa"/>
             </w:tcMar>
@@ -5840,8 +5840,8 @@
             <w:tcW w:type="dxa" w:w="2268"/>
             <w:shd w:val="clear" w:color="auto" w:fill="FFFFFF"/>
             <w:tcMar>
-              <w:top w:w="35" w:type="dxa"/>
-              <w:bottom w:w="35" w:type="dxa"/>
+              <w:top w:w="18" w:type="dxa"/>
+              <w:bottom w:w="18" w:type="dxa"/>
               <w:left w:w="50" w:type="dxa"/>
               <w:right w:w="50" w:type="dxa"/>
             </w:tcMar>
@@ -5877,8 +5877,8 @@
             <w:tcW w:type="dxa" w:w="2891"/>
             <w:shd w:val="clear" w:color="auto" w:fill="F0F4F8"/>
             <w:tcMar>
-              <w:top w:w="35" w:type="dxa"/>
-              <w:bottom w:w="35" w:type="dxa"/>
+              <w:top w:w="18" w:type="dxa"/>
+              <w:bottom w:w="18" w:type="dxa"/>
               <w:left w:w="50" w:type="dxa"/>
               <w:right w:w="50" w:type="dxa"/>
             </w:tcMar>
@@ -5909,8 +5909,8 @@
             <w:tcW w:type="dxa" w:w="2268"/>
             <w:shd w:val="clear" w:color="auto" w:fill="F0F4F8"/>
             <w:tcMar>
-              <w:top w:w="35" w:type="dxa"/>
-              <w:bottom w:w="35" w:type="dxa"/>
+              <w:top w:w="18" w:type="dxa"/>
+              <w:bottom w:w="18" w:type="dxa"/>
               <w:left w:w="50" w:type="dxa"/>
               <w:right w:w="50" w:type="dxa"/>
             </w:tcMar>
@@ -5941,8 +5941,8 @@
             <w:tcW w:type="dxa" w:w="2268"/>
             <w:shd w:val="clear" w:color="auto" w:fill="F0F4F8"/>
             <w:tcMar>
-              <w:top w:w="35" w:type="dxa"/>
-              <w:bottom w:w="35" w:type="dxa"/>
+              <w:top w:w="18" w:type="dxa"/>
+              <w:bottom w:w="18" w:type="dxa"/>
               <w:left w:w="50" w:type="dxa"/>
               <w:right w:w="50" w:type="dxa"/>
             </w:tcMar>
@@ -5973,8 +5973,8 @@
             <w:tcW w:type="dxa" w:w="2268"/>
             <w:shd w:val="clear" w:color="auto" w:fill="F0F4F8"/>
             <w:tcMar>
-              <w:top w:w="35" w:type="dxa"/>
-              <w:bottom w:w="35" w:type="dxa"/>
+              <w:top w:w="18" w:type="dxa"/>
+              <w:bottom w:w="18" w:type="dxa"/>
               <w:left w:w="50" w:type="dxa"/>
               <w:right w:w="50" w:type="dxa"/>
             </w:tcMar>
@@ -6010,8 +6010,8 @@
             <w:tcW w:type="dxa" w:w="2891"/>
             <w:shd w:val="clear" w:color="auto" w:fill="FFFFFF"/>
             <w:tcMar>
-              <w:top w:w="35" w:type="dxa"/>
-              <w:bottom w:w="35" w:type="dxa"/>
+              <w:top w:w="18" w:type="dxa"/>
+              <w:bottom w:w="18" w:type="dxa"/>
               <w:left w:w="50" w:type="dxa"/>
               <w:right w:w="50" w:type="dxa"/>
             </w:tcMar>
@@ -6042,8 +6042,8 @@
             <w:tcW w:type="dxa" w:w="2268"/>
             <w:shd w:val="clear" w:color="auto" w:fill="FFFFFF"/>
             <w:tcMar>
-              <w:top w:w="35" w:type="dxa"/>
-              <w:bottom w:w="35" w:type="dxa"/>
+              <w:top w:w="18" w:type="dxa"/>
+              <w:bottom w:w="18" w:type="dxa"/>
               <w:left w:w="50" w:type="dxa"/>
               <w:right w:w="50" w:type="dxa"/>
             </w:tcMar>
@@ -6074,8 +6074,8 @@
             <w:tcW w:type="dxa" w:w="2268"/>
             <w:shd w:val="clear" w:color="auto" w:fill="FFFFFF"/>
             <w:tcMar>
-              <w:top w:w="35" w:type="dxa"/>
-              <w:bottom w:w="35" w:type="dxa"/>
+              <w:top w:w="18" w:type="dxa"/>
+              <w:bottom w:w="18" w:type="dxa"/>
               <w:left w:w="50" w:type="dxa"/>
               <w:right w:w="50" w:type="dxa"/>
             </w:tcMar>
@@ -6106,8 +6106,8 @@
             <w:tcW w:type="dxa" w:w="2268"/>
             <w:shd w:val="clear" w:color="auto" w:fill="FFFFFF"/>
             <w:tcMar>
-              <w:top w:w="35" w:type="dxa"/>
-              <w:bottom w:w="35" w:type="dxa"/>
+              <w:top w:w="18" w:type="dxa"/>
+              <w:bottom w:w="18" w:type="dxa"/>
               <w:left w:w="50" w:type="dxa"/>
               <w:right w:w="50" w:type="dxa"/>
             </w:tcMar>
@@ -6143,8 +6143,8 @@
             <w:tcW w:type="dxa" w:w="2891"/>
             <w:shd w:val="clear" w:color="auto" w:fill="FEF3C7"/>
             <w:tcMar>
-              <w:top w:w="35" w:type="dxa"/>
-              <w:bottom w:w="35" w:type="dxa"/>
+              <w:top w:w="18" w:type="dxa"/>
+              <w:bottom w:w="18" w:type="dxa"/>
               <w:left w:w="50" w:type="dxa"/>
               <w:right w:w="50" w:type="dxa"/>
             </w:tcMar>
@@ -6175,8 +6175,8 @@
             <w:tcW w:type="dxa" w:w="2268"/>
             <w:shd w:val="clear" w:color="auto" w:fill="FEF3C7"/>
             <w:tcMar>
-              <w:top w:w="35" w:type="dxa"/>
-              <w:bottom w:w="35" w:type="dxa"/>
+              <w:top w:w="18" w:type="dxa"/>
+              <w:bottom w:w="18" w:type="dxa"/>
               <w:left w:w="50" w:type="dxa"/>
               <w:right w:w="50" w:type="dxa"/>
             </w:tcMar>
@@ -6207,8 +6207,8 @@
             <w:tcW w:type="dxa" w:w="2268"/>
             <w:shd w:val="clear" w:color="auto" w:fill="FEF3C7"/>
             <w:tcMar>
-              <w:top w:w="35" w:type="dxa"/>
-              <w:bottom w:w="35" w:type="dxa"/>
+              <w:top w:w="18" w:type="dxa"/>
+              <w:bottom w:w="18" w:type="dxa"/>
               <w:left w:w="50" w:type="dxa"/>
               <w:right w:w="50" w:type="dxa"/>
             </w:tcMar>
@@ -6239,8 +6239,8 @@
             <w:tcW w:type="dxa" w:w="2268"/>
             <w:shd w:val="clear" w:color="auto" w:fill="FEF3C7"/>
             <w:tcMar>
-              <w:top w:w="35" w:type="dxa"/>
-              <w:bottom w:w="35" w:type="dxa"/>
+              <w:top w:w="18" w:type="dxa"/>
+              <w:bottom w:w="18" w:type="dxa"/>
               <w:left w:w="50" w:type="dxa"/>
               <w:right w:w="50" w:type="dxa"/>
             </w:tcMar>
@@ -6276,8 +6276,8 @@
             <w:tcW w:type="dxa" w:w="2891"/>
             <w:shd w:val="clear" w:color="auto" w:fill="FFFFFF"/>
             <w:tcMar>
-              <w:top w:w="35" w:type="dxa"/>
-              <w:bottom w:w="35" w:type="dxa"/>
+              <w:top w:w="18" w:type="dxa"/>
+              <w:bottom w:w="18" w:type="dxa"/>
               <w:left w:w="50" w:type="dxa"/>
               <w:right w:w="50" w:type="dxa"/>
             </w:tcMar>
@@ -6308,8 +6308,8 @@
             <w:tcW w:type="dxa" w:w="2268"/>
             <w:shd w:val="clear" w:color="auto" w:fill="FFFFFF"/>
             <w:tcMar>
-              <w:top w:w="35" w:type="dxa"/>
-              <w:bottom w:w="35" w:type="dxa"/>
+              <w:top w:w="18" w:type="dxa"/>
+              <w:bottom w:w="18" w:type="dxa"/>
               <w:left w:w="50" w:type="dxa"/>
               <w:right w:w="50" w:type="dxa"/>
             </w:tcMar>
@@ -6340,8 +6340,8 @@
             <w:tcW w:type="dxa" w:w="2268"/>
             <w:shd w:val="clear" w:color="auto" w:fill="FFFFFF"/>
             <w:tcMar>
-              <w:top w:w="35" w:type="dxa"/>
-              <w:bottom w:w="35" w:type="dxa"/>
+              <w:top w:w="18" w:type="dxa"/>
+              <w:bottom w:w="18" w:type="dxa"/>
               <w:left w:w="50" w:type="dxa"/>
               <w:right w:w="50" w:type="dxa"/>
             </w:tcMar>
@@ -6372,8 +6372,8 @@
             <w:tcW w:type="dxa" w:w="2268"/>
             <w:shd w:val="clear" w:color="auto" w:fill="FFFFFF"/>
             <w:tcMar>
-              <w:top w:w="35" w:type="dxa"/>
-              <w:bottom w:w="35" w:type="dxa"/>
+              <w:top w:w="18" w:type="dxa"/>
+              <w:bottom w:w="18" w:type="dxa"/>
               <w:left w:w="50" w:type="dxa"/>
               <w:right w:w="50" w:type="dxa"/>
             </w:tcMar>
@@ -6409,8 +6409,8 @@
             <w:tcW w:type="dxa" w:w="2891"/>
             <w:shd w:val="clear" w:color="auto" w:fill="FEF3C7"/>
             <w:tcMar>
-              <w:top w:w="35" w:type="dxa"/>
-              <w:bottom w:w="35" w:type="dxa"/>
+              <w:top w:w="18" w:type="dxa"/>
+              <w:bottom w:w="18" w:type="dxa"/>
               <w:left w:w="50" w:type="dxa"/>
               <w:right w:w="50" w:type="dxa"/>
             </w:tcMar>
@@ -6441,8 +6441,8 @@
             <w:tcW w:type="dxa" w:w="2268"/>
             <w:shd w:val="clear" w:color="auto" w:fill="FEF3C7"/>
             <w:tcMar>
-              <w:top w:w="35" w:type="dxa"/>
-              <w:bottom w:w="35" w:type="dxa"/>
+              <w:top w:w="18" w:type="dxa"/>
+              <w:bottom w:w="18" w:type="dxa"/>
               <w:left w:w="50" w:type="dxa"/>
               <w:right w:w="50" w:type="dxa"/>
             </w:tcMar>
@@ -6473,8 +6473,8 @@
             <w:tcW w:type="dxa" w:w="2268"/>
             <w:shd w:val="clear" w:color="auto" w:fill="FEF3C7"/>
             <w:tcMar>
-              <w:top w:w="35" w:type="dxa"/>
-              <w:bottom w:w="35" w:type="dxa"/>
+              <w:top w:w="18" w:type="dxa"/>
+              <w:bottom w:w="18" w:type="dxa"/>
               <w:left w:w="50" w:type="dxa"/>
               <w:right w:w="50" w:type="dxa"/>
             </w:tcMar>
@@ -6505,8 +6505,8 @@
             <w:tcW w:type="dxa" w:w="2268"/>
             <w:shd w:val="clear" w:color="auto" w:fill="FEF3C7"/>
             <w:tcMar>
-              <w:top w:w="35" w:type="dxa"/>
-              <w:bottom w:w="35" w:type="dxa"/>
+              <w:top w:w="18" w:type="dxa"/>
+              <w:bottom w:w="18" w:type="dxa"/>
               <w:left w:w="50" w:type="dxa"/>
               <w:right w:w="50" w:type="dxa"/>
             </w:tcMar>

</xml_diff>

<commit_message>
feat: adjust realistic menu pricing with moderate margins and integrate wholesale plastic rattan plate equipment
</commit_message>
<xml_diff>
--- a/PROPOSAL_INVESTASI_JANGKAR_KOPI.docx
+++ b/PROPOSAL_INVESTASI_JANGKAR_KOPI.docx
@@ -240,7 +240,7 @@
                 <w:color w:val="243B53"/>
                 <w:sz w:val="18"/>
               </w:rPr>
-              <w:t>6,25 Bulan (~6 Bulan) pada Skenario Moderat; 3,8 Bulan pada Skenario Agresif.</w:t>
+              <w:t>7,5 Bulan pada Skenario Moderat; 4,7 Bulan pada Skenario Agresif (Harga Merakyat).</w:t>
             </w:r>
           </w:p>
           <w:p>
@@ -429,7 +429,7 @@
           <w:color w:val="243B53"/>
           <w:sz w:val="19"/>
         </w:rPr>
-        <w:t>Daya beli riil masyarakat di koridor Cikedal dan Menes terbukti sangat kuat. Konsumen lokal terbiasa membelanjakan Rp 15.000 hingga Rp 25.000 per sesi nongkrong saat jajan sate, nasi, dan minuman hangat. Namun, faktor penentu keberhasilan utama bukanlah kemewahan alat, melainkan suasana tempat yang merakyat, ramah, dan tidak menimbulkan rasa segan (kagok/takut mahal). Oleh karena itu, Jangkar Kopi dirancang bersahaja, bersih, dan berakar pada kenyamanan warga lokal.</w:t>
+        <w:t>Daya beli riil masyarakat di koridor Cikedal dan Menes terbukti sangat kuat pada rentang harga merakyat. Konsumen lokal terbiasa membelanjakan Rp 10.000 hingga Rp 20.000 per sesi nongkrong saat jajan aneka sate arang (Rp 2.500–Rp 3.500), nasi kucing, dan kopi hangat (Rp 3.000). Faktor penentu keberhasilan utama bukanlah kemewahan alat, melainkan suasana tempat yang merakyat, ramah, dan harga bersahabat yang tidak menimbulkan rasa segan (kagok/takut mahal). Oleh karena itu, Jangkar Kopi dirancang bersahaja, bersih, dan berakar pada kenyamanan warga lokal.</w:t>
       </w:r>
     </w:p>
     <w:p>
@@ -684,7 +684,7 @@
           <w:color w:val="243B53"/>
           <w:sz w:val="19"/>
         </w:rPr>
-        <w:t>Jangkar Kopi mengusung konsep 100% lesehan bersih beralas tebal yang nyaman (karpet spons/busa empuk waterproof dilapisi tikar rapi) dipadu 4 unit meja lipat kecil portabel yang praktis dan kokoh. Hidangan disajikan di atas piring anyaman rotan beralas kertas nasi coklat, menghadirkan estetika angkringan tradisional yang otentik sekaligus sangat higienis dan praktis tanpa repot mencuci piring berminyak di malam hari (zero washing). Format duduk lesehan melingkar terbukti secara sosiologis mampu meruntuhkan batas status sosial. Pelanggan dapat duduk santai berselonjor menikmati hidangan tanpa merasa canggung atau terintimidasi.</w:t>
+        <w:t>Jangkar Kopi mengusung konsep 100% lesehan bersih beralas tebal yang nyaman (karpet spons/busa empuk waterproof dilapisi tikar rapi) dipadu 4 unit meja lipat kecil portabel yang praktis dan kokoh. Hidangan disajikan di atas piring anyaman rotan plastik bahan PP tebal food-grade anti-jamur hasil riset pasar e-commerce (dipesan paket grosir lusinan hemat Rp 15rb-19rb/lusin) beralas kertas nasi coklat bulat. Pilihan ini menghadirkan estetika angkringan otentik, anti-pecah, tidak menyimpan bau, sekaligus higienis dan praktis tanpa repot mencuci piring berminyak di malam hari (zero washing). Format duduk lesehan melingkar terbukti secara sosiologis mampu meruntuhkan batas status sosial. Pelanggan dapat duduk santai berselonjor menikmati hidangan tanpa merasa canggung atau terintimidasi.</w:t>
       </w:r>
     </w:p>
     <w:p>
@@ -904,7 +904,7 @@
           <w:color w:val="243B53"/>
           <w:sz w:val="19"/>
         </w:rPr>
-        <w:t>Menu makanan awal Jangkar Kopi difokuskan pada olahan siap bakar yang praktis, higienis, dan zero food waste:</w:t>
+        <w:t>Menu makanan awal Jangkar Kopi difokuskan pada olahan siap bakar yang praktis, higienis, dan zero food waste dengan harga jual ramah kantong:</w:t>
       </w:r>
     </w:p>
     <w:p>
@@ -920,7 +920,7 @@
           <w:color w:val="243B53"/>
           <w:sz w:val="19"/>
         </w:rPr>
-        <w:t>• Aneka Sate Frozen Food Bakar Arang: Dumpling ayam &amp; dumpling keju lumer (meleleh gurih saat digigit), sate cumi flower, otak-otak singapura kerat silang, sosis sapi bakar BBQ, bakso sapi bakar arang lada hitam, dan fish roll. Seluruhnya dipanggang hangat di atas bara batok kelapa beralas piring rotan &amp; kertas nasi coklat dengan cocolan sambal kecap rawit pedas dan saus bakar spesial dalam mangkuk plastik kecil.</w:t>
+        <w:t>• Aneka Sate Frozen Food Bakar Arang: Dumpling ayam &amp; keju lumer (Rp 3.500), sate cumi flower (Rp 3.500), otak-otak singapura kerat silang (Rp 2.500), sosis sapi bakar BBQ (Rp 3.000), bakso sapi bakar arang lada hitam (Rp 2.500), dan fish roll (Rp 2.500). Seluruhnya dipanggang hangat di atas bara batok kelapa beralas piring rotan plastik PP &amp; kertas nasi coklat dengan cocolan sambal kecap rawit pedas dan saus bakar spesial dalam mangkuk plastik kecil.</w:t>
       </w:r>
     </w:p>
     <w:p>
@@ -936,7 +936,7 @@
           <w:color w:val="243B53"/>
           <w:sz w:val="19"/>
         </w:rPr>
-        <w:t>• Kudapan Tradisional: Nasi kucing teri balado / orek tempe bungkus daun pisang yang dipanaskan di atas bara panggangan, serta tempe mendoan hangat daun bawang yang renyah dan gurih.</w:t>
+        <w:t>• Kudapan Tradisional: Nasi kucing teri balado / orek tempe bungkus daun pisang (Rp 2.500) yang dihangatkan di atas bara panggangan, serta tempe mendoan hangat daun bawang (Rp 3.000 isi 3 lembar) yang renyah dan gurih.</w:t>
       </w:r>
     </w:p>
     <w:p>
@@ -967,7 +967,7 @@
           <w:color w:val="243B53"/>
           <w:sz w:val="19"/>
         </w:rPr>
-        <w:t>Sebagai pembeda utama, Jangkar Kopi menghadirkan menu signature kopi khas daerah dan minuman rakyat:</w:t>
+        <w:t>Sebagai pembeda utama, Jangkar Kopi menghadirkan menu signature kopi khas daerah dan minuman rakyat berharga terjangkau:</w:t>
       </w:r>
     </w:p>
     <w:p>
@@ -983,7 +983,7 @@
           <w:color w:val="243B53"/>
           <w:sz w:val="19"/>
         </w:rPr>
-        <w:t>1. Kopi Hitam Tubruk 'Jangkar Asli' (Signature Utama): Bubuk kopi Robusta sangrai tradisional khas lereng Gunung Karang Pandeglang, diseduh tubruk panas dengan air mendidih murni. Berkarakter aroma smoky alami, body pekat (bold), dan rasa pahit gurih mantap khas Banten Barat, dengan pilihan gula aren Malingping murni atau gula pasir terpisah (Rp 4.000).</w:t>
+        <w:t>1. Kopi Hitam Tubruk 'Jangkar Asli' (Signature Utama): Bubuk kopi Robusta sangrai tradisional khas lereng Gunung Karang Pandeglang, diseduh tubruk panas dengan air mendidih murni. Berkarakter aroma smoky alami, body pekat (bold), dan rasa pahit gurih mantap khas Banten Barat, dengan pilihan gula aren Malingping murni atau gula pasir terpisah (Rp 3.000).</w:t>
       </w:r>
     </w:p>
     <w:p>
@@ -999,7 +999,7 @@
           <w:color w:val="243B53"/>
           <w:sz w:val="19"/>
         </w:rPr>
-        <w:t>2. Kopi Susu 'Jangkar Dermaga' (Signature Modern): Perpaduan seduhan pekat Robusta lokal Gunung Karang dengan susu segar gurih dan lelehan gula aren murni khas Pandeglang. Menghadirkan rasa manis legit yang lembut dan seimbang, disajikan hangat maupun es dingin segar (Rp 6.000).</w:t>
+        <w:t>2. Kopi Susu 'Jangkar Dermaga' (Signature Modern): Perpaduan seduhan pekat Robusta lokal Gunung Karang dengan susu kental manis gurih dan lelehan gula aren murni khas Pandeglang. Menghadirkan rasa manis legit yang lembut dan seimbang, disajikan hangat maupun es dingin segar (Rp 5.000).</w:t>
       </w:r>
     </w:p>
     <w:p>
@@ -1015,7 +1015,7 @@
           <w:color w:val="243B53"/>
           <w:sz w:val="19"/>
         </w:rPr>
-        <w:t>3. Kopi Jahe Rempah 'Jangkar Samudra' (Signature Penghangat): Seduhan kopi Robusta lokal berpadu rebusan jahe merah geprek, serai, dan kayu manis alami dalam mug jadul. Menjadi primadona pekerja malam, santri, dan pelintas jalur Labuan-Pandeglang untuk memulihkan stamina (Rp 7.000).</w:t>
+        <w:t>3. Kopi Jahe Rempah 'Jangkar Samudra' (Signature Penghangat): Seduhan kopi Robusta lokal berpadu rebusan jahe merah geprek, serai, dan kayu manis alami dalam mug jadul. Menjadi primadona pekerja malam, santri, dan pelintas jalur Labuan-Pandeglang untuk memulihkan stamina (Rp 6.000).</w:t>
       </w:r>
     </w:p>
     <w:p>
@@ -1031,7 +1031,7 @@
           <w:color w:val="243B53"/>
           <w:sz w:val="19"/>
         </w:rPr>
-        <w:t>4. Minuman Rakyat Pendamping: Susu murni segar, wedang jahe susu, es sirup sachet (Nutrisari, Extra Joss Susu), dan varian kopi sachet populer (Good Day, Kapal Api, Indocafe, Luwak White Koffie) seharga Rp 4.000 – Rp 8.500.</w:t>
+        <w:t>4. Minuman Rakyat Pendamping: Susu murni segar, wedang jahe susu, es sirup sachet (Nutrisari, Extra Joss Susu), dan varian kopi sachet populer (Good Day, Kapal Api, Indocafe, Luwak White Koffie) seharga Rp 3.000 – Rp 6.000.</w:t>
       </w:r>
     </w:p>
     <w:p>
@@ -1370,7 +1370,7 @@
           <w:color w:val="243B53"/>
           <w:sz w:val="19"/>
         </w:rPr>
-        <w:t>Total kebutuhan belanja modal (CAPEX) dan modal kerja awal Jangkar Kopi dialokasikan tepat sebesar Rp 15.000.000 (Lima Belas Juta Rupiah). Anggaran ini mengalokasikan sewa lahan terbuka selama 1 tahun di muka sebesar Rp 6.000.000 (40%), serta memanfaatkan sisa dana Rp 9.000.000 (60%) secara optimal untuk pengadaan atap terpal waterproof pada rangka tenda 2×6 meter milik pribadi inisiator, gerobak kayu custom etalase kaca, panggangan arang batok dengan kipas angin kecil, peralatan dapur wedangan, fasilitas lesehan alas tebal nyaman dengan 4 meja lipat portabel, wadah saji piring anyaman rotan beralas kertas nasi &amp; mangkuk plastik kecil sambal, instalasi listrik festoon, stok bahan baku awal yang diperkuat termasuk bubuk kopi Robusta lokal khas daerah (Rp 1.600.000), dan cadangan kas darurat yang kokoh (Rp 2.000.000).</w:t>
+        <w:t>Total kebutuhan belanja modal (CAPEX) dan modal kerja awal Jangkar Kopi dialokasikan tepat sebesar Rp 15.000.000 (Lima Belas Juta Rupiah). Anggaran ini mengalokasikan sewa lahan terbuka selama 1 tahun di muka sebesar Rp 6.000.000 (40%), serta memanfaatkan sisa dana Rp 9.000.000 (60%) secara optimal untuk pengadaan atap terpal waterproof pada rangka tenda 2×6 meter milik pribadi inisiator, gerobak kayu custom etalase kaca, panggangan arang batok dengan kipas angin kecil, peralatan dapur wedangan, fasilitas lesehan alas tebal nyaman dengan 4 meja lipat portabel, wadah saji piring anyaman rotan plastik PP tebal anti-jamur (grosir lusinan) beralas kertas nasi &amp; mangkuk plastik kecil sambal, instalasi listrik festoon, stok bahan baku awal yang diperkuat termasuk bubuk kopi Robusta lokal khas daerah (Rp 1.600.000), dan cadangan kas darurat yang kokoh (Rp 2.000.000).</w:t>
       </w:r>
     </w:p>
     <w:p>
@@ -2223,7 +2223,7 @@
                 <w:color w:val="243B53"/>
                 <w:sz w:val="16"/>
               </w:rPr>
-              <w:t>Cooler box 35-45L, piring rotan, kertas nasi, mangkuk plastik kecil sambal</w:t>
+              <w:t>Cooler box 35-45L, 2 lusin piring rotan plastik PP tebal (grosir), kertas nasi, mangkuk sambal</w:t>
             </w:r>
           </w:p>
         </w:tc>
@@ -2836,7 +2836,7 @@
           <w:color w:val="243B53"/>
           <w:sz w:val="19"/>
         </w:rPr>
-        <w:t>Kalkulasi HPP divalidasi langsung dari harga grosir pasar distributor (CEDEA Dumpling Keju 500g @Rp 29rb-35rb isi 25 pcs, CEDEA Otak-Otak Singapore 500g @Rp 30rb-35rb, CEDEA Fish Roll 250g @Rp 15.900, serta kopi sachet kartonan dus Kapal Api @Rp 1.083/sachet dan Good Day @Rp 1.590/sachet). Seluruh menu ber-margin laba kotor sehat antara 46% hingga 65% (melampaui 70% pada pembelian kartonan):</w:t>
+        <w:t>Kalkulasi HPP divalidasi langsung dari harga grosir riil distributor (CEDEA Dumpling Keju 500g @Rp 29rb-35rb isi 25 pcs, CEDEA/Minaku Otak-Otak Singapore @Rp 25rb-35rb, CEDEA Fish Roll 250g @Rp 15.900, kopi Kapal Api dus @Rp 1.083/sachet, serta piring rotan plastik PP tebal grosir @Rp 15rb-19rb/lusin). Strategi penetrasi awal mengutamakan harga jual realistis dan terjangkau bagi warga lokal, tanpa mematok margin berlebihan (rata-rata laba kotor 35%–50%):</w:t>
       </w:r>
     </w:p>
     <w:tbl>
@@ -3082,7 +3082,7 @@
                 <w:color w:val="243B53"/>
                 <w:sz w:val="15"/>
               </w:rPr>
-              <w:t>Rp 1.800</w:t>
+              <w:t>Rp 1.600</w:t>
             </w:r>
           </w:p>
         </w:tc>
@@ -3113,7 +3113,7 @@
                 <w:color w:val="243B53"/>
                 <w:sz w:val="15"/>
               </w:rPr>
-              <w:t>Rp 4.000</w:t>
+              <w:t>Rp 3.000</w:t>
             </w:r>
           </w:p>
         </w:tc>
@@ -3145,7 +3145,7 @@
                 <w:color w:val="166534"/>
                 <w:sz w:val="15"/>
               </w:rPr>
-              <w:t>Rp 2.200 (55,0%)</w:t>
+              <w:t>Rp 1.400 (46,7%)</w:t>
             </w:r>
           </w:p>
         </w:tc>
@@ -3182,7 +3182,7 @@
                 <w:color w:val="243B53"/>
                 <w:sz w:val="15"/>
               </w:rPr>
-              <w:t>Bakso Sapi Bakar Arang (4 Butir)</w:t>
+              <w:t>Bakso Sapi Bakar Arang (3 Butir)</w:t>
             </w:r>
           </w:p>
         </w:tc>
@@ -3244,7 +3244,7 @@
                 <w:color w:val="243B53"/>
                 <w:sz w:val="15"/>
               </w:rPr>
-              <w:t>Rp 1.600</w:t>
+              <w:t>Rp 1.400</w:t>
             </w:r>
           </w:p>
         </w:tc>
@@ -3275,7 +3275,7 @@
                 <w:color w:val="243B53"/>
                 <w:sz w:val="15"/>
               </w:rPr>
-              <w:t>Rp 3.500</w:t>
+              <w:t>Rp 2.500</w:t>
             </w:r>
           </w:p>
         </w:tc>
@@ -3307,7 +3307,7 @@
                 <w:color w:val="166534"/>
                 <w:sz w:val="15"/>
               </w:rPr>
-              <w:t>Rp 1.900 (54,2%)</w:t>
+              <w:t>Rp 1.100 (44,0%)</w:t>
             </w:r>
           </w:p>
         </w:tc>
@@ -3344,7 +3344,7 @@
                 <w:color w:val="243B53"/>
                 <w:sz w:val="15"/>
               </w:rPr>
-              <w:t>Dumpling Ayam / Keju Lumer (3 Pcs)</w:t>
+              <w:t>Dumpling Ayam / Keju Lumer (2 Pcs)</w:t>
             </w:r>
           </w:p>
         </w:tc>
@@ -3406,7 +3406,7 @@
                 <w:color w:val="243B53"/>
                 <w:sz w:val="15"/>
               </w:rPr>
-              <w:t>Rp 2.200</w:t>
+              <w:t>Rp 2.400</w:t>
             </w:r>
           </w:p>
         </w:tc>
@@ -3437,7 +3437,7 @@
                 <w:color w:val="243B53"/>
                 <w:sz w:val="15"/>
               </w:rPr>
-              <w:t>Rp 5.000</w:t>
+              <w:t>Rp 3.500</w:t>
             </w:r>
           </w:p>
         </w:tc>
@@ -3469,7 +3469,7 @@
                 <w:color w:val="166534"/>
                 <w:sz w:val="15"/>
               </w:rPr>
-              <w:t>Rp 2.800 (56,0%)</w:t>
+              <w:t>Rp 1.100 (31,4%)</w:t>
             </w:r>
           </w:p>
         </w:tc>
@@ -3599,7 +3599,7 @@
                 <w:color w:val="243B53"/>
                 <w:sz w:val="15"/>
               </w:rPr>
-              <w:t>Rp 3.500</w:t>
+              <w:t>Rp 2.500</w:t>
             </w:r>
           </w:p>
         </w:tc>
@@ -3631,7 +3631,7 @@
                 <w:color w:val="166534"/>
                 <w:sz w:val="15"/>
               </w:rPr>
-              <w:t>Rp 2.000 (57,1%)</w:t>
+              <w:t>Rp 1.000 (40,0%)</w:t>
             </w:r>
           </w:p>
         </w:tc>
@@ -3761,7 +3761,7 @@
                 <w:color w:val="243B53"/>
                 <w:sz w:val="15"/>
               </w:rPr>
-              <w:t>Rp 4.500</w:t>
+              <w:t>Rp 3.500</w:t>
             </w:r>
           </w:p>
         </w:tc>
@@ -3793,7 +3793,7 @@
                 <w:color w:val="166534"/>
                 <w:sz w:val="15"/>
               </w:rPr>
-              <w:t>Rp 2.500 (55,5%)</w:t>
+              <w:t>Rp 1.500 (42,9%)</w:t>
             </w:r>
           </w:p>
         </w:tc>
@@ -3862,6 +3862,654 @@
                 <w:sz w:val="15"/>
               </w:rPr>
               <w:t>CEDEA Fish roll / kani stik rempah arang batok kelapa</w:t>
+            </w:r>
+          </w:p>
+        </w:tc>
+        <w:tc>
+          <w:tcPr>
+            <w:tcW w:type="dxa" w:w="1247"/>
+            <w:shd w:val="clear" w:color="auto" w:fill="FFFFFF"/>
+            <w:tcMar>
+              <w:top w:w="16" w:type="dxa"/>
+              <w:bottom w:w="16" w:type="dxa"/>
+              <w:left w:w="45" w:type="dxa"/>
+              <w:right w:w="45" w:type="dxa"/>
+            </w:tcMar>
+            <w:tcBorders>
+              <w:top w:val="none"/>
+              <w:left w:val="none"/>
+              <w:bottom w:val="single" w:sz="4" w:space="0" w:color="D9E2EC"/>
+              <w:right w:val="none"/>
+            </w:tcBorders>
+          </w:tcPr>
+          <w:p>
+            <w:pPr>
+              <w:jc w:val="center"/>
+            </w:pPr>
+            <w:r>
+              <w:rPr>
+                <w:rFonts w:ascii="Arial" w:hAnsi="Arial"/>
+                <w:color w:val="243B53"/>
+                <w:sz w:val="15"/>
+              </w:rPr>
+              <w:t>Rp 1.400</w:t>
+            </w:r>
+          </w:p>
+        </w:tc>
+        <w:tc>
+          <w:tcPr>
+            <w:tcW w:type="dxa" w:w="1247"/>
+            <w:shd w:val="clear" w:color="auto" w:fill="FFFFFF"/>
+            <w:tcMar>
+              <w:top w:w="16" w:type="dxa"/>
+              <w:bottom w:w="16" w:type="dxa"/>
+              <w:left w:w="45" w:type="dxa"/>
+              <w:right w:w="45" w:type="dxa"/>
+            </w:tcMar>
+            <w:tcBorders>
+              <w:top w:val="none"/>
+              <w:left w:val="none"/>
+              <w:bottom w:val="single" w:sz="4" w:space="0" w:color="D9E2EC"/>
+              <w:right w:val="none"/>
+            </w:tcBorders>
+          </w:tcPr>
+          <w:p>
+            <w:pPr>
+              <w:jc w:val="center"/>
+            </w:pPr>
+            <w:r>
+              <w:rPr>
+                <w:rFonts w:ascii="Arial" w:hAnsi="Arial"/>
+                <w:color w:val="243B53"/>
+                <w:sz w:val="15"/>
+              </w:rPr>
+              <w:t>Rp 2.500</w:t>
+            </w:r>
+          </w:p>
+        </w:tc>
+        <w:tc>
+          <w:tcPr>
+            <w:tcW w:type="dxa" w:w="1587"/>
+            <w:shd w:val="clear" w:color="auto" w:fill="FFFFFF"/>
+            <w:tcMar>
+              <w:top w:w="16" w:type="dxa"/>
+              <w:bottom w:w="16" w:type="dxa"/>
+              <w:left w:w="45" w:type="dxa"/>
+              <w:right w:w="45" w:type="dxa"/>
+            </w:tcMar>
+            <w:tcBorders>
+              <w:top w:val="none"/>
+              <w:left w:val="none"/>
+              <w:bottom w:val="single" w:sz="4" w:space="0" w:color="D9E2EC"/>
+              <w:right w:val="none"/>
+            </w:tcBorders>
+          </w:tcPr>
+          <w:p>
+            <w:pPr>
+              <w:jc w:val="right"/>
+            </w:pPr>
+            <w:r>
+              <w:rPr>
+                <w:rFonts w:ascii="Arial" w:hAnsi="Arial"/>
+                <w:b/>
+                <w:color w:val="166534"/>
+                <w:sz w:val="15"/>
+              </w:rPr>
+              <w:t>Rp 1.100 (44,0%)</w:t>
+            </w:r>
+          </w:p>
+        </w:tc>
+      </w:tr>
+      <w:tr>
+        <w:trPr>
+          <w:cantSplit/>
+        </w:trPr>
+        <w:tc>
+          <w:tcPr>
+            <w:tcW w:type="dxa" w:w="2438"/>
+            <w:shd w:val="clear" w:color="auto" w:fill="F0F4F8"/>
+            <w:tcMar>
+              <w:top w:w="16" w:type="dxa"/>
+              <w:bottom w:w="16" w:type="dxa"/>
+              <w:left w:w="45" w:type="dxa"/>
+              <w:right w:w="45" w:type="dxa"/>
+            </w:tcMar>
+            <w:tcBorders>
+              <w:top w:val="none"/>
+              <w:left w:val="none"/>
+              <w:bottom w:val="single" w:sz="4" w:space="0" w:color="D9E2EC"/>
+              <w:right w:val="none"/>
+            </w:tcBorders>
+          </w:tcPr>
+          <w:p>
+            <w:pPr>
+              <w:jc w:val="left"/>
+            </w:pPr>
+            <w:r>
+              <w:rPr>
+                <w:rFonts w:ascii="Arial" w:hAnsi="Arial"/>
+                <w:b/>
+                <w:color w:val="243B53"/>
+                <w:sz w:val="15"/>
+              </w:rPr>
+              <w:t>Nasi Kucing Teri / Orek Tempe</w:t>
+            </w:r>
+          </w:p>
+        </w:tc>
+        <w:tc>
+          <w:tcPr>
+            <w:tcW w:type="dxa" w:w="3175"/>
+            <w:shd w:val="clear" w:color="auto" w:fill="F0F4F8"/>
+            <w:tcMar>
+              <w:top w:w="16" w:type="dxa"/>
+              <w:bottom w:w="16" w:type="dxa"/>
+              <w:left w:w="45" w:type="dxa"/>
+              <w:right w:w="45" w:type="dxa"/>
+            </w:tcMar>
+            <w:tcBorders>
+              <w:top w:val="none"/>
+              <w:left w:val="none"/>
+              <w:bottom w:val="single" w:sz="4" w:space="0" w:color="D9E2EC"/>
+              <w:right w:val="none"/>
+            </w:tcBorders>
+          </w:tcPr>
+          <w:p>
+            <w:pPr>
+              <w:jc w:val="left"/>
+            </w:pPr>
+            <w:r>
+              <w:rPr>
+                <w:rFonts w:ascii="Arial" w:hAnsi="Arial"/>
+                <w:color w:val="243B53"/>
+                <w:sz w:val="15"/>
+              </w:rPr>
+              <w:t>Nasi pulen sambal teri balado / orek tempe bungkus daun pisang</w:t>
+            </w:r>
+          </w:p>
+        </w:tc>
+        <w:tc>
+          <w:tcPr>
+            <w:tcW w:type="dxa" w:w="1247"/>
+            <w:shd w:val="clear" w:color="auto" w:fill="F0F4F8"/>
+            <w:tcMar>
+              <w:top w:w="16" w:type="dxa"/>
+              <w:bottom w:w="16" w:type="dxa"/>
+              <w:left w:w="45" w:type="dxa"/>
+              <w:right w:w="45" w:type="dxa"/>
+            </w:tcMar>
+            <w:tcBorders>
+              <w:top w:val="none"/>
+              <w:left w:val="none"/>
+              <w:bottom w:val="single" w:sz="4" w:space="0" w:color="D9E2EC"/>
+              <w:right w:val="none"/>
+            </w:tcBorders>
+          </w:tcPr>
+          <w:p>
+            <w:pPr>
+              <w:jc w:val="center"/>
+            </w:pPr>
+            <w:r>
+              <w:rPr>
+                <w:rFonts w:ascii="Arial" w:hAnsi="Arial"/>
+                <w:color w:val="243B53"/>
+                <w:sz w:val="15"/>
+              </w:rPr>
+              <w:t>Rp 1.500</w:t>
+            </w:r>
+          </w:p>
+        </w:tc>
+        <w:tc>
+          <w:tcPr>
+            <w:tcW w:type="dxa" w:w="1247"/>
+            <w:shd w:val="clear" w:color="auto" w:fill="F0F4F8"/>
+            <w:tcMar>
+              <w:top w:w="16" w:type="dxa"/>
+              <w:bottom w:w="16" w:type="dxa"/>
+              <w:left w:w="45" w:type="dxa"/>
+              <w:right w:w="45" w:type="dxa"/>
+            </w:tcMar>
+            <w:tcBorders>
+              <w:top w:val="none"/>
+              <w:left w:val="none"/>
+              <w:bottom w:val="single" w:sz="4" w:space="0" w:color="D9E2EC"/>
+              <w:right w:val="none"/>
+            </w:tcBorders>
+          </w:tcPr>
+          <w:p>
+            <w:pPr>
+              <w:jc w:val="center"/>
+            </w:pPr>
+            <w:r>
+              <w:rPr>
+                <w:rFonts w:ascii="Arial" w:hAnsi="Arial"/>
+                <w:color w:val="243B53"/>
+                <w:sz w:val="15"/>
+              </w:rPr>
+              <w:t>Rp 2.500</w:t>
+            </w:r>
+          </w:p>
+        </w:tc>
+        <w:tc>
+          <w:tcPr>
+            <w:tcW w:type="dxa" w:w="1587"/>
+            <w:shd w:val="clear" w:color="auto" w:fill="F0F4F8"/>
+            <w:tcMar>
+              <w:top w:w="16" w:type="dxa"/>
+              <w:bottom w:w="16" w:type="dxa"/>
+              <w:left w:w="45" w:type="dxa"/>
+              <w:right w:w="45" w:type="dxa"/>
+            </w:tcMar>
+            <w:tcBorders>
+              <w:top w:val="none"/>
+              <w:left w:val="none"/>
+              <w:bottom w:val="single" w:sz="4" w:space="0" w:color="D9E2EC"/>
+              <w:right w:val="none"/>
+            </w:tcBorders>
+          </w:tcPr>
+          <w:p>
+            <w:pPr>
+              <w:jc w:val="right"/>
+            </w:pPr>
+            <w:r>
+              <w:rPr>
+                <w:rFonts w:ascii="Arial" w:hAnsi="Arial"/>
+                <w:b/>
+                <w:color w:val="166534"/>
+                <w:sz w:val="15"/>
+              </w:rPr>
+              <w:t>Rp 1.000 (40,0%)</w:t>
+            </w:r>
+          </w:p>
+        </w:tc>
+      </w:tr>
+      <w:tr>
+        <w:trPr>
+          <w:cantSplit/>
+        </w:trPr>
+        <w:tc>
+          <w:tcPr>
+            <w:tcW w:type="dxa" w:w="2438"/>
+            <w:shd w:val="clear" w:color="auto" w:fill="FFFFFF"/>
+            <w:tcMar>
+              <w:top w:w="16" w:type="dxa"/>
+              <w:bottom w:w="16" w:type="dxa"/>
+              <w:left w:w="45" w:type="dxa"/>
+              <w:right w:w="45" w:type="dxa"/>
+            </w:tcMar>
+            <w:tcBorders>
+              <w:top w:val="none"/>
+              <w:left w:val="none"/>
+              <w:bottom w:val="single" w:sz="4" w:space="0" w:color="D9E2EC"/>
+              <w:right w:val="none"/>
+            </w:tcBorders>
+          </w:tcPr>
+          <w:p>
+            <w:pPr>
+              <w:jc w:val="left"/>
+            </w:pPr>
+            <w:r>
+              <w:rPr>
+                <w:rFonts w:ascii="Arial" w:hAnsi="Arial"/>
+                <w:b/>
+                <w:color w:val="243B53"/>
+                <w:sz w:val="15"/>
+              </w:rPr>
+              <w:t>Tempe Mendoan Hangat (3 Lembar)</w:t>
+            </w:r>
+          </w:p>
+        </w:tc>
+        <w:tc>
+          <w:tcPr>
+            <w:tcW w:type="dxa" w:w="3175"/>
+            <w:shd w:val="clear" w:color="auto" w:fill="FFFFFF"/>
+            <w:tcMar>
+              <w:top w:w="16" w:type="dxa"/>
+              <w:bottom w:w="16" w:type="dxa"/>
+              <w:left w:w="45" w:type="dxa"/>
+              <w:right w:w="45" w:type="dxa"/>
+            </w:tcMar>
+            <w:tcBorders>
+              <w:top w:val="none"/>
+              <w:left w:val="none"/>
+              <w:bottom w:val="single" w:sz="4" w:space="0" w:color="D9E2EC"/>
+              <w:right w:val="none"/>
+            </w:tcBorders>
+          </w:tcPr>
+          <w:p>
+            <w:pPr>
+              <w:jc w:val="left"/>
+            </w:pPr>
+            <w:r>
+              <w:rPr>
+                <w:rFonts w:ascii="Arial" w:hAnsi="Arial"/>
+                <w:color w:val="243B53"/>
+                <w:sz w:val="15"/>
+              </w:rPr>
+              <w:t>Tempe kedelai lokal, adonan tepung daun bawang, kecap rawit</w:t>
+            </w:r>
+          </w:p>
+        </w:tc>
+        <w:tc>
+          <w:tcPr>
+            <w:tcW w:type="dxa" w:w="1247"/>
+            <w:shd w:val="clear" w:color="auto" w:fill="FFFFFF"/>
+            <w:tcMar>
+              <w:top w:w="16" w:type="dxa"/>
+              <w:bottom w:w="16" w:type="dxa"/>
+              <w:left w:w="45" w:type="dxa"/>
+              <w:right w:w="45" w:type="dxa"/>
+            </w:tcMar>
+            <w:tcBorders>
+              <w:top w:val="none"/>
+              <w:left w:val="none"/>
+              <w:bottom w:val="single" w:sz="4" w:space="0" w:color="D9E2EC"/>
+              <w:right w:val="none"/>
+            </w:tcBorders>
+          </w:tcPr>
+          <w:p>
+            <w:pPr>
+              <w:jc w:val="center"/>
+            </w:pPr>
+            <w:r>
+              <w:rPr>
+                <w:rFonts w:ascii="Arial" w:hAnsi="Arial"/>
+                <w:color w:val="243B53"/>
+                <w:sz w:val="15"/>
+              </w:rPr>
+              <w:t>Rp 2.000</w:t>
+            </w:r>
+          </w:p>
+        </w:tc>
+        <w:tc>
+          <w:tcPr>
+            <w:tcW w:type="dxa" w:w="1247"/>
+            <w:shd w:val="clear" w:color="auto" w:fill="FFFFFF"/>
+            <w:tcMar>
+              <w:top w:w="16" w:type="dxa"/>
+              <w:bottom w:w="16" w:type="dxa"/>
+              <w:left w:w="45" w:type="dxa"/>
+              <w:right w:w="45" w:type="dxa"/>
+            </w:tcMar>
+            <w:tcBorders>
+              <w:top w:val="none"/>
+              <w:left w:val="none"/>
+              <w:bottom w:val="single" w:sz="4" w:space="0" w:color="D9E2EC"/>
+              <w:right w:val="none"/>
+            </w:tcBorders>
+          </w:tcPr>
+          <w:p>
+            <w:pPr>
+              <w:jc w:val="center"/>
+            </w:pPr>
+            <w:r>
+              <w:rPr>
+                <w:rFonts w:ascii="Arial" w:hAnsi="Arial"/>
+                <w:color w:val="243B53"/>
+                <w:sz w:val="15"/>
+              </w:rPr>
+              <w:t>Rp 3.000</w:t>
+            </w:r>
+          </w:p>
+        </w:tc>
+        <w:tc>
+          <w:tcPr>
+            <w:tcW w:type="dxa" w:w="1587"/>
+            <w:shd w:val="clear" w:color="auto" w:fill="FFFFFF"/>
+            <w:tcMar>
+              <w:top w:w="16" w:type="dxa"/>
+              <w:bottom w:w="16" w:type="dxa"/>
+              <w:left w:w="45" w:type="dxa"/>
+              <w:right w:w="45" w:type="dxa"/>
+            </w:tcMar>
+            <w:tcBorders>
+              <w:top w:val="none"/>
+              <w:left w:val="none"/>
+              <w:bottom w:val="single" w:sz="4" w:space="0" w:color="D9E2EC"/>
+              <w:right w:val="none"/>
+            </w:tcBorders>
+          </w:tcPr>
+          <w:p>
+            <w:pPr>
+              <w:jc w:val="right"/>
+            </w:pPr>
+            <w:r>
+              <w:rPr>
+                <w:rFonts w:ascii="Arial" w:hAnsi="Arial"/>
+                <w:b/>
+                <w:color w:val="166534"/>
+                <w:sz w:val="15"/>
+              </w:rPr>
+              <w:t>Rp 1.000 (33,3%)</w:t>
+            </w:r>
+          </w:p>
+        </w:tc>
+      </w:tr>
+      <w:tr>
+        <w:trPr>
+          <w:cantSplit/>
+        </w:trPr>
+        <w:tc>
+          <w:tcPr>
+            <w:tcW w:type="dxa" w:w="2438"/>
+            <w:shd w:val="clear" w:color="auto" w:fill="F0F4F8"/>
+            <w:tcMar>
+              <w:top w:w="16" w:type="dxa"/>
+              <w:bottom w:w="16" w:type="dxa"/>
+              <w:left w:w="45" w:type="dxa"/>
+              <w:right w:w="45" w:type="dxa"/>
+            </w:tcMar>
+            <w:tcBorders>
+              <w:top w:val="none"/>
+              <w:left w:val="none"/>
+              <w:bottom w:val="single" w:sz="4" w:space="0" w:color="D9E2EC"/>
+              <w:right w:val="none"/>
+            </w:tcBorders>
+          </w:tcPr>
+          <w:p>
+            <w:pPr>
+              <w:jc w:val="left"/>
+            </w:pPr>
+            <w:r>
+              <w:rPr>
+                <w:rFonts w:ascii="Arial" w:hAnsi="Arial"/>
+                <w:b/>
+                <w:color w:val="243B53"/>
+                <w:sz w:val="15"/>
+              </w:rPr>
+              <w:t>Kopi Tubruk 'Jangkar Asli' (Signature)</w:t>
+            </w:r>
+          </w:p>
+        </w:tc>
+        <w:tc>
+          <w:tcPr>
+            <w:tcW w:type="dxa" w:w="3175"/>
+            <w:shd w:val="clear" w:color="auto" w:fill="F0F4F8"/>
+            <w:tcMar>
+              <w:top w:w="16" w:type="dxa"/>
+              <w:bottom w:w="16" w:type="dxa"/>
+              <w:left w:w="45" w:type="dxa"/>
+              <w:right w:w="45" w:type="dxa"/>
+            </w:tcMar>
+            <w:tcBorders>
+              <w:top w:val="none"/>
+              <w:left w:val="none"/>
+              <w:bottom w:val="single" w:sz="4" w:space="0" w:color="D9E2EC"/>
+              <w:right w:val="none"/>
+            </w:tcBorders>
+          </w:tcPr>
+          <w:p>
+            <w:pPr>
+              <w:jc w:val="left"/>
+            </w:pPr>
+            <w:r>
+              <w:rPr>
+                <w:rFonts w:ascii="Arial" w:hAnsi="Arial"/>
+                <w:color w:val="243B53"/>
+                <w:sz w:val="15"/>
+              </w:rPr>
+              <w:t>Bubuk Robusta sangrai lereng Gn. Karang, gula aren/pasir</w:t>
+            </w:r>
+          </w:p>
+        </w:tc>
+        <w:tc>
+          <w:tcPr>
+            <w:tcW w:type="dxa" w:w="1247"/>
+            <w:shd w:val="clear" w:color="auto" w:fill="F0F4F8"/>
+            <w:tcMar>
+              <w:top w:w="16" w:type="dxa"/>
+              <w:bottom w:w="16" w:type="dxa"/>
+              <w:left w:w="45" w:type="dxa"/>
+              <w:right w:w="45" w:type="dxa"/>
+            </w:tcMar>
+            <w:tcBorders>
+              <w:top w:val="none"/>
+              <w:left w:val="none"/>
+              <w:bottom w:val="single" w:sz="4" w:space="0" w:color="D9E2EC"/>
+              <w:right w:val="none"/>
+            </w:tcBorders>
+          </w:tcPr>
+          <w:p>
+            <w:pPr>
+              <w:jc w:val="center"/>
+            </w:pPr>
+            <w:r>
+              <w:rPr>
+                <w:rFonts w:ascii="Arial" w:hAnsi="Arial"/>
+                <w:color w:val="243B53"/>
+                <w:sz w:val="15"/>
+              </w:rPr>
+              <w:t>Rp 1.200</w:t>
+            </w:r>
+          </w:p>
+        </w:tc>
+        <w:tc>
+          <w:tcPr>
+            <w:tcW w:type="dxa" w:w="1247"/>
+            <w:shd w:val="clear" w:color="auto" w:fill="F0F4F8"/>
+            <w:tcMar>
+              <w:top w:w="16" w:type="dxa"/>
+              <w:bottom w:w="16" w:type="dxa"/>
+              <w:left w:w="45" w:type="dxa"/>
+              <w:right w:w="45" w:type="dxa"/>
+            </w:tcMar>
+            <w:tcBorders>
+              <w:top w:val="none"/>
+              <w:left w:val="none"/>
+              <w:bottom w:val="single" w:sz="4" w:space="0" w:color="D9E2EC"/>
+              <w:right w:val="none"/>
+            </w:tcBorders>
+          </w:tcPr>
+          <w:p>
+            <w:pPr>
+              <w:jc w:val="center"/>
+            </w:pPr>
+            <w:r>
+              <w:rPr>
+                <w:rFonts w:ascii="Arial" w:hAnsi="Arial"/>
+                <w:color w:val="243B53"/>
+                <w:sz w:val="15"/>
+              </w:rPr>
+              <w:t>Rp 3.000</w:t>
+            </w:r>
+          </w:p>
+        </w:tc>
+        <w:tc>
+          <w:tcPr>
+            <w:tcW w:type="dxa" w:w="1587"/>
+            <w:shd w:val="clear" w:color="auto" w:fill="F0F4F8"/>
+            <w:tcMar>
+              <w:top w:w="16" w:type="dxa"/>
+              <w:bottom w:w="16" w:type="dxa"/>
+              <w:left w:w="45" w:type="dxa"/>
+              <w:right w:w="45" w:type="dxa"/>
+            </w:tcMar>
+            <w:tcBorders>
+              <w:top w:val="none"/>
+              <w:left w:val="none"/>
+              <w:bottom w:val="single" w:sz="4" w:space="0" w:color="D9E2EC"/>
+              <w:right w:val="none"/>
+            </w:tcBorders>
+          </w:tcPr>
+          <w:p>
+            <w:pPr>
+              <w:jc w:val="right"/>
+            </w:pPr>
+            <w:r>
+              <w:rPr>
+                <w:rFonts w:ascii="Arial" w:hAnsi="Arial"/>
+                <w:b/>
+                <w:color w:val="166534"/>
+                <w:sz w:val="15"/>
+              </w:rPr>
+              <w:t>Rp 1.800 (60,0%)</w:t>
+            </w:r>
+          </w:p>
+        </w:tc>
+      </w:tr>
+      <w:tr>
+        <w:trPr>
+          <w:cantSplit/>
+        </w:trPr>
+        <w:tc>
+          <w:tcPr>
+            <w:tcW w:type="dxa" w:w="2438"/>
+            <w:shd w:val="clear" w:color="auto" w:fill="FFFFFF"/>
+            <w:tcMar>
+              <w:top w:w="16" w:type="dxa"/>
+              <w:bottom w:w="16" w:type="dxa"/>
+              <w:left w:w="45" w:type="dxa"/>
+              <w:right w:w="45" w:type="dxa"/>
+            </w:tcMar>
+            <w:tcBorders>
+              <w:top w:val="none"/>
+              <w:left w:val="none"/>
+              <w:bottom w:val="single" w:sz="4" w:space="0" w:color="D9E2EC"/>
+              <w:right w:val="none"/>
+            </w:tcBorders>
+          </w:tcPr>
+          <w:p>
+            <w:pPr>
+              <w:jc w:val="left"/>
+            </w:pPr>
+            <w:r>
+              <w:rPr>
+                <w:rFonts w:ascii="Arial" w:hAnsi="Arial"/>
+                <w:b/>
+                <w:color w:val="243B53"/>
+                <w:sz w:val="15"/>
+              </w:rPr>
+              <w:t>Kopi Sachet Populer (Renceng/Dus)</w:t>
+            </w:r>
+          </w:p>
+        </w:tc>
+        <w:tc>
+          <w:tcPr>
+            <w:tcW w:type="dxa" w:w="3175"/>
+            <w:shd w:val="clear" w:color="auto" w:fill="FFFFFF"/>
+            <w:tcMar>
+              <w:top w:w="16" w:type="dxa"/>
+              <w:bottom w:w="16" w:type="dxa"/>
+              <w:left w:w="45" w:type="dxa"/>
+              <w:right w:w="45" w:type="dxa"/>
+            </w:tcMar>
+            <w:tcBorders>
+              <w:top w:val="none"/>
+              <w:left w:val="none"/>
+              <w:bottom w:val="single" w:sz="4" w:space="0" w:color="D9E2EC"/>
+              <w:right w:val="none"/>
+            </w:tcBorders>
+          </w:tcPr>
+          <w:p>
+            <w:pPr>
+              <w:jc w:val="left"/>
+            </w:pPr>
+            <w:r>
+              <w:rPr>
+                <w:rFonts w:ascii="Arial" w:hAnsi="Arial"/>
+                <w:color w:val="243B53"/>
+                <w:sz w:val="15"/>
+              </w:rPr>
+              <w:t>Good Day / Kapal Api / Indocafe / Luwak White Koffie</w:t>
             </w:r>
           </w:p>
         </w:tc>
@@ -3992,654 +4640,6 @@
                 <w:color w:val="243B53"/>
                 <w:sz w:val="15"/>
               </w:rPr>
-              <w:t>Nasi Kucing Teri / Orek Tempe</w:t>
-            </w:r>
-          </w:p>
-        </w:tc>
-        <w:tc>
-          <w:tcPr>
-            <w:tcW w:type="dxa" w:w="3175"/>
-            <w:shd w:val="clear" w:color="auto" w:fill="F0F4F8"/>
-            <w:tcMar>
-              <w:top w:w="16" w:type="dxa"/>
-              <w:bottom w:w="16" w:type="dxa"/>
-              <w:left w:w="45" w:type="dxa"/>
-              <w:right w:w="45" w:type="dxa"/>
-            </w:tcMar>
-            <w:tcBorders>
-              <w:top w:val="none"/>
-              <w:left w:val="none"/>
-              <w:bottom w:val="single" w:sz="4" w:space="0" w:color="D9E2EC"/>
-              <w:right w:val="none"/>
-            </w:tcBorders>
-          </w:tcPr>
-          <w:p>
-            <w:pPr>
-              <w:jc w:val="left"/>
-            </w:pPr>
-            <w:r>
-              <w:rPr>
-                <w:rFonts w:ascii="Arial" w:hAnsi="Arial"/>
-                <w:color w:val="243B53"/>
-                <w:sz w:val="15"/>
-              </w:rPr>
-              <w:t>Nasi pulen sambal teri balado / orek tempe bungkus daun pisang</w:t>
-            </w:r>
-          </w:p>
-        </w:tc>
-        <w:tc>
-          <w:tcPr>
-            <w:tcW w:type="dxa" w:w="1247"/>
-            <w:shd w:val="clear" w:color="auto" w:fill="F0F4F8"/>
-            <w:tcMar>
-              <w:top w:w="16" w:type="dxa"/>
-              <w:bottom w:w="16" w:type="dxa"/>
-              <w:left w:w="45" w:type="dxa"/>
-              <w:right w:w="45" w:type="dxa"/>
-            </w:tcMar>
-            <w:tcBorders>
-              <w:top w:val="none"/>
-              <w:left w:val="none"/>
-              <w:bottom w:val="single" w:sz="4" w:space="0" w:color="D9E2EC"/>
-              <w:right w:val="none"/>
-            </w:tcBorders>
-          </w:tcPr>
-          <w:p>
-            <w:pPr>
-              <w:jc w:val="center"/>
-            </w:pPr>
-            <w:r>
-              <w:rPr>
-                <w:rFonts w:ascii="Arial" w:hAnsi="Arial"/>
-                <w:color w:val="243B53"/>
-                <w:sz w:val="15"/>
-              </w:rPr>
-              <w:t>Rp 1.600</w:t>
-            </w:r>
-          </w:p>
-        </w:tc>
-        <w:tc>
-          <w:tcPr>
-            <w:tcW w:type="dxa" w:w="1247"/>
-            <w:shd w:val="clear" w:color="auto" w:fill="F0F4F8"/>
-            <w:tcMar>
-              <w:top w:w="16" w:type="dxa"/>
-              <w:bottom w:w="16" w:type="dxa"/>
-              <w:left w:w="45" w:type="dxa"/>
-              <w:right w:w="45" w:type="dxa"/>
-            </w:tcMar>
-            <w:tcBorders>
-              <w:top w:val="none"/>
-              <w:left w:val="none"/>
-              <w:bottom w:val="single" w:sz="4" w:space="0" w:color="D9E2EC"/>
-              <w:right w:val="none"/>
-            </w:tcBorders>
-          </w:tcPr>
-          <w:p>
-            <w:pPr>
-              <w:jc w:val="center"/>
-            </w:pPr>
-            <w:r>
-              <w:rPr>
-                <w:rFonts w:ascii="Arial" w:hAnsi="Arial"/>
-                <w:color w:val="243B53"/>
-                <w:sz w:val="15"/>
-              </w:rPr>
-              <w:t>Rp 3.000</w:t>
-            </w:r>
-          </w:p>
-        </w:tc>
-        <w:tc>
-          <w:tcPr>
-            <w:tcW w:type="dxa" w:w="1587"/>
-            <w:shd w:val="clear" w:color="auto" w:fill="F0F4F8"/>
-            <w:tcMar>
-              <w:top w:w="16" w:type="dxa"/>
-              <w:bottom w:w="16" w:type="dxa"/>
-              <w:left w:w="45" w:type="dxa"/>
-              <w:right w:w="45" w:type="dxa"/>
-            </w:tcMar>
-            <w:tcBorders>
-              <w:top w:val="none"/>
-              <w:left w:val="none"/>
-              <w:bottom w:val="single" w:sz="4" w:space="0" w:color="D9E2EC"/>
-              <w:right w:val="none"/>
-            </w:tcBorders>
-          </w:tcPr>
-          <w:p>
-            <w:pPr>
-              <w:jc w:val="right"/>
-            </w:pPr>
-            <w:r>
-              <w:rPr>
-                <w:rFonts w:ascii="Arial" w:hAnsi="Arial"/>
-                <w:b/>
-                <w:color w:val="166534"/>
-                <w:sz w:val="15"/>
-              </w:rPr>
-              <w:t>Rp 1.400 (46,7%)</w:t>
-            </w:r>
-          </w:p>
-        </w:tc>
-      </w:tr>
-      <w:tr>
-        <w:trPr>
-          <w:cantSplit/>
-        </w:trPr>
-        <w:tc>
-          <w:tcPr>
-            <w:tcW w:type="dxa" w:w="2438"/>
-            <w:shd w:val="clear" w:color="auto" w:fill="FFFFFF"/>
-            <w:tcMar>
-              <w:top w:w="16" w:type="dxa"/>
-              <w:bottom w:w="16" w:type="dxa"/>
-              <w:left w:w="45" w:type="dxa"/>
-              <w:right w:w="45" w:type="dxa"/>
-            </w:tcMar>
-            <w:tcBorders>
-              <w:top w:val="none"/>
-              <w:left w:val="none"/>
-              <w:bottom w:val="single" w:sz="4" w:space="0" w:color="D9E2EC"/>
-              <w:right w:val="none"/>
-            </w:tcBorders>
-          </w:tcPr>
-          <w:p>
-            <w:pPr>
-              <w:jc w:val="left"/>
-            </w:pPr>
-            <w:r>
-              <w:rPr>
-                <w:rFonts w:ascii="Arial" w:hAnsi="Arial"/>
-                <w:b/>
-                <w:color w:val="243B53"/>
-                <w:sz w:val="15"/>
-              </w:rPr>
-              <w:t>Tempe Mendoan Hangat (3 Lembar)</w:t>
-            </w:r>
-          </w:p>
-        </w:tc>
-        <w:tc>
-          <w:tcPr>
-            <w:tcW w:type="dxa" w:w="3175"/>
-            <w:shd w:val="clear" w:color="auto" w:fill="FFFFFF"/>
-            <w:tcMar>
-              <w:top w:w="16" w:type="dxa"/>
-              <w:bottom w:w="16" w:type="dxa"/>
-              <w:left w:w="45" w:type="dxa"/>
-              <w:right w:w="45" w:type="dxa"/>
-            </w:tcMar>
-            <w:tcBorders>
-              <w:top w:val="none"/>
-              <w:left w:val="none"/>
-              <w:bottom w:val="single" w:sz="4" w:space="0" w:color="D9E2EC"/>
-              <w:right w:val="none"/>
-            </w:tcBorders>
-          </w:tcPr>
-          <w:p>
-            <w:pPr>
-              <w:jc w:val="left"/>
-            </w:pPr>
-            <w:r>
-              <w:rPr>
-                <w:rFonts w:ascii="Arial" w:hAnsi="Arial"/>
-                <w:color w:val="243B53"/>
-                <w:sz w:val="15"/>
-              </w:rPr>
-              <w:t>Tempe kedelai lokal, adonan tepung daun bawang, kecap rawit</w:t>
-            </w:r>
-          </w:p>
-        </w:tc>
-        <w:tc>
-          <w:tcPr>
-            <w:tcW w:type="dxa" w:w="1247"/>
-            <w:shd w:val="clear" w:color="auto" w:fill="FFFFFF"/>
-            <w:tcMar>
-              <w:top w:w="16" w:type="dxa"/>
-              <w:bottom w:w="16" w:type="dxa"/>
-              <w:left w:w="45" w:type="dxa"/>
-              <w:right w:w="45" w:type="dxa"/>
-            </w:tcMar>
-            <w:tcBorders>
-              <w:top w:val="none"/>
-              <w:left w:val="none"/>
-              <w:bottom w:val="single" w:sz="4" w:space="0" w:color="D9E2EC"/>
-              <w:right w:val="none"/>
-            </w:tcBorders>
-          </w:tcPr>
-          <w:p>
-            <w:pPr>
-              <w:jc w:val="center"/>
-            </w:pPr>
-            <w:r>
-              <w:rPr>
-                <w:rFonts w:ascii="Arial" w:hAnsi="Arial"/>
-                <w:color w:val="243B53"/>
-                <w:sz w:val="15"/>
-              </w:rPr>
-              <w:t>Rp 2.500</w:t>
-            </w:r>
-          </w:p>
-        </w:tc>
-        <w:tc>
-          <w:tcPr>
-            <w:tcW w:type="dxa" w:w="1247"/>
-            <w:shd w:val="clear" w:color="auto" w:fill="FFFFFF"/>
-            <w:tcMar>
-              <w:top w:w="16" w:type="dxa"/>
-              <w:bottom w:w="16" w:type="dxa"/>
-              <w:left w:w="45" w:type="dxa"/>
-              <w:right w:w="45" w:type="dxa"/>
-            </w:tcMar>
-            <w:tcBorders>
-              <w:top w:val="none"/>
-              <w:left w:val="none"/>
-              <w:bottom w:val="single" w:sz="4" w:space="0" w:color="D9E2EC"/>
-              <w:right w:val="none"/>
-            </w:tcBorders>
-          </w:tcPr>
-          <w:p>
-            <w:pPr>
-              <w:jc w:val="center"/>
-            </w:pPr>
-            <w:r>
-              <w:rPr>
-                <w:rFonts w:ascii="Arial" w:hAnsi="Arial"/>
-                <w:color w:val="243B53"/>
-                <w:sz w:val="15"/>
-              </w:rPr>
-              <w:t>Rp 5.000</w:t>
-            </w:r>
-          </w:p>
-        </w:tc>
-        <w:tc>
-          <w:tcPr>
-            <w:tcW w:type="dxa" w:w="1587"/>
-            <w:shd w:val="clear" w:color="auto" w:fill="FFFFFF"/>
-            <w:tcMar>
-              <w:top w:w="16" w:type="dxa"/>
-              <w:bottom w:w="16" w:type="dxa"/>
-              <w:left w:w="45" w:type="dxa"/>
-              <w:right w:w="45" w:type="dxa"/>
-            </w:tcMar>
-            <w:tcBorders>
-              <w:top w:val="none"/>
-              <w:left w:val="none"/>
-              <w:bottom w:val="single" w:sz="4" w:space="0" w:color="D9E2EC"/>
-              <w:right w:val="none"/>
-            </w:tcBorders>
-          </w:tcPr>
-          <w:p>
-            <w:pPr>
-              <w:jc w:val="right"/>
-            </w:pPr>
-            <w:r>
-              <w:rPr>
-                <w:rFonts w:ascii="Arial" w:hAnsi="Arial"/>
-                <w:b/>
-                <w:color w:val="166534"/>
-                <w:sz w:val="15"/>
-              </w:rPr>
-              <w:t>Rp 2.500 (50,0%)</w:t>
-            </w:r>
-          </w:p>
-        </w:tc>
-      </w:tr>
-      <w:tr>
-        <w:trPr>
-          <w:cantSplit/>
-        </w:trPr>
-        <w:tc>
-          <w:tcPr>
-            <w:tcW w:type="dxa" w:w="2438"/>
-            <w:shd w:val="clear" w:color="auto" w:fill="F0F4F8"/>
-            <w:tcMar>
-              <w:top w:w="16" w:type="dxa"/>
-              <w:bottom w:w="16" w:type="dxa"/>
-              <w:left w:w="45" w:type="dxa"/>
-              <w:right w:w="45" w:type="dxa"/>
-            </w:tcMar>
-            <w:tcBorders>
-              <w:top w:val="none"/>
-              <w:left w:val="none"/>
-              <w:bottom w:val="single" w:sz="4" w:space="0" w:color="D9E2EC"/>
-              <w:right w:val="none"/>
-            </w:tcBorders>
-          </w:tcPr>
-          <w:p>
-            <w:pPr>
-              <w:jc w:val="left"/>
-            </w:pPr>
-            <w:r>
-              <w:rPr>
-                <w:rFonts w:ascii="Arial" w:hAnsi="Arial"/>
-                <w:b/>
-                <w:color w:val="243B53"/>
-                <w:sz w:val="15"/>
-              </w:rPr>
-              <w:t>Kopi Tubruk 'Jangkar Asli' (Signature)</w:t>
-            </w:r>
-          </w:p>
-        </w:tc>
-        <w:tc>
-          <w:tcPr>
-            <w:tcW w:type="dxa" w:w="3175"/>
-            <w:shd w:val="clear" w:color="auto" w:fill="F0F4F8"/>
-            <w:tcMar>
-              <w:top w:w="16" w:type="dxa"/>
-              <w:bottom w:w="16" w:type="dxa"/>
-              <w:left w:w="45" w:type="dxa"/>
-              <w:right w:w="45" w:type="dxa"/>
-            </w:tcMar>
-            <w:tcBorders>
-              <w:top w:val="none"/>
-              <w:left w:val="none"/>
-              <w:bottom w:val="single" w:sz="4" w:space="0" w:color="D9E2EC"/>
-              <w:right w:val="none"/>
-            </w:tcBorders>
-          </w:tcPr>
-          <w:p>
-            <w:pPr>
-              <w:jc w:val="left"/>
-            </w:pPr>
-            <w:r>
-              <w:rPr>
-                <w:rFonts w:ascii="Arial" w:hAnsi="Arial"/>
-                <w:color w:val="243B53"/>
-                <w:sz w:val="15"/>
-              </w:rPr>
-              <w:t>Bubuk Robusta sangrai lereng Gn. Karang, gula aren/pasir</w:t>
-            </w:r>
-          </w:p>
-        </w:tc>
-        <w:tc>
-          <w:tcPr>
-            <w:tcW w:type="dxa" w:w="1247"/>
-            <w:shd w:val="clear" w:color="auto" w:fill="F0F4F8"/>
-            <w:tcMar>
-              <w:top w:w="16" w:type="dxa"/>
-              <w:bottom w:w="16" w:type="dxa"/>
-              <w:left w:w="45" w:type="dxa"/>
-              <w:right w:w="45" w:type="dxa"/>
-            </w:tcMar>
-            <w:tcBorders>
-              <w:top w:val="none"/>
-              <w:left w:val="none"/>
-              <w:bottom w:val="single" w:sz="4" w:space="0" w:color="D9E2EC"/>
-              <w:right w:val="none"/>
-            </w:tcBorders>
-          </w:tcPr>
-          <w:p>
-            <w:pPr>
-              <w:jc w:val="center"/>
-            </w:pPr>
-            <w:r>
-              <w:rPr>
-                <w:rFonts w:ascii="Arial" w:hAnsi="Arial"/>
-                <w:color w:val="243B53"/>
-                <w:sz w:val="15"/>
-              </w:rPr>
-              <w:t>Rp 1.400</w:t>
-            </w:r>
-          </w:p>
-        </w:tc>
-        <w:tc>
-          <w:tcPr>
-            <w:tcW w:type="dxa" w:w="1247"/>
-            <w:shd w:val="clear" w:color="auto" w:fill="F0F4F8"/>
-            <w:tcMar>
-              <w:top w:w="16" w:type="dxa"/>
-              <w:bottom w:w="16" w:type="dxa"/>
-              <w:left w:w="45" w:type="dxa"/>
-              <w:right w:w="45" w:type="dxa"/>
-            </w:tcMar>
-            <w:tcBorders>
-              <w:top w:val="none"/>
-              <w:left w:val="none"/>
-              <w:bottom w:val="single" w:sz="4" w:space="0" w:color="D9E2EC"/>
-              <w:right w:val="none"/>
-            </w:tcBorders>
-          </w:tcPr>
-          <w:p>
-            <w:pPr>
-              <w:jc w:val="center"/>
-            </w:pPr>
-            <w:r>
-              <w:rPr>
-                <w:rFonts w:ascii="Arial" w:hAnsi="Arial"/>
-                <w:color w:val="243B53"/>
-                <w:sz w:val="15"/>
-              </w:rPr>
-              <w:t>Rp 4.000</w:t>
-            </w:r>
-          </w:p>
-        </w:tc>
-        <w:tc>
-          <w:tcPr>
-            <w:tcW w:type="dxa" w:w="1587"/>
-            <w:shd w:val="clear" w:color="auto" w:fill="F0F4F8"/>
-            <w:tcMar>
-              <w:top w:w="16" w:type="dxa"/>
-              <w:bottom w:w="16" w:type="dxa"/>
-              <w:left w:w="45" w:type="dxa"/>
-              <w:right w:w="45" w:type="dxa"/>
-            </w:tcMar>
-            <w:tcBorders>
-              <w:top w:val="none"/>
-              <w:left w:val="none"/>
-              <w:bottom w:val="single" w:sz="4" w:space="0" w:color="D9E2EC"/>
-              <w:right w:val="none"/>
-            </w:tcBorders>
-          </w:tcPr>
-          <w:p>
-            <w:pPr>
-              <w:jc w:val="right"/>
-            </w:pPr>
-            <w:r>
-              <w:rPr>
-                <w:rFonts w:ascii="Arial" w:hAnsi="Arial"/>
-                <w:b/>
-                <w:color w:val="166534"/>
-                <w:sz w:val="15"/>
-              </w:rPr>
-              <w:t>Rp 2.600 (65,0%)</w:t>
-            </w:r>
-          </w:p>
-        </w:tc>
-      </w:tr>
-      <w:tr>
-        <w:trPr>
-          <w:cantSplit/>
-        </w:trPr>
-        <w:tc>
-          <w:tcPr>
-            <w:tcW w:type="dxa" w:w="2438"/>
-            <w:shd w:val="clear" w:color="auto" w:fill="FFFFFF"/>
-            <w:tcMar>
-              <w:top w:w="16" w:type="dxa"/>
-              <w:bottom w:w="16" w:type="dxa"/>
-              <w:left w:w="45" w:type="dxa"/>
-              <w:right w:w="45" w:type="dxa"/>
-            </w:tcMar>
-            <w:tcBorders>
-              <w:top w:val="none"/>
-              <w:left w:val="none"/>
-              <w:bottom w:val="single" w:sz="4" w:space="0" w:color="D9E2EC"/>
-              <w:right w:val="none"/>
-            </w:tcBorders>
-          </w:tcPr>
-          <w:p>
-            <w:pPr>
-              <w:jc w:val="left"/>
-            </w:pPr>
-            <w:r>
-              <w:rPr>
-                <w:rFonts w:ascii="Arial" w:hAnsi="Arial"/>
-                <w:b/>
-                <w:color w:val="243B53"/>
-                <w:sz w:val="15"/>
-              </w:rPr>
-              <w:t>Kopi Sachet Populer (Renceng/Dus)</w:t>
-            </w:r>
-          </w:p>
-        </w:tc>
-        <w:tc>
-          <w:tcPr>
-            <w:tcW w:type="dxa" w:w="3175"/>
-            <w:shd w:val="clear" w:color="auto" w:fill="FFFFFF"/>
-            <w:tcMar>
-              <w:top w:w="16" w:type="dxa"/>
-              <w:bottom w:w="16" w:type="dxa"/>
-              <w:left w:w="45" w:type="dxa"/>
-              <w:right w:w="45" w:type="dxa"/>
-            </w:tcMar>
-            <w:tcBorders>
-              <w:top w:val="none"/>
-              <w:left w:val="none"/>
-              <w:bottom w:val="single" w:sz="4" w:space="0" w:color="D9E2EC"/>
-              <w:right w:val="none"/>
-            </w:tcBorders>
-          </w:tcPr>
-          <w:p>
-            <w:pPr>
-              <w:jc w:val="left"/>
-            </w:pPr>
-            <w:r>
-              <w:rPr>
-                <w:rFonts w:ascii="Arial" w:hAnsi="Arial"/>
-                <w:color w:val="243B53"/>
-                <w:sz w:val="15"/>
-              </w:rPr>
-              <w:t>Good Day / Kapal Api / Indocafe / Luwak White Koffie</w:t>
-            </w:r>
-          </w:p>
-        </w:tc>
-        <w:tc>
-          <w:tcPr>
-            <w:tcW w:type="dxa" w:w="1247"/>
-            <w:shd w:val="clear" w:color="auto" w:fill="FFFFFF"/>
-            <w:tcMar>
-              <w:top w:w="16" w:type="dxa"/>
-              <w:bottom w:w="16" w:type="dxa"/>
-              <w:left w:w="45" w:type="dxa"/>
-              <w:right w:w="45" w:type="dxa"/>
-            </w:tcMar>
-            <w:tcBorders>
-              <w:top w:val="none"/>
-              <w:left w:val="none"/>
-              <w:bottom w:val="single" w:sz="4" w:space="0" w:color="D9E2EC"/>
-              <w:right w:val="none"/>
-            </w:tcBorders>
-          </w:tcPr>
-          <w:p>
-            <w:pPr>
-              <w:jc w:val="center"/>
-            </w:pPr>
-            <w:r>
-              <w:rPr>
-                <w:rFonts w:ascii="Arial" w:hAnsi="Arial"/>
-                <w:color w:val="243B53"/>
-                <w:sz w:val="15"/>
-              </w:rPr>
-              <w:t>Rp 1.800</w:t>
-            </w:r>
-          </w:p>
-        </w:tc>
-        <w:tc>
-          <w:tcPr>
-            <w:tcW w:type="dxa" w:w="1247"/>
-            <w:shd w:val="clear" w:color="auto" w:fill="FFFFFF"/>
-            <w:tcMar>
-              <w:top w:w="16" w:type="dxa"/>
-              <w:bottom w:w="16" w:type="dxa"/>
-              <w:left w:w="45" w:type="dxa"/>
-              <w:right w:w="45" w:type="dxa"/>
-            </w:tcMar>
-            <w:tcBorders>
-              <w:top w:val="none"/>
-              <w:left w:val="none"/>
-              <w:bottom w:val="single" w:sz="4" w:space="0" w:color="D9E2EC"/>
-              <w:right w:val="none"/>
-            </w:tcBorders>
-          </w:tcPr>
-          <w:p>
-            <w:pPr>
-              <w:jc w:val="center"/>
-            </w:pPr>
-            <w:r>
-              <w:rPr>
-                <w:rFonts w:ascii="Arial" w:hAnsi="Arial"/>
-                <w:color w:val="243B53"/>
-                <w:sz w:val="15"/>
-              </w:rPr>
-              <w:t>Rp 4.000</w:t>
-            </w:r>
-          </w:p>
-        </w:tc>
-        <w:tc>
-          <w:tcPr>
-            <w:tcW w:type="dxa" w:w="1587"/>
-            <w:shd w:val="clear" w:color="auto" w:fill="FFFFFF"/>
-            <w:tcMar>
-              <w:top w:w="16" w:type="dxa"/>
-              <w:bottom w:w="16" w:type="dxa"/>
-              <w:left w:w="45" w:type="dxa"/>
-              <w:right w:w="45" w:type="dxa"/>
-            </w:tcMar>
-            <w:tcBorders>
-              <w:top w:val="none"/>
-              <w:left w:val="none"/>
-              <w:bottom w:val="single" w:sz="4" w:space="0" w:color="D9E2EC"/>
-              <w:right w:val="none"/>
-            </w:tcBorders>
-          </w:tcPr>
-          <w:p>
-            <w:pPr>
-              <w:jc w:val="right"/>
-            </w:pPr>
-            <w:r>
-              <w:rPr>
-                <w:rFonts w:ascii="Arial" w:hAnsi="Arial"/>
-                <w:b/>
-                <w:color w:val="166534"/>
-                <w:sz w:val="15"/>
-              </w:rPr>
-              <w:t>Rp 2.200 (55,0%)</w:t>
-            </w:r>
-          </w:p>
-        </w:tc>
-      </w:tr>
-      <w:tr>
-        <w:trPr>
-          <w:cantSplit/>
-        </w:trPr>
-        <w:tc>
-          <w:tcPr>
-            <w:tcW w:type="dxa" w:w="2438"/>
-            <w:shd w:val="clear" w:color="auto" w:fill="F0F4F8"/>
-            <w:tcMar>
-              <w:top w:w="16" w:type="dxa"/>
-              <w:bottom w:w="16" w:type="dxa"/>
-              <w:left w:w="45" w:type="dxa"/>
-              <w:right w:w="45" w:type="dxa"/>
-            </w:tcMar>
-            <w:tcBorders>
-              <w:top w:val="none"/>
-              <w:left w:val="none"/>
-              <w:bottom w:val="single" w:sz="4" w:space="0" w:color="D9E2EC"/>
-              <w:right w:val="none"/>
-            </w:tcBorders>
-          </w:tcPr>
-          <w:p>
-            <w:pPr>
-              <w:jc w:val="left"/>
-            </w:pPr>
-            <w:r>
-              <w:rPr>
-                <w:rFonts w:ascii="Arial" w:hAnsi="Arial"/>
-                <w:b/>
-                <w:color w:val="243B53"/>
-                <w:sz w:val="15"/>
-              </w:rPr>
               <w:t>Es / Hangat Minuman Sachet Segar</w:t>
             </w:r>
           </w:p>
@@ -4702,7 +4702,7 @@
                 <w:color w:val="243B53"/>
                 <w:sz w:val="15"/>
               </w:rPr>
-              <w:t>Rp 2.200</w:t>
+              <w:t>Rp 2.000</w:t>
             </w:r>
           </w:p>
         </w:tc>
@@ -4733,7 +4733,7 @@
                 <w:color w:val="243B53"/>
                 <w:sz w:val="15"/>
               </w:rPr>
-              <w:t>Rp 5.000</w:t>
+              <w:t>Rp 3.500</w:t>
             </w:r>
           </w:p>
         </w:tc>
@@ -4765,7 +4765,7 @@
                 <w:color w:val="166534"/>
                 <w:sz w:val="15"/>
               </w:rPr>
-              <w:t>Rp 2.800 (56,0%)</w:t>
+              <w:t>Rp 1.500 (42,9%)</w:t>
             </w:r>
           </w:p>
         </w:tc>
@@ -4864,7 +4864,7 @@
                 <w:color w:val="243B53"/>
                 <w:sz w:val="15"/>
               </w:rPr>
-              <w:t>Rp 3.800</w:t>
+              <w:t>Rp 3.500</w:t>
             </w:r>
           </w:p>
         </w:tc>
@@ -4895,7 +4895,7 @@
                 <w:color w:val="243B53"/>
                 <w:sz w:val="15"/>
               </w:rPr>
-              <w:t>Rp 8.500</w:t>
+              <w:t>Rp 6.000</w:t>
             </w:r>
           </w:p>
         </w:tc>
@@ -4927,7 +4927,7 @@
                 <w:color w:val="166534"/>
                 <w:sz w:val="15"/>
               </w:rPr>
-              <w:t>Rp 4.700 (55,3%)</w:t>
+              <w:t>Rp 2.500 (41,7%)</w:t>
             </w:r>
           </w:p>
         </w:tc>
@@ -5134,7 +5134,7 @@
                 <w:color w:val="243B53"/>
                 <w:sz w:val="16"/>
               </w:rPr>
-              <w:t>20 orang / hari</w:t>
+              <w:t>25 orang / hari</w:t>
             </w:r>
           </w:p>
         </w:tc>
@@ -5166,7 +5166,7 @@
                 <w:color w:val="243B53"/>
                 <w:sz w:val="16"/>
               </w:rPr>
-              <w:t>30 orang / hari</w:t>
+              <w:t>40 orang / hari</w:t>
             </w:r>
           </w:p>
         </w:tc>
@@ -5198,7 +5198,7 @@
                 <w:color w:val="243B53"/>
                 <w:sz w:val="16"/>
               </w:rPr>
-              <w:t>45 orang / hari</w:t>
+              <w:t>55 orang / hari</w:t>
             </w:r>
           </w:p>
         </w:tc>
@@ -5267,7 +5267,7 @@
                 <w:color w:val="243B53"/>
                 <w:sz w:val="16"/>
               </w:rPr>
-              <w:t>Rp 15.000 / orang</w:t>
+              <w:t>Rp 11.000 / orang</w:t>
             </w:r>
           </w:p>
         </w:tc>
@@ -5299,7 +5299,7 @@
                 <w:color w:val="243B53"/>
                 <w:sz w:val="16"/>
               </w:rPr>
-              <w:t>Rp 16.700 / orang</w:t>
+              <w:t>Rp 12.500 / orang</w:t>
             </w:r>
           </w:p>
         </w:tc>
@@ -5331,7 +5331,7 @@
                 <w:color w:val="243B53"/>
                 <w:sz w:val="16"/>
               </w:rPr>
-              <w:t>Rp 18.000 / orang</w:t>
+              <w:t>Rp 14.000 / orang</w:t>
             </w:r>
           </w:p>
         </w:tc>
@@ -5400,7 +5400,7 @@
                 <w:color w:val="243B53"/>
                 <w:sz w:val="16"/>
               </w:rPr>
-              <w:t>Rp 300.000 / hari</w:t>
+              <w:t>Rp 275.000 / hari</w:t>
             </w:r>
           </w:p>
         </w:tc>
@@ -5464,7 +5464,7 @@
                 <w:color w:val="243B53"/>
                 <w:sz w:val="16"/>
               </w:rPr>
-              <w:t>Rp 810.000 / hari</w:t>
+              <w:t>Rp 770.000 / hari</w:t>
             </w:r>
           </w:p>
         </w:tc>
@@ -5533,7 +5533,7 @@
                 <w:color w:val="243B53"/>
                 <w:sz w:val="16"/>
               </w:rPr>
-              <w:t>Rp 9.000.000</w:t>
+              <w:t>Rp 8.250.000</w:t>
             </w:r>
           </w:p>
         </w:tc>
@@ -5597,7 +5597,7 @@
                 <w:color w:val="243B53"/>
                 <w:sz w:val="16"/>
               </w:rPr>
-              <w:t>Rp 24.300.000</w:t>
+              <w:t>Rp 23.100.000</w:t>
             </w:r>
           </w:p>
         </w:tc>
@@ -5634,7 +5634,7 @@
                 <w:color w:val="243B53"/>
                 <w:sz w:val="16"/>
               </w:rPr>
-              <w:t>HPP Bahan Pokok (~44%)</w:t>
+              <w:t>HPP Bahan Pokok (~52%)</w:t>
             </w:r>
           </w:p>
         </w:tc>
@@ -5666,7 +5666,7 @@
                 <w:color w:val="243B53"/>
                 <w:sz w:val="16"/>
               </w:rPr>
-              <w:t>Rp 3.960.000</w:t>
+              <w:t>Rp 4.290.000</w:t>
             </w:r>
           </w:p>
         </w:tc>
@@ -5698,7 +5698,7 @@
                 <w:color w:val="243B53"/>
                 <w:sz w:val="16"/>
               </w:rPr>
-              <w:t>Rp 6.600.000</w:t>
+              <w:t>Rp 7.800.000</w:t>
             </w:r>
           </w:p>
         </w:tc>
@@ -5730,7 +5730,7 @@
                 <w:color w:val="243B53"/>
                 <w:sz w:val="16"/>
               </w:rPr>
-              <w:t>Rp 10.700.000</w:t>
+              <w:t>Rp 12.012.000</w:t>
             </w:r>
           </w:p>
         </w:tc>
@@ -5799,7 +5799,7 @@
                 <w:color w:val="243B53"/>
                 <w:sz w:val="16"/>
               </w:rPr>
-              <w:t>Rp 5.040.000</w:t>
+              <w:t>Rp 3.960.000</w:t>
             </w:r>
           </w:p>
         </w:tc>
@@ -5831,7 +5831,7 @@
                 <w:color w:val="243B53"/>
                 <w:sz w:val="16"/>
               </w:rPr>
-              <w:t>Rp 8.400.000</w:t>
+              <w:t>Rp 7.200.000</w:t>
             </w:r>
           </w:p>
         </w:tc>
@@ -5863,7 +5863,7 @@
                 <w:color w:val="243B53"/>
                 <w:sz w:val="16"/>
               </w:rPr>
-              <w:t>Rp 13.600.000</w:t>
+              <w:t>Rp 11.088.000</w:t>
             </w:r>
           </w:p>
         </w:tc>
@@ -5932,7 +5932,7 @@
                 <w:color w:val="243B53"/>
                 <w:sz w:val="16"/>
               </w:rPr>
-              <w:t>Rp 1.840.000</w:t>
+              <w:t>Rp 1.760.000</w:t>
             </w:r>
           </w:p>
         </w:tc>
@@ -5964,7 +5964,7 @@
                 <w:color w:val="243B53"/>
                 <w:sz w:val="16"/>
               </w:rPr>
-              <w:t>Rp 2.400.000</w:t>
+              <w:t>Rp 2.200.000</w:t>
             </w:r>
           </w:p>
         </w:tc>
@@ -5996,7 +5996,7 @@
                 <w:color w:val="243B53"/>
                 <w:sz w:val="16"/>
               </w:rPr>
-              <w:t>Rp 3.600.000</w:t>
+              <w:t>Rp 3.088.000</w:t>
             </w:r>
           </w:p>
         </w:tc>
@@ -6065,7 +6065,7 @@
                 <w:color w:val="243B53"/>
                 <w:sz w:val="16"/>
               </w:rPr>
-              <w:t>Rp 3.200.000</w:t>
+              <w:t>Rp 2.200.000</w:t>
             </w:r>
           </w:p>
         </w:tc>
@@ -6097,7 +6097,7 @@
                 <w:color w:val="243B53"/>
                 <w:sz w:val="16"/>
               </w:rPr>
-              <w:t>Rp 6.000.000</w:t>
+              <w:t>Rp 5.000.000</w:t>
             </w:r>
           </w:p>
         </w:tc>
@@ -6129,7 +6129,7 @@
                 <w:color w:val="243B53"/>
                 <w:sz w:val="16"/>
               </w:rPr>
-              <w:t>Rp 10.000.000</w:t>
+              <w:t>Rp 8.000.000</w:t>
             </w:r>
           </w:p>
         </w:tc>
@@ -6198,7 +6198,7 @@
                 <w:color w:val="102A43"/>
                 <w:sz w:val="16"/>
               </w:rPr>
-              <w:t>Rp 1.280.000 / bulan</w:t>
+              <w:t>Rp 880.000 / bulan</w:t>
             </w:r>
           </w:p>
         </w:tc>
@@ -6230,7 +6230,7 @@
                 <w:color w:val="102A43"/>
                 <w:sz w:val="16"/>
               </w:rPr>
-              <w:t>Rp 2.400.000 / bulan</w:t>
+              <w:t>Rp 2.000.000 / bulan</w:t>
             </w:r>
           </w:p>
         </w:tc>
@@ -6262,7 +6262,7 @@
                 <w:color w:val="102A43"/>
                 <w:sz w:val="16"/>
               </w:rPr>
-              <w:t>Rp 4.000.000 / bulan</w:t>
+              <w:t>Rp 3.200.000 / bulan</w:t>
             </w:r>
           </w:p>
         </w:tc>
@@ -6331,7 +6331,7 @@
                 <w:color w:val="243B53"/>
                 <w:sz w:val="16"/>
               </w:rPr>
-              <w:t>Rp 1.920.000 / bulan</w:t>
+              <w:t>Rp 1.320.000 / bulan</w:t>
             </w:r>
           </w:p>
         </w:tc>
@@ -6363,7 +6363,7 @@
                 <w:color w:val="243B53"/>
                 <w:sz w:val="16"/>
               </w:rPr>
-              <w:t>Rp 3.600.000 / bulan</w:t>
+              <w:t>Rp 3.000.000 / bulan</w:t>
             </w:r>
           </w:p>
         </w:tc>
@@ -6395,7 +6395,7 @@
                 <w:color w:val="243B53"/>
                 <w:sz w:val="16"/>
               </w:rPr>
-              <w:t>Rp 6.000.000 / bulan</w:t>
+              <w:t>Rp 4.800.000 / bulan</w:t>
             </w:r>
           </w:p>
         </w:tc>
@@ -6464,7 +6464,7 @@
                 <w:color w:val="102A43"/>
                 <w:sz w:val="16"/>
               </w:rPr>
-              <w:t>11,7 Bulan</w:t>
+              <w:t>17,0 Bulan</w:t>
             </w:r>
           </w:p>
         </w:tc>
@@ -6496,7 +6496,7 @@
                 <w:color w:val="102A43"/>
                 <w:sz w:val="16"/>
               </w:rPr>
-              <w:t>6,25 Bulan (~6 Bulan)</w:t>
+              <w:t>7,5 Bulan (~7,5 Bulan)</w:t>
             </w:r>
           </w:p>
         </w:tc>
@@ -6528,7 +6528,7 @@
                 <w:color w:val="102A43"/>
                 <w:sz w:val="16"/>
               </w:rPr>
-              <w:t>3,8 Bulan</w:t>
+              <w:t>4,7 Bulan</w:t>
             </w:r>
           </w:p>
         </w:tc>
@@ -6755,7 +6755,7 @@
           <w:color w:val="243B53"/>
           <w:sz w:val="19"/>
         </w:rPr>
-        <w:t>Jangkar Kopi &amp; Angkringan adalah jawaban atas kebutuhan ruang temu warga yang bersahaja, bersih, dan berbiaya terjangkau di koridor Cikedal - Menes. Dengan modal lean Rp 15.000.000, beban sewa lahan terkunci aman 1 tahun (Rp 6 Jt), stok awal dan cadangan kas yang solid, serta menu arang tradisional yang digemari masyarakat, usaha ini diproyeksikan mencapai titik impas dalam tempo 6,25 bulan (~6 bulan) dan siap berkembang menjadi ikon kuliner malam rakyat.</w:t>
+        <w:t>Jangkar Kopi &amp; Angkringan adalah jawaban atas kebutuhan ruang temu warga yang bersahaja, bersih, dan berbiaya terjangkau di koridor Cikedal - Menes. Dengan modal lean Rp 15.000.000, beban sewa lahan terkunci aman 1 tahun (Rp 6 Jt), stok awal dan cadangan kas yang solid, serta menu arang tradisional murah meriah tanpa mematok margin berlebihan di awal, usaha ini diproyeksikan mencapai titik impas dalam tempo 7,5 bulan pada skenario moderat (4,7 bulan skenario agresif) dan siap berkembang menjadi ikon kuliner malam rakyat.</w:t>
       </w:r>
     </w:p>
     <w:p>

</xml_diff>

<commit_message>
style: align colons and tab stops with hanging indents in executive summary and commitment form
</commit_message>
<xml_diff>
--- a/PROPOSAL_INVESTASI_JANGKAR_KOPI.docx
+++ b/PROPOSAL_INVESTASI_JANGKAR_KOPI.docx
@@ -130,7 +130,11 @@
           </w:p>
           <w:p>
             <w:pPr>
+              <w:tabs>
+                <w:tab w:pos="3061" w:val="left"/>
+              </w:tabs>
               <w:spacing w:before="30" w:after="40" w:line="276" w:lineRule="auto"/>
+              <w:ind w:left="3061" w:hanging="3061"/>
               <w:jc w:val="left"/>
             </w:pPr>
             <w:r>
@@ -140,7 +144,9 @@
                 <w:color w:val="B45309"/>
                 <w:sz w:val="18"/>
               </w:rPr>
-              <w:t xml:space="preserve">• Nilai Total Permodalan Awal : </w:t>
+              <w:t>• Nilai Total Permodalan Awal</w:t>
+              <w:tab/>
+              <w:t xml:space="preserve">: </w:t>
             </w:r>
             <w:r>
               <w:rPr>
@@ -153,7 +159,11 @@
           </w:p>
           <w:p>
             <w:pPr>
+              <w:tabs>
+                <w:tab w:pos="3061" w:val="left"/>
+              </w:tabs>
               <w:spacing w:before="30" w:after="40" w:line="276" w:lineRule="auto"/>
+              <w:ind w:left="3061" w:hanging="3061"/>
               <w:jc w:val="left"/>
             </w:pPr>
             <w:r>
@@ -163,7 +173,9 @@
                 <w:color w:val="B45309"/>
                 <w:sz w:val="18"/>
               </w:rPr>
-              <w:t xml:space="preserve">• Opsi Partisipasi Mitra       : </w:t>
+              <w:t>• Opsi Partisipasi Mitra</w:t>
+              <w:tab/>
+              <w:t xml:space="preserve">: </w:t>
             </w:r>
             <w:r>
               <w:rPr>
@@ -176,7 +188,11 @@
           </w:p>
           <w:p>
             <w:pPr>
+              <w:tabs>
+                <w:tab w:pos="3061" w:val="left"/>
+              </w:tabs>
               <w:spacing w:before="30" w:after="40" w:line="276" w:lineRule="auto"/>
+              <w:ind w:left="3061" w:hanging="3061"/>
               <w:jc w:val="left"/>
             </w:pPr>
             <w:r>
@@ -186,7 +202,9 @@
                 <w:color w:val="B45309"/>
                 <w:sz w:val="18"/>
               </w:rPr>
-              <w:t xml:space="preserve">• Alokasi Sewa Lahan Sementara : </w:t>
+              <w:t>• Alokasi Sewa Lahan Sementara</w:t>
+              <w:tab/>
+              <w:t xml:space="preserve">: </w:t>
             </w:r>
             <w:r>
               <w:rPr>
@@ -199,7 +217,11 @@
           </w:p>
           <w:p>
             <w:pPr>
+              <w:tabs>
+                <w:tab w:pos="3061" w:val="left"/>
+              </w:tabs>
               <w:spacing w:before="30" w:after="40" w:line="276" w:lineRule="auto"/>
+              <w:ind w:left="3061" w:hanging="3061"/>
               <w:jc w:val="left"/>
             </w:pPr>
             <w:r>
@@ -209,7 +231,9 @@
                 <w:color w:val="B45309"/>
                 <w:sz w:val="18"/>
               </w:rPr>
-              <w:t xml:space="preserve">• Skema Kemitraan Usaha        : </w:t>
+              <w:t>• Skema Kemitraan Usaha</w:t>
+              <w:tab/>
+              <w:t xml:space="preserve">: </w:t>
             </w:r>
             <w:r>
               <w:rPr>
@@ -222,7 +246,11 @@
           </w:p>
           <w:p>
             <w:pPr>
+              <w:tabs>
+                <w:tab w:pos="3061" w:val="left"/>
+              </w:tabs>
               <w:spacing w:before="30" w:after="40" w:line="276" w:lineRule="auto"/>
+              <w:ind w:left="3061" w:hanging="3061"/>
               <w:jc w:val="left"/>
             </w:pPr>
             <w:r>
@@ -232,7 +260,9 @@
                 <w:color w:val="B45309"/>
                 <w:sz w:val="18"/>
               </w:rPr>
-              <w:t xml:space="preserve">• Proyeksi Balik Modal (BEP)   : </w:t>
+              <w:t>• Proyeksi Balik Modal (BEP)</w:t>
+              <w:tab/>
+              <w:t xml:space="preserve">: </w:t>
             </w:r>
             <w:r>
               <w:rPr>
@@ -245,7 +275,11 @@
           </w:p>
           <w:p>
             <w:pPr>
+              <w:tabs>
+                <w:tab w:pos="3061" w:val="left"/>
+              </w:tabs>
               <w:spacing w:before="30" w:after="40" w:line="276" w:lineRule="auto"/>
+              <w:ind w:left="3061" w:hanging="3061"/>
               <w:jc w:val="left"/>
             </w:pPr>
             <w:r>
@@ -255,7 +289,9 @@
                 <w:color w:val="B45309"/>
                 <w:sz w:val="18"/>
               </w:rPr>
-              <w:t xml:space="preserve">• Konsep Ruang &amp; Duduk         : </w:t>
+              <w:t>• Konsep Ruang &amp; Duduk</w:t>
+              <w:tab/>
+              <w:t xml:space="preserve">: </w:t>
             </w:r>
             <w:r>
               <w:rPr>
@@ -268,7 +304,11 @@
           </w:p>
           <w:p>
             <w:pPr>
+              <w:tabs>
+                <w:tab w:pos="3061" w:val="left"/>
+              </w:tabs>
               <w:spacing w:before="30" w:after="40" w:line="276" w:lineRule="auto"/>
+              <w:ind w:left="3061" w:hanging="3061"/>
               <w:jc w:val="left"/>
             </w:pPr>
             <w:r>
@@ -278,7 +318,9 @@
                 <w:color w:val="B45309"/>
                 <w:sz w:val="18"/>
               </w:rPr>
-              <w:t xml:space="preserve">• Konsep Dapur &amp; Minuman       : </w:t>
+              <w:t>• Konsep Dapur &amp; Minuman</w:t>
+              <w:tab/>
+              <w:t xml:space="preserve">: </w:t>
             </w:r>
             <w:r>
               <w:rPr>
@@ -291,7 +333,11 @@
           </w:p>
           <w:p>
             <w:pPr>
+              <w:tabs>
+                <w:tab w:pos="3061" w:val="left"/>
+              </w:tabs>
               <w:spacing w:before="30" w:after="40" w:line="276" w:lineRule="auto"/>
+              <w:ind w:left="3061" w:hanging="3061"/>
               <w:jc w:val="left"/>
             </w:pPr>
             <w:r>
@@ -301,7 +347,9 @@
                 <w:color w:val="B45309"/>
                 <w:sz w:val="18"/>
               </w:rPr>
-              <w:t xml:space="preserve">• Lokasi Basis Operasional     : </w:t>
+              <w:t>• Lokasi Basis Operasional</w:t>
+              <w:tab/>
+              <w:t xml:space="preserve">: </w:t>
             </w:r>
             <w:r>
               <w:rPr>
@@ -314,7 +362,11 @@
           </w:p>
           <w:p>
             <w:pPr>
+              <w:tabs>
+                <w:tab w:pos="3061" w:val="left"/>
+              </w:tabs>
               <w:spacing w:before="30" w:after="40" w:line="276" w:lineRule="auto"/>
+              <w:ind w:left="3061" w:hanging="3061"/>
               <w:jc w:val="left"/>
             </w:pPr>
             <w:r>
@@ -324,7 +376,9 @@
                 <w:color w:val="B45309"/>
                 <w:sz w:val="18"/>
               </w:rPr>
-              <w:t xml:space="preserve">• Inisiator &amp; Penanggung Jawab : </w:t>
+              <w:t>• Inisiator &amp; Penanggung Jawab</w:t>
+              <w:tab/>
+              <w:t xml:space="preserve">: </w:t>
             </w:r>
             <w:r>
               <w:rPr>
@@ -6833,6 +6887,9 @@
           </w:p>
           <w:p>
             <w:pPr>
+              <w:tabs>
+                <w:tab w:pos="2721" w:val="left"/>
+              </w:tabs>
               <w:spacing w:before="30" w:after="40" w:line="276" w:lineRule="auto"/>
               <w:jc w:val="left"/>
             </w:pPr>
@@ -6843,7 +6900,9 @@
                 <w:color w:val="B45309"/>
                 <w:sz w:val="18"/>
               </w:rPr>
-              <w:t xml:space="preserve">Nama Lengkap Calon Mitra : </w:t>
+              <w:t>Nama Lengkap Calon Mitra</w:t>
+              <w:tab/>
+              <w:t xml:space="preserve">: </w:t>
             </w:r>
             <w:r>
               <w:rPr>
@@ -6856,6 +6915,9 @@
           </w:p>
           <w:p>
             <w:pPr>
+              <w:tabs>
+                <w:tab w:pos="2721" w:val="left"/>
+              </w:tabs>
               <w:spacing w:before="30" w:after="40" w:line="276" w:lineRule="auto"/>
               <w:jc w:val="left"/>
             </w:pPr>
@@ -6866,7 +6928,9 @@
                 <w:color w:val="B45309"/>
                 <w:sz w:val="18"/>
               </w:rPr>
-              <w:t xml:space="preserve">Nomor WhatsApp / Kontak   : </w:t>
+              <w:t>Nomor WhatsApp / Kontak</w:t>
+              <w:tab/>
+              <w:t xml:space="preserve">: </w:t>
             </w:r>
             <w:r>
               <w:rPr>
@@ -6879,6 +6943,9 @@
           </w:p>
           <w:p>
             <w:pPr>
+              <w:tabs>
+                <w:tab w:pos="2721" w:val="left"/>
+              </w:tabs>
               <w:spacing w:before="30" w:after="40" w:line="276" w:lineRule="auto"/>
               <w:jc w:val="left"/>
             </w:pPr>
@@ -6889,7 +6956,9 @@
                 <w:color w:val="B45309"/>
                 <w:sz w:val="18"/>
               </w:rPr>
-              <w:t xml:space="preserve">Alamat / Domisili          : </w:t>
+              <w:t>Alamat / Domisili</w:t>
+              <w:tab/>
+              <w:t xml:space="preserve">: </w:t>
             </w:r>
             <w:r>
               <w:rPr>
@@ -6902,6 +6971,9 @@
           </w:p>
           <w:p>
             <w:pPr>
+              <w:tabs>
+                <w:tab w:pos="2721" w:val="left"/>
+              </w:tabs>
               <w:spacing w:before="30" w:after="40" w:line="276" w:lineRule="auto"/>
               <w:jc w:val="left"/>
             </w:pPr>
@@ -6912,7 +6984,9 @@
                 <w:color w:val="B45309"/>
                 <w:sz w:val="18"/>
               </w:rPr>
-              <w:t xml:space="preserve">Pilihan Partisipasi Modal : </w:t>
+              <w:t>Pilihan Partisipasi Modal</w:t>
+              <w:tab/>
+              <w:t xml:space="preserve">: </w:t>
             </w:r>
             <w:r>
               <w:rPr>

</xml_diff>

<commit_message>
feat: add brand identity section, primary color #A56341, and logo philosophy
</commit_message>
<xml_diff>
--- a/PROPOSAL_INVESTASI_JANGKAR_KOPI.docx
+++ b/PROPOSAL_INVESTASI_JANGKAR_KOPI.docx
@@ -2,62 +2,137 @@
 <file path=word/document.xml><?xml version="1.0" encoding="utf-8"?>
 <w:document xmlns:wpc="http://schemas.microsoft.com/office/word/2010/wordprocessingCanvas" xmlns:mo="http://schemas.microsoft.com/office/mac/office/2008/main" xmlns:mc="http://schemas.openxmlformats.org/markup-compatibility/2006" xmlns:mv="urn:schemas-microsoft-com:mac:vml" xmlns:o="urn:schemas-microsoft-com:office:office" xmlns:r="http://schemas.openxmlformats.org/officeDocument/2006/relationships" xmlns:m="http://schemas.openxmlformats.org/officeDocument/2006/math" xmlns:v="urn:schemas-microsoft-com:vml" xmlns:wp14="http://schemas.microsoft.com/office/word/2010/wordprocessingDrawing" xmlns:wp="http://schemas.openxmlformats.org/drawingml/2006/wordprocessingDrawing" xmlns:w10="urn:schemas-microsoft-com:office:word" xmlns:w="http://schemas.openxmlformats.org/wordprocessingml/2006/main" xmlns:w14="http://schemas.microsoft.com/office/word/2010/wordml" xmlns:wpg="http://schemas.microsoft.com/office/word/2010/wordprocessingGroup" xmlns:wpi="http://schemas.microsoft.com/office/word/2010/wordprocessingInk" xmlns:wne="http://schemas.microsoft.com/office/word/2006/wordml" xmlns:wps="http://schemas.microsoft.com/office/word/2010/wordprocessingShape" mc:Ignorable="w14 wp14">
   <w:body>
+    <w:tbl>
+      <w:tblPr>
+        <w:tblW w:type="auto" w:w="0"/>
+        <w:jc w:val="center"/>
+        <w:tblLook w:firstColumn="1" w:firstRow="1" w:lastColumn="0" w:lastRow="0" w:noHBand="0" w:noVBand="1" w:val="04A0"/>
+      </w:tblPr>
+      <w:tblGrid>
+        <w:gridCol w:w="4847"/>
+        <w:gridCol w:w="4847"/>
+      </w:tblGrid>
+      <w:tr>
+        <w:tc>
+          <w:tcPr>
+            <w:tcW w:type="dxa" w:w="7597"/>
+            <w:tcMar>
+              <w:top w:w="0" w:type="dxa"/>
+              <w:bottom w:w="0" w:type="dxa"/>
+              <w:left w:w="0" w:type="dxa"/>
+              <w:right w:w="10" w:type="dxa"/>
+            </w:tcMar>
+          </w:tcPr>
+          <w:p>
+            <w:pPr>
+              <w:spacing w:before="0" w:after="40"/>
+            </w:pPr>
+            <w:r>
+              <w:rPr>
+                <w:rFonts w:ascii="Arial" w:hAnsi="Arial"/>
+                <w:b/>
+                <w:color w:val="A56341"/>
+                <w:sz w:val="17"/>
+              </w:rPr>
+              <w:t>PENAWARAN INVESTASI &amp; KEMITRAAN USAHA MIKRO BERBASIS LEAN STARTUP</w:t>
+            </w:r>
+          </w:p>
+          <w:p>
+            <w:pPr>
+              <w:spacing w:before="0" w:after="160"/>
+            </w:pPr>
+            <w:r>
+              <w:rPr>
+                <w:color w:val="102A43"/>
+              </w:rPr>
+              <w:t>————————————————————————————————————————</w:t>
+            </w:r>
+          </w:p>
+          <w:p>
+            <w:pPr>
+              <w:spacing w:before="40" w:after="40"/>
+            </w:pPr>
+            <w:r>
+              <w:rPr>
+                <w:rFonts w:ascii="Arial" w:hAnsi="Arial"/>
+                <w:b/>
+                <w:color w:val="102A43"/>
+                <w:sz w:val="56"/>
+              </w:rPr>
+              <w:t>JANGKAR KOPI</w:t>
+            </w:r>
+          </w:p>
+          <w:p>
+            <w:pPr>
+              <w:spacing w:before="0" w:after="80"/>
+            </w:pPr>
+            <w:r>
+              <w:rPr>
+                <w:rFonts w:ascii="Arial" w:hAnsi="Arial"/>
+                <w:b/>
+                <w:color w:val="A56341"/>
+                <w:sz w:val="30"/>
+              </w:rPr>
+              <w:t>&amp; ARTISAN ANGKRINGAN RAKYAT</w:t>
+            </w:r>
+          </w:p>
+        </w:tc>
+        <w:tc>
+          <w:tcPr>
+            <w:tcW w:type="dxa" w:w="2098"/>
+            <w:tcMar>
+              <w:top w:w="0" w:type="dxa"/>
+              <w:bottom w:w="0" w:type="dxa"/>
+              <w:left w:w="10" w:type="dxa"/>
+              <w:right w:w="0" w:type="dxa"/>
+            </w:tcMar>
+          </w:tcPr>
+          <w:p>
+            <w:pPr>
+              <w:spacing w:before="0" w:after="0"/>
+              <w:jc w:val="right"/>
+            </w:pPr>
+            <w:r>
+              <w:drawing>
+                <wp:inline xmlns:a="http://schemas.openxmlformats.org/drawingml/2006/main" xmlns:pic="http://schemas.openxmlformats.org/drawingml/2006/picture">
+                  <wp:extent cx="1152000" cy="1152000"/>
+                  <wp:docPr id="1" name="Picture 1"/>
+                  <wp:cNvGraphicFramePr>
+                    <a:graphicFrameLocks noChangeAspect="1"/>
+                  </wp:cNvGraphicFramePr>
+                  <a:graphic>
+                    <a:graphicData uri="http://schemas.openxmlformats.org/drawingml/2006/picture">
+                      <pic:pic>
+                        <pic:nvPicPr>
+                          <pic:cNvPr id="0" name="JANGKAR KOPI - LOGOMARK.png"/>
+                          <pic:cNvPicPr/>
+                        </pic:nvPicPr>
+                        <pic:blipFill>
+                          <a:blip r:embed="rId13"/>
+                          <a:stretch>
+                            <a:fillRect/>
+                          </a:stretch>
+                        </pic:blipFill>
+                        <pic:spPr>
+                          <a:xfrm>
+                            <a:off x="0" y="0"/>
+                            <a:ext cx="1152000" cy="1152000"/>
+                          </a:xfrm>
+                          <a:prstGeom prst="rect"/>
+                        </pic:spPr>
+                      </pic:pic>
+                    </a:graphicData>
+                  </a:graphic>
+                </wp:inline>
+              </w:drawing>
+            </w:r>
+          </w:p>
+        </w:tc>
+      </w:tr>
+    </w:tbl>
     <w:p>
       <w:pPr>
-        <w:spacing w:before="160" w:after="40"/>
-      </w:pPr>
-      <w:r>
-        <w:rPr>
-          <w:rFonts w:ascii="Arial" w:hAnsi="Arial"/>
-          <w:b/>
-          <w:color w:val="B45309"/>
-          <w:sz w:val="19"/>
-        </w:rPr>
-        <w:t>PENAWARAN INVESTASI &amp; KEMITRAAN USAHA MIKRO BERBASIS LEAN STARTUP</w:t>
-      </w:r>
-    </w:p>
-    <w:p>
-      <w:pPr>
-        <w:spacing w:before="0" w:after="280"/>
-      </w:pPr>
-      <w:r>
-        <w:rPr>
-          <w:color w:val="102A43"/>
-        </w:rPr>
-        <w:t>————————————————————————————————————————————————————</w:t>
-      </w:r>
-    </w:p>
-    <w:p>
-      <w:pPr>
-        <w:spacing w:before="120" w:after="80"/>
-      </w:pPr>
-      <w:r>
-        <w:rPr>
-          <w:rFonts w:ascii="Arial" w:hAnsi="Arial"/>
-          <w:b/>
-          <w:color w:val="102A43"/>
-          <w:sz w:val="64"/>
-        </w:rPr>
-        <w:t>JANGKAR KOPI</w:t>
-      </w:r>
-    </w:p>
-    <w:p>
-      <w:pPr>
-        <w:spacing w:before="0" w:after="120"/>
-      </w:pPr>
-      <w:r>
-        <w:rPr>
-          <w:rFonts w:ascii="Arial" w:hAnsi="Arial"/>
-          <w:b/>
-          <w:color w:val="B45309"/>
-          <w:sz w:val="34"/>
-        </w:rPr>
-        <w:t>&amp; ARTISAN ANGKRINGAN RAKYAT</w:t>
-      </w:r>
-    </w:p>
-    <w:p>
-      <w:pPr>
-        <w:spacing w:before="40" w:after="320"/>
+        <w:spacing w:before="80" w:after="280"/>
       </w:pPr>
       <w:r>
         <w:rPr>
@@ -99,7 +174,7 @@
         <w:tc>
           <w:tcPr>
             <w:tcW w:type="dxa" w:w="9694"/>
-            <w:shd w:val="clear" w:color="auto" w:fill="F0F4F8"/>
+            <w:shd w:val="clear" w:color="auto" w:fill="FDF6F0"/>
             <w:tcMar>
               <w:top w:w="70" w:type="dxa"/>
               <w:bottom w:w="70" w:type="dxa"/>
@@ -108,7 +183,7 @@
             </w:tcMar>
             <w:tcBorders>
               <w:top w:val="none"/>
-              <w:left w:val="single" w:sz="24" w:space="0" w:color="102A43"/>
+              <w:left w:val="single" w:sz="24" w:space="0" w:color="A56341"/>
               <w:bottom w:val="none"/>
               <w:right w:val="none"/>
             </w:tcBorders>
@@ -141,7 +216,7 @@
               <w:rPr>
                 <w:rFonts w:ascii="Arial" w:hAnsi="Arial"/>
                 <w:b/>
-                <w:color w:val="B45309"/>
+                <w:color w:val="A56341"/>
                 <w:sz w:val="18"/>
               </w:rPr>
               <w:t>• Nilai Total Permodalan Awal</w:t>
@@ -170,7 +245,7 @@
               <w:rPr>
                 <w:rFonts w:ascii="Arial" w:hAnsi="Arial"/>
                 <w:b/>
-                <w:color w:val="B45309"/>
+                <w:color w:val="A56341"/>
                 <w:sz w:val="18"/>
               </w:rPr>
               <w:t>• Opsi Partisipasi Mitra</w:t>
@@ -199,7 +274,7 @@
               <w:rPr>
                 <w:rFonts w:ascii="Arial" w:hAnsi="Arial"/>
                 <w:b/>
-                <w:color w:val="B45309"/>
+                <w:color w:val="A56341"/>
                 <w:sz w:val="18"/>
               </w:rPr>
               <w:t>• Alokasi Sewa Lahan Sementara</w:t>
@@ -228,7 +303,7 @@
               <w:rPr>
                 <w:rFonts w:ascii="Arial" w:hAnsi="Arial"/>
                 <w:b/>
-                <w:color w:val="B45309"/>
+                <w:color w:val="A56341"/>
                 <w:sz w:val="18"/>
               </w:rPr>
               <w:t>• Skema Kemitraan Usaha</w:t>
@@ -257,7 +332,7 @@
               <w:rPr>
                 <w:rFonts w:ascii="Arial" w:hAnsi="Arial"/>
                 <w:b/>
-                <w:color w:val="B45309"/>
+                <w:color w:val="A56341"/>
                 <w:sz w:val="18"/>
               </w:rPr>
               <w:t>• Proyeksi Balik Modal (BEP)</w:t>
@@ -286,7 +361,7 @@
               <w:rPr>
                 <w:rFonts w:ascii="Arial" w:hAnsi="Arial"/>
                 <w:b/>
-                <w:color w:val="B45309"/>
+                <w:color w:val="A56341"/>
                 <w:sz w:val="18"/>
               </w:rPr>
               <w:t>• Konsep Ruang &amp; Duduk</w:t>
@@ -315,7 +390,7 @@
               <w:rPr>
                 <w:rFonts w:ascii="Arial" w:hAnsi="Arial"/>
                 <w:b/>
-                <w:color w:val="B45309"/>
+                <w:color w:val="A56341"/>
                 <w:sz w:val="18"/>
               </w:rPr>
               <w:t>• Konsep Dapur &amp; Minuman</w:t>
@@ -344,7 +419,7 @@
               <w:rPr>
                 <w:rFonts w:ascii="Arial" w:hAnsi="Arial"/>
                 <w:b/>
-                <w:color w:val="B45309"/>
+                <w:color w:val="A56341"/>
                 <w:sz w:val="18"/>
               </w:rPr>
               <w:t>• Lokasi Basis Operasional</w:t>
@@ -373,7 +448,7 @@
               <w:rPr>
                 <w:rFonts w:ascii="Arial" w:hAnsi="Arial"/>
                 <w:b/>
-                <w:color w:val="B45309"/>
+                <w:color w:val="A56341"/>
                 <w:sz w:val="18"/>
               </w:rPr>
               <w:t>• Inisiator &amp; Penanggung Jawab</w:t>
@@ -399,7 +474,7 @@
     </w:p>
     <w:p>
       <w:pPr>
-        <w:spacing w:before="320" w:after="0"/>
+        <w:spacing w:before="280" w:after="0"/>
         <w:jc w:val="right"/>
       </w:pPr>
       <w:r>
@@ -448,7 +523,7 @@
         <w:rPr>
           <w:rFonts w:ascii="Arial" w:hAnsi="Arial"/>
           <w:b/>
-          <w:color w:val="B45309"/>
+          <w:color w:val="A56341"/>
           <w:sz w:val="21"/>
         </w:rPr>
         <w:t>1.1 Mengapa Model Lean MVP Diterapkan?</w:t>
@@ -495,26 +570,10 @@
         <w:rPr>
           <w:rFonts w:ascii="Arial" w:hAnsi="Arial"/>
           <w:b/>
-          <w:color w:val="B45309"/>
+          <w:color w:val="A56341"/>
           <w:sz w:val="21"/>
         </w:rPr>
-        <w:t>1.2 Filosofi Mendalam "Jangkar Kopi" — Nama adalah Doa dan Harapan</w:t>
-      </w:r>
-    </w:p>
-    <w:p>
-      <w:pPr>
-        <w:spacing w:before="0" w:after="60" w:line="276" w:lineRule="auto"/>
-        <w:jc w:val="both"/>
-      </w:pPr>
-      <w:r>
-        <w:rPr>
-          <w:rFonts w:ascii="Arial" w:hAnsi="Arial"/>
-          <w:b w:val="0"/>
-          <w:i w:val="0"/>
-          <w:color w:val="243B53"/>
-          <w:sz w:val="19"/>
-        </w:rPr>
-        <w:t>Nama "Jangkar Kopi" dipilih bukan dari istilah asing yang mengada-ada, melainkan berakar pada filosofi kehidupan, kearifan lokal, dan kedekatan geografis wilayah Pandeglang barat:</w:t>
+        <w:t>1.2 Filosofi Nama Merek "Jangkar Kopi" — Doa dan Harapan</w:t>
       </w:r>
     </w:p>
     <w:tbl>
@@ -530,7 +589,7 @@
         <w:tc>
           <w:tcPr>
             <w:tcW w:type="dxa" w:w="9694"/>
-            <w:shd w:val="clear" w:color="auto" w:fill="FEF3C7"/>
+            <w:shd w:val="clear" w:color="auto" w:fill="FDF6F0"/>
             <w:tcMar>
               <w:top w:w="70" w:type="dxa"/>
               <w:bottom w:w="70" w:type="dxa"/>
@@ -539,7 +598,7 @@
             </w:tcMar>
             <w:tcBorders>
               <w:top w:val="none"/>
-              <w:left w:val="single" w:sz="24" w:space="0" w:color="B45309"/>
+              <w:left w:val="single" w:sz="24" w:space="0" w:color="A56341"/>
               <w:bottom w:val="none"/>
               <w:right w:val="none"/>
             </w:tcBorders>
@@ -568,7 +627,7 @@
               <w:rPr>
                 <w:rFonts w:ascii="Arial" w:hAnsi="Arial"/>
                 <w:b/>
-                <w:color w:val="B45309"/>
+                <w:color w:val="A56341"/>
                 <w:sz w:val="18"/>
               </w:rPr>
               <w:t xml:space="preserve">1. Tempat Berlabuh &amp; Melepas Lelah (The Safe Harbor): </w:t>
@@ -579,7 +638,7 @@
                 <w:color w:val="243B53"/>
                 <w:sz w:val="18"/>
               </w:rPr>
-              <w:t>Fungsi utama jangkar adalah diturunkan saat perahu tiba di dermaga yang tenang. Setiap hari warga bekerja keras mengarungi ombak kehidupan; Jangkar Kopi hadir sebagai tempat mereka berlabuh, menghela napas, dan melepas penat di malam hari.</w:t>
+              <w:t>Fungsi utama jangkar adalah diturunkan saat perahu tiba di dermaga yang tenang. Jangkar Kopi hadir sebagai tempat warga berlabuh, menghela napas, dan melepas penat setelah seharian bekerja.</w:t>
             </w:r>
           </w:p>
           <w:p>
@@ -591,7 +650,7 @@
               <w:rPr>
                 <w:rFonts w:ascii="Arial" w:hAnsi="Arial"/>
                 <w:b/>
-                <w:color w:val="B45309"/>
+                <w:color w:val="A56341"/>
                 <w:sz w:val="18"/>
               </w:rPr>
               <w:t xml:space="preserve">2. Kaitan Geografis Jalur Maritim Banten Barat: </w:t>
@@ -602,7 +661,7 @@
                 <w:color w:val="243B53"/>
                 <w:sz w:val="18"/>
               </w:rPr>
-              <w:t>Cikedal dan Menes adalah gerbang pelintas menuju kawasan pesisir Labuan, Carita, dan Tanjung Lesung. Jangkar sangat lekat dengan ketangguhan masyarakat maritim Banten yang bersahaja dan pekerja keras.</w:t>
+              <w:t>Cikedal dan Menes adalah gerbang pelintas menuju pesisir Labuan, Carita, dan Tanjung Lesung. Jangkar sangat lekat dengan ketangguhan masyarakat maritim Banten yang bersahaja dan pekerja keras.</w:t>
             </w:r>
           </w:p>
           <w:p>
@@ -614,7 +673,7 @@
               <w:rPr>
                 <w:rFonts w:ascii="Arial" w:hAnsi="Arial"/>
                 <w:b/>
-                <w:color w:val="B45309"/>
+                <w:color w:val="A56341"/>
                 <w:sz w:val="18"/>
               </w:rPr>
               <w:t xml:space="preserve">3. Keteguhan yang Menancap Membumi (Grounded): </w:t>
@@ -625,7 +684,7 @@
                 <w:color w:val="243B53"/>
                 <w:sz w:val="18"/>
               </w:rPr>
-              <w:t>Jangkar tidak pernah melayang di langit; jangkar menancap kuat di bumi. Ini adalah doa agar usaha ini selalu membumi, tidak sombong, berakar pada realitas rakyat, dan tahan banting menghadapi ujian usaha.</w:t>
+              <w:t>Jangkar menancap kuat di bumi. Ini adalah doa agar usaha selalu membumi, tidak congkak, berakar pada realitas rakyat, dan tahan banting menghadapi ujian usaha.</w:t>
             </w:r>
           </w:p>
           <w:p>
@@ -637,7 +696,7 @@
               <w:rPr>
                 <w:rFonts w:ascii="Arial" w:hAnsi="Arial"/>
                 <w:b/>
-                <w:color w:val="B45309"/>
+                <w:color w:val="A56341"/>
                 <w:sz w:val="18"/>
               </w:rPr>
               <w:t xml:space="preserve">4. Pengikat Tali Silaturahmi: </w:t>
@@ -648,7 +707,7 @@
                 <w:color w:val="243B53"/>
                 <w:sz w:val="18"/>
               </w:rPr>
-              <w:t>Jangkar menahan perahu agar tidak hanyut terseret arus. Usaha ini diniatkan menjadi pengikat tali persaudaraan antarwarga, pemuda, santri, dan tetangga agar tetap rukun dan guyub.</w:t>
+              <w:t>Jangkar menahan perahu agar tidak hanyut; usaha ini diniatkan menjadi pengikat tali persaudaraan antarwarga, pemuda, santri, dan tetangga agar tetap guyub rukun.</w:t>
             </w:r>
           </w:p>
         </w:tc>
@@ -668,7 +727,7 @@
         <w:rPr>
           <w:rFonts w:ascii="Arial" w:hAnsi="Arial"/>
           <w:b/>
-          <w:color w:val="B45309"/>
+          <w:color w:val="A56341"/>
           <w:sz w:val="21"/>
         </w:rPr>
         <w:t>1.3 Sederhana, Cepat Buka &amp; Minim Risiko</w:t>
@@ -687,9 +746,207 @@
           <w:color w:val="243B53"/>
           <w:sz w:val="19"/>
         </w:rPr>
-        <w:t>Dengan menunda pembelian set kursi camping dan mesin espresso impor, serta memfokuskan fasilitas duduk pada alas tebal yang nyaman (karpet busa empuk waterproof) dan meja lipat kecil portabel, Jangkar Kopi menekan belanja modal awal secara drastis sehingga dapat dieksekusi dalam tempo 10–14 hari kerja. Risiko kerugian ditekan seminimal mungkin, sementara perputaran uang harian langsung aktif sejak hari pertama.</w:t>
+        <w:t>Dengan menunda pembelian kursi camping dan mesin espresso impor, serta memfokuskan fasilitas duduk pada alas tebal nyaman dan meja lipat portabel, Jangkar Kopi menekan CAPEX awal secara drastis sehingga dapat dieksekusi dalam tempo 10–14 hari kerja. Risiko kerugian ditekan seminimal mungkin, sementara perputaran uang harian langsung aktif sejak hari pertama.</w:t>
       </w:r>
     </w:p>
+    <w:p>
+      <w:pPr>
+        <w:keepNext/>
+        <w:spacing w:before="160" w:after="60"/>
+      </w:pPr>
+      <w:r>
+        <w:rPr>
+          <w:rFonts w:ascii="Arial" w:hAnsi="Arial"/>
+          <w:b/>
+          <w:color w:val="A56341"/>
+          <w:sz w:val="21"/>
+        </w:rPr>
+        <w:t>1.4 Identitas Visual Merek, Palet Warna (#A56341) &amp; Filosofi Logo</w:t>
+      </w:r>
+    </w:p>
+    <w:tbl>
+      <w:tblPr>
+        <w:tblW w:type="auto" w:w="0"/>
+        <w:jc w:val="center"/>
+        <w:tblLook w:firstColumn="1" w:firstRow="1" w:lastColumn="0" w:lastRow="0" w:noHBand="0" w:noVBand="1" w:val="04A0"/>
+      </w:tblPr>
+      <w:tblGrid>
+        <w:gridCol w:w="4847"/>
+        <w:gridCol w:w="4847"/>
+      </w:tblGrid>
+      <w:tr>
+        <w:tc>
+          <w:tcPr>
+            <w:tcW w:type="dxa" w:w="2381"/>
+            <w:tcMar>
+              <w:top w:w="30" w:type="dxa"/>
+              <w:bottom w:w="30" w:type="dxa"/>
+              <w:left w:w="40" w:type="dxa"/>
+              <w:right w:w="50" w:type="dxa"/>
+            </w:tcMar>
+            <w:shd w:val="clear" w:color="auto" w:fill="FDF6F0"/>
+            <w:tcBorders>
+              <w:top w:val="single" w:sz="4" w:space="0" w:color="E2D8CE"/>
+              <w:left w:val="single" w:sz="20" w:space="0" w:color="A56341"/>
+              <w:bottom w:val="single" w:sz="4" w:space="0" w:color="E2D8CE"/>
+              <w:right w:val="none"/>
+            </w:tcBorders>
+          </w:tcPr>
+          <w:p>
+            <w:pPr>
+              <w:spacing w:before="40" w:after="60"/>
+              <w:jc w:val="center"/>
+            </w:pPr>
+            <w:r>
+              <w:drawing>
+                <wp:inline xmlns:a="http://schemas.openxmlformats.org/drawingml/2006/main" xmlns:pic="http://schemas.openxmlformats.org/drawingml/2006/picture">
+                  <wp:extent cx="1260000" cy="1260000"/>
+                  <wp:docPr id="2" name="Picture 2"/>
+                  <wp:cNvGraphicFramePr>
+                    <a:graphicFrameLocks noChangeAspect="1"/>
+                  </wp:cNvGraphicFramePr>
+                  <a:graphic>
+                    <a:graphicData uri="http://schemas.openxmlformats.org/drawingml/2006/picture">
+                      <pic:pic>
+                        <pic:nvPicPr>
+                          <pic:cNvPr id="0" name="JANGKAR KOPI - LOGO 2.png"/>
+                          <pic:cNvPicPr/>
+                        </pic:nvPicPr>
+                        <pic:blipFill>
+                          <a:blip r:embed="rId14"/>
+                          <a:stretch>
+                            <a:fillRect/>
+                          </a:stretch>
+                        </pic:blipFill>
+                        <pic:spPr>
+                          <a:xfrm>
+                            <a:off x="0" y="0"/>
+                            <a:ext cx="1260000" cy="1260000"/>
+                          </a:xfrm>
+                          <a:prstGeom prst="rect"/>
+                        </pic:spPr>
+                      </pic:pic>
+                    </a:graphicData>
+                  </a:graphic>
+                </wp:inline>
+              </w:drawing>
+            </w:r>
+          </w:p>
+          <w:p>
+            <w:pPr>
+              <w:spacing w:before="0" w:after="20"/>
+              <w:jc w:val="center"/>
+            </w:pPr>
+            <w:r>
+              <w:rPr>
+                <w:b/>
+                <w:color w:val="102A43"/>
+                <w:sz w:val="15"/>
+              </w:rPr>
+              <w:t>Warna Primer Merek:</w:t>
+              <w:br/>
+            </w:r>
+            <w:r>
+              <w:rPr>
+                <w:b/>
+                <w:color w:val="A56341"/>
+                <w:sz w:val="16"/>
+              </w:rPr>
+              <w:t>Terracotta Coffee Roast</w:t>
+              <w:br/>
+            </w:r>
+            <w:r>
+              <w:rPr>
+                <w:color w:val="627D98"/>
+                <w:sz w:val="14"/>
+              </w:rPr>
+              <w:t>#A56341 | RGB (165,99,65)</w:t>
+            </w:r>
+          </w:p>
+        </w:tc>
+        <w:tc>
+          <w:tcPr>
+            <w:tcW w:type="dxa" w:w="7313"/>
+            <w:tcMar>
+              <w:top w:w="30" w:type="dxa"/>
+              <w:bottom w:w="30" w:type="dxa"/>
+              <w:left w:w="50" w:type="dxa"/>
+              <w:right w:w="40" w:type="dxa"/>
+            </w:tcMar>
+            <w:shd w:val="clear" w:color="auto" w:fill="FDF6F0"/>
+            <w:tcBorders>
+              <w:top w:val="single" w:sz="4" w:space="0" w:color="E2D8CE"/>
+              <w:left w:val="none"/>
+              <w:bottom w:val="single" w:sz="4" w:space="0" w:color="E2D8CE"/>
+              <w:right w:val="single" w:sz="4" w:space="0" w:color="E2D8CE"/>
+            </w:tcBorders>
+          </w:tcPr>
+          <w:p>
+            <w:pPr>
+              <w:spacing w:before="0" w:after="50" w:line="276" w:lineRule="auto"/>
+              <w:jc w:val="left"/>
+            </w:pPr>
+            <w:r>
+              <w:rPr>
+                <w:b/>
+                <w:color w:val="A56341"/>
+                <w:sz w:val="16"/>
+              </w:rPr>
+              <w:t xml:space="preserve">1. Siluet Jangkar &amp; Inisial 'J' (Stabilitas &amp; Safe Harbor): </w:t>
+            </w:r>
+            <w:r>
+              <w:rPr>
+                <w:color w:val="243B53"/>
+                <w:sz w:val="16"/>
+              </w:rPr>
+              <w:t>Batang kokoh dan kait jangkar membentuk inisial 'J' yang menancap di tanah. Merepresentasikan stabilitas usaha F&amp;B yang tahan banting, membumi (grounded), serta menjadi pelabuhan teduh melepas lelah.</w:t>
+            </w:r>
+          </w:p>
+          <w:p>
+            <w:pPr>
+              <w:spacing w:before="20" w:after="50" w:line="276" w:lineRule="auto"/>
+              <w:jc w:val="left"/>
+            </w:pPr>
+            <w:r>
+              <w:rPr>
+                <w:b/>
+                <w:color w:val="A56341"/>
+                <w:sz w:val="16"/>
+              </w:rPr>
+              <w:t xml:space="preserve">2. Lengkung Cangkir &amp; Senyuman (Welcoming Cup &amp; Smile): </w:t>
+            </w:r>
+            <w:r>
+              <w:rPr>
+                <w:color w:val="243B53"/>
+                <w:sz w:val="16"/>
+              </w:rPr>
+              <w:t>Lengan bawah jangkar membentuk mangkuk cangkir kopi sekaligus lengkungan senyum ramah. Menyimbolkan keramahtamahan (hospitality), kehangatan interaksi, dan ruang temu santai yang egaliter bagi semua kalangan warga.</w:t>
+            </w:r>
+          </w:p>
+          <w:p>
+            <w:pPr>
+              <w:spacing w:before="20" w:after="0" w:line="276" w:lineRule="auto"/>
+              <w:jc w:val="left"/>
+            </w:pPr>
+            <w:r>
+              <w:rPr>
+                <w:b/>
+                <w:color w:val="A56341"/>
+                <w:sz w:val="16"/>
+              </w:rPr>
+              <w:t xml:space="preserve">3. Uap Aroma Kopi &amp; Nyala Pelita (Steam Aroma &amp; Beacon Flame): </w:t>
+            </w:r>
+            <w:r>
+              <w:rPr>
+                <w:color w:val="243B53"/>
+                <w:sz w:val="16"/>
+              </w:rPr>
+              <w:t>Tiga liukan uap di puncak cangkir memancarkan semerbak seduhan kopi Robusta lokal dan kehangatan bara arang, sekaligus menyimbolkan nyala lentera mercusuar pemandu pelintas malam di koridor jalan.</w:t>
+            </w:r>
+          </w:p>
+        </w:tc>
+      </w:tr>
+    </w:tbl>
     <w:p>
       <w:r>
         <w:br w:type="page"/>
@@ -719,7 +976,7 @@
         <w:rPr>
           <w:rFonts w:ascii="Arial" w:hAnsi="Arial"/>
           <w:b/>
-          <w:color w:val="B45309"/>
+          <w:color w:val="A56341"/>
           <w:sz w:val="21"/>
         </w:rPr>
         <w:t>2.1 Konsep Tempat: 100% Lesehan Alas Tebal Nyaman &amp; 4 Meja Lipat Portabel</w:t>
@@ -766,7 +1023,7 @@
         <w:rPr>
           <w:rFonts w:ascii="Arial" w:hAnsi="Arial"/>
           <w:b/>
-          <w:color w:val="B45309"/>
+          <w:color w:val="A56341"/>
           <w:sz w:val="21"/>
         </w:rPr>
         <w:t>2.2 Zonasi Tata Ruang Lahan Terbuka (~5 × 5 Meter / 25 m²)</w:t>
@@ -801,7 +1058,7 @@
         <w:tc>
           <w:tcPr>
             <w:tcW w:type="dxa" w:w="9694"/>
-            <w:shd w:val="clear" w:color="auto" w:fill="F0F4F8"/>
+            <w:shd w:val="clear" w:color="auto" w:fill="FDF6F0"/>
             <w:tcMar>
               <w:top w:w="70" w:type="dxa"/>
               <w:bottom w:w="70" w:type="dxa"/>
@@ -810,7 +1067,7 @@
             </w:tcMar>
             <w:tcBorders>
               <w:top w:val="none"/>
-              <w:left w:val="single" w:sz="24" w:space="0" w:color="102A43"/>
+              <w:left w:val="single" w:sz="24" w:space="0" w:color="A56341"/>
               <w:bottom w:val="none"/>
               <w:right w:val="none"/>
             </w:tcBorders>
@@ -839,7 +1096,7 @@
               <w:rPr>
                 <w:rFonts w:ascii="Arial" w:hAnsi="Arial"/>
                 <w:b/>
-                <w:color w:val="B45309"/>
+                <w:color w:val="A56341"/>
                 <w:sz w:val="18"/>
               </w:rPr>
               <w:t xml:space="preserve">• Zonasi Depan (1,5 m × 5,0 m) — Dapur Display &amp; Panggangan Arang: </w:t>
@@ -862,7 +1119,7 @@
               <w:rPr>
                 <w:rFonts w:ascii="Arial" w:hAnsi="Arial"/>
                 <w:b/>
-                <w:color w:val="B45309"/>
+                <w:color w:val="A56341"/>
                 <w:sz w:val="18"/>
               </w:rPr>
               <w:t xml:space="preserve">• Zonasi Tengah &amp; Belakang (3,5 m × 5,0 m) — Area Lesehan Tamu: </w:t>
@@ -885,7 +1142,7 @@
               <w:rPr>
                 <w:rFonts w:ascii="Arial" w:hAnsi="Arial"/>
                 <w:b/>
-                <w:color w:val="B45309"/>
+                <w:color w:val="A56341"/>
                 <w:sz w:val="18"/>
               </w:rPr>
               <w:t xml:space="preserve">• Perlindungan Cuaca (Tenda 2×6m Milik Sendiri + Atap Terpal Baru): </w:t>
@@ -908,7 +1165,7 @@
               <w:rPr>
                 <w:rFonts w:ascii="Arial" w:hAnsi="Arial"/>
                 <w:b/>
-                <w:color w:val="B45309"/>
+                <w:color w:val="A56341"/>
                 <w:sz w:val="18"/>
               </w:rPr>
               <w:t xml:space="preserve">• Zonasi Parkir &amp; Akses Bersih: </w:t>
@@ -939,7 +1196,7 @@
         <w:rPr>
           <w:rFonts w:ascii="Arial" w:hAnsi="Arial"/>
           <w:b/>
-          <w:color w:val="B45309"/>
+          <w:color w:val="A56341"/>
           <w:sz w:val="21"/>
         </w:rPr>
         <w:t>2.3 Menu Makanan Awal: Aneka Sate Frozen Food Bakar Arang &amp; Kudapan</w:t>
@@ -1002,7 +1259,7 @@
         <w:rPr>
           <w:rFonts w:ascii="Arial" w:hAnsi="Arial"/>
           <w:b/>
-          <w:color w:val="B45309"/>
+          <w:color w:val="A56341"/>
           <w:sz w:val="21"/>
         </w:rPr>
         <w:t>2.4 Signature Menu Kopi Jangkar &amp; Minuman Rakyat (Ikon Minuman Usaha)</w:t>
@@ -1117,7 +1374,7 @@
         <w:rPr>
           <w:rFonts w:ascii="Arial" w:hAnsi="Arial"/>
           <w:b/>
-          <w:color w:val="B45309"/>
+          <w:color w:val="A56341"/>
           <w:sz w:val="21"/>
         </w:rPr>
         <w:t>3.1 Segmentasi Sasaran Konsumen Koridor Cikedal - Menes</w:t>
@@ -1152,7 +1409,7 @@
         <w:tc>
           <w:tcPr>
             <w:tcW w:type="dxa" w:w="9694"/>
-            <w:shd w:val="clear" w:color="auto" w:fill="FEF3C7"/>
+            <w:shd w:val="clear" w:color="auto" w:fill="FDF6F0"/>
             <w:tcMar>
               <w:top w:w="70" w:type="dxa"/>
               <w:bottom w:w="70" w:type="dxa"/>
@@ -1161,7 +1418,7 @@
             </w:tcMar>
             <w:tcBorders>
               <w:top w:val="none"/>
-              <w:left w:val="single" w:sz="24" w:space="0" w:color="B45309"/>
+              <w:left w:val="single" w:sz="24" w:space="0" w:color="A56341"/>
               <w:bottom w:val="none"/>
               <w:right w:val="none"/>
             </w:tcBorders>
@@ -1190,7 +1447,7 @@
               <w:rPr>
                 <w:rFonts w:ascii="Arial" w:hAnsi="Arial"/>
                 <w:b/>
-                <w:color w:val="B45309"/>
+                <w:color w:val="A56341"/>
                 <w:sz w:val="18"/>
               </w:rPr>
               <w:t xml:space="preserve">1. Pemuda Desa &amp; Komunitas Nongkrong Lokal (40%): </w:t>
@@ -1213,7 +1470,7 @@
               <w:rPr>
                 <w:rFonts w:ascii="Arial" w:hAnsi="Arial"/>
                 <w:b/>
-                <w:color w:val="B45309"/>
+                <w:color w:val="A56341"/>
                 <w:sz w:val="18"/>
               </w:rPr>
               <w:t xml:space="preserve">2. Santri, Alumni &amp; Pelajar Lembaga Pendidikan (25%): </w:t>
@@ -1236,7 +1493,7 @@
               <w:rPr>
                 <w:rFonts w:ascii="Arial" w:hAnsi="Arial"/>
                 <w:b/>
-                <w:color w:val="B45309"/>
+                <w:color w:val="A56341"/>
                 <w:sz w:val="18"/>
               </w:rPr>
               <w:t xml:space="preserve">3. Pekerja Malam, Guru, Pedagang &amp; Petugas Ronda (20%): </w:t>
@@ -1259,7 +1516,7 @@
               <w:rPr>
                 <w:rFonts w:ascii="Arial" w:hAnsi="Arial"/>
                 <w:b/>
-                <w:color w:val="B45309"/>
+                <w:color w:val="A56341"/>
                 <w:sz w:val="18"/>
               </w:rPr>
               <w:t xml:space="preserve">4. Pelintas Jalur Wisata &amp; Logistik Pantai Barat (15%): </w:t>
@@ -1290,7 +1547,7 @@
         <w:rPr>
           <w:rFonts w:ascii="Arial" w:hAnsi="Arial"/>
           <w:b/>
-          <w:color w:val="B45309"/>
+          <w:color w:val="A56341"/>
           <w:sz w:val="21"/>
         </w:rPr>
         <w:t>3.2 Keunggulan Kompetitif Dibanding Warkop Konvensional</w:t>
@@ -1369,7 +1626,7 @@
         <w:rPr>
           <w:rFonts w:ascii="Arial" w:hAnsi="Arial"/>
           <w:b/>
-          <w:color w:val="B45309"/>
+          <w:color w:val="A56341"/>
           <w:sz w:val="21"/>
         </w:rPr>
         <w:t>3.3 Waktu Operasional &amp; Pola Layanan</w:t>
@@ -1436,7 +1693,7 @@
         <w:rPr>
           <w:rFonts w:ascii="Arial" w:hAnsi="Arial"/>
           <w:b/>
-          <w:color w:val="B45309"/>
+          <w:color w:val="A56341"/>
           <w:sz w:val="21"/>
         </w:rPr>
         <w:t>4.1 Tabel Rincian Belanja Modal Awal (Tepat Rp 15.000.000)</w:t>
@@ -1571,7 +1828,7 @@
         <w:tc>
           <w:tcPr>
             <w:tcW w:type="dxa" w:w="2721"/>
-            <w:shd w:val="clear" w:color="auto" w:fill="F0F4F8"/>
+            <w:shd w:val="clear" w:color="auto" w:fill="FDF6F0"/>
             <w:tcMar>
               <w:top w:w="32" w:type="dxa"/>
               <w:bottom w:w="32" w:type="dxa"/>
@@ -1581,7 +1838,7 @@
             <w:tcBorders>
               <w:top w:val="none"/>
               <w:left w:val="none"/>
-              <w:bottom w:val="single" w:sz="4" w:space="0" w:color="D9E2EC"/>
+              <w:bottom w:val="single" w:sz="4" w:space="0" w:color="E2D8CE"/>
               <w:right w:val="none"/>
             </w:tcBorders>
           </w:tcPr>
@@ -1603,7 +1860,7 @@
         <w:tc>
           <w:tcPr>
             <w:tcW w:type="dxa" w:w="3685"/>
-            <w:shd w:val="clear" w:color="auto" w:fill="F0F4F8"/>
+            <w:shd w:val="clear" w:color="auto" w:fill="FDF6F0"/>
             <w:tcMar>
               <w:top w:w="32" w:type="dxa"/>
               <w:bottom w:w="32" w:type="dxa"/>
@@ -1613,7 +1870,7 @@
             <w:tcBorders>
               <w:top w:val="none"/>
               <w:left w:val="none"/>
-              <w:bottom w:val="single" w:sz="4" w:space="0" w:color="D9E2EC"/>
+              <w:bottom w:val="single" w:sz="4" w:space="0" w:color="E2D8CE"/>
               <w:right w:val="none"/>
             </w:tcBorders>
           </w:tcPr>
@@ -1634,7 +1891,7 @@
         <w:tc>
           <w:tcPr>
             <w:tcW w:type="dxa" w:w="1247"/>
-            <w:shd w:val="clear" w:color="auto" w:fill="F0F4F8"/>
+            <w:shd w:val="clear" w:color="auto" w:fill="FDF6F0"/>
             <w:tcMar>
               <w:top w:w="32" w:type="dxa"/>
               <w:bottom w:w="32" w:type="dxa"/>
@@ -1644,7 +1901,7 @@
             <w:tcBorders>
               <w:top w:val="none"/>
               <w:left w:val="none"/>
-              <w:bottom w:val="single" w:sz="4" w:space="0" w:color="D9E2EC"/>
+              <w:bottom w:val="single" w:sz="4" w:space="0" w:color="E2D8CE"/>
               <w:right w:val="none"/>
             </w:tcBorders>
           </w:tcPr>
@@ -1665,7 +1922,7 @@
         <w:tc>
           <w:tcPr>
             <w:tcW w:type="dxa" w:w="2041"/>
-            <w:shd w:val="clear" w:color="auto" w:fill="F0F4F8"/>
+            <w:shd w:val="clear" w:color="auto" w:fill="FDF6F0"/>
             <w:tcMar>
               <w:top w:w="32" w:type="dxa"/>
               <w:bottom w:w="32" w:type="dxa"/>
@@ -1675,7 +1932,7 @@
             <w:tcBorders>
               <w:top w:val="none"/>
               <w:left w:val="none"/>
-              <w:bottom w:val="single" w:sz="4" w:space="0" w:color="D9E2EC"/>
+              <w:bottom w:val="single" w:sz="4" w:space="0" w:color="E2D8CE"/>
               <w:right w:val="none"/>
             </w:tcBorders>
           </w:tcPr>
@@ -1711,7 +1968,7 @@
             <w:tcBorders>
               <w:top w:val="none"/>
               <w:left w:val="none"/>
-              <w:bottom w:val="single" w:sz="4" w:space="0" w:color="D9E2EC"/>
+              <w:bottom w:val="single" w:sz="4" w:space="0" w:color="E2D8CE"/>
               <w:right w:val="none"/>
             </w:tcBorders>
           </w:tcPr>
@@ -1743,7 +2000,7 @@
             <w:tcBorders>
               <w:top w:val="none"/>
               <w:left w:val="none"/>
-              <w:bottom w:val="single" w:sz="4" w:space="0" w:color="D9E2EC"/>
+              <w:bottom w:val="single" w:sz="4" w:space="0" w:color="E2D8CE"/>
               <w:right w:val="none"/>
             </w:tcBorders>
           </w:tcPr>
@@ -1774,7 +2031,7 @@
             <w:tcBorders>
               <w:top w:val="none"/>
               <w:left w:val="none"/>
-              <w:bottom w:val="single" w:sz="4" w:space="0" w:color="D9E2EC"/>
+              <w:bottom w:val="single" w:sz="4" w:space="0" w:color="E2D8CE"/>
               <w:right w:val="none"/>
             </w:tcBorders>
           </w:tcPr>
@@ -1805,7 +2062,7 @@
             <w:tcBorders>
               <w:top w:val="none"/>
               <w:left w:val="none"/>
-              <w:bottom w:val="single" w:sz="4" w:space="0" w:color="D9E2EC"/>
+              <w:bottom w:val="single" w:sz="4" w:space="0" w:color="E2D8CE"/>
               <w:right w:val="none"/>
             </w:tcBorders>
           </w:tcPr>
@@ -1831,7 +2088,7 @@
         <w:tc>
           <w:tcPr>
             <w:tcW w:type="dxa" w:w="2721"/>
-            <w:shd w:val="clear" w:color="auto" w:fill="F0F4F8"/>
+            <w:shd w:val="clear" w:color="auto" w:fill="FDF6F0"/>
             <w:tcMar>
               <w:top w:w="32" w:type="dxa"/>
               <w:bottom w:w="32" w:type="dxa"/>
@@ -1841,7 +2098,7 @@
             <w:tcBorders>
               <w:top w:val="none"/>
               <w:left w:val="none"/>
-              <w:bottom w:val="single" w:sz="4" w:space="0" w:color="D9E2EC"/>
+              <w:bottom w:val="single" w:sz="4" w:space="0" w:color="E2D8CE"/>
               <w:right w:val="none"/>
             </w:tcBorders>
           </w:tcPr>
@@ -1863,7 +2120,7 @@
         <w:tc>
           <w:tcPr>
             <w:tcW w:type="dxa" w:w="3685"/>
-            <w:shd w:val="clear" w:color="auto" w:fill="F0F4F8"/>
+            <w:shd w:val="clear" w:color="auto" w:fill="FDF6F0"/>
             <w:tcMar>
               <w:top w:w="32" w:type="dxa"/>
               <w:bottom w:w="32" w:type="dxa"/>
@@ -1873,7 +2130,7 @@
             <w:tcBorders>
               <w:top w:val="none"/>
               <w:left w:val="none"/>
-              <w:bottom w:val="single" w:sz="4" w:space="0" w:color="D9E2EC"/>
+              <w:bottom w:val="single" w:sz="4" w:space="0" w:color="E2D8CE"/>
               <w:right w:val="none"/>
             </w:tcBorders>
           </w:tcPr>
@@ -1894,7 +2151,7 @@
         <w:tc>
           <w:tcPr>
             <w:tcW w:type="dxa" w:w="1247"/>
-            <w:shd w:val="clear" w:color="auto" w:fill="F0F4F8"/>
+            <w:shd w:val="clear" w:color="auto" w:fill="FDF6F0"/>
             <w:tcMar>
               <w:top w:w="32" w:type="dxa"/>
               <w:bottom w:w="32" w:type="dxa"/>
@@ -1904,7 +2161,7 @@
             <w:tcBorders>
               <w:top w:val="none"/>
               <w:left w:val="none"/>
-              <w:bottom w:val="single" w:sz="4" w:space="0" w:color="D9E2EC"/>
+              <w:bottom w:val="single" w:sz="4" w:space="0" w:color="E2D8CE"/>
               <w:right w:val="none"/>
             </w:tcBorders>
           </w:tcPr>
@@ -1925,7 +2182,7 @@
         <w:tc>
           <w:tcPr>
             <w:tcW w:type="dxa" w:w="2041"/>
-            <w:shd w:val="clear" w:color="auto" w:fill="F0F4F8"/>
+            <w:shd w:val="clear" w:color="auto" w:fill="FDF6F0"/>
             <w:tcMar>
               <w:top w:w="32" w:type="dxa"/>
               <w:bottom w:w="32" w:type="dxa"/>
@@ -1935,7 +2192,7 @@
             <w:tcBorders>
               <w:top w:val="none"/>
               <w:left w:val="none"/>
-              <w:bottom w:val="single" w:sz="4" w:space="0" w:color="D9E2EC"/>
+              <w:bottom w:val="single" w:sz="4" w:space="0" w:color="E2D8CE"/>
               <w:right w:val="none"/>
             </w:tcBorders>
           </w:tcPr>
@@ -1971,7 +2228,7 @@
             <w:tcBorders>
               <w:top w:val="none"/>
               <w:left w:val="none"/>
-              <w:bottom w:val="single" w:sz="4" w:space="0" w:color="D9E2EC"/>
+              <w:bottom w:val="single" w:sz="4" w:space="0" w:color="E2D8CE"/>
               <w:right w:val="none"/>
             </w:tcBorders>
           </w:tcPr>
@@ -2003,7 +2260,7 @@
             <w:tcBorders>
               <w:top w:val="none"/>
               <w:left w:val="none"/>
-              <w:bottom w:val="single" w:sz="4" w:space="0" w:color="D9E2EC"/>
+              <w:bottom w:val="single" w:sz="4" w:space="0" w:color="E2D8CE"/>
               <w:right w:val="none"/>
             </w:tcBorders>
           </w:tcPr>
@@ -2034,7 +2291,7 @@
             <w:tcBorders>
               <w:top w:val="none"/>
               <w:left w:val="none"/>
-              <w:bottom w:val="single" w:sz="4" w:space="0" w:color="D9E2EC"/>
+              <w:bottom w:val="single" w:sz="4" w:space="0" w:color="E2D8CE"/>
               <w:right w:val="none"/>
             </w:tcBorders>
           </w:tcPr>
@@ -2065,7 +2322,7 @@
             <w:tcBorders>
               <w:top w:val="none"/>
               <w:left w:val="none"/>
-              <w:bottom w:val="single" w:sz="4" w:space="0" w:color="D9E2EC"/>
+              <w:bottom w:val="single" w:sz="4" w:space="0" w:color="E2D8CE"/>
               <w:right w:val="none"/>
             </w:tcBorders>
           </w:tcPr>
@@ -2091,7 +2348,7 @@
         <w:tc>
           <w:tcPr>
             <w:tcW w:type="dxa" w:w="2721"/>
-            <w:shd w:val="clear" w:color="auto" w:fill="F0F4F8"/>
+            <w:shd w:val="clear" w:color="auto" w:fill="FDF6F0"/>
             <w:tcMar>
               <w:top w:w="32" w:type="dxa"/>
               <w:bottom w:w="32" w:type="dxa"/>
@@ -2101,7 +2358,7 @@
             <w:tcBorders>
               <w:top w:val="none"/>
               <w:left w:val="none"/>
-              <w:bottom w:val="single" w:sz="4" w:space="0" w:color="D9E2EC"/>
+              <w:bottom w:val="single" w:sz="4" w:space="0" w:color="E2D8CE"/>
               <w:right w:val="none"/>
             </w:tcBorders>
           </w:tcPr>
@@ -2123,7 +2380,7 @@
         <w:tc>
           <w:tcPr>
             <w:tcW w:type="dxa" w:w="3685"/>
-            <w:shd w:val="clear" w:color="auto" w:fill="F0F4F8"/>
+            <w:shd w:val="clear" w:color="auto" w:fill="FDF6F0"/>
             <w:tcMar>
               <w:top w:w="32" w:type="dxa"/>
               <w:bottom w:w="32" w:type="dxa"/>
@@ -2133,7 +2390,7 @@
             <w:tcBorders>
               <w:top w:val="none"/>
               <w:left w:val="none"/>
-              <w:bottom w:val="single" w:sz="4" w:space="0" w:color="D9E2EC"/>
+              <w:bottom w:val="single" w:sz="4" w:space="0" w:color="E2D8CE"/>
               <w:right w:val="none"/>
             </w:tcBorders>
           </w:tcPr>
@@ -2154,7 +2411,7 @@
         <w:tc>
           <w:tcPr>
             <w:tcW w:type="dxa" w:w="1247"/>
-            <w:shd w:val="clear" w:color="auto" w:fill="F0F4F8"/>
+            <w:shd w:val="clear" w:color="auto" w:fill="FDF6F0"/>
             <w:tcMar>
               <w:top w:w="32" w:type="dxa"/>
               <w:bottom w:w="32" w:type="dxa"/>
@@ -2164,7 +2421,7 @@
             <w:tcBorders>
               <w:top w:val="none"/>
               <w:left w:val="none"/>
-              <w:bottom w:val="single" w:sz="4" w:space="0" w:color="D9E2EC"/>
+              <w:bottom w:val="single" w:sz="4" w:space="0" w:color="E2D8CE"/>
               <w:right w:val="none"/>
             </w:tcBorders>
           </w:tcPr>
@@ -2185,7 +2442,7 @@
         <w:tc>
           <w:tcPr>
             <w:tcW w:type="dxa" w:w="2041"/>
-            <w:shd w:val="clear" w:color="auto" w:fill="F0F4F8"/>
+            <w:shd w:val="clear" w:color="auto" w:fill="FDF6F0"/>
             <w:tcMar>
               <w:top w:w="32" w:type="dxa"/>
               <w:bottom w:w="32" w:type="dxa"/>
@@ -2195,7 +2452,7 @@
             <w:tcBorders>
               <w:top w:val="none"/>
               <w:left w:val="none"/>
-              <w:bottom w:val="single" w:sz="4" w:space="0" w:color="D9E2EC"/>
+              <w:bottom w:val="single" w:sz="4" w:space="0" w:color="E2D8CE"/>
               <w:right w:val="none"/>
             </w:tcBorders>
           </w:tcPr>
@@ -2231,7 +2488,7 @@
             <w:tcBorders>
               <w:top w:val="none"/>
               <w:left w:val="none"/>
-              <w:bottom w:val="single" w:sz="4" w:space="0" w:color="D9E2EC"/>
+              <w:bottom w:val="single" w:sz="4" w:space="0" w:color="E2D8CE"/>
               <w:right w:val="none"/>
             </w:tcBorders>
           </w:tcPr>
@@ -2263,7 +2520,7 @@
             <w:tcBorders>
               <w:top w:val="none"/>
               <w:left w:val="none"/>
-              <w:bottom w:val="single" w:sz="4" w:space="0" w:color="D9E2EC"/>
+              <w:bottom w:val="single" w:sz="4" w:space="0" w:color="E2D8CE"/>
               <w:right w:val="none"/>
             </w:tcBorders>
           </w:tcPr>
@@ -2294,7 +2551,7 @@
             <w:tcBorders>
               <w:top w:val="none"/>
               <w:left w:val="none"/>
-              <w:bottom w:val="single" w:sz="4" w:space="0" w:color="D9E2EC"/>
+              <w:bottom w:val="single" w:sz="4" w:space="0" w:color="E2D8CE"/>
               <w:right w:val="none"/>
             </w:tcBorders>
           </w:tcPr>
@@ -2325,7 +2582,7 @@
             <w:tcBorders>
               <w:top w:val="none"/>
               <w:left w:val="none"/>
-              <w:bottom w:val="single" w:sz="4" w:space="0" w:color="D9E2EC"/>
+              <w:bottom w:val="single" w:sz="4" w:space="0" w:color="E2D8CE"/>
               <w:right w:val="none"/>
             </w:tcBorders>
           </w:tcPr>
@@ -2351,7 +2608,7 @@
         <w:tc>
           <w:tcPr>
             <w:tcW w:type="dxa" w:w="2721"/>
-            <w:shd w:val="clear" w:color="auto" w:fill="F0F4F8"/>
+            <w:shd w:val="clear" w:color="auto" w:fill="FDF6F0"/>
             <w:tcMar>
               <w:top w:w="32" w:type="dxa"/>
               <w:bottom w:w="32" w:type="dxa"/>
@@ -2361,7 +2618,7 @@
             <w:tcBorders>
               <w:top w:val="none"/>
               <w:left w:val="none"/>
-              <w:bottom w:val="single" w:sz="4" w:space="0" w:color="D9E2EC"/>
+              <w:bottom w:val="single" w:sz="4" w:space="0" w:color="E2D8CE"/>
               <w:right w:val="none"/>
             </w:tcBorders>
           </w:tcPr>
@@ -2383,7 +2640,7 @@
         <w:tc>
           <w:tcPr>
             <w:tcW w:type="dxa" w:w="3685"/>
-            <w:shd w:val="clear" w:color="auto" w:fill="F0F4F8"/>
+            <w:shd w:val="clear" w:color="auto" w:fill="FDF6F0"/>
             <w:tcMar>
               <w:top w:w="32" w:type="dxa"/>
               <w:bottom w:w="32" w:type="dxa"/>
@@ -2393,7 +2650,7 @@
             <w:tcBorders>
               <w:top w:val="none"/>
               <w:left w:val="none"/>
-              <w:bottom w:val="single" w:sz="4" w:space="0" w:color="D9E2EC"/>
+              <w:bottom w:val="single" w:sz="4" w:space="0" w:color="E2D8CE"/>
               <w:right w:val="none"/>
             </w:tcBorders>
           </w:tcPr>
@@ -2414,7 +2671,7 @@
         <w:tc>
           <w:tcPr>
             <w:tcW w:type="dxa" w:w="1247"/>
-            <w:shd w:val="clear" w:color="auto" w:fill="F0F4F8"/>
+            <w:shd w:val="clear" w:color="auto" w:fill="FDF6F0"/>
             <w:tcMar>
               <w:top w:w="32" w:type="dxa"/>
               <w:bottom w:w="32" w:type="dxa"/>
@@ -2424,7 +2681,7 @@
             <w:tcBorders>
               <w:top w:val="none"/>
               <w:left w:val="none"/>
-              <w:bottom w:val="single" w:sz="4" w:space="0" w:color="D9E2EC"/>
+              <w:bottom w:val="single" w:sz="4" w:space="0" w:color="E2D8CE"/>
               <w:right w:val="none"/>
             </w:tcBorders>
           </w:tcPr>
@@ -2445,7 +2702,7 @@
         <w:tc>
           <w:tcPr>
             <w:tcW w:type="dxa" w:w="2041"/>
-            <w:shd w:val="clear" w:color="auto" w:fill="F0F4F8"/>
+            <w:shd w:val="clear" w:color="auto" w:fill="FDF6F0"/>
             <w:tcMar>
               <w:top w:w="32" w:type="dxa"/>
               <w:bottom w:w="32" w:type="dxa"/>
@@ -2455,7 +2712,7 @@
             <w:tcBorders>
               <w:top w:val="none"/>
               <w:left w:val="none"/>
-              <w:bottom w:val="single" w:sz="4" w:space="0" w:color="D9E2EC"/>
+              <w:bottom w:val="single" w:sz="4" w:space="0" w:color="E2D8CE"/>
               <w:right w:val="none"/>
             </w:tcBorders>
           </w:tcPr>
@@ -2491,7 +2748,7 @@
             <w:tcBorders>
               <w:top w:val="none"/>
               <w:left w:val="none"/>
-              <w:bottom w:val="single" w:sz="4" w:space="0" w:color="D9E2EC"/>
+              <w:bottom w:val="single" w:sz="4" w:space="0" w:color="E2D8CE"/>
               <w:right w:val="none"/>
             </w:tcBorders>
           </w:tcPr>
@@ -2523,7 +2780,7 @@
             <w:tcBorders>
               <w:top w:val="none"/>
               <w:left w:val="none"/>
-              <w:bottom w:val="single" w:sz="4" w:space="0" w:color="D9E2EC"/>
+              <w:bottom w:val="single" w:sz="4" w:space="0" w:color="E2D8CE"/>
               <w:right w:val="none"/>
             </w:tcBorders>
           </w:tcPr>
@@ -2554,7 +2811,7 @@
             <w:tcBorders>
               <w:top w:val="none"/>
               <w:left w:val="none"/>
-              <w:bottom w:val="single" w:sz="4" w:space="0" w:color="D9E2EC"/>
+              <w:bottom w:val="single" w:sz="4" w:space="0" w:color="E2D8CE"/>
               <w:right w:val="none"/>
             </w:tcBorders>
           </w:tcPr>
@@ -2585,7 +2842,7 @@
             <w:tcBorders>
               <w:top w:val="none"/>
               <w:left w:val="none"/>
-              <w:bottom w:val="single" w:sz="4" w:space="0" w:color="D9E2EC"/>
+              <w:bottom w:val="single" w:sz="4" w:space="0" w:color="E2D8CE"/>
               <w:right w:val="none"/>
             </w:tcBorders>
           </w:tcPr>
@@ -2611,7 +2868,7 @@
         <w:tc>
           <w:tcPr>
             <w:tcW w:type="dxa" w:w="2721"/>
-            <w:shd w:val="clear" w:color="auto" w:fill="F0F4F8"/>
+            <w:shd w:val="clear" w:color="auto" w:fill="FDF6F0"/>
             <w:tcMar>
               <w:top w:w="32" w:type="dxa"/>
               <w:bottom w:w="32" w:type="dxa"/>
@@ -2621,7 +2878,7 @@
             <w:tcBorders>
               <w:top w:val="none"/>
               <w:left w:val="none"/>
-              <w:bottom w:val="single" w:sz="4" w:space="0" w:color="D9E2EC"/>
+              <w:bottom w:val="single" w:sz="4" w:space="0" w:color="E2D8CE"/>
               <w:right w:val="none"/>
             </w:tcBorders>
           </w:tcPr>
@@ -2643,7 +2900,7 @@
         <w:tc>
           <w:tcPr>
             <w:tcW w:type="dxa" w:w="3685"/>
-            <w:shd w:val="clear" w:color="auto" w:fill="F0F4F8"/>
+            <w:shd w:val="clear" w:color="auto" w:fill="FDF6F0"/>
             <w:tcMar>
               <w:top w:w="32" w:type="dxa"/>
               <w:bottom w:w="32" w:type="dxa"/>
@@ -2653,7 +2910,7 @@
             <w:tcBorders>
               <w:top w:val="none"/>
               <w:left w:val="none"/>
-              <w:bottom w:val="single" w:sz="4" w:space="0" w:color="D9E2EC"/>
+              <w:bottom w:val="single" w:sz="4" w:space="0" w:color="E2D8CE"/>
               <w:right w:val="none"/>
             </w:tcBorders>
           </w:tcPr>
@@ -2674,7 +2931,7 @@
         <w:tc>
           <w:tcPr>
             <w:tcW w:type="dxa" w:w="1247"/>
-            <w:shd w:val="clear" w:color="auto" w:fill="F0F4F8"/>
+            <w:shd w:val="clear" w:color="auto" w:fill="FDF6F0"/>
             <w:tcMar>
               <w:top w:w="32" w:type="dxa"/>
               <w:bottom w:w="32" w:type="dxa"/>
@@ -2684,7 +2941,7 @@
             <w:tcBorders>
               <w:top w:val="none"/>
               <w:left w:val="none"/>
-              <w:bottom w:val="single" w:sz="4" w:space="0" w:color="D9E2EC"/>
+              <w:bottom w:val="single" w:sz="4" w:space="0" w:color="E2D8CE"/>
               <w:right w:val="none"/>
             </w:tcBorders>
           </w:tcPr>
@@ -2705,7 +2962,7 @@
         <w:tc>
           <w:tcPr>
             <w:tcW w:type="dxa" w:w="2041"/>
-            <w:shd w:val="clear" w:color="auto" w:fill="F0F4F8"/>
+            <w:shd w:val="clear" w:color="auto" w:fill="FDF6F0"/>
             <w:tcMar>
               <w:top w:w="32" w:type="dxa"/>
               <w:bottom w:w="32" w:type="dxa"/>
@@ -2715,7 +2972,7 @@
             <w:tcBorders>
               <w:top w:val="none"/>
               <w:left w:val="none"/>
-              <w:bottom w:val="single" w:sz="4" w:space="0" w:color="D9E2EC"/>
+              <w:bottom w:val="single" w:sz="4" w:space="0" w:color="E2D8CE"/>
               <w:right w:val="none"/>
             </w:tcBorders>
           </w:tcPr>
@@ -2749,9 +3006,9 @@
               <w:right w:w="80" w:type="dxa"/>
             </w:tcMar>
             <w:tcBorders>
-              <w:top w:val="single" w:sz="12" w:space="0" w:color="102A43"/>
+              <w:top w:val="single" w:sz="12" w:space="0" w:color="A56341"/>
               <w:left w:val="none"/>
-              <w:bottom w:val="single" w:sz="12" w:space="0" w:color="102A43"/>
+              <w:bottom w:val="single" w:sz="12" w:space="0" w:color="A56341"/>
               <w:right w:val="none"/>
             </w:tcBorders>
           </w:tcPr>
@@ -2781,9 +3038,9 @@
               <w:right w:w="80" w:type="dxa"/>
             </w:tcMar>
             <w:tcBorders>
-              <w:top w:val="single" w:sz="12" w:space="0" w:color="102A43"/>
+              <w:top w:val="single" w:sz="12" w:space="0" w:color="A56341"/>
               <w:left w:val="none"/>
-              <w:bottom w:val="single" w:sz="12" w:space="0" w:color="102A43"/>
+              <w:bottom w:val="single" w:sz="12" w:space="0" w:color="A56341"/>
               <w:right w:val="none"/>
             </w:tcBorders>
           </w:tcPr>
@@ -2800,9 +3057,9 @@
               <w:right w:w="80" w:type="dxa"/>
             </w:tcMar>
             <w:tcBorders>
-              <w:top w:val="single" w:sz="12" w:space="0" w:color="102A43"/>
+              <w:top w:val="single" w:sz="12" w:space="0" w:color="A56341"/>
               <w:left w:val="none"/>
-              <w:bottom w:val="single" w:sz="12" w:space="0" w:color="102A43"/>
+              <w:bottom w:val="single" w:sz="12" w:space="0" w:color="A56341"/>
               <w:right w:val="none"/>
             </w:tcBorders>
           </w:tcPr>
@@ -2819,9 +3076,9 @@
               <w:right w:w="80" w:type="dxa"/>
             </w:tcMar>
             <w:tcBorders>
-              <w:top w:val="single" w:sz="12" w:space="0" w:color="102A43"/>
+              <w:top w:val="single" w:sz="12" w:space="0" w:color="A56341"/>
               <w:left w:val="none"/>
-              <w:bottom w:val="single" w:sz="12" w:space="0" w:color="102A43"/>
+              <w:bottom w:val="single" w:sz="12" w:space="0" w:color="A56341"/>
               <w:right w:val="none"/>
             </w:tcBorders>
           </w:tcPr>
@@ -2871,7 +3128,7 @@
         <w:rPr>
           <w:rFonts w:ascii="Arial" w:hAnsi="Arial"/>
           <w:b/>
-          <w:color w:val="B45309"/>
+          <w:color w:val="A56341"/>
           <w:sz w:val="21"/>
         </w:rPr>
         <w:t>5.1 Rincian HPP dan Margin Keuntungan Menu Kunci</w:t>
@@ -3049,7 +3306,7 @@
         <w:tc>
           <w:tcPr>
             <w:tcW w:type="dxa" w:w="2438"/>
-            <w:shd w:val="clear" w:color="auto" w:fill="F0F4F8"/>
+            <w:shd w:val="clear" w:color="auto" w:fill="FDF6F0"/>
             <w:tcMar>
               <w:top w:w="16" w:type="dxa"/>
               <w:bottom w:w="16" w:type="dxa"/>
@@ -3059,7 +3316,7 @@
             <w:tcBorders>
               <w:top w:val="none"/>
               <w:left w:val="none"/>
-              <w:bottom w:val="single" w:sz="4" w:space="0" w:color="D9E2EC"/>
+              <w:bottom w:val="single" w:sz="4" w:space="0" w:color="E2D8CE"/>
               <w:right w:val="none"/>
             </w:tcBorders>
           </w:tcPr>
@@ -3081,7 +3338,7 @@
         <w:tc>
           <w:tcPr>
             <w:tcW w:type="dxa" w:w="3175"/>
-            <w:shd w:val="clear" w:color="auto" w:fill="F0F4F8"/>
+            <w:shd w:val="clear" w:color="auto" w:fill="FDF6F0"/>
             <w:tcMar>
               <w:top w:w="16" w:type="dxa"/>
               <w:bottom w:w="16" w:type="dxa"/>
@@ -3091,7 +3348,7 @@
             <w:tcBorders>
               <w:top w:val="none"/>
               <w:left w:val="none"/>
-              <w:bottom w:val="single" w:sz="4" w:space="0" w:color="D9E2EC"/>
+              <w:bottom w:val="single" w:sz="4" w:space="0" w:color="E2D8CE"/>
               <w:right w:val="none"/>
             </w:tcBorders>
           </w:tcPr>
@@ -3112,7 +3369,7 @@
         <w:tc>
           <w:tcPr>
             <w:tcW w:type="dxa" w:w="1247"/>
-            <w:shd w:val="clear" w:color="auto" w:fill="F0F4F8"/>
+            <w:shd w:val="clear" w:color="auto" w:fill="FDF6F0"/>
             <w:tcMar>
               <w:top w:w="16" w:type="dxa"/>
               <w:bottom w:w="16" w:type="dxa"/>
@@ -3122,7 +3379,7 @@
             <w:tcBorders>
               <w:top w:val="none"/>
               <w:left w:val="none"/>
-              <w:bottom w:val="single" w:sz="4" w:space="0" w:color="D9E2EC"/>
+              <w:bottom w:val="single" w:sz="4" w:space="0" w:color="E2D8CE"/>
               <w:right w:val="none"/>
             </w:tcBorders>
           </w:tcPr>
@@ -3143,7 +3400,7 @@
         <w:tc>
           <w:tcPr>
             <w:tcW w:type="dxa" w:w="1247"/>
-            <w:shd w:val="clear" w:color="auto" w:fill="F0F4F8"/>
+            <w:shd w:val="clear" w:color="auto" w:fill="FDF6F0"/>
             <w:tcMar>
               <w:top w:w="16" w:type="dxa"/>
               <w:bottom w:w="16" w:type="dxa"/>
@@ -3153,7 +3410,7 @@
             <w:tcBorders>
               <w:top w:val="none"/>
               <w:left w:val="none"/>
-              <w:bottom w:val="single" w:sz="4" w:space="0" w:color="D9E2EC"/>
+              <w:bottom w:val="single" w:sz="4" w:space="0" w:color="E2D8CE"/>
               <w:right w:val="none"/>
             </w:tcBorders>
           </w:tcPr>
@@ -3174,7 +3431,7 @@
         <w:tc>
           <w:tcPr>
             <w:tcW w:type="dxa" w:w="1587"/>
-            <w:shd w:val="clear" w:color="auto" w:fill="F0F4F8"/>
+            <w:shd w:val="clear" w:color="auto" w:fill="FDF6F0"/>
             <w:tcMar>
               <w:top w:w="16" w:type="dxa"/>
               <w:bottom w:w="16" w:type="dxa"/>
@@ -3184,7 +3441,7 @@
             <w:tcBorders>
               <w:top w:val="none"/>
               <w:left w:val="none"/>
-              <w:bottom w:val="single" w:sz="4" w:space="0" w:color="D9E2EC"/>
+              <w:bottom w:val="single" w:sz="4" w:space="0" w:color="E2D8CE"/>
               <w:right w:val="none"/>
             </w:tcBorders>
           </w:tcPr>
@@ -3221,7 +3478,7 @@
             <w:tcBorders>
               <w:top w:val="none"/>
               <w:left w:val="none"/>
-              <w:bottom w:val="single" w:sz="4" w:space="0" w:color="D9E2EC"/>
+              <w:bottom w:val="single" w:sz="4" w:space="0" w:color="E2D8CE"/>
               <w:right w:val="none"/>
             </w:tcBorders>
           </w:tcPr>
@@ -3253,7 +3510,7 @@
             <w:tcBorders>
               <w:top w:val="none"/>
               <w:left w:val="none"/>
-              <w:bottom w:val="single" w:sz="4" w:space="0" w:color="D9E2EC"/>
+              <w:bottom w:val="single" w:sz="4" w:space="0" w:color="E2D8CE"/>
               <w:right w:val="none"/>
             </w:tcBorders>
           </w:tcPr>
@@ -3284,7 +3541,7 @@
             <w:tcBorders>
               <w:top w:val="none"/>
               <w:left w:val="none"/>
-              <w:bottom w:val="single" w:sz="4" w:space="0" w:color="D9E2EC"/>
+              <w:bottom w:val="single" w:sz="4" w:space="0" w:color="E2D8CE"/>
               <w:right w:val="none"/>
             </w:tcBorders>
           </w:tcPr>
@@ -3315,7 +3572,7 @@
             <w:tcBorders>
               <w:top w:val="none"/>
               <w:left w:val="none"/>
-              <w:bottom w:val="single" w:sz="4" w:space="0" w:color="D9E2EC"/>
+              <w:bottom w:val="single" w:sz="4" w:space="0" w:color="E2D8CE"/>
               <w:right w:val="none"/>
             </w:tcBorders>
           </w:tcPr>
@@ -3346,7 +3603,7 @@
             <w:tcBorders>
               <w:top w:val="none"/>
               <w:left w:val="none"/>
-              <w:bottom w:val="single" w:sz="4" w:space="0" w:color="D9E2EC"/>
+              <w:bottom w:val="single" w:sz="4" w:space="0" w:color="E2D8CE"/>
               <w:right w:val="none"/>
             </w:tcBorders>
           </w:tcPr>
@@ -3373,7 +3630,7 @@
         <w:tc>
           <w:tcPr>
             <w:tcW w:type="dxa" w:w="2438"/>
-            <w:shd w:val="clear" w:color="auto" w:fill="F0F4F8"/>
+            <w:shd w:val="clear" w:color="auto" w:fill="FDF6F0"/>
             <w:tcMar>
               <w:top w:w="16" w:type="dxa"/>
               <w:bottom w:w="16" w:type="dxa"/>
@@ -3383,7 +3640,7 @@
             <w:tcBorders>
               <w:top w:val="none"/>
               <w:left w:val="none"/>
-              <w:bottom w:val="single" w:sz="4" w:space="0" w:color="D9E2EC"/>
+              <w:bottom w:val="single" w:sz="4" w:space="0" w:color="E2D8CE"/>
               <w:right w:val="none"/>
             </w:tcBorders>
           </w:tcPr>
@@ -3405,7 +3662,7 @@
         <w:tc>
           <w:tcPr>
             <w:tcW w:type="dxa" w:w="3175"/>
-            <w:shd w:val="clear" w:color="auto" w:fill="F0F4F8"/>
+            <w:shd w:val="clear" w:color="auto" w:fill="FDF6F0"/>
             <w:tcMar>
               <w:top w:w="16" w:type="dxa"/>
               <w:bottom w:w="16" w:type="dxa"/>
@@ -3415,7 +3672,7 @@
             <w:tcBorders>
               <w:top w:val="none"/>
               <w:left w:val="none"/>
-              <w:bottom w:val="single" w:sz="4" w:space="0" w:color="D9E2EC"/>
+              <w:bottom w:val="single" w:sz="4" w:space="0" w:color="E2D8CE"/>
               <w:right w:val="none"/>
             </w:tcBorders>
           </w:tcPr>
@@ -3436,7 +3693,7 @@
         <w:tc>
           <w:tcPr>
             <w:tcW w:type="dxa" w:w="1247"/>
-            <w:shd w:val="clear" w:color="auto" w:fill="F0F4F8"/>
+            <w:shd w:val="clear" w:color="auto" w:fill="FDF6F0"/>
             <w:tcMar>
               <w:top w:w="16" w:type="dxa"/>
               <w:bottom w:w="16" w:type="dxa"/>
@@ -3446,7 +3703,7 @@
             <w:tcBorders>
               <w:top w:val="none"/>
               <w:left w:val="none"/>
-              <w:bottom w:val="single" w:sz="4" w:space="0" w:color="D9E2EC"/>
+              <w:bottom w:val="single" w:sz="4" w:space="0" w:color="E2D8CE"/>
               <w:right w:val="none"/>
             </w:tcBorders>
           </w:tcPr>
@@ -3467,7 +3724,7 @@
         <w:tc>
           <w:tcPr>
             <w:tcW w:type="dxa" w:w="1247"/>
-            <w:shd w:val="clear" w:color="auto" w:fill="F0F4F8"/>
+            <w:shd w:val="clear" w:color="auto" w:fill="FDF6F0"/>
             <w:tcMar>
               <w:top w:w="16" w:type="dxa"/>
               <w:bottom w:w="16" w:type="dxa"/>
@@ -3477,7 +3734,7 @@
             <w:tcBorders>
               <w:top w:val="none"/>
               <w:left w:val="none"/>
-              <w:bottom w:val="single" w:sz="4" w:space="0" w:color="D9E2EC"/>
+              <w:bottom w:val="single" w:sz="4" w:space="0" w:color="E2D8CE"/>
               <w:right w:val="none"/>
             </w:tcBorders>
           </w:tcPr>
@@ -3498,7 +3755,7 @@
         <w:tc>
           <w:tcPr>
             <w:tcW w:type="dxa" w:w="1587"/>
-            <w:shd w:val="clear" w:color="auto" w:fill="F0F4F8"/>
+            <w:shd w:val="clear" w:color="auto" w:fill="FDF6F0"/>
             <w:tcMar>
               <w:top w:w="16" w:type="dxa"/>
               <w:bottom w:w="16" w:type="dxa"/>
@@ -3508,7 +3765,7 @@
             <w:tcBorders>
               <w:top w:val="none"/>
               <w:left w:val="none"/>
-              <w:bottom w:val="single" w:sz="4" w:space="0" w:color="D9E2EC"/>
+              <w:bottom w:val="single" w:sz="4" w:space="0" w:color="E2D8CE"/>
               <w:right w:val="none"/>
             </w:tcBorders>
           </w:tcPr>
@@ -3545,7 +3802,7 @@
             <w:tcBorders>
               <w:top w:val="none"/>
               <w:left w:val="none"/>
-              <w:bottom w:val="single" w:sz="4" w:space="0" w:color="D9E2EC"/>
+              <w:bottom w:val="single" w:sz="4" w:space="0" w:color="E2D8CE"/>
               <w:right w:val="none"/>
             </w:tcBorders>
           </w:tcPr>
@@ -3577,7 +3834,7 @@
             <w:tcBorders>
               <w:top w:val="none"/>
               <w:left w:val="none"/>
-              <w:bottom w:val="single" w:sz="4" w:space="0" w:color="D9E2EC"/>
+              <w:bottom w:val="single" w:sz="4" w:space="0" w:color="E2D8CE"/>
               <w:right w:val="none"/>
             </w:tcBorders>
           </w:tcPr>
@@ -3608,7 +3865,7 @@
             <w:tcBorders>
               <w:top w:val="none"/>
               <w:left w:val="none"/>
-              <w:bottom w:val="single" w:sz="4" w:space="0" w:color="D9E2EC"/>
+              <w:bottom w:val="single" w:sz="4" w:space="0" w:color="E2D8CE"/>
               <w:right w:val="none"/>
             </w:tcBorders>
           </w:tcPr>
@@ -3639,7 +3896,7 @@
             <w:tcBorders>
               <w:top w:val="none"/>
               <w:left w:val="none"/>
-              <w:bottom w:val="single" w:sz="4" w:space="0" w:color="D9E2EC"/>
+              <w:bottom w:val="single" w:sz="4" w:space="0" w:color="E2D8CE"/>
               <w:right w:val="none"/>
             </w:tcBorders>
           </w:tcPr>
@@ -3670,7 +3927,7 @@
             <w:tcBorders>
               <w:top w:val="none"/>
               <w:left w:val="none"/>
-              <w:bottom w:val="single" w:sz="4" w:space="0" w:color="D9E2EC"/>
+              <w:bottom w:val="single" w:sz="4" w:space="0" w:color="E2D8CE"/>
               <w:right w:val="none"/>
             </w:tcBorders>
           </w:tcPr>
@@ -3697,7 +3954,7 @@
         <w:tc>
           <w:tcPr>
             <w:tcW w:type="dxa" w:w="2438"/>
-            <w:shd w:val="clear" w:color="auto" w:fill="F0F4F8"/>
+            <w:shd w:val="clear" w:color="auto" w:fill="FDF6F0"/>
             <w:tcMar>
               <w:top w:w="16" w:type="dxa"/>
               <w:bottom w:w="16" w:type="dxa"/>
@@ -3707,7 +3964,7 @@
             <w:tcBorders>
               <w:top w:val="none"/>
               <w:left w:val="none"/>
-              <w:bottom w:val="single" w:sz="4" w:space="0" w:color="D9E2EC"/>
+              <w:bottom w:val="single" w:sz="4" w:space="0" w:color="E2D8CE"/>
               <w:right w:val="none"/>
             </w:tcBorders>
           </w:tcPr>
@@ -3729,7 +3986,7 @@
         <w:tc>
           <w:tcPr>
             <w:tcW w:type="dxa" w:w="3175"/>
-            <w:shd w:val="clear" w:color="auto" w:fill="F0F4F8"/>
+            <w:shd w:val="clear" w:color="auto" w:fill="FDF6F0"/>
             <w:tcMar>
               <w:top w:w="16" w:type="dxa"/>
               <w:bottom w:w="16" w:type="dxa"/>
@@ -3739,7 +3996,7 @@
             <w:tcBorders>
               <w:top w:val="none"/>
               <w:left w:val="none"/>
-              <w:bottom w:val="single" w:sz="4" w:space="0" w:color="D9E2EC"/>
+              <w:bottom w:val="single" w:sz="4" w:space="0" w:color="E2D8CE"/>
               <w:right w:val="none"/>
             </w:tcBorders>
           </w:tcPr>
@@ -3760,7 +4017,7 @@
         <w:tc>
           <w:tcPr>
             <w:tcW w:type="dxa" w:w="1247"/>
-            <w:shd w:val="clear" w:color="auto" w:fill="F0F4F8"/>
+            <w:shd w:val="clear" w:color="auto" w:fill="FDF6F0"/>
             <w:tcMar>
               <w:top w:w="16" w:type="dxa"/>
               <w:bottom w:w="16" w:type="dxa"/>
@@ -3770,7 +4027,7 @@
             <w:tcBorders>
               <w:top w:val="none"/>
               <w:left w:val="none"/>
-              <w:bottom w:val="single" w:sz="4" w:space="0" w:color="D9E2EC"/>
+              <w:bottom w:val="single" w:sz="4" w:space="0" w:color="E2D8CE"/>
               <w:right w:val="none"/>
             </w:tcBorders>
           </w:tcPr>
@@ -3791,7 +4048,7 @@
         <w:tc>
           <w:tcPr>
             <w:tcW w:type="dxa" w:w="1247"/>
-            <w:shd w:val="clear" w:color="auto" w:fill="F0F4F8"/>
+            <w:shd w:val="clear" w:color="auto" w:fill="FDF6F0"/>
             <w:tcMar>
               <w:top w:w="16" w:type="dxa"/>
               <w:bottom w:w="16" w:type="dxa"/>
@@ -3801,7 +4058,7 @@
             <w:tcBorders>
               <w:top w:val="none"/>
               <w:left w:val="none"/>
-              <w:bottom w:val="single" w:sz="4" w:space="0" w:color="D9E2EC"/>
+              <w:bottom w:val="single" w:sz="4" w:space="0" w:color="E2D8CE"/>
               <w:right w:val="none"/>
             </w:tcBorders>
           </w:tcPr>
@@ -3822,7 +4079,7 @@
         <w:tc>
           <w:tcPr>
             <w:tcW w:type="dxa" w:w="1587"/>
-            <w:shd w:val="clear" w:color="auto" w:fill="F0F4F8"/>
+            <w:shd w:val="clear" w:color="auto" w:fill="FDF6F0"/>
             <w:tcMar>
               <w:top w:w="16" w:type="dxa"/>
               <w:bottom w:w="16" w:type="dxa"/>
@@ -3832,7 +4089,7 @@
             <w:tcBorders>
               <w:top w:val="none"/>
               <w:left w:val="none"/>
-              <w:bottom w:val="single" w:sz="4" w:space="0" w:color="D9E2EC"/>
+              <w:bottom w:val="single" w:sz="4" w:space="0" w:color="E2D8CE"/>
               <w:right w:val="none"/>
             </w:tcBorders>
           </w:tcPr>
@@ -3869,7 +4126,7 @@
             <w:tcBorders>
               <w:top w:val="none"/>
               <w:left w:val="none"/>
-              <w:bottom w:val="single" w:sz="4" w:space="0" w:color="D9E2EC"/>
+              <w:bottom w:val="single" w:sz="4" w:space="0" w:color="E2D8CE"/>
               <w:right w:val="none"/>
             </w:tcBorders>
           </w:tcPr>
@@ -3901,7 +4158,7 @@
             <w:tcBorders>
               <w:top w:val="none"/>
               <w:left w:val="none"/>
-              <w:bottom w:val="single" w:sz="4" w:space="0" w:color="D9E2EC"/>
+              <w:bottom w:val="single" w:sz="4" w:space="0" w:color="E2D8CE"/>
               <w:right w:val="none"/>
             </w:tcBorders>
           </w:tcPr>
@@ -3932,7 +4189,7 @@
             <w:tcBorders>
               <w:top w:val="none"/>
               <w:left w:val="none"/>
-              <w:bottom w:val="single" w:sz="4" w:space="0" w:color="D9E2EC"/>
+              <w:bottom w:val="single" w:sz="4" w:space="0" w:color="E2D8CE"/>
               <w:right w:val="none"/>
             </w:tcBorders>
           </w:tcPr>
@@ -3963,7 +4220,7 @@
             <w:tcBorders>
               <w:top w:val="none"/>
               <w:left w:val="none"/>
-              <w:bottom w:val="single" w:sz="4" w:space="0" w:color="D9E2EC"/>
+              <w:bottom w:val="single" w:sz="4" w:space="0" w:color="E2D8CE"/>
               <w:right w:val="none"/>
             </w:tcBorders>
           </w:tcPr>
@@ -3994,7 +4251,7 @@
             <w:tcBorders>
               <w:top w:val="none"/>
               <w:left w:val="none"/>
-              <w:bottom w:val="single" w:sz="4" w:space="0" w:color="D9E2EC"/>
+              <w:bottom w:val="single" w:sz="4" w:space="0" w:color="E2D8CE"/>
               <w:right w:val="none"/>
             </w:tcBorders>
           </w:tcPr>
@@ -4021,7 +4278,7 @@
         <w:tc>
           <w:tcPr>
             <w:tcW w:type="dxa" w:w="2438"/>
-            <w:shd w:val="clear" w:color="auto" w:fill="F0F4F8"/>
+            <w:shd w:val="clear" w:color="auto" w:fill="FDF6F0"/>
             <w:tcMar>
               <w:top w:w="16" w:type="dxa"/>
               <w:bottom w:w="16" w:type="dxa"/>
@@ -4031,7 +4288,7 @@
             <w:tcBorders>
               <w:top w:val="none"/>
               <w:left w:val="none"/>
-              <w:bottom w:val="single" w:sz="4" w:space="0" w:color="D9E2EC"/>
+              <w:bottom w:val="single" w:sz="4" w:space="0" w:color="E2D8CE"/>
               <w:right w:val="none"/>
             </w:tcBorders>
           </w:tcPr>
@@ -4053,7 +4310,7 @@
         <w:tc>
           <w:tcPr>
             <w:tcW w:type="dxa" w:w="3175"/>
-            <w:shd w:val="clear" w:color="auto" w:fill="F0F4F8"/>
+            <w:shd w:val="clear" w:color="auto" w:fill="FDF6F0"/>
             <w:tcMar>
               <w:top w:w="16" w:type="dxa"/>
               <w:bottom w:w="16" w:type="dxa"/>
@@ -4063,7 +4320,7 @@
             <w:tcBorders>
               <w:top w:val="none"/>
               <w:left w:val="none"/>
-              <w:bottom w:val="single" w:sz="4" w:space="0" w:color="D9E2EC"/>
+              <w:bottom w:val="single" w:sz="4" w:space="0" w:color="E2D8CE"/>
               <w:right w:val="none"/>
             </w:tcBorders>
           </w:tcPr>
@@ -4084,7 +4341,7 @@
         <w:tc>
           <w:tcPr>
             <w:tcW w:type="dxa" w:w="1247"/>
-            <w:shd w:val="clear" w:color="auto" w:fill="F0F4F8"/>
+            <w:shd w:val="clear" w:color="auto" w:fill="FDF6F0"/>
             <w:tcMar>
               <w:top w:w="16" w:type="dxa"/>
               <w:bottom w:w="16" w:type="dxa"/>
@@ -4094,7 +4351,7 @@
             <w:tcBorders>
               <w:top w:val="none"/>
               <w:left w:val="none"/>
-              <w:bottom w:val="single" w:sz="4" w:space="0" w:color="D9E2EC"/>
+              <w:bottom w:val="single" w:sz="4" w:space="0" w:color="E2D8CE"/>
               <w:right w:val="none"/>
             </w:tcBorders>
           </w:tcPr>
@@ -4115,7 +4372,7 @@
         <w:tc>
           <w:tcPr>
             <w:tcW w:type="dxa" w:w="1247"/>
-            <w:shd w:val="clear" w:color="auto" w:fill="F0F4F8"/>
+            <w:shd w:val="clear" w:color="auto" w:fill="FDF6F0"/>
             <w:tcMar>
               <w:top w:w="16" w:type="dxa"/>
               <w:bottom w:w="16" w:type="dxa"/>
@@ -4125,7 +4382,7 @@
             <w:tcBorders>
               <w:top w:val="none"/>
               <w:left w:val="none"/>
-              <w:bottom w:val="single" w:sz="4" w:space="0" w:color="D9E2EC"/>
+              <w:bottom w:val="single" w:sz="4" w:space="0" w:color="E2D8CE"/>
               <w:right w:val="none"/>
             </w:tcBorders>
           </w:tcPr>
@@ -4146,7 +4403,7 @@
         <w:tc>
           <w:tcPr>
             <w:tcW w:type="dxa" w:w="1587"/>
-            <w:shd w:val="clear" w:color="auto" w:fill="F0F4F8"/>
+            <w:shd w:val="clear" w:color="auto" w:fill="FDF6F0"/>
             <w:tcMar>
               <w:top w:w="16" w:type="dxa"/>
               <w:bottom w:w="16" w:type="dxa"/>
@@ -4156,7 +4413,7 @@
             <w:tcBorders>
               <w:top w:val="none"/>
               <w:left w:val="none"/>
-              <w:bottom w:val="single" w:sz="4" w:space="0" w:color="D9E2EC"/>
+              <w:bottom w:val="single" w:sz="4" w:space="0" w:color="E2D8CE"/>
               <w:right w:val="none"/>
             </w:tcBorders>
           </w:tcPr>
@@ -4193,7 +4450,7 @@
             <w:tcBorders>
               <w:top w:val="none"/>
               <w:left w:val="none"/>
-              <w:bottom w:val="single" w:sz="4" w:space="0" w:color="D9E2EC"/>
+              <w:bottom w:val="single" w:sz="4" w:space="0" w:color="E2D8CE"/>
               <w:right w:val="none"/>
             </w:tcBorders>
           </w:tcPr>
@@ -4225,7 +4482,7 @@
             <w:tcBorders>
               <w:top w:val="none"/>
               <w:left w:val="none"/>
-              <w:bottom w:val="single" w:sz="4" w:space="0" w:color="D9E2EC"/>
+              <w:bottom w:val="single" w:sz="4" w:space="0" w:color="E2D8CE"/>
               <w:right w:val="none"/>
             </w:tcBorders>
           </w:tcPr>
@@ -4256,7 +4513,7 @@
             <w:tcBorders>
               <w:top w:val="none"/>
               <w:left w:val="none"/>
-              <w:bottom w:val="single" w:sz="4" w:space="0" w:color="D9E2EC"/>
+              <w:bottom w:val="single" w:sz="4" w:space="0" w:color="E2D8CE"/>
               <w:right w:val="none"/>
             </w:tcBorders>
           </w:tcPr>
@@ -4287,7 +4544,7 @@
             <w:tcBorders>
               <w:top w:val="none"/>
               <w:left w:val="none"/>
-              <w:bottom w:val="single" w:sz="4" w:space="0" w:color="D9E2EC"/>
+              <w:bottom w:val="single" w:sz="4" w:space="0" w:color="E2D8CE"/>
               <w:right w:val="none"/>
             </w:tcBorders>
           </w:tcPr>
@@ -4318,7 +4575,7 @@
             <w:tcBorders>
               <w:top w:val="none"/>
               <w:left w:val="none"/>
-              <w:bottom w:val="single" w:sz="4" w:space="0" w:color="D9E2EC"/>
+              <w:bottom w:val="single" w:sz="4" w:space="0" w:color="E2D8CE"/>
               <w:right w:val="none"/>
             </w:tcBorders>
           </w:tcPr>
@@ -4345,7 +4602,7 @@
         <w:tc>
           <w:tcPr>
             <w:tcW w:type="dxa" w:w="2438"/>
-            <w:shd w:val="clear" w:color="auto" w:fill="F0F4F8"/>
+            <w:shd w:val="clear" w:color="auto" w:fill="FDF6F0"/>
             <w:tcMar>
               <w:top w:w="16" w:type="dxa"/>
               <w:bottom w:w="16" w:type="dxa"/>
@@ -4355,7 +4612,7 @@
             <w:tcBorders>
               <w:top w:val="none"/>
               <w:left w:val="none"/>
-              <w:bottom w:val="single" w:sz="4" w:space="0" w:color="D9E2EC"/>
+              <w:bottom w:val="single" w:sz="4" w:space="0" w:color="E2D8CE"/>
               <w:right w:val="none"/>
             </w:tcBorders>
           </w:tcPr>
@@ -4377,7 +4634,7 @@
         <w:tc>
           <w:tcPr>
             <w:tcW w:type="dxa" w:w="3175"/>
-            <w:shd w:val="clear" w:color="auto" w:fill="F0F4F8"/>
+            <w:shd w:val="clear" w:color="auto" w:fill="FDF6F0"/>
             <w:tcMar>
               <w:top w:w="16" w:type="dxa"/>
               <w:bottom w:w="16" w:type="dxa"/>
@@ -4387,7 +4644,7 @@
             <w:tcBorders>
               <w:top w:val="none"/>
               <w:left w:val="none"/>
-              <w:bottom w:val="single" w:sz="4" w:space="0" w:color="D9E2EC"/>
+              <w:bottom w:val="single" w:sz="4" w:space="0" w:color="E2D8CE"/>
               <w:right w:val="none"/>
             </w:tcBorders>
           </w:tcPr>
@@ -4408,7 +4665,7 @@
         <w:tc>
           <w:tcPr>
             <w:tcW w:type="dxa" w:w="1247"/>
-            <w:shd w:val="clear" w:color="auto" w:fill="F0F4F8"/>
+            <w:shd w:val="clear" w:color="auto" w:fill="FDF6F0"/>
             <w:tcMar>
               <w:top w:w="16" w:type="dxa"/>
               <w:bottom w:w="16" w:type="dxa"/>
@@ -4418,7 +4675,7 @@
             <w:tcBorders>
               <w:top w:val="none"/>
               <w:left w:val="none"/>
-              <w:bottom w:val="single" w:sz="4" w:space="0" w:color="D9E2EC"/>
+              <w:bottom w:val="single" w:sz="4" w:space="0" w:color="E2D8CE"/>
               <w:right w:val="none"/>
             </w:tcBorders>
           </w:tcPr>
@@ -4439,7 +4696,7 @@
         <w:tc>
           <w:tcPr>
             <w:tcW w:type="dxa" w:w="1247"/>
-            <w:shd w:val="clear" w:color="auto" w:fill="F0F4F8"/>
+            <w:shd w:val="clear" w:color="auto" w:fill="FDF6F0"/>
             <w:tcMar>
               <w:top w:w="16" w:type="dxa"/>
               <w:bottom w:w="16" w:type="dxa"/>
@@ -4449,7 +4706,7 @@
             <w:tcBorders>
               <w:top w:val="none"/>
               <w:left w:val="none"/>
-              <w:bottom w:val="single" w:sz="4" w:space="0" w:color="D9E2EC"/>
+              <w:bottom w:val="single" w:sz="4" w:space="0" w:color="E2D8CE"/>
               <w:right w:val="none"/>
             </w:tcBorders>
           </w:tcPr>
@@ -4470,7 +4727,7 @@
         <w:tc>
           <w:tcPr>
             <w:tcW w:type="dxa" w:w="1587"/>
-            <w:shd w:val="clear" w:color="auto" w:fill="F0F4F8"/>
+            <w:shd w:val="clear" w:color="auto" w:fill="FDF6F0"/>
             <w:tcMar>
               <w:top w:w="16" w:type="dxa"/>
               <w:bottom w:w="16" w:type="dxa"/>
@@ -4480,7 +4737,7 @@
             <w:tcBorders>
               <w:top w:val="none"/>
               <w:left w:val="none"/>
-              <w:bottom w:val="single" w:sz="4" w:space="0" w:color="D9E2EC"/>
+              <w:bottom w:val="single" w:sz="4" w:space="0" w:color="E2D8CE"/>
               <w:right w:val="none"/>
             </w:tcBorders>
           </w:tcPr>
@@ -4517,7 +4774,7 @@
             <w:tcBorders>
               <w:top w:val="none"/>
               <w:left w:val="none"/>
-              <w:bottom w:val="single" w:sz="4" w:space="0" w:color="D9E2EC"/>
+              <w:bottom w:val="single" w:sz="4" w:space="0" w:color="E2D8CE"/>
               <w:right w:val="none"/>
             </w:tcBorders>
           </w:tcPr>
@@ -4549,7 +4806,7 @@
             <w:tcBorders>
               <w:top w:val="none"/>
               <w:left w:val="none"/>
-              <w:bottom w:val="single" w:sz="4" w:space="0" w:color="D9E2EC"/>
+              <w:bottom w:val="single" w:sz="4" w:space="0" w:color="E2D8CE"/>
               <w:right w:val="none"/>
             </w:tcBorders>
           </w:tcPr>
@@ -4580,7 +4837,7 @@
             <w:tcBorders>
               <w:top w:val="none"/>
               <w:left w:val="none"/>
-              <w:bottom w:val="single" w:sz="4" w:space="0" w:color="D9E2EC"/>
+              <w:bottom w:val="single" w:sz="4" w:space="0" w:color="E2D8CE"/>
               <w:right w:val="none"/>
             </w:tcBorders>
           </w:tcPr>
@@ -4611,7 +4868,7 @@
             <w:tcBorders>
               <w:top w:val="none"/>
               <w:left w:val="none"/>
-              <w:bottom w:val="single" w:sz="4" w:space="0" w:color="D9E2EC"/>
+              <w:bottom w:val="single" w:sz="4" w:space="0" w:color="E2D8CE"/>
               <w:right w:val="none"/>
             </w:tcBorders>
           </w:tcPr>
@@ -4642,7 +4899,7 @@
             <w:tcBorders>
               <w:top w:val="none"/>
               <w:left w:val="none"/>
-              <w:bottom w:val="single" w:sz="4" w:space="0" w:color="D9E2EC"/>
+              <w:bottom w:val="single" w:sz="4" w:space="0" w:color="E2D8CE"/>
               <w:right w:val="none"/>
             </w:tcBorders>
           </w:tcPr>
@@ -4669,7 +4926,7 @@
         <w:tc>
           <w:tcPr>
             <w:tcW w:type="dxa" w:w="2438"/>
-            <w:shd w:val="clear" w:color="auto" w:fill="F0F4F8"/>
+            <w:shd w:val="clear" w:color="auto" w:fill="FDF6F0"/>
             <w:tcMar>
               <w:top w:w="16" w:type="dxa"/>
               <w:bottom w:w="16" w:type="dxa"/>
@@ -4679,7 +4936,7 @@
             <w:tcBorders>
               <w:top w:val="none"/>
               <w:left w:val="none"/>
-              <w:bottom w:val="single" w:sz="4" w:space="0" w:color="D9E2EC"/>
+              <w:bottom w:val="single" w:sz="4" w:space="0" w:color="E2D8CE"/>
               <w:right w:val="none"/>
             </w:tcBorders>
           </w:tcPr>
@@ -4701,7 +4958,7 @@
         <w:tc>
           <w:tcPr>
             <w:tcW w:type="dxa" w:w="3175"/>
-            <w:shd w:val="clear" w:color="auto" w:fill="F0F4F8"/>
+            <w:shd w:val="clear" w:color="auto" w:fill="FDF6F0"/>
             <w:tcMar>
               <w:top w:w="16" w:type="dxa"/>
               <w:bottom w:w="16" w:type="dxa"/>
@@ -4711,7 +4968,7 @@
             <w:tcBorders>
               <w:top w:val="none"/>
               <w:left w:val="none"/>
-              <w:bottom w:val="single" w:sz="4" w:space="0" w:color="D9E2EC"/>
+              <w:bottom w:val="single" w:sz="4" w:space="0" w:color="E2D8CE"/>
               <w:right w:val="none"/>
             </w:tcBorders>
           </w:tcPr>
@@ -4732,7 +4989,7 @@
         <w:tc>
           <w:tcPr>
             <w:tcW w:type="dxa" w:w="1247"/>
-            <w:shd w:val="clear" w:color="auto" w:fill="F0F4F8"/>
+            <w:shd w:val="clear" w:color="auto" w:fill="FDF6F0"/>
             <w:tcMar>
               <w:top w:w="16" w:type="dxa"/>
               <w:bottom w:w="16" w:type="dxa"/>
@@ -4742,7 +4999,7 @@
             <w:tcBorders>
               <w:top w:val="none"/>
               <w:left w:val="none"/>
-              <w:bottom w:val="single" w:sz="4" w:space="0" w:color="D9E2EC"/>
+              <w:bottom w:val="single" w:sz="4" w:space="0" w:color="E2D8CE"/>
               <w:right w:val="none"/>
             </w:tcBorders>
           </w:tcPr>
@@ -4763,7 +5020,7 @@
         <w:tc>
           <w:tcPr>
             <w:tcW w:type="dxa" w:w="1247"/>
-            <w:shd w:val="clear" w:color="auto" w:fill="F0F4F8"/>
+            <w:shd w:val="clear" w:color="auto" w:fill="FDF6F0"/>
             <w:tcMar>
               <w:top w:w="16" w:type="dxa"/>
               <w:bottom w:w="16" w:type="dxa"/>
@@ -4773,7 +5030,7 @@
             <w:tcBorders>
               <w:top w:val="none"/>
               <w:left w:val="none"/>
-              <w:bottom w:val="single" w:sz="4" w:space="0" w:color="D9E2EC"/>
+              <w:bottom w:val="single" w:sz="4" w:space="0" w:color="E2D8CE"/>
               <w:right w:val="none"/>
             </w:tcBorders>
           </w:tcPr>
@@ -4794,7 +5051,7 @@
         <w:tc>
           <w:tcPr>
             <w:tcW w:type="dxa" w:w="1587"/>
-            <w:shd w:val="clear" w:color="auto" w:fill="F0F4F8"/>
+            <w:shd w:val="clear" w:color="auto" w:fill="FDF6F0"/>
             <w:tcMar>
               <w:top w:w="16" w:type="dxa"/>
               <w:bottom w:w="16" w:type="dxa"/>
@@ -4804,7 +5061,7 @@
             <w:tcBorders>
               <w:top w:val="none"/>
               <w:left w:val="none"/>
-              <w:bottom w:val="single" w:sz="4" w:space="0" w:color="D9E2EC"/>
+              <w:bottom w:val="single" w:sz="4" w:space="0" w:color="E2D8CE"/>
               <w:right w:val="none"/>
             </w:tcBorders>
           </w:tcPr>
@@ -4841,7 +5098,7 @@
             <w:tcBorders>
               <w:top w:val="none"/>
               <w:left w:val="none"/>
-              <w:bottom w:val="single" w:sz="4" w:space="0" w:color="D9E2EC"/>
+              <w:bottom w:val="single" w:sz="4" w:space="0" w:color="E2D8CE"/>
               <w:right w:val="none"/>
             </w:tcBorders>
           </w:tcPr>
@@ -4873,7 +5130,7 @@
             <w:tcBorders>
               <w:top w:val="none"/>
               <w:left w:val="none"/>
-              <w:bottom w:val="single" w:sz="4" w:space="0" w:color="D9E2EC"/>
+              <w:bottom w:val="single" w:sz="4" w:space="0" w:color="E2D8CE"/>
               <w:right w:val="none"/>
             </w:tcBorders>
           </w:tcPr>
@@ -4904,7 +5161,7 @@
             <w:tcBorders>
               <w:top w:val="none"/>
               <w:left w:val="none"/>
-              <w:bottom w:val="single" w:sz="4" w:space="0" w:color="D9E2EC"/>
+              <w:bottom w:val="single" w:sz="4" w:space="0" w:color="E2D8CE"/>
               <w:right w:val="none"/>
             </w:tcBorders>
           </w:tcPr>
@@ -4935,7 +5192,7 @@
             <w:tcBorders>
               <w:top w:val="none"/>
               <w:left w:val="none"/>
-              <w:bottom w:val="single" w:sz="4" w:space="0" w:color="D9E2EC"/>
+              <w:bottom w:val="single" w:sz="4" w:space="0" w:color="E2D8CE"/>
               <w:right w:val="none"/>
             </w:tcBorders>
           </w:tcPr>
@@ -4966,7 +5223,7 @@
             <w:tcBorders>
               <w:top w:val="none"/>
               <w:left w:val="none"/>
-              <w:bottom w:val="single" w:sz="4" w:space="0" w:color="D9E2EC"/>
+              <w:bottom w:val="single" w:sz="4" w:space="0" w:color="E2D8CE"/>
               <w:right w:val="none"/>
             </w:tcBorders>
           </w:tcPr>
@@ -4996,7 +5253,7 @@
         <w:rPr>
           <w:rFonts w:ascii="Arial" w:hAnsi="Arial"/>
           <w:b/>
-          <w:color w:val="B45309"/>
+          <w:color w:val="A56341"/>
           <w:sz w:val="21"/>
         </w:rPr>
         <w:t>5.2 Proyeksi Kinerja Keuangan &amp; Waktu Balik Modal (BEP)</w:t>
@@ -5131,7 +5388,7 @@
         <w:tc>
           <w:tcPr>
             <w:tcW w:type="dxa" w:w="2891"/>
-            <w:shd w:val="clear" w:color="auto" w:fill="F0F4F8"/>
+            <w:shd w:val="clear" w:color="auto" w:fill="FDF6F0"/>
             <w:tcMar>
               <w:top w:w="18" w:type="dxa"/>
               <w:bottom w:w="18" w:type="dxa"/>
@@ -5141,7 +5398,7 @@
             <w:tcBorders>
               <w:top w:val="none"/>
               <w:left w:val="none"/>
-              <w:bottom w:val="single" w:sz="4" w:space="0" w:color="D9E2EC"/>
+              <w:bottom w:val="single" w:sz="4" w:space="0" w:color="E2D8CE"/>
               <w:right w:val="none"/>
             </w:tcBorders>
           </w:tcPr>
@@ -5163,7 +5420,7 @@
         <w:tc>
           <w:tcPr>
             <w:tcW w:type="dxa" w:w="2268"/>
-            <w:shd w:val="clear" w:color="auto" w:fill="F0F4F8"/>
+            <w:shd w:val="clear" w:color="auto" w:fill="FDF6F0"/>
             <w:tcMar>
               <w:top w:w="18" w:type="dxa"/>
               <w:bottom w:w="18" w:type="dxa"/>
@@ -5173,7 +5430,7 @@
             <w:tcBorders>
               <w:top w:val="none"/>
               <w:left w:val="none"/>
-              <w:bottom w:val="single" w:sz="4" w:space="0" w:color="D9E2EC"/>
+              <w:bottom w:val="single" w:sz="4" w:space="0" w:color="E2D8CE"/>
               <w:right w:val="none"/>
             </w:tcBorders>
           </w:tcPr>
@@ -5195,7 +5452,7 @@
         <w:tc>
           <w:tcPr>
             <w:tcW w:type="dxa" w:w="2268"/>
-            <w:shd w:val="clear" w:color="auto" w:fill="F0F4F8"/>
+            <w:shd w:val="clear" w:color="auto" w:fill="FDF6F0"/>
             <w:tcMar>
               <w:top w:w="18" w:type="dxa"/>
               <w:bottom w:w="18" w:type="dxa"/>
@@ -5205,7 +5462,7 @@
             <w:tcBorders>
               <w:top w:val="none"/>
               <w:left w:val="none"/>
-              <w:bottom w:val="single" w:sz="4" w:space="0" w:color="D9E2EC"/>
+              <w:bottom w:val="single" w:sz="4" w:space="0" w:color="E2D8CE"/>
               <w:right w:val="none"/>
             </w:tcBorders>
           </w:tcPr>
@@ -5227,7 +5484,7 @@
         <w:tc>
           <w:tcPr>
             <w:tcW w:type="dxa" w:w="2268"/>
-            <w:shd w:val="clear" w:color="auto" w:fill="F0F4F8"/>
+            <w:shd w:val="clear" w:color="auto" w:fill="FDF6F0"/>
             <w:tcMar>
               <w:top w:w="18" w:type="dxa"/>
               <w:bottom w:w="18" w:type="dxa"/>
@@ -5237,7 +5494,7 @@
             <w:tcBorders>
               <w:top w:val="none"/>
               <w:left w:val="none"/>
-              <w:bottom w:val="single" w:sz="4" w:space="0" w:color="D9E2EC"/>
+              <w:bottom w:val="single" w:sz="4" w:space="0" w:color="E2D8CE"/>
               <w:right w:val="none"/>
             </w:tcBorders>
           </w:tcPr>
@@ -5274,7 +5531,7 @@
             <w:tcBorders>
               <w:top w:val="none"/>
               <w:left w:val="none"/>
-              <w:bottom w:val="single" w:sz="4" w:space="0" w:color="D9E2EC"/>
+              <w:bottom w:val="single" w:sz="4" w:space="0" w:color="E2D8CE"/>
               <w:right w:val="none"/>
             </w:tcBorders>
           </w:tcPr>
@@ -5306,7 +5563,7 @@
             <w:tcBorders>
               <w:top w:val="none"/>
               <w:left w:val="none"/>
-              <w:bottom w:val="single" w:sz="4" w:space="0" w:color="D9E2EC"/>
+              <w:bottom w:val="single" w:sz="4" w:space="0" w:color="E2D8CE"/>
               <w:right w:val="none"/>
             </w:tcBorders>
           </w:tcPr>
@@ -5338,7 +5595,7 @@
             <w:tcBorders>
               <w:top w:val="none"/>
               <w:left w:val="none"/>
-              <w:bottom w:val="single" w:sz="4" w:space="0" w:color="D9E2EC"/>
+              <w:bottom w:val="single" w:sz="4" w:space="0" w:color="E2D8CE"/>
               <w:right w:val="none"/>
             </w:tcBorders>
           </w:tcPr>
@@ -5370,7 +5627,7 @@
             <w:tcBorders>
               <w:top w:val="none"/>
               <w:left w:val="none"/>
-              <w:bottom w:val="single" w:sz="4" w:space="0" w:color="D9E2EC"/>
+              <w:bottom w:val="single" w:sz="4" w:space="0" w:color="E2D8CE"/>
               <w:right w:val="none"/>
             </w:tcBorders>
           </w:tcPr>
@@ -5397,7 +5654,7 @@
         <w:tc>
           <w:tcPr>
             <w:tcW w:type="dxa" w:w="2891"/>
-            <w:shd w:val="clear" w:color="auto" w:fill="F0F4F8"/>
+            <w:shd w:val="clear" w:color="auto" w:fill="FDF6F0"/>
             <w:tcMar>
               <w:top w:w="18" w:type="dxa"/>
               <w:bottom w:w="18" w:type="dxa"/>
@@ -5407,7 +5664,7 @@
             <w:tcBorders>
               <w:top w:val="none"/>
               <w:left w:val="none"/>
-              <w:bottom w:val="single" w:sz="4" w:space="0" w:color="D9E2EC"/>
+              <w:bottom w:val="single" w:sz="4" w:space="0" w:color="E2D8CE"/>
               <w:right w:val="none"/>
             </w:tcBorders>
           </w:tcPr>
@@ -5429,7 +5686,7 @@
         <w:tc>
           <w:tcPr>
             <w:tcW w:type="dxa" w:w="2268"/>
-            <w:shd w:val="clear" w:color="auto" w:fill="F0F4F8"/>
+            <w:shd w:val="clear" w:color="auto" w:fill="FDF6F0"/>
             <w:tcMar>
               <w:top w:w="18" w:type="dxa"/>
               <w:bottom w:w="18" w:type="dxa"/>
@@ -5439,7 +5696,7 @@
             <w:tcBorders>
               <w:top w:val="none"/>
               <w:left w:val="none"/>
-              <w:bottom w:val="single" w:sz="4" w:space="0" w:color="D9E2EC"/>
+              <w:bottom w:val="single" w:sz="4" w:space="0" w:color="E2D8CE"/>
               <w:right w:val="none"/>
             </w:tcBorders>
           </w:tcPr>
@@ -5461,7 +5718,7 @@
         <w:tc>
           <w:tcPr>
             <w:tcW w:type="dxa" w:w="2268"/>
-            <w:shd w:val="clear" w:color="auto" w:fill="F0F4F8"/>
+            <w:shd w:val="clear" w:color="auto" w:fill="FDF6F0"/>
             <w:tcMar>
               <w:top w:w="18" w:type="dxa"/>
               <w:bottom w:w="18" w:type="dxa"/>
@@ -5471,7 +5728,7 @@
             <w:tcBorders>
               <w:top w:val="none"/>
               <w:left w:val="none"/>
-              <w:bottom w:val="single" w:sz="4" w:space="0" w:color="D9E2EC"/>
+              <w:bottom w:val="single" w:sz="4" w:space="0" w:color="E2D8CE"/>
               <w:right w:val="none"/>
             </w:tcBorders>
           </w:tcPr>
@@ -5493,7 +5750,7 @@
         <w:tc>
           <w:tcPr>
             <w:tcW w:type="dxa" w:w="2268"/>
-            <w:shd w:val="clear" w:color="auto" w:fill="F0F4F8"/>
+            <w:shd w:val="clear" w:color="auto" w:fill="FDF6F0"/>
             <w:tcMar>
               <w:top w:w="18" w:type="dxa"/>
               <w:bottom w:w="18" w:type="dxa"/>
@@ -5503,7 +5760,7 @@
             <w:tcBorders>
               <w:top w:val="none"/>
               <w:left w:val="none"/>
-              <w:bottom w:val="single" w:sz="4" w:space="0" w:color="D9E2EC"/>
+              <w:bottom w:val="single" w:sz="4" w:space="0" w:color="E2D8CE"/>
               <w:right w:val="none"/>
             </w:tcBorders>
           </w:tcPr>
@@ -5540,7 +5797,7 @@
             <w:tcBorders>
               <w:top w:val="none"/>
               <w:left w:val="none"/>
-              <w:bottom w:val="single" w:sz="4" w:space="0" w:color="D9E2EC"/>
+              <w:bottom w:val="single" w:sz="4" w:space="0" w:color="E2D8CE"/>
               <w:right w:val="none"/>
             </w:tcBorders>
           </w:tcPr>
@@ -5572,7 +5829,7 @@
             <w:tcBorders>
               <w:top w:val="none"/>
               <w:left w:val="none"/>
-              <w:bottom w:val="single" w:sz="4" w:space="0" w:color="D9E2EC"/>
+              <w:bottom w:val="single" w:sz="4" w:space="0" w:color="E2D8CE"/>
               <w:right w:val="none"/>
             </w:tcBorders>
           </w:tcPr>
@@ -5604,7 +5861,7 @@
             <w:tcBorders>
               <w:top w:val="none"/>
               <w:left w:val="none"/>
-              <w:bottom w:val="single" w:sz="4" w:space="0" w:color="D9E2EC"/>
+              <w:bottom w:val="single" w:sz="4" w:space="0" w:color="E2D8CE"/>
               <w:right w:val="none"/>
             </w:tcBorders>
           </w:tcPr>
@@ -5636,7 +5893,7 @@
             <w:tcBorders>
               <w:top w:val="none"/>
               <w:left w:val="none"/>
-              <w:bottom w:val="single" w:sz="4" w:space="0" w:color="D9E2EC"/>
+              <w:bottom w:val="single" w:sz="4" w:space="0" w:color="E2D8CE"/>
               <w:right w:val="none"/>
             </w:tcBorders>
           </w:tcPr>
@@ -5663,7 +5920,7 @@
         <w:tc>
           <w:tcPr>
             <w:tcW w:type="dxa" w:w="2891"/>
-            <w:shd w:val="clear" w:color="auto" w:fill="F0F4F8"/>
+            <w:shd w:val="clear" w:color="auto" w:fill="FDF6F0"/>
             <w:tcMar>
               <w:top w:w="18" w:type="dxa"/>
               <w:bottom w:w="18" w:type="dxa"/>
@@ -5673,7 +5930,7 @@
             <w:tcBorders>
               <w:top w:val="none"/>
               <w:left w:val="none"/>
-              <w:bottom w:val="single" w:sz="4" w:space="0" w:color="D9E2EC"/>
+              <w:bottom w:val="single" w:sz="4" w:space="0" w:color="E2D8CE"/>
               <w:right w:val="none"/>
             </w:tcBorders>
           </w:tcPr>
@@ -5695,7 +5952,7 @@
         <w:tc>
           <w:tcPr>
             <w:tcW w:type="dxa" w:w="2268"/>
-            <w:shd w:val="clear" w:color="auto" w:fill="F0F4F8"/>
+            <w:shd w:val="clear" w:color="auto" w:fill="FDF6F0"/>
             <w:tcMar>
               <w:top w:w="18" w:type="dxa"/>
               <w:bottom w:w="18" w:type="dxa"/>
@@ -5705,7 +5962,7 @@
             <w:tcBorders>
               <w:top w:val="none"/>
               <w:left w:val="none"/>
-              <w:bottom w:val="single" w:sz="4" w:space="0" w:color="D9E2EC"/>
+              <w:bottom w:val="single" w:sz="4" w:space="0" w:color="E2D8CE"/>
               <w:right w:val="none"/>
             </w:tcBorders>
           </w:tcPr>
@@ -5727,7 +5984,7 @@
         <w:tc>
           <w:tcPr>
             <w:tcW w:type="dxa" w:w="2268"/>
-            <w:shd w:val="clear" w:color="auto" w:fill="F0F4F8"/>
+            <w:shd w:val="clear" w:color="auto" w:fill="FDF6F0"/>
             <w:tcMar>
               <w:top w:w="18" w:type="dxa"/>
               <w:bottom w:w="18" w:type="dxa"/>
@@ -5737,7 +5994,7 @@
             <w:tcBorders>
               <w:top w:val="none"/>
               <w:left w:val="none"/>
-              <w:bottom w:val="single" w:sz="4" w:space="0" w:color="D9E2EC"/>
+              <w:bottom w:val="single" w:sz="4" w:space="0" w:color="E2D8CE"/>
               <w:right w:val="none"/>
             </w:tcBorders>
           </w:tcPr>
@@ -5759,7 +6016,7 @@
         <w:tc>
           <w:tcPr>
             <w:tcW w:type="dxa" w:w="2268"/>
-            <w:shd w:val="clear" w:color="auto" w:fill="F0F4F8"/>
+            <w:shd w:val="clear" w:color="auto" w:fill="FDF6F0"/>
             <w:tcMar>
               <w:top w:w="18" w:type="dxa"/>
               <w:bottom w:w="18" w:type="dxa"/>
@@ -5769,7 +6026,7 @@
             <w:tcBorders>
               <w:top w:val="none"/>
               <w:left w:val="none"/>
-              <w:bottom w:val="single" w:sz="4" w:space="0" w:color="D9E2EC"/>
+              <w:bottom w:val="single" w:sz="4" w:space="0" w:color="E2D8CE"/>
               <w:right w:val="none"/>
             </w:tcBorders>
           </w:tcPr>
@@ -5806,7 +6063,7 @@
             <w:tcBorders>
               <w:top w:val="none"/>
               <w:left w:val="none"/>
-              <w:bottom w:val="single" w:sz="4" w:space="0" w:color="D9E2EC"/>
+              <w:bottom w:val="single" w:sz="4" w:space="0" w:color="E2D8CE"/>
               <w:right w:val="none"/>
             </w:tcBorders>
           </w:tcPr>
@@ -5838,7 +6095,7 @@
             <w:tcBorders>
               <w:top w:val="none"/>
               <w:left w:val="none"/>
-              <w:bottom w:val="single" w:sz="4" w:space="0" w:color="D9E2EC"/>
+              <w:bottom w:val="single" w:sz="4" w:space="0" w:color="E2D8CE"/>
               <w:right w:val="none"/>
             </w:tcBorders>
           </w:tcPr>
@@ -5870,7 +6127,7 @@
             <w:tcBorders>
               <w:top w:val="none"/>
               <w:left w:val="none"/>
-              <w:bottom w:val="single" w:sz="4" w:space="0" w:color="D9E2EC"/>
+              <w:bottom w:val="single" w:sz="4" w:space="0" w:color="E2D8CE"/>
               <w:right w:val="none"/>
             </w:tcBorders>
           </w:tcPr>
@@ -5902,7 +6159,7 @@
             <w:tcBorders>
               <w:top w:val="none"/>
               <w:left w:val="none"/>
-              <w:bottom w:val="single" w:sz="4" w:space="0" w:color="D9E2EC"/>
+              <w:bottom w:val="single" w:sz="4" w:space="0" w:color="E2D8CE"/>
               <w:right w:val="none"/>
             </w:tcBorders>
           </w:tcPr>
@@ -5929,7 +6186,7 @@
         <w:tc>
           <w:tcPr>
             <w:tcW w:type="dxa" w:w="2891"/>
-            <w:shd w:val="clear" w:color="auto" w:fill="F0F4F8"/>
+            <w:shd w:val="clear" w:color="auto" w:fill="FDF6F0"/>
             <w:tcMar>
               <w:top w:w="18" w:type="dxa"/>
               <w:bottom w:w="18" w:type="dxa"/>
@@ -5939,7 +6196,7 @@
             <w:tcBorders>
               <w:top w:val="none"/>
               <w:left w:val="none"/>
-              <w:bottom w:val="single" w:sz="4" w:space="0" w:color="D9E2EC"/>
+              <w:bottom w:val="single" w:sz="4" w:space="0" w:color="E2D8CE"/>
               <w:right w:val="none"/>
             </w:tcBorders>
           </w:tcPr>
@@ -5961,7 +6218,7 @@
         <w:tc>
           <w:tcPr>
             <w:tcW w:type="dxa" w:w="2268"/>
-            <w:shd w:val="clear" w:color="auto" w:fill="F0F4F8"/>
+            <w:shd w:val="clear" w:color="auto" w:fill="FDF6F0"/>
             <w:tcMar>
               <w:top w:w="18" w:type="dxa"/>
               <w:bottom w:w="18" w:type="dxa"/>
@@ -5971,7 +6228,7 @@
             <w:tcBorders>
               <w:top w:val="none"/>
               <w:left w:val="none"/>
-              <w:bottom w:val="single" w:sz="4" w:space="0" w:color="D9E2EC"/>
+              <w:bottom w:val="single" w:sz="4" w:space="0" w:color="E2D8CE"/>
               <w:right w:val="none"/>
             </w:tcBorders>
           </w:tcPr>
@@ -5993,7 +6250,7 @@
         <w:tc>
           <w:tcPr>
             <w:tcW w:type="dxa" w:w="2268"/>
-            <w:shd w:val="clear" w:color="auto" w:fill="F0F4F8"/>
+            <w:shd w:val="clear" w:color="auto" w:fill="FDF6F0"/>
             <w:tcMar>
               <w:top w:w="18" w:type="dxa"/>
               <w:bottom w:w="18" w:type="dxa"/>
@@ -6003,7 +6260,7 @@
             <w:tcBorders>
               <w:top w:val="none"/>
               <w:left w:val="none"/>
-              <w:bottom w:val="single" w:sz="4" w:space="0" w:color="D9E2EC"/>
+              <w:bottom w:val="single" w:sz="4" w:space="0" w:color="E2D8CE"/>
               <w:right w:val="none"/>
             </w:tcBorders>
           </w:tcPr>
@@ -6025,7 +6282,7 @@
         <w:tc>
           <w:tcPr>
             <w:tcW w:type="dxa" w:w="2268"/>
-            <w:shd w:val="clear" w:color="auto" w:fill="F0F4F8"/>
+            <w:shd w:val="clear" w:color="auto" w:fill="FDF6F0"/>
             <w:tcMar>
               <w:top w:w="18" w:type="dxa"/>
               <w:bottom w:w="18" w:type="dxa"/>
@@ -6035,7 +6292,7 @@
             <w:tcBorders>
               <w:top w:val="none"/>
               <w:left w:val="none"/>
-              <w:bottom w:val="single" w:sz="4" w:space="0" w:color="D9E2EC"/>
+              <w:bottom w:val="single" w:sz="4" w:space="0" w:color="E2D8CE"/>
               <w:right w:val="none"/>
             </w:tcBorders>
           </w:tcPr>
@@ -6072,7 +6329,7 @@
             <w:tcBorders>
               <w:top w:val="none"/>
               <w:left w:val="none"/>
-              <w:bottom w:val="single" w:sz="4" w:space="0" w:color="D9E2EC"/>
+              <w:bottom w:val="single" w:sz="4" w:space="0" w:color="E2D8CE"/>
               <w:right w:val="none"/>
             </w:tcBorders>
           </w:tcPr>
@@ -6104,7 +6361,7 @@
             <w:tcBorders>
               <w:top w:val="none"/>
               <w:left w:val="none"/>
-              <w:bottom w:val="single" w:sz="4" w:space="0" w:color="D9E2EC"/>
+              <w:bottom w:val="single" w:sz="4" w:space="0" w:color="E2D8CE"/>
               <w:right w:val="none"/>
             </w:tcBorders>
           </w:tcPr>
@@ -6136,7 +6393,7 @@
             <w:tcBorders>
               <w:top w:val="none"/>
               <w:left w:val="none"/>
-              <w:bottom w:val="single" w:sz="4" w:space="0" w:color="D9E2EC"/>
+              <w:bottom w:val="single" w:sz="4" w:space="0" w:color="E2D8CE"/>
               <w:right w:val="none"/>
             </w:tcBorders>
           </w:tcPr>
@@ -6168,7 +6425,7 @@
             <w:tcBorders>
               <w:top w:val="none"/>
               <w:left w:val="none"/>
-              <w:bottom w:val="single" w:sz="4" w:space="0" w:color="D9E2EC"/>
+              <w:bottom w:val="single" w:sz="4" w:space="0" w:color="E2D8CE"/>
               <w:right w:val="none"/>
             </w:tcBorders>
           </w:tcPr>
@@ -6205,7 +6462,7 @@
             <w:tcBorders>
               <w:top w:val="none"/>
               <w:left w:val="none"/>
-              <w:bottom w:val="single" w:sz="4" w:space="0" w:color="D9E2EC"/>
+              <w:bottom w:val="single" w:sz="4" w:space="0" w:color="E2D8CE"/>
               <w:right w:val="none"/>
             </w:tcBorders>
           </w:tcPr>
@@ -6237,7 +6494,7 @@
             <w:tcBorders>
               <w:top w:val="none"/>
               <w:left w:val="none"/>
-              <w:bottom w:val="single" w:sz="4" w:space="0" w:color="D9E2EC"/>
+              <w:bottom w:val="single" w:sz="4" w:space="0" w:color="E2D8CE"/>
               <w:right w:val="none"/>
             </w:tcBorders>
           </w:tcPr>
@@ -6269,7 +6526,7 @@
             <w:tcBorders>
               <w:top w:val="none"/>
               <w:left w:val="none"/>
-              <w:bottom w:val="single" w:sz="4" w:space="0" w:color="D9E2EC"/>
+              <w:bottom w:val="single" w:sz="4" w:space="0" w:color="E2D8CE"/>
               <w:right w:val="none"/>
             </w:tcBorders>
           </w:tcPr>
@@ -6301,7 +6558,7 @@
             <w:tcBorders>
               <w:top w:val="none"/>
               <w:left w:val="none"/>
-              <w:bottom w:val="single" w:sz="4" w:space="0" w:color="D9E2EC"/>
+              <w:bottom w:val="single" w:sz="4" w:space="0" w:color="E2D8CE"/>
               <w:right w:val="none"/>
             </w:tcBorders>
           </w:tcPr>
@@ -6338,7 +6595,7 @@
             <w:tcBorders>
               <w:top w:val="none"/>
               <w:left w:val="none"/>
-              <w:bottom w:val="single" w:sz="4" w:space="0" w:color="D9E2EC"/>
+              <w:bottom w:val="single" w:sz="4" w:space="0" w:color="E2D8CE"/>
               <w:right w:val="none"/>
             </w:tcBorders>
           </w:tcPr>
@@ -6370,7 +6627,7 @@
             <w:tcBorders>
               <w:top w:val="none"/>
               <w:left w:val="none"/>
-              <w:bottom w:val="single" w:sz="4" w:space="0" w:color="D9E2EC"/>
+              <w:bottom w:val="single" w:sz="4" w:space="0" w:color="E2D8CE"/>
               <w:right w:val="none"/>
             </w:tcBorders>
           </w:tcPr>
@@ -6402,7 +6659,7 @@
             <w:tcBorders>
               <w:top w:val="none"/>
               <w:left w:val="none"/>
-              <w:bottom w:val="single" w:sz="4" w:space="0" w:color="D9E2EC"/>
+              <w:bottom w:val="single" w:sz="4" w:space="0" w:color="E2D8CE"/>
               <w:right w:val="none"/>
             </w:tcBorders>
           </w:tcPr>
@@ -6434,7 +6691,7 @@
             <w:tcBorders>
               <w:top w:val="none"/>
               <w:left w:val="none"/>
-              <w:bottom w:val="single" w:sz="4" w:space="0" w:color="D9E2EC"/>
+              <w:bottom w:val="single" w:sz="4" w:space="0" w:color="E2D8CE"/>
               <w:right w:val="none"/>
             </w:tcBorders>
           </w:tcPr>
@@ -6471,7 +6728,7 @@
             <w:tcBorders>
               <w:top w:val="none"/>
               <w:left w:val="none"/>
-              <w:bottom w:val="single" w:sz="4" w:space="0" w:color="D9E2EC"/>
+              <w:bottom w:val="single" w:sz="4" w:space="0" w:color="E2D8CE"/>
               <w:right w:val="none"/>
             </w:tcBorders>
           </w:tcPr>
@@ -6503,7 +6760,7 @@
             <w:tcBorders>
               <w:top w:val="none"/>
               <w:left w:val="none"/>
-              <w:bottom w:val="single" w:sz="4" w:space="0" w:color="D9E2EC"/>
+              <w:bottom w:val="single" w:sz="4" w:space="0" w:color="E2D8CE"/>
               <w:right w:val="none"/>
             </w:tcBorders>
           </w:tcPr>
@@ -6535,7 +6792,7 @@
             <w:tcBorders>
               <w:top w:val="none"/>
               <w:left w:val="none"/>
-              <w:bottom w:val="single" w:sz="4" w:space="0" w:color="D9E2EC"/>
+              <w:bottom w:val="single" w:sz="4" w:space="0" w:color="E2D8CE"/>
               <w:right w:val="none"/>
             </w:tcBorders>
           </w:tcPr>
@@ -6567,7 +6824,7 @@
             <w:tcBorders>
               <w:top w:val="none"/>
               <w:left w:val="none"/>
-              <w:bottom w:val="single" w:sz="4" w:space="0" w:color="D9E2EC"/>
+              <w:bottom w:val="single" w:sz="4" w:space="0" w:color="E2D8CE"/>
               <w:right w:val="none"/>
             </w:tcBorders>
           </w:tcPr>
@@ -6617,7 +6874,7 @@
         <w:rPr>
           <w:rFonts w:ascii="Arial" w:hAnsi="Arial"/>
           <w:b/>
-          <w:color w:val="B45309"/>
+          <w:color w:val="A56341"/>
           <w:sz w:val="21"/>
         </w:rPr>
         <w:t>6.1 Struktur Penawaran Kemitraan Modal Rp 15.000.000</w:t>
@@ -6652,7 +6909,7 @@
         <w:tc>
           <w:tcPr>
             <w:tcW w:type="dxa" w:w="9694"/>
-            <w:shd w:val="clear" w:color="auto" w:fill="F0F4F8"/>
+            <w:shd w:val="clear" w:color="auto" w:fill="FDF6F0"/>
             <w:tcMar>
               <w:top w:w="70" w:type="dxa"/>
               <w:bottom w:w="70" w:type="dxa"/>
@@ -6661,7 +6918,7 @@
             </w:tcMar>
             <w:tcBorders>
               <w:top w:val="none"/>
-              <w:left w:val="single" w:sz="24" w:space="0" w:color="102A43"/>
+              <w:left w:val="single" w:sz="24" w:space="0" w:color="A56341"/>
               <w:bottom w:val="none"/>
               <w:right w:val="none"/>
             </w:tcBorders>
@@ -6690,7 +6947,7 @@
               <w:rPr>
                 <w:rFonts w:ascii="Arial" w:hAnsi="Arial"/>
                 <w:b/>
-                <w:color w:val="B45309"/>
+                <w:color w:val="A56341"/>
                 <w:sz w:val="18"/>
               </w:rPr>
               <w:t xml:space="preserve">• Pilihan Slot Permodalan: </w:t>
@@ -6713,7 +6970,7 @@
               <w:rPr>
                 <w:rFonts w:ascii="Arial" w:hAnsi="Arial"/>
                 <w:b/>
-                <w:color w:val="B45309"/>
+                <w:color w:val="A56341"/>
                 <w:sz w:val="18"/>
               </w:rPr>
               <w:t xml:space="preserve">• Nisbah Bagi Hasil Laba Bersih: </w:t>
@@ -6736,7 +6993,7 @@
               <w:rPr>
                 <w:rFonts w:ascii="Arial" w:hAnsi="Arial"/>
                 <w:b/>
-                <w:color w:val="B45309"/>
+                <w:color w:val="A56341"/>
                 <w:sz w:val="18"/>
               </w:rPr>
               <w:t xml:space="preserve">• Transparansi Kasir Digital: </w:t>
@@ -6759,7 +7016,7 @@
               <w:rPr>
                 <w:rFonts w:ascii="Arial" w:hAnsi="Arial"/>
                 <w:b/>
-                <w:color w:val="B45309"/>
+                <w:color w:val="A56341"/>
                 <w:sz w:val="18"/>
               </w:rPr>
               <w:t xml:space="preserve">• Roadmap Ekspansi Bertahap: </w:t>
@@ -6790,7 +7047,7 @@
         <w:rPr>
           <w:rFonts w:ascii="Arial" w:hAnsi="Arial"/>
           <w:b/>
-          <w:color w:val="B45309"/>
+          <w:color w:val="A56341"/>
           <w:sz w:val="21"/>
         </w:rPr>
         <w:t>6.2 Kesimpulan Eksekutif</w:t>
@@ -6821,7 +7078,7 @@
         <w:rPr>
           <w:rFonts w:ascii="Arial" w:hAnsi="Arial"/>
           <w:b/>
-          <w:color w:val="B45309"/>
+          <w:color w:val="A56341"/>
           <w:sz w:val="21"/>
         </w:rPr>
         <w:t>6.3 Lembar Pernyataan Komitmen Kemitraan Investasi</w:t>
@@ -6865,7 +7122,7 @@
             </w:tcMar>
             <w:tcBorders>
               <w:top w:val="none"/>
-              <w:left w:val="single" w:sz="24" w:space="0" w:color="B45309"/>
+              <w:left w:val="single" w:sz="24" w:space="0" w:color="A56341"/>
               <w:bottom w:val="none"/>
               <w:right w:val="none"/>
             </w:tcBorders>
@@ -6897,7 +7154,7 @@
               <w:rPr>
                 <w:rFonts w:ascii="Arial" w:hAnsi="Arial"/>
                 <w:b/>
-                <w:color w:val="B45309"/>
+                <w:color w:val="A56341"/>
                 <w:sz w:val="18"/>
               </w:rPr>
               <w:t>Nama Lengkap Calon Mitra</w:t>
@@ -6925,7 +7182,7 @@
               <w:rPr>
                 <w:rFonts w:ascii="Arial" w:hAnsi="Arial"/>
                 <w:b/>
-                <w:color w:val="B45309"/>
+                <w:color w:val="A56341"/>
                 <w:sz w:val="18"/>
               </w:rPr>
               <w:t>Nomor WhatsApp / Kontak</w:t>
@@ -6953,7 +7210,7 @@
               <w:rPr>
                 <w:rFonts w:ascii="Arial" w:hAnsi="Arial"/>
                 <w:b/>
-                <w:color w:val="B45309"/>
+                <w:color w:val="A56341"/>
                 <w:sz w:val="18"/>
               </w:rPr>
               <w:t>Alamat / Domisili</w:t>
@@ -6981,7 +7238,7 @@
               <w:rPr>
                 <w:rFonts w:ascii="Arial" w:hAnsi="Arial"/>
                 <w:b/>
-                <w:color w:val="B45309"/>
+                <w:color w:val="A56341"/>
                 <w:sz w:val="18"/>
               </w:rPr>
               <w:t>Pilihan Partisipasi Modal</w:t>

</xml_diff>

<commit_message>
feat: align investment modal options vertically and add brand identity psychological impact section
</commit_message>
<xml_diff>
--- a/PROPOSAL_INVESTASI_JANGKAR_KOPI.docx
+++ b/PROPOSAL_INVESTASI_JANGKAR_KOPI.docx
@@ -176,10 +176,10 @@
             <w:tcW w:type="dxa" w:w="9694"/>
             <w:shd w:val="clear" w:color="auto" w:fill="FDF6F0"/>
             <w:tcMar>
-              <w:top w:w="70" w:type="dxa"/>
-              <w:bottom w:w="70" w:type="dxa"/>
-              <w:left w:w="110" w:type="dxa"/>
-              <w:right w:w="110" w:type="dxa"/>
+              <w:top w:w="65" w:type="dxa"/>
+              <w:bottom w:w="65" w:type="dxa"/>
+              <w:left w:w="105" w:type="dxa"/>
+              <w:right w:w="105" w:type="dxa"/>
             </w:tcMar>
             <w:tcBorders>
               <w:top w:val="none"/>
@@ -190,7 +190,7 @@
           </w:tcPr>
           <w:p>
             <w:pPr>
-              <w:spacing w:before="0" w:after="80"/>
+              <w:spacing w:before="0" w:after="70"/>
               <w:jc w:val="left"/>
             </w:pPr>
             <w:r>
@@ -208,7 +208,7 @@
               <w:tabs>
                 <w:tab w:pos="3061" w:val="left"/>
               </w:tabs>
-              <w:spacing w:before="30" w:after="40" w:line="276" w:lineRule="auto"/>
+              <w:spacing w:before="10" w:after="40" w:line="276" w:lineRule="auto"/>
               <w:ind w:left="3061" w:hanging="3061"/>
               <w:jc w:val="left"/>
             </w:pPr>
@@ -237,7 +237,7 @@
               <w:tabs>
                 <w:tab w:pos="3061" w:val="left"/>
               </w:tabs>
-              <w:spacing w:before="30" w:after="40" w:line="276" w:lineRule="auto"/>
+              <w:spacing w:before="10" w:after="40" w:line="276" w:lineRule="auto"/>
               <w:ind w:left="3061" w:hanging="3061"/>
               <w:jc w:val="left"/>
             </w:pPr>
@@ -266,7 +266,7 @@
               <w:tabs>
                 <w:tab w:pos="3061" w:val="left"/>
               </w:tabs>
-              <w:spacing w:before="30" w:after="40" w:line="276" w:lineRule="auto"/>
+              <w:spacing w:before="10" w:after="40" w:line="276" w:lineRule="auto"/>
               <w:ind w:left="3061" w:hanging="3061"/>
               <w:jc w:val="left"/>
             </w:pPr>
@@ -295,7 +295,7 @@
               <w:tabs>
                 <w:tab w:pos="3061" w:val="left"/>
               </w:tabs>
-              <w:spacing w:before="30" w:after="40" w:line="276" w:lineRule="auto"/>
+              <w:spacing w:before="10" w:after="40" w:line="276" w:lineRule="auto"/>
               <w:ind w:left="3061" w:hanging="3061"/>
               <w:jc w:val="left"/>
             </w:pPr>
@@ -324,7 +324,7 @@
               <w:tabs>
                 <w:tab w:pos="3061" w:val="left"/>
               </w:tabs>
-              <w:spacing w:before="30" w:after="40" w:line="276" w:lineRule="auto"/>
+              <w:spacing w:before="10" w:after="40" w:line="276" w:lineRule="auto"/>
               <w:ind w:left="3061" w:hanging="3061"/>
               <w:jc w:val="left"/>
             </w:pPr>
@@ -353,7 +353,7 @@
               <w:tabs>
                 <w:tab w:pos="3061" w:val="left"/>
               </w:tabs>
-              <w:spacing w:before="30" w:after="40" w:line="276" w:lineRule="auto"/>
+              <w:spacing w:before="10" w:after="40" w:line="276" w:lineRule="auto"/>
               <w:ind w:left="3061" w:hanging="3061"/>
               <w:jc w:val="left"/>
             </w:pPr>
@@ -382,7 +382,7 @@
               <w:tabs>
                 <w:tab w:pos="3061" w:val="left"/>
               </w:tabs>
-              <w:spacing w:before="30" w:after="40" w:line="276" w:lineRule="auto"/>
+              <w:spacing w:before="10" w:after="40" w:line="276" w:lineRule="auto"/>
               <w:ind w:left="3061" w:hanging="3061"/>
               <w:jc w:val="left"/>
             </w:pPr>
@@ -411,7 +411,7 @@
               <w:tabs>
                 <w:tab w:pos="3061" w:val="left"/>
               </w:tabs>
-              <w:spacing w:before="30" w:after="40" w:line="276" w:lineRule="auto"/>
+              <w:spacing w:before="10" w:after="40" w:line="276" w:lineRule="auto"/>
               <w:ind w:left="3061" w:hanging="3061"/>
               <w:jc w:val="left"/>
             </w:pPr>
@@ -440,7 +440,7 @@
               <w:tabs>
                 <w:tab w:pos="3061" w:val="left"/>
               </w:tabs>
-              <w:spacing w:before="30" w:after="40" w:line="276" w:lineRule="auto"/>
+              <w:spacing w:before="10" w:after="40" w:line="276" w:lineRule="auto"/>
               <w:ind w:left="3061" w:hanging="3061"/>
               <w:jc w:val="left"/>
             </w:pPr>
@@ -469,7 +469,7 @@
     </w:tbl>
     <w:p>
       <w:pPr>
-        <w:spacing w:before="0" w:after="40"/>
+        <w:spacing w:before="0" w:after="30"/>
       </w:pPr>
     </w:p>
     <w:p>
@@ -591,10 +591,10 @@
             <w:tcW w:type="dxa" w:w="9694"/>
             <w:shd w:val="clear" w:color="auto" w:fill="FDF6F0"/>
             <w:tcMar>
-              <w:top w:w="70" w:type="dxa"/>
-              <w:bottom w:w="70" w:type="dxa"/>
-              <w:left w:w="110" w:type="dxa"/>
-              <w:right w:w="110" w:type="dxa"/>
+              <w:top w:w="65" w:type="dxa"/>
+              <w:bottom w:w="65" w:type="dxa"/>
+              <w:left w:w="105" w:type="dxa"/>
+              <w:right w:w="105" w:type="dxa"/>
             </w:tcMar>
             <w:tcBorders>
               <w:top w:val="none"/>
@@ -605,7 +605,7 @@
           </w:tcPr>
           <w:p>
             <w:pPr>
-              <w:spacing w:before="0" w:after="80"/>
+              <w:spacing w:before="0" w:after="70"/>
               <w:jc w:val="left"/>
             </w:pPr>
             <w:r>
@@ -620,7 +620,7 @@
           </w:p>
           <w:p>
             <w:pPr>
-              <w:spacing w:before="30" w:after="40" w:line="276" w:lineRule="auto"/>
+              <w:spacing w:before="10" w:after="40" w:line="276" w:lineRule="auto"/>
               <w:jc w:val="left"/>
             </w:pPr>
             <w:r>
@@ -643,7 +643,7 @@
           </w:p>
           <w:p>
             <w:pPr>
-              <w:spacing w:before="30" w:after="40" w:line="276" w:lineRule="auto"/>
+              <w:spacing w:before="10" w:after="40" w:line="276" w:lineRule="auto"/>
               <w:jc w:val="left"/>
             </w:pPr>
             <w:r>
@@ -666,7 +666,7 @@
           </w:p>
           <w:p>
             <w:pPr>
-              <w:spacing w:before="30" w:after="40" w:line="276" w:lineRule="auto"/>
+              <w:spacing w:before="10" w:after="40" w:line="276" w:lineRule="auto"/>
               <w:jc w:val="left"/>
             </w:pPr>
             <w:r>
@@ -689,7 +689,7 @@
           </w:p>
           <w:p>
             <w:pPr>
-              <w:spacing w:before="30" w:after="40" w:line="276" w:lineRule="auto"/>
+              <w:spacing w:before="10" w:after="40" w:line="276" w:lineRule="auto"/>
               <w:jc w:val="left"/>
             </w:pPr>
             <w:r>
@@ -715,7 +715,7 @@
     </w:tbl>
     <w:p>
       <w:pPr>
-        <w:spacing w:before="0" w:after="40"/>
+        <w:spacing w:before="0" w:after="30"/>
       </w:pPr>
     </w:p>
     <w:p>
@@ -730,38 +730,7 @@
           <w:color w:val="A56341"/>
           <w:sz w:val="21"/>
         </w:rPr>
-        <w:t>1.3 Sederhana, Cepat Buka &amp; Minim Risiko</w:t>
-      </w:r>
-    </w:p>
-    <w:p>
-      <w:pPr>
-        <w:spacing w:before="0" w:after="60" w:line="276" w:lineRule="auto"/>
-        <w:jc w:val="both"/>
-      </w:pPr>
-      <w:r>
-        <w:rPr>
-          <w:rFonts w:ascii="Arial" w:hAnsi="Arial"/>
-          <w:b w:val="0"/>
-          <w:i w:val="0"/>
-          <w:color w:val="243B53"/>
-          <w:sz w:val="19"/>
-        </w:rPr>
-        <w:t>Dengan menunda pembelian kursi camping dan mesin espresso impor, serta memfokuskan fasilitas duduk pada alas tebal nyaman dan meja lipat portabel, Jangkar Kopi menekan CAPEX awal secara drastis sehingga dapat dieksekusi dalam tempo 10–14 hari kerja. Risiko kerugian ditekan seminimal mungkin, sementara perputaran uang harian langsung aktif sejak hari pertama.</w:t>
-      </w:r>
-    </w:p>
-    <w:p>
-      <w:pPr>
-        <w:keepNext/>
-        <w:spacing w:before="160" w:after="60"/>
-      </w:pPr>
-      <w:r>
-        <w:rPr>
-          <w:rFonts w:ascii="Arial" w:hAnsi="Arial"/>
-          <w:b/>
-          <w:color w:val="A56341"/>
-          <w:sz w:val="21"/>
-        </w:rPr>
-        <w:t>1.4 Identitas Visual Merek, Palet Warna (#A56341) &amp; Filosofi Logo</w:t>
+        <w:t>1.3 Identitas Visual Merek, Palet Warna (#A56341) &amp; Filosofi Logo</w:t>
       </w:r>
     </w:p>
     <w:tbl>
@@ -779,10 +748,10 @@
           <w:tcPr>
             <w:tcW w:type="dxa" w:w="2381"/>
             <w:tcMar>
-              <w:top w:w="30" w:type="dxa"/>
-              <w:bottom w:w="30" w:type="dxa"/>
-              <w:left w:w="40" w:type="dxa"/>
-              <w:right w:w="50" w:type="dxa"/>
+              <w:top w:w="24" w:type="dxa"/>
+              <w:bottom w:w="24" w:type="dxa"/>
+              <w:left w:w="35" w:type="dxa"/>
+              <w:right w:w="45" w:type="dxa"/>
             </w:tcMar>
             <w:shd w:val="clear" w:color="auto" w:fill="FDF6F0"/>
             <w:tcBorders>
@@ -794,13 +763,13 @@
           </w:tcPr>
           <w:p>
             <w:pPr>
-              <w:spacing w:before="40" w:after="60"/>
+              <w:spacing w:before="40" w:after="40"/>
               <w:jc w:val="center"/>
             </w:pPr>
             <w:r>
               <w:drawing>
                 <wp:inline xmlns:a="http://schemas.openxmlformats.org/drawingml/2006/main" xmlns:pic="http://schemas.openxmlformats.org/drawingml/2006/picture">
-                  <wp:extent cx="1260000" cy="1260000"/>
+                  <wp:extent cx="1224000" cy="1224000"/>
                   <wp:docPr id="2" name="Picture 2"/>
                   <wp:cNvGraphicFramePr>
                     <a:graphicFrameLocks noChangeAspect="1"/>
@@ -821,7 +790,7 @@
                         <pic:spPr>
                           <a:xfrm>
                             <a:off x="0" y="0"/>
-                            <a:ext cx="1260000" cy="1260000"/>
+                            <a:ext cx="1224000" cy="1224000"/>
                           </a:xfrm>
                           <a:prstGeom prst="rect"/>
                         </pic:spPr>
@@ -834,7 +803,7 @@
           </w:p>
           <w:p>
             <w:pPr>
-              <w:spacing w:before="0" w:after="20"/>
+              <w:spacing w:before="0" w:after="0"/>
               <w:jc w:val="center"/>
             </w:pPr>
             <w:r>
@@ -868,10 +837,10 @@
           <w:tcPr>
             <w:tcW w:type="dxa" w:w="7313"/>
             <w:tcMar>
-              <w:top w:w="30" w:type="dxa"/>
-              <w:bottom w:w="30" w:type="dxa"/>
-              <w:left w:w="50" w:type="dxa"/>
-              <w:right w:w="40" w:type="dxa"/>
+              <w:top w:w="24" w:type="dxa"/>
+              <w:bottom w:w="24" w:type="dxa"/>
+              <w:left w:w="45" w:type="dxa"/>
+              <w:right w:w="35" w:type="dxa"/>
             </w:tcMar>
             <w:shd w:val="clear" w:color="auto" w:fill="FDF6F0"/>
             <w:tcBorders>
@@ -883,7 +852,7 @@
           </w:tcPr>
           <w:p>
             <w:pPr>
-              <w:spacing w:before="0" w:after="50" w:line="276" w:lineRule="auto"/>
+              <w:spacing w:before="0" w:after="40" w:line="276" w:lineRule="auto"/>
               <w:jc w:val="left"/>
             </w:pPr>
             <w:r>
@@ -899,12 +868,12 @@
                 <w:color w:val="243B53"/>
                 <w:sz w:val="16"/>
               </w:rPr>
-              <w:t>Batang kokoh dan kait jangkar membentuk inisial 'J' yang menancap di tanah. Merepresentasikan stabilitas usaha F&amp;B yang tahan banting, membumi (grounded), serta menjadi pelabuhan teduh melepas lelah.</w:t>
+              <w:t>Batang kokoh dan kait jangkar membentuk inisial 'J' menancap kokoh. Simbol kestabilan usaha F&amp;B yang tahan banting, membumi (grounded), dan menjadi pelabuhan teduh melepas lelah.</w:t>
             </w:r>
           </w:p>
           <w:p>
             <w:pPr>
-              <w:spacing w:before="20" w:after="50" w:line="276" w:lineRule="auto"/>
+              <w:spacing w:before="10" w:after="40" w:line="276" w:lineRule="auto"/>
               <w:jc w:val="left"/>
             </w:pPr>
             <w:r>
@@ -920,12 +889,12 @@
                 <w:color w:val="243B53"/>
                 <w:sz w:val="16"/>
               </w:rPr>
-              <w:t>Lengan bawah jangkar membentuk mangkuk cangkir kopi sekaligus lengkungan senyum ramah. Menyimbolkan keramahtamahan (hospitality), kehangatan interaksi, dan ruang temu santai yang egaliter bagi semua kalangan warga.</w:t>
+              <w:t>Lengan bawah jangkar memadukan mangkuk cangkir kopi dan kurva senyuman ramah. Simbol keramahtamahan (hospitality), kehangatan, dan ruang temu egaliter tanpa sekat sosial.</w:t>
             </w:r>
           </w:p>
           <w:p>
             <w:pPr>
-              <w:spacing w:before="20" w:after="0" w:line="276" w:lineRule="auto"/>
+              <w:spacing w:before="10" w:after="0" w:line="276" w:lineRule="auto"/>
               <w:jc w:val="left"/>
             </w:pPr>
             <w:r>
@@ -941,12 +910,43 @@
                 <w:color w:val="243B53"/>
                 <w:sz w:val="16"/>
               </w:rPr>
-              <w:t>Tiga liukan uap di puncak cangkir memancarkan semerbak seduhan kopi Robusta lokal dan kehangatan bara arang, sekaligus menyimbolkan nyala lentera mercusuar pemandu pelintas malam di koridor jalan.</w:t>
+              <w:t>Tiga liukan uap memancarkan aroma seduhan Robusta lokal lereng Gn. Karang dan bara arang, sekaligus simbol lentera mercusuar pemandu pelintas malam di koridor jalan.</w:t>
             </w:r>
           </w:p>
         </w:tc>
       </w:tr>
     </w:tbl>
+    <w:p>
+      <w:pPr>
+        <w:keepNext/>
+        <w:spacing w:before="120" w:after="40"/>
+      </w:pPr>
+      <w:r>
+        <w:rPr>
+          <w:rFonts w:ascii="Arial" w:hAnsi="Arial"/>
+          <w:b/>
+          <w:color w:val="A56341"/>
+          <w:sz w:val="21"/>
+        </w:rPr>
+        <w:t>1.4 Urgensi Identitas Merek: Dampak Psikologis bagi Pengunjung</w:t>
+      </w:r>
+    </w:p>
+    <w:p>
+      <w:pPr>
+        <w:spacing w:before="0" w:after="40" w:line="269" w:lineRule="auto"/>
+        <w:jc w:val="both"/>
+      </w:pPr>
+      <w:r>
+        <w:rPr>
+          <w:rFonts w:ascii="Arial" w:hAnsi="Arial"/>
+          <w:b w:val="0"/>
+          <w:i w:val="0"/>
+          <w:color w:val="243B53"/>
+          <w:sz w:val="17"/>
+        </w:rPr>
+        <w:t>Banyak warkop dan angkringan kaki lima beroperasi secara anonim tanpa identitas yang jelas. Bagi psikologi pengunjung dan warga lokal, perbedaan bisnis dengan vs. tanpa identitas merek sangatlah fundamental: (1) Rasa Aman &amp; Kepastian Mutu (Psychological Safety &amp; Trust) — Warung anonim sering dipersepsikan seadanya tanpa kepastian mutu, sedangkan identitas merek memberi sinyal keseriusan profesional, standar higienitas, dan tanggung jawab mutu produk; (2) Rasa Memiliki &amp; Kebanggaan Sosial (Sense of Belonging &amp; Pride) — Pengunjung tidak merasa sekadar 'numpang jajan di pinggir jalan', melainkan bangga menjadi bagian dari ruang temu yang berjiwa dan bernarasi hangat ('Labuhkan Lelah, Seduh Cerita'); (3) Pembeda dari Anonimitas Pasar (Top-of-Mind Recall) — Warna khas Terracotta #A56341 dan logo jangkar menjadi mercusuar visual pemandu di jalur Cikedal - Menes yang membedakannya dari lapak jalanan biasa dan mengunci loyalitas kunjungan berulang (repeat order).</w:t>
+      </w:r>
+    </w:p>
     <w:p>
       <w:r>
         <w:br w:type="page"/>
@@ -1060,10 +1060,10 @@
             <w:tcW w:type="dxa" w:w="9694"/>
             <w:shd w:val="clear" w:color="auto" w:fill="FDF6F0"/>
             <w:tcMar>
-              <w:top w:w="70" w:type="dxa"/>
-              <w:bottom w:w="70" w:type="dxa"/>
-              <w:left w:w="110" w:type="dxa"/>
-              <w:right w:w="110" w:type="dxa"/>
+              <w:top w:w="65" w:type="dxa"/>
+              <w:bottom w:w="65" w:type="dxa"/>
+              <w:left w:w="105" w:type="dxa"/>
+              <w:right w:w="105" w:type="dxa"/>
             </w:tcMar>
             <w:tcBorders>
               <w:top w:val="none"/>
@@ -1074,7 +1074,7 @@
           </w:tcPr>
           <w:p>
             <w:pPr>
-              <w:spacing w:before="0" w:after="80"/>
+              <w:spacing w:before="0" w:after="70"/>
               <w:jc w:val="left"/>
             </w:pPr>
             <w:r>
@@ -1089,7 +1089,7 @@
           </w:p>
           <w:p>
             <w:pPr>
-              <w:spacing w:before="30" w:after="40" w:line="276" w:lineRule="auto"/>
+              <w:spacing w:before="10" w:after="40" w:line="276" w:lineRule="auto"/>
               <w:jc w:val="left"/>
             </w:pPr>
             <w:r>
@@ -1112,7 +1112,7 @@
           </w:p>
           <w:p>
             <w:pPr>
-              <w:spacing w:before="30" w:after="40" w:line="276" w:lineRule="auto"/>
+              <w:spacing w:before="10" w:after="40" w:line="276" w:lineRule="auto"/>
               <w:jc w:val="left"/>
             </w:pPr>
             <w:r>
@@ -1135,7 +1135,7 @@
           </w:p>
           <w:p>
             <w:pPr>
-              <w:spacing w:before="30" w:after="40" w:line="276" w:lineRule="auto"/>
+              <w:spacing w:before="10" w:after="40" w:line="276" w:lineRule="auto"/>
               <w:jc w:val="left"/>
             </w:pPr>
             <w:r>
@@ -1158,7 +1158,7 @@
           </w:p>
           <w:p>
             <w:pPr>
-              <w:spacing w:before="30" w:after="40" w:line="276" w:lineRule="auto"/>
+              <w:spacing w:before="10" w:after="40" w:line="276" w:lineRule="auto"/>
               <w:jc w:val="left"/>
             </w:pPr>
             <w:r>
@@ -1184,7 +1184,7 @@
     </w:tbl>
     <w:p>
       <w:pPr>
-        <w:spacing w:before="0" w:after="40"/>
+        <w:spacing w:before="0" w:after="30"/>
       </w:pPr>
     </w:p>
     <w:p>
@@ -1411,10 +1411,10 @@
             <w:tcW w:type="dxa" w:w="9694"/>
             <w:shd w:val="clear" w:color="auto" w:fill="FDF6F0"/>
             <w:tcMar>
-              <w:top w:w="70" w:type="dxa"/>
-              <w:bottom w:w="70" w:type="dxa"/>
-              <w:left w:w="110" w:type="dxa"/>
-              <w:right w:w="110" w:type="dxa"/>
+              <w:top w:w="65" w:type="dxa"/>
+              <w:bottom w:w="65" w:type="dxa"/>
+              <w:left w:w="105" w:type="dxa"/>
+              <w:right w:w="105" w:type="dxa"/>
             </w:tcMar>
             <w:tcBorders>
               <w:top w:val="none"/>
@@ -1425,7 +1425,7 @@
           </w:tcPr>
           <w:p>
             <w:pPr>
-              <w:spacing w:before="0" w:after="80"/>
+              <w:spacing w:before="0" w:after="70"/>
               <w:jc w:val="left"/>
             </w:pPr>
             <w:r>
@@ -1440,7 +1440,7 @@
           </w:p>
           <w:p>
             <w:pPr>
-              <w:spacing w:before="30" w:after="40" w:line="276" w:lineRule="auto"/>
+              <w:spacing w:before="10" w:after="40" w:line="276" w:lineRule="auto"/>
               <w:jc w:val="left"/>
             </w:pPr>
             <w:r>
@@ -1463,7 +1463,7 @@
           </w:p>
           <w:p>
             <w:pPr>
-              <w:spacing w:before="30" w:after="40" w:line="276" w:lineRule="auto"/>
+              <w:spacing w:before="10" w:after="40" w:line="276" w:lineRule="auto"/>
               <w:jc w:val="left"/>
             </w:pPr>
             <w:r>
@@ -1486,7 +1486,7 @@
           </w:p>
           <w:p>
             <w:pPr>
-              <w:spacing w:before="30" w:after="40" w:line="276" w:lineRule="auto"/>
+              <w:spacing w:before="10" w:after="40" w:line="276" w:lineRule="auto"/>
               <w:jc w:val="left"/>
             </w:pPr>
             <w:r>
@@ -1509,7 +1509,7 @@
           </w:p>
           <w:p>
             <w:pPr>
-              <w:spacing w:before="30" w:after="40" w:line="276" w:lineRule="auto"/>
+              <w:spacing w:before="10" w:after="40" w:line="276" w:lineRule="auto"/>
               <w:jc w:val="left"/>
             </w:pPr>
             <w:r>
@@ -1535,7 +1535,7 @@
     </w:tbl>
     <w:p>
       <w:pPr>
-        <w:spacing w:before="0" w:after="40"/>
+        <w:spacing w:before="0" w:after="30"/>
       </w:pPr>
     </w:p>
     <w:p>
@@ -6911,10 +6911,10 @@
             <w:tcW w:type="dxa" w:w="9694"/>
             <w:shd w:val="clear" w:color="auto" w:fill="FDF6F0"/>
             <w:tcMar>
-              <w:top w:w="70" w:type="dxa"/>
-              <w:bottom w:w="70" w:type="dxa"/>
-              <w:left w:w="110" w:type="dxa"/>
-              <w:right w:w="110" w:type="dxa"/>
+              <w:top w:w="65" w:type="dxa"/>
+              <w:bottom w:w="65" w:type="dxa"/>
+              <w:left w:w="105" w:type="dxa"/>
+              <w:right w:w="105" w:type="dxa"/>
             </w:tcMar>
             <w:tcBorders>
               <w:top w:val="none"/>
@@ -6925,7 +6925,7 @@
           </w:tcPr>
           <w:p>
             <w:pPr>
-              <w:spacing w:before="0" w:after="80"/>
+              <w:spacing w:before="0" w:after="70"/>
               <w:jc w:val="left"/>
             </w:pPr>
             <w:r>
@@ -6940,7 +6940,7 @@
           </w:p>
           <w:p>
             <w:pPr>
-              <w:spacing w:before="30" w:after="40" w:line="276" w:lineRule="auto"/>
+              <w:spacing w:before="10" w:after="40" w:line="276" w:lineRule="auto"/>
               <w:jc w:val="left"/>
             </w:pPr>
             <w:r>
@@ -6963,7 +6963,7 @@
           </w:p>
           <w:p>
             <w:pPr>
-              <w:spacing w:before="30" w:after="40" w:line="276" w:lineRule="auto"/>
+              <w:spacing w:before="10" w:after="40" w:line="276" w:lineRule="auto"/>
               <w:jc w:val="left"/>
             </w:pPr>
             <w:r>
@@ -6986,7 +6986,7 @@
           </w:p>
           <w:p>
             <w:pPr>
-              <w:spacing w:before="30" w:after="40" w:line="276" w:lineRule="auto"/>
+              <w:spacing w:before="10" w:after="40" w:line="276" w:lineRule="auto"/>
               <w:jc w:val="left"/>
             </w:pPr>
             <w:r>
@@ -7009,7 +7009,7 @@
           </w:p>
           <w:p>
             <w:pPr>
-              <w:spacing w:before="30" w:after="40" w:line="276" w:lineRule="auto"/>
+              <w:spacing w:before="10" w:after="40" w:line="276" w:lineRule="auto"/>
               <w:jc w:val="left"/>
             </w:pPr>
             <w:r>
@@ -7035,7 +7035,7 @@
     </w:tbl>
     <w:p>
       <w:pPr>
-        <w:spacing w:before="0" w:after="40"/>
+        <w:spacing w:before="0" w:after="30"/>
       </w:pPr>
     </w:p>
     <w:p>
@@ -7115,10 +7115,10 @@
             <w:tcW w:type="dxa" w:w="9694"/>
             <w:shd w:val="clear" w:color="auto" w:fill="FEF3C7"/>
             <w:tcMar>
-              <w:top w:w="70" w:type="dxa"/>
-              <w:bottom w:w="70" w:type="dxa"/>
-              <w:left w:w="110" w:type="dxa"/>
-              <w:right w:w="110" w:type="dxa"/>
+              <w:top w:w="65" w:type="dxa"/>
+              <w:bottom w:w="65" w:type="dxa"/>
+              <w:left w:w="105" w:type="dxa"/>
+              <w:right w:w="105" w:type="dxa"/>
             </w:tcMar>
             <w:tcBorders>
               <w:top w:val="none"/>
@@ -7129,7 +7129,7 @@
           </w:tcPr>
           <w:p>
             <w:pPr>
-              <w:spacing w:before="0" w:after="80"/>
+              <w:spacing w:before="0" w:after="70"/>
               <w:jc w:val="left"/>
             </w:pPr>
             <w:r>
@@ -7146,8 +7146,9 @@
             <w:pPr>
               <w:tabs>
                 <w:tab w:pos="2721" w:val="left"/>
+                <w:tab w:pos="2948" w:val="left"/>
               </w:tabs>
-              <w:spacing w:before="30" w:after="40" w:line="276" w:lineRule="auto"/>
+              <w:spacing w:before="10" w:after="16" w:line="276" w:lineRule="auto"/>
               <w:jc w:val="left"/>
             </w:pPr>
             <w:r>
@@ -7159,7 +7160,8 @@
               </w:rPr>
               <w:t>Nama Lengkap Calon Mitra</w:t>
               <w:tab/>
-              <w:t xml:space="preserve">: </w:t>
+              <w:t>:</w:t>
+              <w:tab/>
             </w:r>
             <w:r>
               <w:rPr>
@@ -7174,8 +7176,9 @@
             <w:pPr>
               <w:tabs>
                 <w:tab w:pos="2721" w:val="left"/>
+                <w:tab w:pos="2948" w:val="left"/>
               </w:tabs>
-              <w:spacing w:before="30" w:after="40" w:line="276" w:lineRule="auto"/>
+              <w:spacing w:before="10" w:after="16" w:line="276" w:lineRule="auto"/>
               <w:jc w:val="left"/>
             </w:pPr>
             <w:r>
@@ -7187,7 +7190,8 @@
               </w:rPr>
               <w:t>Nomor WhatsApp / Kontak</w:t>
               <w:tab/>
-              <w:t xml:space="preserve">: </w:t>
+              <w:t>:</w:t>
+              <w:tab/>
             </w:r>
             <w:r>
               <w:rPr>
@@ -7202,8 +7206,9 @@
             <w:pPr>
               <w:tabs>
                 <w:tab w:pos="2721" w:val="left"/>
+                <w:tab w:pos="2948" w:val="left"/>
               </w:tabs>
-              <w:spacing w:before="30" w:after="40" w:line="276" w:lineRule="auto"/>
+              <w:spacing w:before="10" w:after="16" w:line="276" w:lineRule="auto"/>
               <w:jc w:val="left"/>
             </w:pPr>
             <w:r>
@@ -7215,7 +7220,8 @@
               </w:rPr>
               <w:t>Alamat / Domisili</w:t>
               <w:tab/>
-              <w:t xml:space="preserve">: </w:t>
+              <w:t>:</w:t>
+              <w:tab/>
             </w:r>
             <w:r>
               <w:rPr>
@@ -7230,8 +7236,9 @@
             <w:pPr>
               <w:tabs>
                 <w:tab w:pos="2721" w:val="left"/>
+                <w:tab w:pos="2948" w:val="left"/>
               </w:tabs>
-              <w:spacing w:before="30" w:after="40" w:line="276" w:lineRule="auto"/>
+              <w:spacing w:before="10" w:after="16" w:line="276" w:lineRule="auto"/>
               <w:jc w:val="left"/>
             </w:pPr>
             <w:r>
@@ -7243,7 +7250,8 @@
               </w:rPr>
               <w:t>Pilihan Partisipasi Modal</w:t>
               <w:tab/>
-              <w:t xml:space="preserve">: </w:t>
+              <w:t>:</w:t>
+              <w:tab/>
             </w:r>
             <w:r>
               <w:rPr>
@@ -7251,9 +7259,91 @@
                 <w:color w:val="243B53"/>
                 <w:sz w:val="18"/>
               </w:rPr>
-              <w:t>[   ] 1 Slot Sindikasi (Rp 3.000.000)      [   ] 1 Slot Kemitraan (Rp 5.000.000)</w:t>
-              <w:br/>
-              <w:t xml:space="preserve">                              [   ] 1 Slot Kemitraan (Rp 7.500.000)      [   ] Mitra Tunggal Penuh (Rp 15.000.000)</w:t>
+              <w:t>[   ] 1 Slot Sindikasi Ringan (Rp 3.000.000)</w:t>
+            </w:r>
+          </w:p>
+          <w:p>
+            <w:pPr>
+              <w:tabs>
+                <w:tab w:pos="2721" w:val="left"/>
+                <w:tab w:pos="2948" w:val="left"/>
+              </w:tabs>
+              <w:spacing w:before="10" w:after="16" w:line="276" w:lineRule="auto"/>
+              <w:jc w:val="left"/>
+            </w:pPr>
+            <w:r>
+              <w:rPr>
+                <w:rFonts w:ascii="Arial" w:hAnsi="Arial"/>
+                <w:b/>
+                <w:color w:val="A56341"/>
+                <w:sz w:val="18"/>
+              </w:rPr>
+              <w:tab/>
+              <w:tab/>
+            </w:r>
+            <w:r>
+              <w:rPr>
+                <w:rFonts w:ascii="Arial" w:hAnsi="Arial"/>
+                <w:color w:val="243B53"/>
+                <w:sz w:val="18"/>
+              </w:rPr>
+              <w:t>[   ] 1 Slot Kemitraan Usaha (Rp 5.000.000)</w:t>
+            </w:r>
+          </w:p>
+          <w:p>
+            <w:pPr>
+              <w:tabs>
+                <w:tab w:pos="2721" w:val="left"/>
+                <w:tab w:pos="2948" w:val="left"/>
+              </w:tabs>
+              <w:spacing w:before="10" w:after="16" w:line="276" w:lineRule="auto"/>
+              <w:jc w:val="left"/>
+            </w:pPr>
+            <w:r>
+              <w:rPr>
+                <w:rFonts w:ascii="Arial" w:hAnsi="Arial"/>
+                <w:b/>
+                <w:color w:val="A56341"/>
+                <w:sz w:val="18"/>
+              </w:rPr>
+              <w:tab/>
+              <w:tab/>
+            </w:r>
+            <w:r>
+              <w:rPr>
+                <w:rFonts w:ascii="Arial" w:hAnsi="Arial"/>
+                <w:color w:val="243B53"/>
+                <w:sz w:val="18"/>
+              </w:rPr>
+              <w:t>[   ] 1 Slot Kemitraan Usaha (Rp 7.500.000)</w:t>
+            </w:r>
+          </w:p>
+          <w:p>
+            <w:pPr>
+              <w:tabs>
+                <w:tab w:pos="2721" w:val="left"/>
+                <w:tab w:pos="2948" w:val="left"/>
+              </w:tabs>
+              <w:spacing w:before="10" w:after="16" w:line="276" w:lineRule="auto"/>
+              <w:jc w:val="left"/>
+            </w:pPr>
+            <w:r>
+              <w:rPr>
+                <w:rFonts w:ascii="Arial" w:hAnsi="Arial"/>
+                <w:b/>
+                <w:color w:val="A56341"/>
+                <w:sz w:val="18"/>
+              </w:rPr>
+              <w:tab/>
+              <w:tab/>
+            </w:r>
+            <w:r>
+              <w:rPr>
+                <w:rFonts w:ascii="Arial" w:hAnsi="Arial"/>
+                <w:color w:val="243B53"/>
+                <w:sz w:val="18"/>
+              </w:rPr>
+              <w:t>[   ] 1 Mitra Tunggal Penuh (Rp 15.000.000)</w:t>
             </w:r>
           </w:p>
         </w:tc>
@@ -7261,7 +7351,7 @@
     </w:tbl>
     <w:p>
       <w:pPr>
-        <w:spacing w:before="0" w:after="40"/>
+        <w:spacing w:before="0" w:after="30"/>
       </w:pPr>
     </w:p>
     <w:tbl>
@@ -7279,8 +7369,8 @@
           <w:tcPr>
             <w:tcW w:type="dxa" w:w="4819"/>
             <w:tcMar>
-              <w:top w:w="20" w:type="dxa"/>
-              <w:bottom w:w="20" w:type="dxa"/>
+              <w:top w:w="16" w:type="dxa"/>
+              <w:bottom w:w="16" w:type="dxa"/>
               <w:left w:w="40" w:type="dxa"/>
               <w:right w:w="40" w:type="dxa"/>
             </w:tcMar>
@@ -7298,7 +7388,6 @@
               <w:t>PIHAK PENGELOLA USAHA</w:t>
               <w:br/>
               <w:t>Jangkar Kopi &amp; Angkringan</w:t>
-              <w:br/>
               <w:br/>
               <w:br/>
               <w:br/>
@@ -7328,8 +7417,8 @@
           <w:tcPr>
             <w:tcW w:type="dxa" w:w="4819"/>
             <w:tcMar>
-              <w:top w:w="20" w:type="dxa"/>
-              <w:bottom w:w="20" w:type="dxa"/>
+              <w:top w:w="16" w:type="dxa"/>
+              <w:bottom w:w="16" w:type="dxa"/>
               <w:left w:w="40" w:type="dxa"/>
               <w:right w:w="40" w:type="dxa"/>
             </w:tcMar>
@@ -7347,7 +7436,6 @@
               <w:t>PIHAK MITRA INVESTOR</w:t>
               <w:br/>
               <w:t>Jangkar Kopi &amp; Angkringan</w:t>
-              <w:br/>
               <w:br/>
               <w:br/>
               <w:br/>

</xml_diff>

<commit_message>
feat: reposition low-risk lean section before brand philosophy and enlarge logo png in Bab 1
</commit_message>
<xml_diff>
--- a/PROPOSAL_INVESTASI_JANGKAR_KOPI.docx
+++ b/PROPOSAL_INVESTASI_JANGKAR_KOPI.docx
@@ -190,7 +190,7 @@
           </w:tcPr>
           <w:p>
             <w:pPr>
-              <w:spacing w:before="0" w:after="70"/>
+              <w:spacing w:before="0" w:after="60"/>
               <w:jc w:val="left"/>
             </w:pPr>
             <w:r>
@@ -502,7 +502,7 @@
     <w:p>
       <w:pPr>
         <w:keepNext/>
-        <w:spacing w:before="220" w:after="80"/>
+        <w:spacing w:before="0" w:after="60"/>
       </w:pPr>
       <w:r>
         <w:rPr>
@@ -517,7 +517,7 @@
     <w:p>
       <w:pPr>
         <w:keepNext/>
-        <w:spacing w:before="160" w:after="60"/>
+        <w:spacing w:before="80" w:after="30"/>
       </w:pPr>
       <w:r>
         <w:rPr>
@@ -531,7 +531,7 @@
     </w:p>
     <w:p>
       <w:pPr>
-        <w:spacing w:before="0" w:after="60" w:line="276" w:lineRule="auto"/>
+        <w:spacing w:before="0" w:after="40" w:line="269" w:lineRule="auto"/>
         <w:jc w:val="both"/>
       </w:pPr>
       <w:r>
@@ -540,14 +540,14 @@
           <w:b w:val="0"/>
           <w:i w:val="0"/>
           <w:color w:val="243B53"/>
-          <w:sz w:val="19"/>
+          <w:sz w:val="17"/>
         </w:rPr>
         <w:t>Berdasarkan evaluasi objektif bersama dewan penasihat dan calon mitra investor strategis, langkah paling bijak dalam memulai usaha F&amp;B pedesaan adalah menerapkan prinsip Lean Startup: memangkas belanja modal yang belum mendesak, menghilangkan risiko kelebihan kapasitas (over-capitalization), dan menguji penerimaan pasar secara langsung dengan modal ringan yang cepat menghasilkan arus kas (cashflow engine).</w:t>
       </w:r>
     </w:p>
     <w:p>
       <w:pPr>
-        <w:spacing w:before="0" w:after="60" w:line="276" w:lineRule="auto"/>
+        <w:spacing w:before="0" w:after="40" w:line="269" w:lineRule="auto"/>
         <w:jc w:val="both"/>
       </w:pPr>
       <w:r>
@@ -556,7 +556,7 @@
           <w:b w:val="0"/>
           <w:i w:val="0"/>
           <w:color w:val="243B53"/>
-          <w:sz w:val="19"/>
+          <w:sz w:val="17"/>
         </w:rPr>
         <w:t>Daya beli riil masyarakat di koridor Cikedal dan Menes terbukti sangat kuat pada rentang harga merakyat. Konsumen lokal terbiasa membelanjakan Rp 10.000 hingga Rp 20.000 per sesi nongkrong saat jajan aneka sate arang (Rp 2.500–Rp 3.500), nasi kucing, dan kopi hangat (Rp 3.000). Faktor penentu keberhasilan utama bukanlah kemewahan alat, melainkan suasana tempat yang merakyat, ramah, dan harga bersahabat yang tidak menimbulkan rasa segan (kagok/takut mahal). Oleh karena itu, Jangkar Kopi dirancang bersahaja, bersih, dan berakar pada kenyamanan warga lokal.</w:t>
       </w:r>
@@ -564,7 +564,7 @@
     <w:p>
       <w:pPr>
         <w:keepNext/>
-        <w:spacing w:before="160" w:after="60"/>
+        <w:spacing w:before="80" w:after="30"/>
       </w:pPr>
       <w:r>
         <w:rPr>
@@ -573,7 +573,38 @@
           <w:color w:val="A56341"/>
           <w:sz w:val="21"/>
         </w:rPr>
-        <w:t>1.2 Filosofi Nama Merek "Jangkar Kopi" — Doa dan Harapan</w:t>
+        <w:t>1.2 Sederhana, Cepat Buka &amp; Minim Risiko</w:t>
+      </w:r>
+    </w:p>
+    <w:p>
+      <w:pPr>
+        <w:spacing w:before="0" w:after="40" w:line="269" w:lineRule="auto"/>
+        <w:jc w:val="both"/>
+      </w:pPr>
+      <w:r>
+        <w:rPr>
+          <w:rFonts w:ascii="Arial" w:hAnsi="Arial"/>
+          <w:b w:val="0"/>
+          <w:i w:val="0"/>
+          <w:color w:val="243B53"/>
+          <w:sz w:val="17"/>
+        </w:rPr>
+        <w:t>Dengan menunda pembelian kursi camping dan mesin espresso impor, serta memfokuskan fasilitas duduk pada alas tebal nyaman dan meja lipat portabel, Jangkar Kopi menekan CAPEX awal secara drastis sehingga dapat dieksekusi dalam tempo 10–14 hari kerja. Risiko kerugian ditekan seminimal mungkin, sementara perputaran uang harian langsung aktif sejak hari pertama.</w:t>
+      </w:r>
+    </w:p>
+    <w:p>
+      <w:pPr>
+        <w:keepNext/>
+        <w:spacing w:before="80" w:after="30"/>
+      </w:pPr>
+      <w:r>
+        <w:rPr>
+          <w:rFonts w:ascii="Arial" w:hAnsi="Arial"/>
+          <w:b/>
+          <w:color w:val="A56341"/>
+          <w:sz w:val="21"/>
+        </w:rPr>
+        <w:t>1.3 Filosofi Nama Merek "Jangkar Kopi" — Doa dan Harapan</w:t>
       </w:r>
     </w:p>
     <w:tbl>
@@ -591,10 +622,10 @@
             <w:tcW w:type="dxa" w:w="9694"/>
             <w:shd w:val="clear" w:color="auto" w:fill="FDF6F0"/>
             <w:tcMar>
-              <w:top w:w="65" w:type="dxa"/>
-              <w:bottom w:w="65" w:type="dxa"/>
-              <w:left w:w="105" w:type="dxa"/>
-              <w:right w:w="105" w:type="dxa"/>
+              <w:top w:w="40" w:type="dxa"/>
+              <w:bottom w:w="40" w:type="dxa"/>
+              <w:left w:w="70" w:type="dxa"/>
+              <w:right w:w="70" w:type="dxa"/>
             </w:tcMar>
             <w:tcBorders>
               <w:top w:val="none"/>
@@ -605,7 +636,7 @@
           </w:tcPr>
           <w:p>
             <w:pPr>
-              <w:spacing w:before="0" w:after="70"/>
+              <w:spacing w:before="0" w:after="60"/>
               <w:jc w:val="left"/>
             </w:pPr>
             <w:r>
@@ -613,14 +644,14 @@
                 <w:rFonts w:ascii="Arial" w:hAnsi="Arial"/>
                 <w:b/>
                 <w:color w:val="102A43"/>
-                <w:sz w:val="20"/>
+                <w:sz w:val="19"/>
               </w:rPr>
               <w:t>EMPAT PILAR FILOSOFI DAN DOA DI BALIK NAMA JANGKAR KOPI</w:t>
             </w:r>
           </w:p>
           <w:p>
             <w:pPr>
-              <w:spacing w:before="10" w:after="40" w:line="276" w:lineRule="auto"/>
+              <w:spacing w:before="10" w:after="16" w:line="276" w:lineRule="auto"/>
               <w:jc w:val="left"/>
             </w:pPr>
             <w:r>
@@ -628,7 +659,7 @@
                 <w:rFonts w:ascii="Arial" w:hAnsi="Arial"/>
                 <w:b/>
                 <w:color w:val="A56341"/>
-                <w:sz w:val="18"/>
+                <w:sz w:val="17"/>
               </w:rPr>
               <w:t xml:space="preserve">1. Tempat Berlabuh &amp; Melepas Lelah (The Safe Harbor): </w:t>
             </w:r>
@@ -636,14 +667,14 @@
               <w:rPr>
                 <w:rFonts w:ascii="Arial" w:hAnsi="Arial"/>
                 <w:color w:val="243B53"/>
-                <w:sz w:val="18"/>
+                <w:sz w:val="17"/>
               </w:rPr>
               <w:t>Fungsi utama jangkar adalah diturunkan saat perahu tiba di dermaga yang tenang. Jangkar Kopi hadir sebagai tempat warga berlabuh, menghela napas, dan melepas penat setelah seharian bekerja.</w:t>
             </w:r>
           </w:p>
           <w:p>
             <w:pPr>
-              <w:spacing w:before="10" w:after="40" w:line="276" w:lineRule="auto"/>
+              <w:spacing w:before="10" w:after="16" w:line="276" w:lineRule="auto"/>
               <w:jc w:val="left"/>
             </w:pPr>
             <w:r>
@@ -651,7 +682,7 @@
                 <w:rFonts w:ascii="Arial" w:hAnsi="Arial"/>
                 <w:b/>
                 <w:color w:val="A56341"/>
-                <w:sz w:val="18"/>
+                <w:sz w:val="17"/>
               </w:rPr>
               <w:t xml:space="preserve">2. Kaitan Geografis Jalur Maritim Banten Barat: </w:t>
             </w:r>
@@ -659,14 +690,14 @@
               <w:rPr>
                 <w:rFonts w:ascii="Arial" w:hAnsi="Arial"/>
                 <w:color w:val="243B53"/>
-                <w:sz w:val="18"/>
+                <w:sz w:val="17"/>
               </w:rPr>
               <w:t>Cikedal dan Menes adalah gerbang pelintas menuju pesisir Labuan, Carita, dan Tanjung Lesung. Jangkar sangat lekat dengan ketangguhan masyarakat maritim Banten yang bersahaja dan pekerja keras.</w:t>
             </w:r>
           </w:p>
           <w:p>
             <w:pPr>
-              <w:spacing w:before="10" w:after="40" w:line="276" w:lineRule="auto"/>
+              <w:spacing w:before="10" w:after="16" w:line="276" w:lineRule="auto"/>
               <w:jc w:val="left"/>
             </w:pPr>
             <w:r>
@@ -674,7 +705,7 @@
                 <w:rFonts w:ascii="Arial" w:hAnsi="Arial"/>
                 <w:b/>
                 <w:color w:val="A56341"/>
-                <w:sz w:val="18"/>
+                <w:sz w:val="17"/>
               </w:rPr>
               <w:t xml:space="preserve">3. Keteguhan yang Menancap Membumi (Grounded): </w:t>
             </w:r>
@@ -682,14 +713,14 @@
               <w:rPr>
                 <w:rFonts w:ascii="Arial" w:hAnsi="Arial"/>
                 <w:color w:val="243B53"/>
-                <w:sz w:val="18"/>
+                <w:sz w:val="17"/>
               </w:rPr>
               <w:t>Jangkar menancap kuat di bumi. Ini adalah doa agar usaha selalu membumi, tidak congkak, berakar pada realitas rakyat, dan tahan banting menghadapi ujian usaha.</w:t>
             </w:r>
           </w:p>
           <w:p>
             <w:pPr>
-              <w:spacing w:before="10" w:after="40" w:line="276" w:lineRule="auto"/>
+              <w:spacing w:before="10" w:after="16" w:line="276" w:lineRule="auto"/>
               <w:jc w:val="left"/>
             </w:pPr>
             <w:r>
@@ -697,7 +728,7 @@
                 <w:rFonts w:ascii="Arial" w:hAnsi="Arial"/>
                 <w:b/>
                 <w:color w:val="A56341"/>
-                <w:sz w:val="18"/>
+                <w:sz w:val="17"/>
               </w:rPr>
               <w:t xml:space="preserve">4. Pengikat Tali Silaturahmi: </w:t>
             </w:r>
@@ -705,7 +736,7 @@
               <w:rPr>
                 <w:rFonts w:ascii="Arial" w:hAnsi="Arial"/>
                 <w:color w:val="243B53"/>
-                <w:sz w:val="18"/>
+                <w:sz w:val="17"/>
               </w:rPr>
               <w:t>Jangkar menahan perahu agar tidak hanyut; usaha ini diniatkan menjadi pengikat tali persaudaraan antarwarga, pemuda, santri, dan tetangga agar tetap guyub rukun.</w:t>
             </w:r>
@@ -715,13 +746,13 @@
     </w:tbl>
     <w:p>
       <w:pPr>
-        <w:spacing w:before="0" w:after="30"/>
+        <w:spacing w:before="0" w:after="20"/>
       </w:pPr>
     </w:p>
     <w:p>
       <w:pPr>
         <w:keepNext/>
-        <w:spacing w:before="160" w:after="60"/>
+        <w:spacing w:before="80" w:after="30"/>
       </w:pPr>
       <w:r>
         <w:rPr>
@@ -730,7 +761,7 @@
           <w:color w:val="A56341"/>
           <w:sz w:val="21"/>
         </w:rPr>
-        <w:t>1.3 Identitas Visual Merek, Palet Warna (#A56341) &amp; Filosofi Logo</w:t>
+        <w:t>1.4 Identitas Visual Merek, Palet Warna (#A56341) &amp; Filosofi Logo</w:t>
       </w:r>
     </w:p>
     <w:tbl>
@@ -746,12 +777,12 @@
       <w:tr>
         <w:tc>
           <w:tcPr>
-            <w:tcW w:type="dxa" w:w="2381"/>
+            <w:tcW w:type="dxa" w:w="2948"/>
             <w:tcMar>
-              <w:top w:w="24" w:type="dxa"/>
-              <w:bottom w:w="24" w:type="dxa"/>
-              <w:left w:w="35" w:type="dxa"/>
-              <w:right w:w="45" w:type="dxa"/>
+              <w:top w:w="16" w:type="dxa"/>
+              <w:bottom w:w="16" w:type="dxa"/>
+              <w:left w:w="25" w:type="dxa"/>
+              <w:right w:w="30" w:type="dxa"/>
             </w:tcMar>
             <w:shd w:val="clear" w:color="auto" w:fill="FDF6F0"/>
             <w:tcBorders>
@@ -763,13 +794,13 @@
           </w:tcPr>
           <w:p>
             <w:pPr>
-              <w:spacing w:before="40" w:after="40"/>
+              <w:spacing w:before="20" w:after="20"/>
               <w:jc w:val="center"/>
             </w:pPr>
             <w:r>
               <w:drawing>
                 <wp:inline xmlns:a="http://schemas.openxmlformats.org/drawingml/2006/main" xmlns:pic="http://schemas.openxmlformats.org/drawingml/2006/picture">
-                  <wp:extent cx="1224000" cy="1224000"/>
+                  <wp:extent cx="1655999" cy="1655999"/>
                   <wp:docPr id="2" name="Picture 2"/>
                   <wp:cNvGraphicFramePr>
                     <a:graphicFrameLocks noChangeAspect="1"/>
@@ -790,7 +821,7 @@
                         <pic:spPr>
                           <a:xfrm>
                             <a:off x="0" y="0"/>
-                            <a:ext cx="1224000" cy="1224000"/>
+                            <a:ext cx="1655999" cy="1655999"/>
                           </a:xfrm>
                           <a:prstGeom prst="rect"/>
                         </pic:spPr>
@@ -835,12 +866,12 @@
         </w:tc>
         <w:tc>
           <w:tcPr>
-            <w:tcW w:type="dxa" w:w="7313"/>
+            <w:tcW w:type="dxa" w:w="6746"/>
             <w:tcMar>
-              <w:top w:w="24" w:type="dxa"/>
-              <w:bottom w:w="24" w:type="dxa"/>
-              <w:left w:w="45" w:type="dxa"/>
-              <w:right w:w="35" w:type="dxa"/>
+              <w:top w:w="16" w:type="dxa"/>
+              <w:bottom w:w="16" w:type="dxa"/>
+              <w:left w:w="30" w:type="dxa"/>
+              <w:right w:w="25" w:type="dxa"/>
             </w:tcMar>
             <w:shd w:val="clear" w:color="auto" w:fill="FDF6F0"/>
             <w:tcBorders>
@@ -852,7 +883,7 @@
           </w:tcPr>
           <w:p>
             <w:pPr>
-              <w:spacing w:before="0" w:after="40" w:line="276" w:lineRule="auto"/>
+              <w:spacing w:before="0" w:after="30" w:line="269" w:lineRule="auto"/>
               <w:jc w:val="left"/>
             </w:pPr>
             <w:r>
@@ -873,7 +904,7 @@
           </w:p>
           <w:p>
             <w:pPr>
-              <w:spacing w:before="10" w:after="40" w:line="276" w:lineRule="auto"/>
+              <w:spacing w:before="10" w:after="30" w:line="269" w:lineRule="auto"/>
               <w:jc w:val="left"/>
             </w:pPr>
             <w:r>
@@ -894,7 +925,7 @@
           </w:p>
           <w:p>
             <w:pPr>
-              <w:spacing w:before="10" w:after="0" w:line="276" w:lineRule="auto"/>
+              <w:spacing w:before="10" w:after="0" w:line="269" w:lineRule="auto"/>
               <w:jc w:val="left"/>
             </w:pPr>
             <w:r>
@@ -919,7 +950,7 @@
     <w:p>
       <w:pPr>
         <w:keepNext/>
-        <w:spacing w:before="120" w:after="40"/>
+        <w:spacing w:before="80" w:after="30"/>
       </w:pPr>
       <w:r>
         <w:rPr>
@@ -928,12 +959,12 @@
           <w:color w:val="A56341"/>
           <w:sz w:val="21"/>
         </w:rPr>
-        <w:t>1.4 Urgensi Identitas Merek: Dampak Psikologis bagi Pengunjung</w:t>
+        <w:t>1.5 Urgensi Identitas Merek: Dampak Psikologis bagi Pengunjung</w:t>
       </w:r>
     </w:p>
     <w:p>
       <w:pPr>
-        <w:spacing w:before="0" w:after="40" w:line="269" w:lineRule="auto"/>
+        <w:spacing w:before="0" w:after="30" w:line="264" w:lineRule="auto"/>
         <w:jc w:val="both"/>
       </w:pPr>
       <w:r>
@@ -1074,7 +1105,7 @@
           </w:tcPr>
           <w:p>
             <w:pPr>
-              <w:spacing w:before="0" w:after="70"/>
+              <w:spacing w:before="0" w:after="60"/>
               <w:jc w:val="left"/>
             </w:pPr>
             <w:r>
@@ -1425,7 +1456,7 @@
           </w:tcPr>
           <w:p>
             <w:pPr>
-              <w:spacing w:before="0" w:after="70"/>
+              <w:spacing w:before="0" w:after="60"/>
               <w:jc w:val="left"/>
             </w:pPr>
             <w:r>
@@ -6925,7 +6956,7 @@
           </w:tcPr>
           <w:p>
             <w:pPr>
-              <w:spacing w:before="0" w:after="70"/>
+              <w:spacing w:before="0" w:after="60"/>
               <w:jc w:val="left"/>
             </w:pPr>
             <w:r>
@@ -7129,7 +7160,7 @@
           </w:tcPr>
           <w:p>
             <w:pPr>
-              <w:spacing w:before="0" w:after="70"/>
+              <w:spacing w:before="0" w:after="60"/>
               <w:jc w:val="left"/>
             </w:pPr>
             <w:r>

</xml_diff>

<commit_message>
style: align font size to 9.5pt and format section 1.5 into structured points
</commit_message>
<xml_diff>
--- a/PROPOSAL_INVESTASI_JANGKAR_KOPI.docx
+++ b/PROPOSAL_INVESTASI_JANGKAR_KOPI.docx
@@ -531,7 +531,7 @@
     </w:p>
     <w:p>
       <w:pPr>
-        <w:spacing w:before="0" w:after="40" w:line="269" w:lineRule="auto"/>
+        <w:spacing w:before="0" w:after="50" w:line="276" w:lineRule="auto"/>
         <w:jc w:val="both"/>
       </w:pPr>
       <w:r>
@@ -540,14 +540,14 @@
           <w:b w:val="0"/>
           <w:i w:val="0"/>
           <w:color w:val="243B53"/>
-          <w:sz w:val="17"/>
+          <w:sz w:val="19"/>
         </w:rPr>
         <w:t>Berdasarkan evaluasi objektif bersama dewan penasihat dan calon mitra investor strategis, langkah paling bijak dalam memulai usaha F&amp;B pedesaan adalah menerapkan prinsip Lean Startup: memangkas belanja modal yang belum mendesak, menghilangkan risiko kelebihan kapasitas (over-capitalization), dan menguji penerimaan pasar secara langsung dengan modal ringan yang cepat menghasilkan arus kas (cashflow engine).</w:t>
       </w:r>
     </w:p>
     <w:p>
       <w:pPr>
-        <w:spacing w:before="0" w:after="40" w:line="269" w:lineRule="auto"/>
+        <w:spacing w:before="0" w:after="50" w:line="276" w:lineRule="auto"/>
         <w:jc w:val="both"/>
       </w:pPr>
       <w:r>
@@ -556,7 +556,7 @@
           <w:b w:val="0"/>
           <w:i w:val="0"/>
           <w:color w:val="243B53"/>
-          <w:sz w:val="17"/>
+          <w:sz w:val="19"/>
         </w:rPr>
         <w:t>Daya beli riil masyarakat di koridor Cikedal dan Menes terbukti sangat kuat pada rentang harga merakyat. Konsumen lokal terbiasa membelanjakan Rp 10.000 hingga Rp 20.000 per sesi nongkrong saat jajan aneka sate arang (Rp 2.500–Rp 3.500), nasi kucing, dan kopi hangat (Rp 3.000). Faktor penentu keberhasilan utama bukanlah kemewahan alat, melainkan suasana tempat yang merakyat, ramah, dan harga bersahabat yang tidak menimbulkan rasa segan (kagok/takut mahal). Oleh karena itu, Jangkar Kopi dirancang bersahaja, bersih, dan berakar pada kenyamanan warga lokal.</w:t>
       </w:r>
@@ -578,7 +578,7 @@
     </w:p>
     <w:p>
       <w:pPr>
-        <w:spacing w:before="0" w:after="40" w:line="269" w:lineRule="auto"/>
+        <w:spacing w:before="0" w:after="50" w:line="276" w:lineRule="auto"/>
         <w:jc w:val="both"/>
       </w:pPr>
       <w:r>
@@ -587,7 +587,7 @@
           <w:b w:val="0"/>
           <w:i w:val="0"/>
           <w:color w:val="243B53"/>
-          <w:sz w:val="17"/>
+          <w:sz w:val="19"/>
         </w:rPr>
         <w:t>Dengan menunda pembelian kursi camping dan mesin espresso impor, serta memfokuskan fasilitas duduk pada alas tebal nyaman dan meja lipat portabel, Jangkar Kopi menekan CAPEX awal secara drastis sehingga dapat dieksekusi dalam tempo 10–14 hari kerja. Risiko kerugian ditekan seminimal mungkin, sementara perputaran uang harian langsung aktif sejak hari pertama.</w:t>
       </w:r>
@@ -644,7 +644,7 @@
                 <w:rFonts w:ascii="Arial" w:hAnsi="Arial"/>
                 <w:b/>
                 <w:color w:val="102A43"/>
-                <w:sz w:val="19"/>
+                <w:sz w:val="20"/>
               </w:rPr>
               <w:t>EMPAT PILAR FILOSOFI DAN DOA DI BALIK NAMA JANGKAR KOPI</w:t>
             </w:r>
@@ -659,7 +659,7 @@
                 <w:rFonts w:ascii="Arial" w:hAnsi="Arial"/>
                 <w:b/>
                 <w:color w:val="A56341"/>
-                <w:sz w:val="17"/>
+                <w:sz w:val="18"/>
               </w:rPr>
               <w:t xml:space="preserve">1. Tempat Berlabuh &amp; Melepas Lelah (The Safe Harbor): </w:t>
             </w:r>
@@ -667,7 +667,7 @@
               <w:rPr>
                 <w:rFonts w:ascii="Arial" w:hAnsi="Arial"/>
                 <w:color w:val="243B53"/>
-                <w:sz w:val="17"/>
+                <w:sz w:val="18"/>
               </w:rPr>
               <w:t>Fungsi utama jangkar adalah diturunkan saat perahu tiba di dermaga yang tenang. Jangkar Kopi hadir sebagai tempat warga berlabuh, menghela napas, dan melepas penat setelah seharian bekerja.</w:t>
             </w:r>
@@ -682,7 +682,7 @@
                 <w:rFonts w:ascii="Arial" w:hAnsi="Arial"/>
                 <w:b/>
                 <w:color w:val="A56341"/>
-                <w:sz w:val="17"/>
+                <w:sz w:val="18"/>
               </w:rPr>
               <w:t xml:space="preserve">2. Kaitan Geografis Jalur Maritim Banten Barat: </w:t>
             </w:r>
@@ -690,7 +690,7 @@
               <w:rPr>
                 <w:rFonts w:ascii="Arial" w:hAnsi="Arial"/>
                 <w:color w:val="243B53"/>
-                <w:sz w:val="17"/>
+                <w:sz w:val="18"/>
               </w:rPr>
               <w:t>Cikedal dan Menes adalah gerbang pelintas menuju pesisir Labuan, Carita, dan Tanjung Lesung. Jangkar sangat lekat dengan ketangguhan masyarakat maritim Banten yang bersahaja dan pekerja keras.</w:t>
             </w:r>
@@ -705,7 +705,7 @@
                 <w:rFonts w:ascii="Arial" w:hAnsi="Arial"/>
                 <w:b/>
                 <w:color w:val="A56341"/>
-                <w:sz w:val="17"/>
+                <w:sz w:val="18"/>
               </w:rPr>
               <w:t xml:space="preserve">3. Keteguhan yang Menancap Membumi (Grounded): </w:t>
             </w:r>
@@ -713,7 +713,7 @@
               <w:rPr>
                 <w:rFonts w:ascii="Arial" w:hAnsi="Arial"/>
                 <w:color w:val="243B53"/>
-                <w:sz w:val="17"/>
+                <w:sz w:val="18"/>
               </w:rPr>
               <w:t>Jangkar menancap kuat di bumi. Ini adalah doa agar usaha selalu membumi, tidak congkak, berakar pada realitas rakyat, dan tahan banting menghadapi ujian usaha.</w:t>
             </w:r>
@@ -728,7 +728,7 @@
                 <w:rFonts w:ascii="Arial" w:hAnsi="Arial"/>
                 <w:b/>
                 <w:color w:val="A56341"/>
-                <w:sz w:val="17"/>
+                <w:sz w:val="18"/>
               </w:rPr>
               <w:t xml:space="preserve">4. Pengikat Tali Silaturahmi: </w:t>
             </w:r>
@@ -736,7 +736,7 @@
               <w:rPr>
                 <w:rFonts w:ascii="Arial" w:hAnsi="Arial"/>
                 <w:color w:val="243B53"/>
-                <w:sz w:val="17"/>
+                <w:sz w:val="18"/>
               </w:rPr>
               <w:t>Jangkar menahan perahu agar tidak hanyut; usaha ini diniatkan menjadi pengikat tali persaudaraan antarwarga, pemuda, santri, dan tetangga agar tetap guyub rukun.</w:t>
             </w:r>
@@ -779,8 +779,8 @@
           <w:tcPr>
             <w:tcW w:type="dxa" w:w="2948"/>
             <w:tcMar>
-              <w:top w:w="16" w:type="dxa"/>
-              <w:bottom w:w="16" w:type="dxa"/>
+              <w:top w:w="14" w:type="dxa"/>
+              <w:bottom w:w="14" w:type="dxa"/>
               <w:left w:w="25" w:type="dxa"/>
               <w:right w:w="30" w:type="dxa"/>
             </w:tcMar>
@@ -868,8 +868,8 @@
           <w:tcPr>
             <w:tcW w:type="dxa" w:w="6746"/>
             <w:tcMar>
-              <w:top w:w="16" w:type="dxa"/>
-              <w:bottom w:w="16" w:type="dxa"/>
+              <w:top w:w="14" w:type="dxa"/>
+              <w:bottom w:w="14" w:type="dxa"/>
               <w:left w:w="30" w:type="dxa"/>
               <w:right w:w="25" w:type="dxa"/>
             </w:tcMar>
@@ -890,14 +890,14 @@
               <w:rPr>
                 <w:b/>
                 <w:color w:val="A56341"/>
-                <w:sz w:val="16"/>
+                <w:sz w:val="17"/>
               </w:rPr>
               <w:t xml:space="preserve">1. Siluet Jangkar &amp; Inisial 'J' (Stabilitas &amp; Safe Harbor): </w:t>
             </w:r>
             <w:r>
               <w:rPr>
                 <w:color w:val="243B53"/>
-                <w:sz w:val="16"/>
+                <w:sz w:val="17"/>
               </w:rPr>
               <w:t>Batang kokoh dan kait jangkar membentuk inisial 'J' menancap kokoh. Simbol kestabilan usaha F&amp;B yang tahan banting, membumi (grounded), dan menjadi pelabuhan teduh melepas lelah.</w:t>
             </w:r>
@@ -911,14 +911,14 @@
               <w:rPr>
                 <w:b/>
                 <w:color w:val="A56341"/>
-                <w:sz w:val="16"/>
+                <w:sz w:val="17"/>
               </w:rPr>
               <w:t xml:space="preserve">2. Lengkung Cangkir &amp; Senyuman (Welcoming Cup &amp; Smile): </w:t>
             </w:r>
             <w:r>
               <w:rPr>
                 <w:color w:val="243B53"/>
-                <w:sz w:val="16"/>
+                <w:sz w:val="17"/>
               </w:rPr>
               <w:t>Lengan bawah jangkar memadukan mangkuk cangkir kopi dan kurva senyuman ramah. Simbol keramahtamahan (hospitality), kehangatan, dan ruang temu egaliter tanpa sekat sosial.</w:t>
             </w:r>
@@ -932,14 +932,14 @@
               <w:rPr>
                 <w:b/>
                 <w:color w:val="A56341"/>
-                <w:sz w:val="16"/>
+                <w:sz w:val="17"/>
               </w:rPr>
               <w:t xml:space="preserve">3. Uap Aroma Kopi &amp; Nyala Pelita (Steam Aroma &amp; Beacon Flame): </w:t>
             </w:r>
             <w:r>
               <w:rPr>
                 <w:color w:val="243B53"/>
-                <w:sz w:val="16"/>
+                <w:sz w:val="17"/>
               </w:rPr>
               <w:t>Tiga liukan uap memancarkan aroma seduhan Robusta lokal lereng Gn. Karang dan bara arang, sekaligus simbol lentera mercusuar pemandu pelintas malam di koridor jalan.</w:t>
             </w:r>
@@ -964,7 +964,7 @@
     </w:p>
     <w:p>
       <w:pPr>
-        <w:spacing w:before="0" w:after="30" w:line="264" w:lineRule="auto"/>
+        <w:spacing w:before="0" w:after="40" w:line="276" w:lineRule="auto"/>
         <w:jc w:val="both"/>
       </w:pPr>
       <w:r>
@@ -973,9 +973,78 @@
           <w:b w:val="0"/>
           <w:i w:val="0"/>
           <w:color w:val="243B53"/>
-          <w:sz w:val="17"/>
+          <w:sz w:val="19"/>
         </w:rPr>
-        <w:t>Banyak warkop dan angkringan kaki lima beroperasi secara anonim tanpa identitas yang jelas. Bagi psikologi pengunjung dan warga lokal, perbedaan bisnis dengan vs. tanpa identitas merek sangatlah fundamental: (1) Rasa Aman &amp; Kepastian Mutu (Psychological Safety &amp; Trust) — Warung anonim sering dipersepsikan seadanya tanpa kepastian mutu, sedangkan identitas merek memberi sinyal keseriusan profesional, standar higienitas, dan tanggung jawab mutu produk; (2) Rasa Memiliki &amp; Kebanggaan Sosial (Sense of Belonging &amp; Pride) — Pengunjung tidak merasa sekadar 'numpang jajan di pinggir jalan', melainkan bangga menjadi bagian dari ruang temu yang berjiwa dan bernarasi hangat ('Labuhkan Lelah, Seduh Cerita'); (3) Pembeda dari Anonimitas Pasar (Top-of-Mind Recall) — Warna khas Terracotta #A56341 dan logo jangkar menjadi mercusuar visual pemandu di jalur Cikedal - Menes yang membedakannya dari lapak jalanan biasa dan mengunci loyalitas kunjungan berulang (repeat order).</w:t>
+        <w:t>Banyak warkop dan angkringan kaki lima di pedesaan beroperasi secara anonim tanpa identitas yang jelas. Bagi psikologi pengunjung dan warga lokal, perbedaan bisnis beridentitas merek sangatlah fundamental:</w:t>
+      </w:r>
+    </w:p>
+    <w:p>
+      <w:pPr>
+        <w:spacing w:before="10" w:after="40" w:line="276" w:lineRule="auto"/>
+        <w:jc w:val="both"/>
+      </w:pPr>
+      <w:r>
+        <w:rPr>
+          <w:rFonts w:ascii="Arial" w:hAnsi="Arial"/>
+          <w:b/>
+          <w:color w:val="A56341"/>
+          <w:sz w:val="19"/>
+        </w:rPr>
+        <w:t xml:space="preserve">1. Rasa Aman &amp; Kepastian Mutu (Psychological Safety &amp; Trust): </w:t>
+      </w:r>
+      <w:r>
+        <w:rPr>
+          <w:rFonts w:ascii="Arial" w:hAnsi="Arial"/>
+          <w:color w:val="243B53"/>
+          <w:sz w:val="19"/>
+        </w:rPr>
+        <w:t>Warung anonim sering dipersepsikan seadanya tanpa kepastian mutu. Keberadaan identitas merek memberi sinyal keseriusan profesional, standar higienitas, dan kepastian rasa aman bagi pengunjung bahwa ada pihak yang bertanggung jawab penuh atas mutu hidangan.</w:t>
+      </w:r>
+    </w:p>
+    <w:p>
+      <w:pPr>
+        <w:spacing w:before="10" w:after="40" w:line="276" w:lineRule="auto"/>
+        <w:jc w:val="both"/>
+      </w:pPr>
+      <w:r>
+        <w:rPr>
+          <w:rFonts w:ascii="Arial" w:hAnsi="Arial"/>
+          <w:b/>
+          <w:color w:val="A56341"/>
+          <w:sz w:val="19"/>
+        </w:rPr>
+        <w:t xml:space="preserve">2. Rasa Memiliki &amp; Kebanggaan Sosial (Sense of Belonging &amp; Pride): </w:t>
+      </w:r>
+      <w:r>
+        <w:rPr>
+          <w:rFonts w:ascii="Arial" w:hAnsi="Arial"/>
+          <w:color w:val="243B53"/>
+          <w:sz w:val="19"/>
+        </w:rPr>
+        <w:t>Pengunjung tidak merasa sekadar 'numpang jajan di pinggir jalan', melainkan bangga menjadi bagian dari ruang temu komunitas yang berjiwa dan bernarasi hangat ('Labuhkan Lelah, Seduh Cerita').</w:t>
+      </w:r>
+    </w:p>
+    <w:p>
+      <w:pPr>
+        <w:spacing w:before="10" w:after="40" w:line="276" w:lineRule="auto"/>
+        <w:jc w:val="both"/>
+      </w:pPr>
+      <w:r>
+        <w:rPr>
+          <w:rFonts w:ascii="Arial" w:hAnsi="Arial"/>
+          <w:b/>
+          <w:color w:val="A56341"/>
+          <w:sz w:val="19"/>
+        </w:rPr>
+        <w:t xml:space="preserve">3. Pembeda dari Anonimitas Pasar (Top-of-Mind Brand Recall): </w:t>
+      </w:r>
+      <w:r>
+        <w:rPr>
+          <w:rFonts w:ascii="Arial" w:hAnsi="Arial"/>
+          <w:color w:val="243B53"/>
+          <w:sz w:val="19"/>
+        </w:rPr>
+        <w:t>Warna khas Terracotta #A56341 dan logo jangkar bertindak sebagai mercusuar visual pemandu di jalur Cikedal - Menes yang membedakannya dari lapak jalanan biasa dan mengunci loyalitas kunjungan berulang (repeat order).</w:t>
       </w:r>
     </w:p>
     <w:p>

</xml_diff>